<commit_message>
Update Assignment 3B - Project process book.docx
</commit_message>
<xml_diff>
--- a/Assignment 3B_Project process book/Assignment 3B - Project process book.docx
+++ b/Assignment 3B_Project process book/Assignment 3B - Project process book.docx
@@ -1,6 +1,6 @@
 
 <file path=word/document.xml><?xml version="1.0" encoding="utf-8"?>
-<w:document xmlns:wpc="http://schemas.microsoft.com/office/word/2010/wordprocessingCanvas" xmlns:cx="http://schemas.microsoft.com/office/drawing/2014/chartex" xmlns:cx1="http://schemas.microsoft.com/office/drawing/2015/9/8/chartex" xmlns:cx2="http://schemas.microsoft.com/office/drawing/2015/10/21/chartex" xmlns:cx3="http://schemas.microsoft.com/office/drawing/2016/5/9/chartex" xmlns:cx4="http://schemas.microsoft.com/office/drawing/2016/5/10/chartex" xmlns:cx5="http://schemas.microsoft.com/office/drawing/2016/5/11/chartex" xmlns:cx6="http://schemas.microsoft.com/office/drawing/2016/5/12/chartex" xmlns:cx7="http://schemas.microsoft.com/office/drawing/2016/5/13/chartex" xmlns:cx8="http://schemas.microsoft.com/office/drawing/2016/5/14/chartex" xmlns:mc="http://schemas.openxmlformats.org/markup-compatibility/2006" xmlns:m="http://schemas.openxmlformats.org/officeDocument/2006/math" xmlns:aink="http://schemas.microsoft.com/office/drawing/2016/ink" xmlns:am3d="http://schemas.microsoft.com/office/drawing/2017/model3d" xmlns:oel="http://schemas.microsoft.com/office/2019/extlst" xmlns:r="http://schemas.openxmlformats.org/officeDocument/2006/relationships" xmlns:wp14="http://schemas.microsoft.com/office/word/2010/wordprocessingDrawing" xmlns:wp="http://schemas.openxmlformats.org/drawingml/2006/wordprocessingDrawing" xmlns:wpg="http://schemas.microsoft.com/office/word/2010/wordprocessingGroup" xmlns:wpi="http://schemas.microsoft.com/office/word/2010/wordprocessingInk" xmlns:wps="http://schemas.microsoft.com/office/word/2010/wordprocessingShape" xmlns:o="urn:schemas-microsoft-com:office:office" xmlns:v="urn:schemas-microsoft-com:vml" xmlns:w10="urn:schemas-microsoft-com:office:word" xmlns:w="http://schemas.openxmlformats.org/wordprocessingml/2006/main" xmlns:w14="http://schemas.microsoft.com/office/word/2010/wordml" xmlns:w15="http://schemas.microsoft.com/office/word/2012/wordml" xmlns:w16cex="http://schemas.microsoft.com/office/word/2018/wordml/cex" xmlns:w16cid="http://schemas.microsoft.com/office/word/2016/wordml/cid" xmlns:w16="http://schemas.microsoft.com/office/word/2018/wordml" xmlns:w16sdtdh="http://schemas.microsoft.com/office/word/2020/wordml/sdtdatahash" xmlns:w16sdtfl="http://schemas.microsoft.com/office/word/2024/wordml/sdtformatlock" xmlns:w16se="http://schemas.microsoft.com/office/word/2015/wordml/symex" xmlns:w16du="http://schemas.microsoft.com/office/word/2023/wordml/word16du" xmlns:wne="http://schemas.microsoft.com/office/word/2006/wordml" mc:Ignorable="w14 w15 w16se w16cid w16 w16cex w16sdtdh w16sdtfl w16du wp14">
+<w:document xmlns:wpc="http://schemas.microsoft.com/office/word/2010/wordprocessingCanvas" xmlns:cx="http://schemas.microsoft.com/office/drawing/2014/chartex" xmlns:cx1="http://schemas.microsoft.com/office/drawing/2015/9/8/chartex" xmlns:cx2="http://schemas.microsoft.com/office/drawing/2015/10/21/chartex" xmlns:cx3="http://schemas.microsoft.com/office/drawing/2016/5/9/chartex" xmlns:cx4="http://schemas.microsoft.com/office/drawing/2016/5/10/chartex" xmlns:cx5="http://schemas.microsoft.com/office/drawing/2016/5/11/chartex" xmlns:cx6="http://schemas.microsoft.com/office/drawing/2016/5/12/chartex" xmlns:cx7="http://schemas.microsoft.com/office/drawing/2016/5/13/chartex" xmlns:cx8="http://schemas.microsoft.com/office/drawing/2016/5/14/chartex" xmlns:mc="http://schemas.openxmlformats.org/markup-compatibility/2006" xmlns:aink="http://schemas.microsoft.com/office/drawing/2016/ink" xmlns:am3d="http://schemas.microsoft.com/office/drawing/2017/model3d" xmlns:o="urn:schemas-microsoft-com:office:office" xmlns:oel="http://schemas.microsoft.com/office/2019/extlst" xmlns:r="http://schemas.openxmlformats.org/officeDocument/2006/relationships" xmlns:m="http://schemas.openxmlformats.org/officeDocument/2006/math" xmlns:v="urn:schemas-microsoft-com:vml" xmlns:wp14="http://schemas.microsoft.com/office/word/2010/wordprocessingDrawing" xmlns:wp="http://schemas.openxmlformats.org/drawingml/2006/wordprocessingDrawing" xmlns:w10="urn:schemas-microsoft-com:office:word" xmlns:w="http://schemas.openxmlformats.org/wordprocessingml/2006/main" xmlns:w14="http://schemas.microsoft.com/office/word/2010/wordml" xmlns:w15="http://schemas.microsoft.com/office/word/2012/wordml" xmlns:w16cex="http://schemas.microsoft.com/office/word/2018/wordml/cex" xmlns:w16cid="http://schemas.microsoft.com/office/word/2016/wordml/cid" xmlns:w16="http://schemas.microsoft.com/office/word/2018/wordml" xmlns:w16du="http://schemas.microsoft.com/office/word/2023/wordml/word16du" xmlns:w16sdtdh="http://schemas.microsoft.com/office/word/2020/wordml/sdtdatahash" xmlns:w16sdtfl="http://schemas.microsoft.com/office/word/2024/wordml/sdtformatlock" xmlns:w16se="http://schemas.microsoft.com/office/word/2015/wordml/symex" xmlns:wpg="http://schemas.microsoft.com/office/word/2010/wordprocessingGroup" xmlns:wpi="http://schemas.microsoft.com/office/word/2010/wordprocessingInk" xmlns:wne="http://schemas.microsoft.com/office/word/2006/wordml" xmlns:wps="http://schemas.microsoft.com/office/word/2010/wordprocessingShape" mc:Ignorable="w14 w15 w16se w16cid w16 w16cex w16sdtdh w16sdtfl w16du wp14">
   <w:body>
     <w:p>
       <w:pPr>
@@ -3432,13 +3432,29 @@
     </w:p>
     <w:p>
       <w:r>
-        <w:t>After examination of the datasets, it is evident that there are a lot of attributes and observations in the OECD CSV files that are not needed for the project. The data sets will therefore be limited to the focus aspect, i.e. to the countries, years and measures that are relevant to the visualisation.</w:t>
-      </w:r>
-    </w:p>
-    <w:p>
+        <w:t xml:space="preserve">The OECD data sets include observations for </w:t>
+      </w:r>
+      <w:proofErr w:type="gramStart"/>
+      <w:r>
+        <w:t>a number of</w:t>
+      </w:r>
+      <w:proofErr w:type="gramEnd"/>
+      <w:r>
+        <w:t xml:space="preserve"> countries, years and health related measures. The data was limited to 10 countries chosen from the OECD countries to avoid being overwhelmed by the sheer volume of data in the visualisations that would be produced by including all countries: Australia, Canada, France, Germany, </w:t>
+      </w:r>
       <w:r>
         <w:lastRenderedPageBreak/>
-        <w:t>Each observation will include Country and Year will be used for matching the two datasets:</w:t>
+        <w:t>Italy, Japan, Korea, New Zealand, the United Kingdom and the United States. The selected period was 2015 to 2024.</w:t>
+      </w:r>
+    </w:p>
+    <w:p>
+      <w:r>
+        <w:t>The Life Expectancy dataset was restricted to only include annual observations for life expectancy at 0 years, sex = Total. The Healthcare Expenditure dataset was selected to provide data for total annual expenditure on healthcare items per capita at current prices in US dollars in purchasing power parity (PPP) terms. The filters provided the possibility to be sure that the values presented on the charts were common measures in the selected countries.</w:t>
+      </w:r>
+    </w:p>
+    <w:p>
+      <w:r>
+        <w:t>The CSV files were loaded into the program with D3.js. Each data set was read to obtain the relevant country, year and numerical value. The expenditure and life expectancy observations for the health sector were then cross-matched based on country and year common keys. This produced a merged dataset containing four main attributes:</w:t>
       </w:r>
     </w:p>
     <w:p>
@@ -3446,11 +3462,18 @@
         <w:pStyle w:val="ListParagraph"/>
         <w:numPr>
           <w:ilvl w:val="0"/>
-          <w:numId w:val="10"/>
+          <w:numId w:val="20"/>
         </w:numPr>
       </w:pPr>
       <w:r>
-        <w:t xml:space="preserve">Country </w:t>
+        <w:rPr>
+          <w:b/>
+          <w:bCs/>
+        </w:rPr>
+        <w:t>Country:</w:t>
+      </w:r>
+      <w:r>
+        <w:t xml:space="preserve"> The country to be selected is the OECD country.</w:t>
       </w:r>
     </w:p>
     <w:p>
@@ -3458,11 +3481,18 @@
         <w:pStyle w:val="ListParagraph"/>
         <w:numPr>
           <w:ilvl w:val="0"/>
-          <w:numId w:val="10"/>
+          <w:numId w:val="20"/>
         </w:numPr>
       </w:pPr>
       <w:r>
-        <w:t xml:space="preserve">Year </w:t>
+        <w:rPr>
+          <w:b/>
+          <w:bCs/>
+        </w:rPr>
+        <w:t>Year:</w:t>
+      </w:r>
+      <w:r>
+        <w:t xml:space="preserve"> The year that observations are being made (2015-2024).</w:t>
       </w:r>
     </w:p>
     <w:p>
@@ -3470,47 +3500,66 @@
         <w:pStyle w:val="ListParagraph"/>
         <w:numPr>
           <w:ilvl w:val="0"/>
-          <w:numId w:val="10"/>
+          <w:numId w:val="20"/>
         </w:numPr>
       </w:pPr>
       <w:r>
-        <w:t xml:space="preserve">Life expectancy </w:t>
-      </w:r>
-    </w:p>
-    <w:p>
-      <w:pPr>
-        <w:pStyle w:val="ListParagraph"/>
-        <w:numPr>
-          <w:ilvl w:val="0"/>
-          <w:numId w:val="10"/>
-        </w:numPr>
-      </w:pPr>
-      <w:r>
-        <w:t xml:space="preserve">Healthcare expenditure </w:t>
-      </w:r>
-    </w:p>
-    <w:p>
-      <w:r>
-        <w:t>Early testing has been done with the D3.js library to load in each dataset and create a merged dataset with matched observations.</w:t>
-      </w:r>
-    </w:p>
-    <w:p>
-      <w:r>
-        <w:t>Additional data cleaning and processing will take place as the visualisation is developed. Any further filtering, transformation or derived variables will be documented in this section.</w:t>
-      </w:r>
-    </w:p>
-    <w:p>
-      <w:pPr>
         <w:rPr>
           <w:b/>
           <w:bCs/>
         </w:rPr>
-      </w:pPr>
-      <w:r>
+        <w:t>Life expectancy at birth:</w:t>
+      </w:r>
+      <w:r>
+        <w:t xml:space="preserve"> Number of years a person can expect to live if they were born in 2012.</w:t>
+      </w:r>
+    </w:p>
+    <w:p>
+      <w:r>
+        <w:t xml:space="preserve">Healthcare expenditure: Total per capita health spending (in US </w:t>
+      </w:r>
+      <w:proofErr w:type="gramStart"/>
+      <w:r>
+        <w:t>dollars(</w:t>
+      </w:r>
+      <w:proofErr w:type="gramEnd"/>
+      <w:r>
+        <w:t>PPP)).</w:t>
+      </w:r>
+    </w:p>
+    <w:p>
+      <w:r>
+        <w:t xml:space="preserve">The data set that is merged at the end is of 100 observations (10 years x 10 countries). The data in this data set is used to create the scatter graph and the </w:t>
+      </w:r>
+      <w:proofErr w:type="gramStart"/>
+      <w:r>
+        <w:t>two line</w:t>
+      </w:r>
+      <w:proofErr w:type="gramEnd"/>
+      <w:r>
+        <w:t xml:space="preserve"> charts. The latest observation available for each country is used for the scatter plot and the annual observations are used to plot the line charts, to illustrate changes from 2015 to 2024.</w:t>
+      </w:r>
+    </w:p>
+    <w:p>
+      <w:r>
+        <w:t>In JavaScript, the data was merged and filtered, meaning that the visualisations could be based on consistent country and year information without including unneeded fields from the underlying OECD data</w:t>
+      </w:r>
+      <w:r>
+        <w:t>.</w:t>
+      </w:r>
+    </w:p>
+    <w:p>
+      <w:pPr>
         <w:rPr>
           <w:b/>
           <w:bCs/>
         </w:rPr>
+      </w:pPr>
+      <w:r>
+        <w:rPr>
+          <w:b/>
+          <w:bCs/>
+        </w:rPr>
         <w:br w:type="page"/>
       </w:r>
     </w:p>
@@ -3537,102 +3586,268 @@
     </w:p>
     <w:p>
       <w:r>
-        <w:t>Based on the project needs, there is a list of must have requirements that should be considered at the very beginning of the design of the project:</w:t>
-      </w:r>
-    </w:p>
-    <w:p>
-      <w:pPr>
-        <w:pStyle w:val="ListParagraph"/>
-        <w:numPr>
-          <w:ilvl w:val="0"/>
-          <w:numId w:val="12"/>
-        </w:numPr>
-      </w:pPr>
-      <w:r>
-        <w:t xml:space="preserve">Import health statistics from OECD into D3.js. </w:t>
-      </w:r>
-    </w:p>
-    <w:p>
-      <w:pPr>
-        <w:pStyle w:val="ListParagraph"/>
-        <w:numPr>
-          <w:ilvl w:val="0"/>
-          <w:numId w:val="12"/>
-        </w:numPr>
-      </w:pPr>
-      <w:r>
-        <w:t xml:space="preserve">Visually represent expenditure on health and life expectancy. </w:t>
-      </w:r>
-    </w:p>
-    <w:p>
-      <w:pPr>
-        <w:pStyle w:val="ListParagraph"/>
-        <w:numPr>
-          <w:ilvl w:val="0"/>
-          <w:numId w:val="12"/>
-        </w:numPr>
-      </w:pPr>
-      <w:r>
-        <w:t xml:space="preserve">Enable a comparison between O.E.C.D. countries selected. </w:t>
-      </w:r>
-    </w:p>
-    <w:p>
-      <w:pPr>
-        <w:pStyle w:val="ListParagraph"/>
-        <w:numPr>
-          <w:ilvl w:val="0"/>
-          <w:numId w:val="12"/>
-        </w:numPr>
-      </w:pPr>
-      <w:r>
-        <w:t xml:space="preserve">Give user the ability to see how things changed over the years. </w:t>
-      </w:r>
-      <w:r>
-        <w:br/>
-        <w:t xml:space="preserve">Clearly label axes, values and countries. </w:t>
-      </w:r>
-    </w:p>
-    <w:p>
-      <w:pPr>
-        <w:pStyle w:val="ListParagraph"/>
-        <w:numPr>
-          <w:ilvl w:val="0"/>
-          <w:numId w:val="12"/>
-        </w:numPr>
-      </w:pPr>
-      <w:r>
-        <w:t xml:space="preserve">Give suitable titles and descriptions for visualisations. </w:t>
-      </w:r>
-    </w:p>
-    <w:p>
-      <w:pPr>
-        <w:pStyle w:val="ListParagraph"/>
-        <w:numPr>
-          <w:ilvl w:val="0"/>
-          <w:numId w:val="12"/>
-        </w:numPr>
-      </w:pPr>
-      <w:r>
-        <w:t xml:space="preserve">Provide visualisations on the internet. </w:t>
-      </w:r>
-    </w:p>
-    <w:p>
-      <w:pPr>
-        <w:pStyle w:val="ListParagraph"/>
-        <w:numPr>
-          <w:ilvl w:val="0"/>
-          <w:numId w:val="12"/>
-        </w:numPr>
-      </w:pPr>
-      <w:r>
-        <w:t xml:space="preserve">Ensure the visualisations are understandable and easy to use. </w:t>
-      </w:r>
-    </w:p>
-    <w:p>
-      <w:pPr>
-        <w:pStyle w:val="ListParagraph"/>
-      </w:pPr>
-    </w:p>
+        <w:t xml:space="preserve">The following requirements were identified during the planning stage. All must-have features were implemented in the </w:t>
+      </w:r>
+      <w:proofErr w:type="spellStart"/>
+      <w:r>
+        <w:t>fi.nal</w:t>
+      </w:r>
+      <w:proofErr w:type="spellEnd"/>
+      <w:r>
+        <w:t xml:space="preserve"> website</w:t>
+      </w:r>
+    </w:p>
+    <w:tbl>
+      <w:tblPr>
+        <w:tblStyle w:val="TableGrid"/>
+        <w:tblW w:w="0" w:type="auto"/>
+        <w:tblLook w:val="04A0" w:firstRow="1" w:lastRow="0" w:firstColumn="1" w:lastColumn="0" w:noHBand="0" w:noVBand="1"/>
+      </w:tblPr>
+      <w:tblGrid>
+        <w:gridCol w:w="4508"/>
+        <w:gridCol w:w="4508"/>
+      </w:tblGrid>
+      <w:tr>
+        <w:tc>
+          <w:tcPr>
+            <w:tcW w:w="4508" w:type="dxa"/>
+          </w:tcPr>
+          <w:p>
+            <w:pPr>
+              <w:rPr>
+                <w:b/>
+                <w:bCs/>
+              </w:rPr>
+            </w:pPr>
+            <w:r>
+              <w:rPr>
+                <w:b/>
+                <w:bCs/>
+              </w:rPr>
+              <w:t>Requirement</w:t>
+            </w:r>
+          </w:p>
+        </w:tc>
+        <w:tc>
+          <w:tcPr>
+            <w:tcW w:w="4508" w:type="dxa"/>
+          </w:tcPr>
+          <w:p>
+            <w:pPr>
+              <w:rPr>
+                <w:b/>
+                <w:bCs/>
+              </w:rPr>
+            </w:pPr>
+            <w:r>
+              <w:rPr>
+                <w:b/>
+                <w:bCs/>
+              </w:rPr>
+              <w:t>Implementation Status</w:t>
+            </w:r>
+          </w:p>
+        </w:tc>
+      </w:tr>
+      <w:tr>
+        <w:tc>
+          <w:tcPr>
+            <w:tcW w:w="4508" w:type="dxa"/>
+          </w:tcPr>
+          <w:p>
+            <w:r>
+              <w:t>i</w:t>
+            </w:r>
+            <w:r>
+              <w:t>mport OECD health statistics into D3.js</w:t>
+            </w:r>
+          </w:p>
+        </w:tc>
+        <w:tc>
+          <w:tcPr>
+            <w:tcW w:w="4508" w:type="dxa"/>
+          </w:tcPr>
+          <w:p>
+            <w:r>
+              <w:t>Completed – Both CSV datasets are loaded and processed using D3.js</w:t>
+            </w:r>
+            <w:r>
+              <w:t>.</w:t>
+            </w:r>
+          </w:p>
+        </w:tc>
+      </w:tr>
+      <w:tr>
+        <w:tc>
+          <w:tcPr>
+            <w:tcW w:w="4508" w:type="dxa"/>
+          </w:tcPr>
+          <w:p>
+            <w:r>
+              <w:t>Visualise healthcare expenditure and life expectancy</w:t>
+            </w:r>
+          </w:p>
+        </w:tc>
+        <w:tc>
+          <w:tcPr>
+            <w:tcW w:w="4508" w:type="dxa"/>
+          </w:tcPr>
+          <w:p>
+            <w:r>
+              <w:t xml:space="preserve">Completed – A scatter plot and </w:t>
+            </w:r>
+            <w:proofErr w:type="gramStart"/>
+            <w:r>
+              <w:t>two line</w:t>
+            </w:r>
+            <w:proofErr w:type="gramEnd"/>
+            <w:r>
+              <w:t xml:space="preserve"> charts were developed.</w:t>
+            </w:r>
+          </w:p>
+        </w:tc>
+      </w:tr>
+      <w:tr>
+        <w:tc>
+          <w:tcPr>
+            <w:tcW w:w="4508" w:type="dxa"/>
+          </w:tcPr>
+          <w:p>
+            <w:r>
+              <w:t>Compare the selected OECD countries</w:t>
+            </w:r>
+          </w:p>
+        </w:tc>
+        <w:tc>
+          <w:tcPr>
+            <w:tcW w:w="4508" w:type="dxa"/>
+          </w:tcPr>
+          <w:p>
+            <w:r>
+              <w:t>Completed – The visualisations display data for ten selected countries.</w:t>
+            </w:r>
+          </w:p>
+        </w:tc>
+      </w:tr>
+      <w:tr>
+        <w:tc>
+          <w:tcPr>
+            <w:tcW w:w="4508" w:type="dxa"/>
+          </w:tcPr>
+          <w:p>
+            <w:r>
+              <w:t>S</w:t>
+            </w:r>
+            <w:r>
+              <w:t>how changes over time</w:t>
+            </w:r>
+          </w:p>
+        </w:tc>
+        <w:tc>
+          <w:tcPr>
+            <w:tcW w:w="4508" w:type="dxa"/>
+          </w:tcPr>
+          <w:p>
+            <w:r>
+              <w:t>Completed – The line charts show annual data from 2015 to 2024.</w:t>
+            </w:r>
+          </w:p>
+        </w:tc>
+      </w:tr>
+      <w:tr>
+        <w:tc>
+          <w:tcPr>
+            <w:tcW w:w="4508" w:type="dxa"/>
+          </w:tcPr>
+          <w:p>
+            <w:r>
+              <w:t>Clearly label axes, values and countries</w:t>
+            </w:r>
+          </w:p>
+        </w:tc>
+        <w:tc>
+          <w:tcPr>
+            <w:tcW w:w="4508" w:type="dxa"/>
+          </w:tcPr>
+          <w:p>
+            <w:r>
+              <w:t>Completed – The charts include axes, labels, legends and interactive tooltips.</w:t>
+            </w:r>
+          </w:p>
+        </w:tc>
+      </w:tr>
+      <w:tr>
+        <w:tc>
+          <w:tcPr>
+            <w:tcW w:w="4508" w:type="dxa"/>
+          </w:tcPr>
+          <w:p>
+            <w:r>
+              <w:t>Provide suitable titles and descriptions</w:t>
+            </w:r>
+          </w:p>
+        </w:tc>
+        <w:tc>
+          <w:tcPr>
+            <w:tcW w:w="4508" w:type="dxa"/>
+          </w:tcPr>
+          <w:p>
+            <w:r>
+              <w:t>Completed – Each visualisation has a title and an explanation of its purpose.</w:t>
+            </w:r>
+          </w:p>
+        </w:tc>
+      </w:tr>
+      <w:tr>
+        <w:tc>
+          <w:tcPr>
+            <w:tcW w:w="4508" w:type="dxa"/>
+          </w:tcPr>
+          <w:p>
+            <w:r>
+              <w:t>Make the visualisations available online</w:t>
+            </w:r>
+          </w:p>
+        </w:tc>
+        <w:tc>
+          <w:tcPr>
+            <w:tcW w:w="4508" w:type="dxa"/>
+          </w:tcPr>
+          <w:p>
+            <w:r>
+              <w:t>Completed – The website is hosted on the Mercury server.</w:t>
+            </w:r>
+          </w:p>
+        </w:tc>
+      </w:tr>
+      <w:tr>
+        <w:tc>
+          <w:tcPr>
+            <w:tcW w:w="4508" w:type="dxa"/>
+          </w:tcPr>
+          <w:p>
+            <w:r>
+              <w:t>Make the visualisations understandable and easy to use</w:t>
+            </w:r>
+          </w:p>
+        </w:tc>
+        <w:tc>
+          <w:tcPr>
+            <w:tcW w:w="4508" w:type="dxa"/>
+          </w:tcPr>
+          <w:p>
+            <w:r>
+              <w:t>I</w:t>
+            </w:r>
+            <w:r>
+              <w:t>mplemented – The website includes five guiding questions, a consistent layout and interactive chart features. User testing will provide further feedback on usability.</w:t>
+            </w:r>
+          </w:p>
+          <w:p/>
+        </w:tc>
+      </w:tr>
+    </w:tbl>
+    <w:p/>
     <w:p>
       <w:pPr>
         <w:pStyle w:val="Heading2"/>
@@ -3645,116 +3860,329 @@
     </w:p>
     <w:p>
       <w:r>
-        <w:t>Some other options may be included:</w:t>
-      </w:r>
-    </w:p>
-    <w:p>
-      <w:r>
-        <w:t xml:space="preserve">Clicking on any value displays detailed values in tooltips. </w:t>
-      </w:r>
-    </w:p>
-    <w:p>
-      <w:pPr>
-        <w:pStyle w:val="ListParagraph"/>
-        <w:numPr>
-          <w:ilvl w:val="0"/>
-          <w:numId w:val="13"/>
-        </w:numPr>
-      </w:pPr>
-      <w:r>
-        <w:t xml:space="preserve">Countries selection/filter. </w:t>
-      </w:r>
-    </w:p>
-    <w:p>
-      <w:pPr>
-        <w:pStyle w:val="ListParagraph"/>
-        <w:numPr>
-          <w:ilvl w:val="0"/>
-          <w:numId w:val="13"/>
-        </w:numPr>
-      </w:pPr>
-      <w:r>
-        <w:t xml:space="preserve">A method is provided for choosing or filtering on a year level. </w:t>
-      </w:r>
-    </w:p>
-    <w:p>
-      <w:pPr>
-        <w:pStyle w:val="ListParagraph"/>
-        <w:numPr>
-          <w:ilvl w:val="0"/>
-          <w:numId w:val="13"/>
-        </w:numPr>
-      </w:pPr>
-      <w:r>
-        <w:t xml:space="preserve">Highlighting individual countries. </w:t>
-      </w:r>
-    </w:p>
-    <w:p>
-      <w:pPr>
-        <w:pStyle w:val="ListParagraph"/>
-        <w:numPr>
-          <w:ilvl w:val="0"/>
-          <w:numId w:val="13"/>
-        </w:numPr>
-      </w:pPr>
-      <w:r>
-        <w:t xml:space="preserve">Animated screen change or animation when filters change. </w:t>
-      </w:r>
-    </w:p>
-    <w:p>
-      <w:pPr>
-        <w:pStyle w:val="ListParagraph"/>
-        <w:numPr>
-          <w:ilvl w:val="0"/>
-          <w:numId w:val="13"/>
-        </w:numPr>
-      </w:pPr>
-      <w:r>
-        <w:t xml:space="preserve">Additional charts of trends over time. </w:t>
-      </w:r>
-    </w:p>
-    <w:p>
-      <w:pPr>
-        <w:pStyle w:val="ListParagraph"/>
-        <w:numPr>
-          <w:ilvl w:val="0"/>
-          <w:numId w:val="13"/>
-        </w:numPr>
-      </w:pPr>
-      <w:r>
-        <w:t xml:space="preserve">A layout-to-fit screens for varying screen sizes. </w:t>
-      </w:r>
-    </w:p>
-    <w:p>
-      <w:r>
-        <w:t>The above will be factored in with regard to time and usefulness to the project when developing</w:t>
-      </w:r>
-      <w:r>
-        <w:t>.</w:t>
-      </w:r>
-    </w:p>
-    <w:p>
-      <w:pPr>
+        <w:t>Several optional features were considered to improve user interaction and accessibility. The final implementation includes interactive tooltips, country highlighting, additional trend charts and a responsive layout.</w:t>
+      </w:r>
+    </w:p>
+    <w:tbl>
+      <w:tblPr>
+        <w:tblStyle w:val="TableGrid"/>
+        <w:tblW w:w="0" w:type="auto"/>
+        <w:tblLook w:val="04A0" w:firstRow="1" w:lastRow="0" w:firstColumn="1" w:lastColumn="0" w:noHBand="0" w:noVBand="1"/>
+      </w:tblPr>
+      <w:tblGrid>
+        <w:gridCol w:w="4508"/>
+        <w:gridCol w:w="4508"/>
+      </w:tblGrid>
+      <w:tr>
+        <w:tc>
+          <w:tcPr>
+            <w:tcW w:w="4508" w:type="dxa"/>
+          </w:tcPr>
+          <w:p>
+            <w:pPr>
+              <w:rPr>
+                <w:b/>
+                <w:bCs/>
+              </w:rPr>
+            </w:pPr>
+            <w:r>
+              <w:rPr>
+                <w:b/>
+                <w:bCs/>
+              </w:rPr>
+              <w:t>Optional Feature</w:t>
+            </w:r>
+          </w:p>
+        </w:tc>
+        <w:tc>
+          <w:tcPr>
+            <w:tcW w:w="4508" w:type="dxa"/>
+          </w:tcPr>
+          <w:tbl>
+            <w:tblPr>
+              <w:tblW w:w="0" w:type="auto"/>
+              <w:tblCellSpacing w:w="15" w:type="dxa"/>
+              <w:tblCellMar>
+                <w:top w:w="15" w:type="dxa"/>
+                <w:left w:w="15" w:type="dxa"/>
+                <w:bottom w:w="15" w:type="dxa"/>
+                <w:right w:w="15" w:type="dxa"/>
+              </w:tblCellMar>
+              <w:tblLook w:val="04A0" w:firstRow="1" w:lastRow="0" w:firstColumn="1" w:lastColumn="0" w:noHBand="0" w:noVBand="1"/>
+            </w:tblPr>
+            <w:tblGrid>
+              <w:gridCol w:w="81"/>
+              <w:gridCol w:w="2416"/>
+            </w:tblGrid>
+            <w:tr>
+              <w:trPr>
+                <w:tblCellSpacing w:w="15" w:type="dxa"/>
+              </w:trPr>
+              <w:tc>
+                <w:tcPr>
+                  <w:tcW w:w="0" w:type="auto"/>
+                  <w:vAlign w:val="center"/>
+                  <w:hideMark/>
+                </w:tcPr>
+                <w:p>
+                  <w:pPr>
+                    <w:spacing w:after="0" w:line="240" w:lineRule="auto"/>
+                    <w:rPr>
+                      <w:rFonts w:ascii="Times New Roman" w:eastAsia="Times New Roman" w:hAnsi="Times New Roman" w:cs="Times New Roman"/>
+                      <w:kern w:val="0"/>
+                      <w:lang w:eastAsia="en-AU"/>
+                      <w14:ligatures w14:val="none"/>
+                    </w:rPr>
+                  </w:pPr>
+                </w:p>
+              </w:tc>
+              <w:tc>
+                <w:tcPr>
+                  <w:tcW w:w="0" w:type="auto"/>
+                  <w:vAlign w:val="center"/>
+                  <w:hideMark/>
+                </w:tcPr>
+                <w:p>
+                  <w:pPr>
+                    <w:spacing w:after="0" w:line="240" w:lineRule="auto"/>
+                    <w:jc w:val="center"/>
+                    <w:rPr>
+                      <w:rFonts w:ascii="Times New Roman" w:eastAsia="Times New Roman" w:hAnsi="Times New Roman" w:cs="Times New Roman"/>
+                      <w:b/>
+                      <w:bCs/>
+                      <w:kern w:val="0"/>
+                      <w:lang w:eastAsia="en-AU"/>
+                      <w14:ligatures w14:val="none"/>
+                    </w:rPr>
+                  </w:pPr>
+                  <w:r>
+                    <w:rPr>
+                      <w:rFonts w:ascii="Times New Roman" w:eastAsia="Times New Roman" w:hAnsi="Times New Roman" w:cs="Times New Roman"/>
+                      <w:b/>
+                      <w:bCs/>
+                      <w:kern w:val="0"/>
+                      <w:lang w:eastAsia="en-AU"/>
+                      <w14:ligatures w14:val="none"/>
+                    </w:rPr>
+                    <w:t>Implementation Status</w:t>
+                  </w:r>
+                </w:p>
+              </w:tc>
+            </w:tr>
+          </w:tbl>
+          <w:p>
+            <w:pPr>
+              <w:rPr>
+                <w:b/>
+                <w:bCs/>
+              </w:rPr>
+            </w:pPr>
+          </w:p>
+        </w:tc>
+      </w:tr>
+      <w:tr>
+        <w:tc>
+          <w:tcPr>
+            <w:tcW w:w="4508" w:type="dxa"/>
+          </w:tcPr>
+          <w:p>
+            <w:r>
+              <w:t>Display detailed values in tooltips</w:t>
+            </w:r>
+          </w:p>
+        </w:tc>
+        <w:tc>
+          <w:tcPr>
+            <w:tcW w:w="4508" w:type="dxa"/>
+          </w:tcPr>
+          <w:p>
+            <w:r>
+              <w:t>Completed – Hovering over chart data displays country-specific information.</w:t>
+            </w:r>
+          </w:p>
+        </w:tc>
+      </w:tr>
+      <w:tr>
+        <w:tc>
+          <w:tcPr>
+            <w:tcW w:w="4508" w:type="dxa"/>
+          </w:tcPr>
+          <w:p>
+            <w:r>
+              <w:t>Country selection or filtering</w:t>
+            </w:r>
+          </w:p>
+        </w:tc>
+        <w:tc>
+          <w:tcPr>
+            <w:tcW w:w="4508" w:type="dxa"/>
+          </w:tcPr>
+          <w:p>
+            <w:r>
+              <w:t>Not implemented – Users can highlight individual country trends by hovering, but there is no separate country filter.</w:t>
+            </w:r>
+          </w:p>
+        </w:tc>
+      </w:tr>
+      <w:tr>
+        <w:tc>
+          <w:tcPr>
+            <w:tcW w:w="4508" w:type="dxa"/>
+          </w:tcPr>
+          <w:p>
+            <w:r>
+              <w:t>Year selection or filtering</w:t>
+            </w:r>
+          </w:p>
+        </w:tc>
+        <w:tc>
+          <w:tcPr>
+            <w:tcW w:w="4508" w:type="dxa"/>
+          </w:tcPr>
+          <w:p>
+            <w:r>
+              <w:t>Not implemented – The line charts display the full 2015–2024 period, while the scatter plot uses the latest available observation for each country.</w:t>
+            </w:r>
+          </w:p>
+        </w:tc>
+      </w:tr>
+      <w:tr>
+        <w:tc>
+          <w:tcPr>
+            <w:tcW w:w="4508" w:type="dxa"/>
+          </w:tcPr>
+          <w:p>
+            <w:r>
+              <w:lastRenderedPageBreak/>
+              <w:t>Highlight individual countries</w:t>
+            </w:r>
+          </w:p>
+        </w:tc>
+        <w:tc>
+          <w:tcPr>
+            <w:tcW w:w="4508" w:type="dxa"/>
+          </w:tcPr>
+          <w:p>
+            <w:r>
+              <w:t>Completed – Hovering over a country highlights its line and fades the other lines.</w:t>
+            </w:r>
+          </w:p>
+        </w:tc>
+      </w:tr>
+      <w:tr>
+        <w:tc>
+          <w:tcPr>
+            <w:tcW w:w="4508" w:type="dxa"/>
+          </w:tcPr>
+          <w:p>
+            <w:r>
+              <w:t>Animated transitions when filters change</w:t>
+            </w:r>
+          </w:p>
+        </w:tc>
+        <w:tc>
+          <w:tcPr>
+            <w:tcW w:w="4508" w:type="dxa"/>
+          </w:tcPr>
+          <w:p>
+            <w:r>
+              <w:t>Not implemented – No filter-based animations were added.</w:t>
+            </w:r>
+          </w:p>
+        </w:tc>
+      </w:tr>
+      <w:tr>
+        <w:tc>
+          <w:tcPr>
+            <w:tcW w:w="4508" w:type="dxa"/>
+          </w:tcPr>
+          <w:p>
+            <w:r>
+              <w:t>Include additional charts showing trends over time</w:t>
+            </w:r>
+          </w:p>
+        </w:tc>
+        <w:tc>
+          <w:tcPr>
+            <w:tcW w:w="4508" w:type="dxa"/>
+          </w:tcPr>
+          <w:p>
+            <w:r>
+              <w:t>Completed – Separate line charts show healthcare spending and life expectancy trends.</w:t>
+            </w:r>
+          </w:p>
+        </w:tc>
+      </w:tr>
+      <w:tr>
+        <w:tc>
+          <w:tcPr>
+            <w:tcW w:w="4508" w:type="dxa"/>
+          </w:tcPr>
+          <w:p>
+            <w:r>
+              <w:t>Support different screen sizes</w:t>
+            </w:r>
+          </w:p>
+        </w:tc>
+        <w:tc>
+          <w:tcPr>
+            <w:tcW w:w="4508" w:type="dxa"/>
+          </w:tcPr>
+          <w:p>
+            <w:r>
+              <w:t>Completed – The layout adapts to smaller screens, with horizontal scrolling for charts on mobile devices.</w:t>
+            </w:r>
+          </w:p>
+        </w:tc>
+      </w:tr>
+    </w:tbl>
+    <w:p>
+      <w:pPr>
+        <w:jc w:val="both"/>
         <w:rPr>
           <w:b/>
           <w:bCs/>
         </w:rPr>
       </w:pPr>
-      <w:r>
+    </w:p>
+    <w:p>
+      <w:pPr>
+        <w:jc w:val="both"/>
+      </w:pPr>
+      <w:r>
+        <w:t>The optional features were prioritised according to their usefulness and the available development time. Interactive tooltips and country highlighting were implemented to support comparison without adding complex filtering controls.</w:t>
+      </w:r>
+    </w:p>
+    <w:p>
+      <w:pPr>
+        <w:jc w:val="both"/>
         <w:rPr>
           <w:b/>
           <w:bCs/>
         </w:rPr>
+      </w:pPr>
+      <w:r>
+        <w:rPr>
+          <w:b/>
+          <w:bCs/>
+        </w:rPr>
         <w:br w:type="page"/>
       </w:r>
     </w:p>
     <w:p>
       <w:pPr>
+        <w:rPr>
+          <w:b/>
+          <w:bCs/>
+        </w:rPr>
+      </w:pPr>
+    </w:p>
+    <w:p>
+      <w:pPr>
         <w:pStyle w:val="Heading1"/>
       </w:pPr>
       <w:bookmarkStart w:id="13" w:name="_Toc239535721"/>
       <w:r>
-        <w:lastRenderedPageBreak/>
         <w:t>4. Visualisation Design</w:t>
       </w:r>
       <w:bookmarkEnd w:id="13"/>
@@ -3829,7 +4257,7 @@
 </file>
 
 <file path=word/endnotes.xml><?xml version="1.0" encoding="utf-8"?>
-<w:endnotes xmlns:wpc="http://schemas.microsoft.com/office/word/2010/wordprocessingCanvas" xmlns:cx="http://schemas.microsoft.com/office/drawing/2014/chartex" xmlns:cx1="http://schemas.microsoft.com/office/drawing/2015/9/8/chartex" xmlns:cx2="http://schemas.microsoft.com/office/drawing/2015/10/21/chartex" xmlns:cx3="http://schemas.microsoft.com/office/drawing/2016/5/9/chartex" xmlns:cx4="http://schemas.microsoft.com/office/drawing/2016/5/10/chartex" xmlns:cx5="http://schemas.microsoft.com/office/drawing/2016/5/11/chartex" xmlns:cx6="http://schemas.microsoft.com/office/drawing/2016/5/12/chartex" xmlns:cx7="http://schemas.microsoft.com/office/drawing/2016/5/13/chartex" xmlns:cx8="http://schemas.microsoft.com/office/drawing/2016/5/14/chartex" xmlns:mc="http://schemas.openxmlformats.org/markup-compatibility/2006" xmlns:m="http://schemas.openxmlformats.org/officeDocument/2006/math" xmlns:aink="http://schemas.microsoft.com/office/drawing/2016/ink" xmlns:am3d="http://schemas.microsoft.com/office/drawing/2017/model3d" xmlns:oel="http://schemas.microsoft.com/office/2019/extlst" xmlns:r="http://schemas.openxmlformats.org/officeDocument/2006/relationships" xmlns:wp14="http://schemas.microsoft.com/office/word/2010/wordprocessingDrawing" xmlns:wp="http://schemas.openxmlformats.org/drawingml/2006/wordprocessingDrawing" xmlns:wpg="http://schemas.microsoft.com/office/word/2010/wordprocessingGroup" xmlns:wpi="http://schemas.microsoft.com/office/word/2010/wordprocessingInk" xmlns:wps="http://schemas.microsoft.com/office/word/2010/wordprocessingShape" xmlns:o="urn:schemas-microsoft-com:office:office" xmlns:v="urn:schemas-microsoft-com:vml" xmlns:w10="urn:schemas-microsoft-com:office:word" xmlns:w="http://schemas.openxmlformats.org/wordprocessingml/2006/main" xmlns:w14="http://schemas.microsoft.com/office/word/2010/wordml" xmlns:w15="http://schemas.microsoft.com/office/word/2012/wordml" xmlns:w16cex="http://schemas.microsoft.com/office/word/2018/wordml/cex" xmlns:w16cid="http://schemas.microsoft.com/office/word/2016/wordml/cid" xmlns:w16="http://schemas.microsoft.com/office/word/2018/wordml" xmlns:w16sdtdh="http://schemas.microsoft.com/office/word/2020/wordml/sdtdatahash" xmlns:w16sdtfl="http://schemas.microsoft.com/office/word/2024/wordml/sdtformatlock" xmlns:w16se="http://schemas.microsoft.com/office/word/2015/wordml/symex" xmlns:w16du="http://schemas.microsoft.com/office/word/2023/wordml/word16du" xmlns:wne="http://schemas.microsoft.com/office/word/2006/wordml" mc:Ignorable="w14 w15 w16se w16cid w16 w16cex w16sdtdh w16sdtfl w16du wp14">
+<w:endnotes xmlns:wpc="http://schemas.microsoft.com/office/word/2010/wordprocessingCanvas" xmlns:cx="http://schemas.microsoft.com/office/drawing/2014/chartex" xmlns:cx1="http://schemas.microsoft.com/office/drawing/2015/9/8/chartex" xmlns:cx2="http://schemas.microsoft.com/office/drawing/2015/10/21/chartex" xmlns:cx3="http://schemas.microsoft.com/office/drawing/2016/5/9/chartex" xmlns:cx4="http://schemas.microsoft.com/office/drawing/2016/5/10/chartex" xmlns:cx5="http://schemas.microsoft.com/office/drawing/2016/5/11/chartex" xmlns:cx6="http://schemas.microsoft.com/office/drawing/2016/5/12/chartex" xmlns:cx7="http://schemas.microsoft.com/office/drawing/2016/5/13/chartex" xmlns:cx8="http://schemas.microsoft.com/office/drawing/2016/5/14/chartex" xmlns:mc="http://schemas.openxmlformats.org/markup-compatibility/2006" xmlns:aink="http://schemas.microsoft.com/office/drawing/2016/ink" xmlns:am3d="http://schemas.microsoft.com/office/drawing/2017/model3d" xmlns:o="urn:schemas-microsoft-com:office:office" xmlns:oel="http://schemas.microsoft.com/office/2019/extlst" xmlns:r="http://schemas.openxmlformats.org/officeDocument/2006/relationships" xmlns:m="http://schemas.openxmlformats.org/officeDocument/2006/math" xmlns:v="urn:schemas-microsoft-com:vml" xmlns:wp14="http://schemas.microsoft.com/office/word/2010/wordprocessingDrawing" xmlns:wp="http://schemas.openxmlformats.org/drawingml/2006/wordprocessingDrawing" xmlns:w10="urn:schemas-microsoft-com:office:word" xmlns:w="http://schemas.openxmlformats.org/wordprocessingml/2006/main" xmlns:w14="http://schemas.microsoft.com/office/word/2010/wordml" xmlns:w15="http://schemas.microsoft.com/office/word/2012/wordml" xmlns:w16cex="http://schemas.microsoft.com/office/word/2018/wordml/cex" xmlns:w16cid="http://schemas.microsoft.com/office/word/2016/wordml/cid" xmlns:w16="http://schemas.microsoft.com/office/word/2018/wordml" xmlns:w16du="http://schemas.microsoft.com/office/word/2023/wordml/word16du" xmlns:w16sdtdh="http://schemas.microsoft.com/office/word/2020/wordml/sdtdatahash" xmlns:w16sdtfl="http://schemas.microsoft.com/office/word/2024/wordml/sdtformatlock" xmlns:w16se="http://schemas.microsoft.com/office/word/2015/wordml/symex" xmlns:wpg="http://schemas.microsoft.com/office/word/2010/wordprocessingGroup" xmlns:wpi="http://schemas.microsoft.com/office/word/2010/wordprocessingInk" xmlns:wne="http://schemas.microsoft.com/office/word/2006/wordml" xmlns:wps="http://schemas.microsoft.com/office/word/2010/wordprocessingShape" mc:Ignorable="w14 w15 w16se w16cid w16 w16cex w16sdtdh w16sdtfl w16du wp14">
   <w:endnote w:type="separator" w:id="-1">
     <w:p>
       <w:pPr>
@@ -3854,7 +4282,7 @@
 </file>
 
 <file path=word/footnotes.xml><?xml version="1.0" encoding="utf-8"?>
-<w:footnotes xmlns:wpc="http://schemas.microsoft.com/office/word/2010/wordprocessingCanvas" xmlns:cx="http://schemas.microsoft.com/office/drawing/2014/chartex" xmlns:cx1="http://schemas.microsoft.com/office/drawing/2015/9/8/chartex" xmlns:cx2="http://schemas.microsoft.com/office/drawing/2015/10/21/chartex" xmlns:cx3="http://schemas.microsoft.com/office/drawing/2016/5/9/chartex" xmlns:cx4="http://schemas.microsoft.com/office/drawing/2016/5/10/chartex" xmlns:cx5="http://schemas.microsoft.com/office/drawing/2016/5/11/chartex" xmlns:cx6="http://schemas.microsoft.com/office/drawing/2016/5/12/chartex" xmlns:cx7="http://schemas.microsoft.com/office/drawing/2016/5/13/chartex" xmlns:cx8="http://schemas.microsoft.com/office/drawing/2016/5/14/chartex" xmlns:mc="http://schemas.openxmlformats.org/markup-compatibility/2006" xmlns:m="http://schemas.openxmlformats.org/officeDocument/2006/math" xmlns:aink="http://schemas.microsoft.com/office/drawing/2016/ink" xmlns:am3d="http://schemas.microsoft.com/office/drawing/2017/model3d" xmlns:oel="http://schemas.microsoft.com/office/2019/extlst" xmlns:r="http://schemas.openxmlformats.org/officeDocument/2006/relationships" xmlns:wp14="http://schemas.microsoft.com/office/word/2010/wordprocessingDrawing" xmlns:wp="http://schemas.openxmlformats.org/drawingml/2006/wordprocessingDrawing" xmlns:wpg="http://schemas.microsoft.com/office/word/2010/wordprocessingGroup" xmlns:wpi="http://schemas.microsoft.com/office/word/2010/wordprocessingInk" xmlns:wps="http://schemas.microsoft.com/office/word/2010/wordprocessingShape" xmlns:o="urn:schemas-microsoft-com:office:office" xmlns:v="urn:schemas-microsoft-com:vml" xmlns:w10="urn:schemas-microsoft-com:office:word" xmlns:w="http://schemas.openxmlformats.org/wordprocessingml/2006/main" xmlns:w14="http://schemas.microsoft.com/office/word/2010/wordml" xmlns:w15="http://schemas.microsoft.com/office/word/2012/wordml" xmlns:w16cex="http://schemas.microsoft.com/office/word/2018/wordml/cex" xmlns:w16cid="http://schemas.microsoft.com/office/word/2016/wordml/cid" xmlns:w16="http://schemas.microsoft.com/office/word/2018/wordml" xmlns:w16sdtdh="http://schemas.microsoft.com/office/word/2020/wordml/sdtdatahash" xmlns:w16sdtfl="http://schemas.microsoft.com/office/word/2024/wordml/sdtformatlock" xmlns:w16se="http://schemas.microsoft.com/office/word/2015/wordml/symex" xmlns:w16du="http://schemas.microsoft.com/office/word/2023/wordml/word16du" xmlns:wne="http://schemas.microsoft.com/office/word/2006/wordml" mc:Ignorable="w14 w15 w16se w16cid w16 w16cex w16sdtdh w16sdtfl w16du wp14">
+<w:footnotes xmlns:wpc="http://schemas.microsoft.com/office/word/2010/wordprocessingCanvas" xmlns:cx="http://schemas.microsoft.com/office/drawing/2014/chartex" xmlns:cx1="http://schemas.microsoft.com/office/drawing/2015/9/8/chartex" xmlns:cx2="http://schemas.microsoft.com/office/drawing/2015/10/21/chartex" xmlns:cx3="http://schemas.microsoft.com/office/drawing/2016/5/9/chartex" xmlns:cx4="http://schemas.microsoft.com/office/drawing/2016/5/10/chartex" xmlns:cx5="http://schemas.microsoft.com/office/drawing/2016/5/11/chartex" xmlns:cx6="http://schemas.microsoft.com/office/drawing/2016/5/12/chartex" xmlns:cx7="http://schemas.microsoft.com/office/drawing/2016/5/13/chartex" xmlns:cx8="http://schemas.microsoft.com/office/drawing/2016/5/14/chartex" xmlns:mc="http://schemas.openxmlformats.org/markup-compatibility/2006" xmlns:aink="http://schemas.microsoft.com/office/drawing/2016/ink" xmlns:am3d="http://schemas.microsoft.com/office/drawing/2017/model3d" xmlns:o="urn:schemas-microsoft-com:office:office" xmlns:oel="http://schemas.microsoft.com/office/2019/extlst" xmlns:r="http://schemas.openxmlformats.org/officeDocument/2006/relationships" xmlns:m="http://schemas.openxmlformats.org/officeDocument/2006/math" xmlns:v="urn:schemas-microsoft-com:vml" xmlns:wp14="http://schemas.microsoft.com/office/word/2010/wordprocessingDrawing" xmlns:wp="http://schemas.openxmlformats.org/drawingml/2006/wordprocessingDrawing" xmlns:w10="urn:schemas-microsoft-com:office:word" xmlns:w="http://schemas.openxmlformats.org/wordprocessingml/2006/main" xmlns:w14="http://schemas.microsoft.com/office/word/2010/wordml" xmlns:w15="http://schemas.microsoft.com/office/word/2012/wordml" xmlns:w16cex="http://schemas.microsoft.com/office/word/2018/wordml/cex" xmlns:w16cid="http://schemas.microsoft.com/office/word/2016/wordml/cid" xmlns:w16="http://schemas.microsoft.com/office/word/2018/wordml" xmlns:w16du="http://schemas.microsoft.com/office/word/2023/wordml/word16du" xmlns:w16sdtdh="http://schemas.microsoft.com/office/word/2020/wordml/sdtdatahash" xmlns:w16sdtfl="http://schemas.microsoft.com/office/word/2024/wordml/sdtformatlock" xmlns:w16se="http://schemas.microsoft.com/office/word/2015/wordml/symex" xmlns:wpg="http://schemas.microsoft.com/office/word/2010/wordprocessingGroup" xmlns:wpi="http://schemas.microsoft.com/office/word/2010/wordprocessingInk" xmlns:wne="http://schemas.microsoft.com/office/word/2006/wordml" xmlns:wps="http://schemas.microsoft.com/office/word/2010/wordprocessingShape" mc:Ignorable="w14 w15 w16se w16cid w16 w16cex w16sdtdh w16sdtfl w16du wp14">
   <w:footnote w:type="separator" w:id="-1">
     <w:p>
       <w:pPr>
@@ -3879,7 +4307,7 @@
 </file>
 
 <file path=word/header1.xml><?xml version="1.0" encoding="utf-8"?>
-<w:hdr xmlns:wpc="http://schemas.microsoft.com/office/word/2010/wordprocessingCanvas" xmlns:cx="http://schemas.microsoft.com/office/drawing/2014/chartex" xmlns:cx1="http://schemas.microsoft.com/office/drawing/2015/9/8/chartex" xmlns:cx2="http://schemas.microsoft.com/office/drawing/2015/10/21/chartex" xmlns:cx3="http://schemas.microsoft.com/office/drawing/2016/5/9/chartex" xmlns:cx4="http://schemas.microsoft.com/office/drawing/2016/5/10/chartex" xmlns:cx5="http://schemas.microsoft.com/office/drawing/2016/5/11/chartex" xmlns:cx6="http://schemas.microsoft.com/office/drawing/2016/5/12/chartex" xmlns:cx7="http://schemas.microsoft.com/office/drawing/2016/5/13/chartex" xmlns:cx8="http://schemas.microsoft.com/office/drawing/2016/5/14/chartex" xmlns:mc="http://schemas.openxmlformats.org/markup-compatibility/2006" xmlns:m="http://schemas.openxmlformats.org/officeDocument/2006/math" xmlns:aink="http://schemas.microsoft.com/office/drawing/2016/ink" xmlns:am3d="http://schemas.microsoft.com/office/drawing/2017/model3d" xmlns:oel="http://schemas.microsoft.com/office/2019/extlst" xmlns:r="http://schemas.openxmlformats.org/officeDocument/2006/relationships" xmlns:wp14="http://schemas.microsoft.com/office/word/2010/wordprocessingDrawing" xmlns:wp="http://schemas.openxmlformats.org/drawingml/2006/wordprocessingDrawing" xmlns:wpg="http://schemas.microsoft.com/office/word/2010/wordprocessingGroup" xmlns:wpi="http://schemas.microsoft.com/office/word/2010/wordprocessingInk" xmlns:wps="http://schemas.microsoft.com/office/word/2010/wordprocessingShape" xmlns:o="urn:schemas-microsoft-com:office:office" xmlns:v="urn:schemas-microsoft-com:vml" xmlns:w10="urn:schemas-microsoft-com:office:word" xmlns:w="http://schemas.openxmlformats.org/wordprocessingml/2006/main" xmlns:w14="http://schemas.microsoft.com/office/word/2010/wordml" xmlns:w15="http://schemas.microsoft.com/office/word/2012/wordml" xmlns:w16cex="http://schemas.microsoft.com/office/word/2018/wordml/cex" xmlns:w16cid="http://schemas.microsoft.com/office/word/2016/wordml/cid" xmlns:w16="http://schemas.microsoft.com/office/word/2018/wordml" xmlns:w16sdtdh="http://schemas.microsoft.com/office/word/2020/wordml/sdtdatahash" xmlns:w16sdtfl="http://schemas.microsoft.com/office/word/2024/wordml/sdtformatlock" xmlns:w16se="http://schemas.microsoft.com/office/word/2015/wordml/symex" xmlns:w16du="http://schemas.microsoft.com/office/word/2023/wordml/word16du" xmlns:wne="http://schemas.microsoft.com/office/word/2006/wordml" mc:Ignorable="w14 w15 w16se w16cid w16 w16cex w16sdtdh w16sdtfl w16du wp14">
+<w:hdr xmlns:wpc="http://schemas.microsoft.com/office/word/2010/wordprocessingCanvas" xmlns:cx="http://schemas.microsoft.com/office/drawing/2014/chartex" xmlns:cx1="http://schemas.microsoft.com/office/drawing/2015/9/8/chartex" xmlns:cx2="http://schemas.microsoft.com/office/drawing/2015/10/21/chartex" xmlns:cx3="http://schemas.microsoft.com/office/drawing/2016/5/9/chartex" xmlns:cx4="http://schemas.microsoft.com/office/drawing/2016/5/10/chartex" xmlns:cx5="http://schemas.microsoft.com/office/drawing/2016/5/11/chartex" xmlns:cx6="http://schemas.microsoft.com/office/drawing/2016/5/12/chartex" xmlns:cx7="http://schemas.microsoft.com/office/drawing/2016/5/13/chartex" xmlns:cx8="http://schemas.microsoft.com/office/drawing/2016/5/14/chartex" xmlns:mc="http://schemas.openxmlformats.org/markup-compatibility/2006" xmlns:aink="http://schemas.microsoft.com/office/drawing/2016/ink" xmlns:am3d="http://schemas.microsoft.com/office/drawing/2017/model3d" xmlns:o="urn:schemas-microsoft-com:office:office" xmlns:oel="http://schemas.microsoft.com/office/2019/extlst" xmlns:r="http://schemas.openxmlformats.org/officeDocument/2006/relationships" xmlns:m="http://schemas.openxmlformats.org/officeDocument/2006/math" xmlns:v="urn:schemas-microsoft-com:vml" xmlns:wp14="http://schemas.microsoft.com/office/word/2010/wordprocessingDrawing" xmlns:wp="http://schemas.openxmlformats.org/drawingml/2006/wordprocessingDrawing" xmlns:w10="urn:schemas-microsoft-com:office:word" xmlns:w="http://schemas.openxmlformats.org/wordprocessingml/2006/main" xmlns:w14="http://schemas.microsoft.com/office/word/2010/wordml" xmlns:w15="http://schemas.microsoft.com/office/word/2012/wordml" xmlns:w16cex="http://schemas.microsoft.com/office/word/2018/wordml/cex" xmlns:w16cid="http://schemas.microsoft.com/office/word/2016/wordml/cid" xmlns:w16="http://schemas.microsoft.com/office/word/2018/wordml" xmlns:w16du="http://schemas.microsoft.com/office/word/2023/wordml/word16du" xmlns:w16sdtdh="http://schemas.microsoft.com/office/word/2020/wordml/sdtdatahash" xmlns:w16sdtfl="http://schemas.microsoft.com/office/word/2024/wordml/sdtformatlock" xmlns:w16se="http://schemas.microsoft.com/office/word/2015/wordml/symex" xmlns:wpg="http://schemas.microsoft.com/office/word/2010/wordprocessingGroup" xmlns:wpi="http://schemas.microsoft.com/office/word/2010/wordprocessingInk" xmlns:wne="http://schemas.microsoft.com/office/word/2006/wordml" xmlns:wps="http://schemas.microsoft.com/office/word/2010/wordprocessingShape" mc:Ignorable="w14 w15 w16se w16cid w16 w16cex w16sdtdh w16sdtfl w16du wp14">
   <w:p>
     <w:pPr>
       <w:pStyle w:val="Header"/>
@@ -3902,7 +4330,7 @@
 </file>
 
 <file path=word/numbering.xml><?xml version="1.0" encoding="utf-8"?>
-<w:numbering xmlns:wpc="http://schemas.microsoft.com/office/word/2010/wordprocessingCanvas" xmlns:cx="http://schemas.microsoft.com/office/drawing/2014/chartex" xmlns:cx1="http://schemas.microsoft.com/office/drawing/2015/9/8/chartex" xmlns:cx2="http://schemas.microsoft.com/office/drawing/2015/10/21/chartex" xmlns:cx3="http://schemas.microsoft.com/office/drawing/2016/5/9/chartex" xmlns:cx4="http://schemas.microsoft.com/office/drawing/2016/5/10/chartex" xmlns:cx5="http://schemas.microsoft.com/office/drawing/2016/5/11/chartex" xmlns:cx6="http://schemas.microsoft.com/office/drawing/2016/5/12/chartex" xmlns:cx7="http://schemas.microsoft.com/office/drawing/2016/5/13/chartex" xmlns:cx8="http://schemas.microsoft.com/office/drawing/2016/5/14/chartex" xmlns:mc="http://schemas.openxmlformats.org/markup-compatibility/2006" xmlns:m="http://schemas.openxmlformats.org/officeDocument/2006/math" xmlns:aink="http://schemas.microsoft.com/office/drawing/2016/ink" xmlns:am3d="http://schemas.microsoft.com/office/drawing/2017/model3d" xmlns:oel="http://schemas.microsoft.com/office/2019/extlst" xmlns:r="http://schemas.openxmlformats.org/officeDocument/2006/relationships" xmlns:wp14="http://schemas.microsoft.com/office/word/2010/wordprocessingDrawing" xmlns:wp="http://schemas.openxmlformats.org/drawingml/2006/wordprocessingDrawing" xmlns:wpg="http://schemas.microsoft.com/office/word/2010/wordprocessingGroup" xmlns:wpi="http://schemas.microsoft.com/office/word/2010/wordprocessingInk" xmlns:wps="http://schemas.microsoft.com/office/word/2010/wordprocessingShape" xmlns:o="urn:schemas-microsoft-com:office:office" xmlns:v="urn:schemas-microsoft-com:vml" xmlns:w10="urn:schemas-microsoft-com:office:word" xmlns:w="http://schemas.openxmlformats.org/wordprocessingml/2006/main" xmlns:w14="http://schemas.microsoft.com/office/word/2010/wordml" xmlns:w15="http://schemas.microsoft.com/office/word/2012/wordml" xmlns:w16cex="http://schemas.microsoft.com/office/word/2018/wordml/cex" xmlns:w16cid="http://schemas.microsoft.com/office/word/2016/wordml/cid" xmlns:w16="http://schemas.microsoft.com/office/word/2018/wordml" xmlns:w16sdtdh="http://schemas.microsoft.com/office/word/2020/wordml/sdtdatahash" xmlns:w16sdtfl="http://schemas.microsoft.com/office/word/2024/wordml/sdtformatlock" xmlns:w16se="http://schemas.microsoft.com/office/word/2015/wordml/symex" xmlns:w16du="http://schemas.microsoft.com/office/word/2023/wordml/word16du" xmlns:wne="http://schemas.microsoft.com/office/word/2006/wordml" mc:Ignorable="w14 w15 w16se w16cid w16 w16cex w16sdtdh w16sdtfl w16du wp14">
+<w:numbering xmlns:wpc="http://schemas.microsoft.com/office/word/2010/wordprocessingCanvas" xmlns:cx="http://schemas.microsoft.com/office/drawing/2014/chartex" xmlns:cx1="http://schemas.microsoft.com/office/drawing/2015/9/8/chartex" xmlns:cx2="http://schemas.microsoft.com/office/drawing/2015/10/21/chartex" xmlns:cx3="http://schemas.microsoft.com/office/drawing/2016/5/9/chartex" xmlns:cx4="http://schemas.microsoft.com/office/drawing/2016/5/10/chartex" xmlns:cx5="http://schemas.microsoft.com/office/drawing/2016/5/11/chartex" xmlns:cx6="http://schemas.microsoft.com/office/drawing/2016/5/12/chartex" xmlns:cx7="http://schemas.microsoft.com/office/drawing/2016/5/13/chartex" xmlns:cx8="http://schemas.microsoft.com/office/drawing/2016/5/14/chartex" xmlns:mc="http://schemas.openxmlformats.org/markup-compatibility/2006" xmlns:aink="http://schemas.microsoft.com/office/drawing/2016/ink" xmlns:am3d="http://schemas.microsoft.com/office/drawing/2017/model3d" xmlns:o="urn:schemas-microsoft-com:office:office" xmlns:oel="http://schemas.microsoft.com/office/2019/extlst" xmlns:r="http://schemas.openxmlformats.org/officeDocument/2006/relationships" xmlns:m="http://schemas.openxmlformats.org/officeDocument/2006/math" xmlns:v="urn:schemas-microsoft-com:vml" xmlns:wp14="http://schemas.microsoft.com/office/word/2010/wordprocessingDrawing" xmlns:wp="http://schemas.openxmlformats.org/drawingml/2006/wordprocessingDrawing" xmlns:w10="urn:schemas-microsoft-com:office:word" xmlns:w="http://schemas.openxmlformats.org/wordprocessingml/2006/main" xmlns:w14="http://schemas.microsoft.com/office/word/2010/wordml" xmlns:w15="http://schemas.microsoft.com/office/word/2012/wordml" xmlns:w16cex="http://schemas.microsoft.com/office/word/2018/wordml/cex" xmlns:w16cid="http://schemas.microsoft.com/office/word/2016/wordml/cid" xmlns:w16="http://schemas.microsoft.com/office/word/2018/wordml" xmlns:w16du="http://schemas.microsoft.com/office/word/2023/wordml/word16du" xmlns:w16sdtdh="http://schemas.microsoft.com/office/word/2020/wordml/sdtdatahash" xmlns:w16sdtfl="http://schemas.microsoft.com/office/word/2024/wordml/sdtformatlock" xmlns:w16se="http://schemas.microsoft.com/office/word/2015/wordml/symex" xmlns:wpg="http://schemas.microsoft.com/office/word/2010/wordprocessingGroup" xmlns:wpi="http://schemas.microsoft.com/office/word/2010/wordprocessingInk" xmlns:wne="http://schemas.microsoft.com/office/word/2006/wordml" xmlns:wps="http://schemas.microsoft.com/office/word/2010/wordprocessingShape" mc:Ignorable="w14 w15 w16se w16cid w16 w16cex w16sdtdh w16sdtfl w16du wp14">
   <w:abstractNum w:abstractNumId="0" w15:restartNumberingAfterBreak="0">
     <w:nsid w:val="021F1635"/>
     <w:multiLevelType w:val="hybridMultilevel"/>
@@ -5656,6 +6084,119 @@
     </w:lvl>
   </w:abstractNum>
   <w:abstractNum w:abstractNumId="15" w15:restartNumberingAfterBreak="0">
+    <w:nsid w:val="64084BC9"/>
+    <w:multiLevelType w:val="hybridMultilevel"/>
+    <w:tmpl w:val="593CE5C8"/>
+    <w:lvl w:ilvl="0" w:tplc="0C090001">
+      <w:start w:val="1"/>
+      <w:numFmt w:val="bullet"/>
+      <w:lvlText w:val=""/>
+      <w:lvlJc w:val="left"/>
+      <w:pPr>
+        <w:ind w:left="720" w:hanging="360"/>
+      </w:pPr>
+      <w:rPr>
+        <w:rFonts w:ascii="Symbol" w:hAnsi="Symbol" w:hint="default"/>
+      </w:rPr>
+    </w:lvl>
+    <w:lvl w:ilvl="1" w:tplc="0C090003" w:tentative="1">
+      <w:start w:val="1"/>
+      <w:numFmt w:val="bullet"/>
+      <w:lvlText w:val="o"/>
+      <w:lvlJc w:val="left"/>
+      <w:pPr>
+        <w:ind w:left="1440" w:hanging="360"/>
+      </w:pPr>
+      <w:rPr>
+        <w:rFonts w:ascii="Courier New" w:hAnsi="Courier New" w:cs="Courier New" w:hint="default"/>
+      </w:rPr>
+    </w:lvl>
+    <w:lvl w:ilvl="2" w:tplc="0C090005" w:tentative="1">
+      <w:start w:val="1"/>
+      <w:numFmt w:val="bullet"/>
+      <w:lvlText w:val=""/>
+      <w:lvlJc w:val="left"/>
+      <w:pPr>
+        <w:ind w:left="2160" w:hanging="360"/>
+      </w:pPr>
+      <w:rPr>
+        <w:rFonts w:ascii="Wingdings" w:hAnsi="Wingdings" w:hint="default"/>
+      </w:rPr>
+    </w:lvl>
+    <w:lvl w:ilvl="3" w:tplc="0C090001" w:tentative="1">
+      <w:start w:val="1"/>
+      <w:numFmt w:val="bullet"/>
+      <w:lvlText w:val=""/>
+      <w:lvlJc w:val="left"/>
+      <w:pPr>
+        <w:ind w:left="2880" w:hanging="360"/>
+      </w:pPr>
+      <w:rPr>
+        <w:rFonts w:ascii="Symbol" w:hAnsi="Symbol" w:hint="default"/>
+      </w:rPr>
+    </w:lvl>
+    <w:lvl w:ilvl="4" w:tplc="0C090003" w:tentative="1">
+      <w:start w:val="1"/>
+      <w:numFmt w:val="bullet"/>
+      <w:lvlText w:val="o"/>
+      <w:lvlJc w:val="left"/>
+      <w:pPr>
+        <w:ind w:left="3600" w:hanging="360"/>
+      </w:pPr>
+      <w:rPr>
+        <w:rFonts w:ascii="Courier New" w:hAnsi="Courier New" w:cs="Courier New" w:hint="default"/>
+      </w:rPr>
+    </w:lvl>
+    <w:lvl w:ilvl="5" w:tplc="0C090005" w:tentative="1">
+      <w:start w:val="1"/>
+      <w:numFmt w:val="bullet"/>
+      <w:lvlText w:val=""/>
+      <w:lvlJc w:val="left"/>
+      <w:pPr>
+        <w:ind w:left="4320" w:hanging="360"/>
+      </w:pPr>
+      <w:rPr>
+        <w:rFonts w:ascii="Wingdings" w:hAnsi="Wingdings" w:hint="default"/>
+      </w:rPr>
+    </w:lvl>
+    <w:lvl w:ilvl="6" w:tplc="0C090001" w:tentative="1">
+      <w:start w:val="1"/>
+      <w:numFmt w:val="bullet"/>
+      <w:lvlText w:val=""/>
+      <w:lvlJc w:val="left"/>
+      <w:pPr>
+        <w:ind w:left="5040" w:hanging="360"/>
+      </w:pPr>
+      <w:rPr>
+        <w:rFonts w:ascii="Symbol" w:hAnsi="Symbol" w:hint="default"/>
+      </w:rPr>
+    </w:lvl>
+    <w:lvl w:ilvl="7" w:tplc="0C090003" w:tentative="1">
+      <w:start w:val="1"/>
+      <w:numFmt w:val="bullet"/>
+      <w:lvlText w:val="o"/>
+      <w:lvlJc w:val="left"/>
+      <w:pPr>
+        <w:ind w:left="5760" w:hanging="360"/>
+      </w:pPr>
+      <w:rPr>
+        <w:rFonts w:ascii="Courier New" w:hAnsi="Courier New" w:cs="Courier New" w:hint="default"/>
+      </w:rPr>
+    </w:lvl>
+    <w:lvl w:ilvl="8" w:tplc="0C090005" w:tentative="1">
+      <w:start w:val="1"/>
+      <w:numFmt w:val="bullet"/>
+      <w:lvlText w:val=""/>
+      <w:lvlJc w:val="left"/>
+      <w:pPr>
+        <w:ind w:left="6480" w:hanging="360"/>
+      </w:pPr>
+      <w:rPr>
+        <w:rFonts w:ascii="Wingdings" w:hAnsi="Wingdings" w:hint="default"/>
+      </w:rPr>
+    </w:lvl>
+  </w:abstractNum>
+  <w:abstractNum w:abstractNumId="16" w15:restartNumberingAfterBreak="0">
     <w:nsid w:val="64E20DBE"/>
     <w:multiLevelType w:val="hybridMultilevel"/>
     <w:tmpl w:val="E2B83AFE"/>
@@ -5768,7 +6309,7 @@
       </w:rPr>
     </w:lvl>
   </w:abstractNum>
-  <w:abstractNum w:abstractNumId="16" w15:restartNumberingAfterBreak="0">
+  <w:abstractNum w:abstractNumId="17" w15:restartNumberingAfterBreak="0">
     <w:nsid w:val="656A5517"/>
     <w:multiLevelType w:val="hybridMultilevel"/>
     <w:tmpl w:val="4A64655C"/>
@@ -5881,7 +6422,7 @@
       </w:rPr>
     </w:lvl>
   </w:abstractNum>
-  <w:abstractNum w:abstractNumId="17" w15:restartNumberingAfterBreak="0">
+  <w:abstractNum w:abstractNumId="18" w15:restartNumberingAfterBreak="0">
     <w:nsid w:val="712F6703"/>
     <w:multiLevelType w:val="hybridMultilevel"/>
     <w:tmpl w:val="D41E36E2"/>
@@ -5971,7 +6512,7 @@
       </w:pPr>
     </w:lvl>
   </w:abstractNum>
-  <w:abstractNum w:abstractNumId="18" w15:restartNumberingAfterBreak="0">
+  <w:abstractNum w:abstractNumId="19" w15:restartNumberingAfterBreak="0">
     <w:nsid w:val="72575468"/>
     <w:multiLevelType w:val="hybridMultilevel"/>
     <w:tmpl w:val="E30E1D48"/>
@@ -6115,13 +6656,13 @@
     <w:abstractNumId w:val="10"/>
   </w:num>
   <w:num w:numId="11" w16cid:durableId="834565320">
-    <w:abstractNumId w:val="15"/>
+    <w:abstractNumId w:val="16"/>
   </w:num>
   <w:num w:numId="12" w16cid:durableId="752698583">
     <w:abstractNumId w:val="8"/>
   </w:num>
   <w:num w:numId="13" w16cid:durableId="686908962">
-    <w:abstractNumId w:val="16"/>
+    <w:abstractNumId w:val="17"/>
   </w:num>
   <w:num w:numId="14" w16cid:durableId="358966890">
     <w:abstractNumId w:val="9"/>
@@ -6133,19 +6674,22 @@
     <w:abstractNumId w:val="6"/>
   </w:num>
   <w:num w:numId="17" w16cid:durableId="2003701343">
-    <w:abstractNumId w:val="18"/>
+    <w:abstractNumId w:val="19"/>
   </w:num>
   <w:num w:numId="18" w16cid:durableId="1808934357">
     <w:abstractNumId w:val="4"/>
   </w:num>
   <w:num w:numId="19" w16cid:durableId="2079935832">
-    <w:abstractNumId w:val="17"/>
+    <w:abstractNumId w:val="18"/>
+  </w:num>
+  <w:num w:numId="20" w16cid:durableId="68117886">
+    <w:abstractNumId w:val="15"/>
   </w:num>
 </w:numbering>
 </file>
 
 <file path=word/styles.xml><?xml version="1.0" encoding="utf-8"?>
-<w:styles xmlns:mc="http://schemas.openxmlformats.org/markup-compatibility/2006" xmlns:r="http://schemas.openxmlformats.org/officeDocument/2006/relationships" xmlns:w="http://schemas.openxmlformats.org/wordprocessingml/2006/main" xmlns:w14="http://schemas.microsoft.com/office/word/2010/wordml" xmlns:w15="http://schemas.microsoft.com/office/word/2012/wordml" xmlns:w16cex="http://schemas.microsoft.com/office/word/2018/wordml/cex" xmlns:w16cid="http://schemas.microsoft.com/office/word/2016/wordml/cid" xmlns:w16="http://schemas.microsoft.com/office/word/2018/wordml" xmlns:w16sdtdh="http://schemas.microsoft.com/office/word/2020/wordml/sdtdatahash" xmlns:w16sdtfl="http://schemas.microsoft.com/office/word/2024/wordml/sdtformatlock" xmlns:w16se="http://schemas.microsoft.com/office/word/2015/wordml/symex" xmlns:w16du="http://schemas.microsoft.com/office/word/2023/wordml/word16du" mc:Ignorable="w14 w15 w16se w16cid w16 w16cex w16sdtdh w16sdtfl w16du">
+<w:styles xmlns:mc="http://schemas.openxmlformats.org/markup-compatibility/2006" xmlns:r="http://schemas.openxmlformats.org/officeDocument/2006/relationships" xmlns:w="http://schemas.openxmlformats.org/wordprocessingml/2006/main" xmlns:w14="http://schemas.microsoft.com/office/word/2010/wordml" xmlns:w15="http://schemas.microsoft.com/office/word/2012/wordml" xmlns:w16cex="http://schemas.microsoft.com/office/word/2018/wordml/cex" xmlns:w16cid="http://schemas.microsoft.com/office/word/2016/wordml/cid" xmlns:w16="http://schemas.microsoft.com/office/word/2018/wordml" xmlns:w16du="http://schemas.microsoft.com/office/word/2023/wordml/word16du" xmlns:w16sdtdh="http://schemas.microsoft.com/office/word/2020/wordml/sdtdatahash" xmlns:w16sdtfl="http://schemas.microsoft.com/office/word/2024/wordml/sdtformatlock" xmlns:w16se="http://schemas.microsoft.com/office/word/2015/wordml/symex" mc:Ignorable="w14 w15 w16se w16cid w16 w16cex w16sdtdh w16sdtfl w16du">
   <w:docDefaults>
     <w:rPrDefault>
       <w:rPr>
@@ -6744,7 +7288,6 @@
   <w:style w:type="character" w:default="1" w:styleId="DefaultParagraphFont">
     <w:name w:val="Default Paragraph Font"/>
     <w:uiPriority w:val="1"/>
-    <w:semiHidden/>
     <w:unhideWhenUsed/>
   </w:style>
   <w:style w:type="table" w:default="1" w:styleId="TableNormal">

</xml_diff>

<commit_message>
updates to the process book - outlined the validation (user testing)
</commit_message>
<xml_diff>
--- a/Assignment 3B_Project process book/Assignment 3B - Project process book.docx
+++ b/Assignment 3B_Project process book/Assignment 3B - Project process book.docx
@@ -1,6 +1,6 @@
 
 <file path=word/document.xml><?xml version="1.0" encoding="utf-8"?>
-<w:document xmlns:wpc="http://schemas.microsoft.com/office/word/2010/wordprocessingCanvas" xmlns:cx="http://schemas.microsoft.com/office/drawing/2014/chartex" xmlns:cx1="http://schemas.microsoft.com/office/drawing/2015/9/8/chartex" xmlns:cx2="http://schemas.microsoft.com/office/drawing/2015/10/21/chartex" xmlns:cx3="http://schemas.microsoft.com/office/drawing/2016/5/9/chartex" xmlns:cx4="http://schemas.microsoft.com/office/drawing/2016/5/10/chartex" xmlns:cx5="http://schemas.microsoft.com/office/drawing/2016/5/11/chartex" xmlns:cx6="http://schemas.microsoft.com/office/drawing/2016/5/12/chartex" xmlns:cx7="http://schemas.microsoft.com/office/drawing/2016/5/13/chartex" xmlns:cx8="http://schemas.microsoft.com/office/drawing/2016/5/14/chartex" xmlns:mc="http://schemas.openxmlformats.org/markup-compatibility/2006" xmlns:aink="http://schemas.microsoft.com/office/drawing/2016/ink" xmlns:am3d="http://schemas.microsoft.com/office/drawing/2017/model3d" xmlns:o="urn:schemas-microsoft-com:office:office" xmlns:oel="http://schemas.microsoft.com/office/2019/extlst" xmlns:r="http://schemas.openxmlformats.org/officeDocument/2006/relationships" xmlns:m="http://schemas.openxmlformats.org/officeDocument/2006/math" xmlns:v="urn:schemas-microsoft-com:vml" xmlns:wp14="http://schemas.microsoft.com/office/word/2010/wordprocessingDrawing" xmlns:wp="http://schemas.openxmlformats.org/drawingml/2006/wordprocessingDrawing" xmlns:w10="urn:schemas-microsoft-com:office:word" xmlns:w="http://schemas.openxmlformats.org/wordprocessingml/2006/main" xmlns:w14="http://schemas.microsoft.com/office/word/2010/wordml" xmlns:w15="http://schemas.microsoft.com/office/word/2012/wordml" xmlns:w16cex="http://schemas.microsoft.com/office/word/2018/wordml/cex" xmlns:w16cid="http://schemas.microsoft.com/office/word/2016/wordml/cid" xmlns:w16="http://schemas.microsoft.com/office/word/2018/wordml" xmlns:w16du="http://schemas.microsoft.com/office/word/2023/wordml/word16du" xmlns:w16sdtdh="http://schemas.microsoft.com/office/word/2020/wordml/sdtdatahash" xmlns:w16sdtfl="http://schemas.microsoft.com/office/word/2024/wordml/sdtformatlock" xmlns:w16se="http://schemas.microsoft.com/office/word/2015/wordml/symex" xmlns:wpg="http://schemas.microsoft.com/office/word/2010/wordprocessingGroup" xmlns:wpi="http://schemas.microsoft.com/office/word/2010/wordprocessingInk" xmlns:wne="http://schemas.microsoft.com/office/word/2006/wordml" xmlns:wps="http://schemas.microsoft.com/office/word/2010/wordprocessingShape" mc:Ignorable="w14 w15 w16se w16cid w16 w16cex w16sdtdh w16sdtfl w16du wp14">
+<w:document xmlns:wpc="http://schemas.microsoft.com/office/word/2010/wordprocessingCanvas" xmlns:cx="http://schemas.microsoft.com/office/drawing/2014/chartex" xmlns:cx1="http://schemas.microsoft.com/office/drawing/2015/9/8/chartex" xmlns:cx2="http://schemas.microsoft.com/office/drawing/2015/10/21/chartex" xmlns:cx3="http://schemas.microsoft.com/office/drawing/2016/5/9/chartex" xmlns:cx4="http://schemas.microsoft.com/office/drawing/2016/5/10/chartex" xmlns:cx5="http://schemas.microsoft.com/office/drawing/2016/5/11/chartex" xmlns:cx6="http://schemas.microsoft.com/office/drawing/2016/5/12/chartex" xmlns:cx7="http://schemas.microsoft.com/office/drawing/2016/5/13/chartex" xmlns:cx8="http://schemas.microsoft.com/office/drawing/2016/5/14/chartex" xmlns:mc="http://schemas.openxmlformats.org/markup-compatibility/2006" xmlns:m="http://schemas.openxmlformats.org/officeDocument/2006/math" xmlns:aink="http://schemas.microsoft.com/office/drawing/2016/ink" xmlns:am3d="http://schemas.microsoft.com/office/drawing/2017/model3d" xmlns:oel="http://schemas.microsoft.com/office/2019/extlst" xmlns:r="http://schemas.openxmlformats.org/officeDocument/2006/relationships" xmlns:wp14="http://schemas.microsoft.com/office/word/2010/wordprocessingDrawing" xmlns:wp="http://schemas.openxmlformats.org/drawingml/2006/wordprocessingDrawing" xmlns:wpg="http://schemas.microsoft.com/office/word/2010/wordprocessingGroup" xmlns:wpi="http://schemas.microsoft.com/office/word/2010/wordprocessingInk" xmlns:wps="http://schemas.microsoft.com/office/word/2010/wordprocessingShape" xmlns:o="urn:schemas-microsoft-com:office:office" xmlns:v="urn:schemas-microsoft-com:vml" xmlns:w10="urn:schemas-microsoft-com:office:word" xmlns:w="http://schemas.openxmlformats.org/wordprocessingml/2006/main" xmlns:w14="http://schemas.microsoft.com/office/word/2010/wordml" xmlns:w15="http://schemas.microsoft.com/office/word/2012/wordml" xmlns:w16cex="http://schemas.microsoft.com/office/word/2018/wordml/cex" xmlns:w16cid="http://schemas.microsoft.com/office/word/2016/wordml/cid" xmlns:w16="http://schemas.microsoft.com/office/word/2018/wordml" xmlns:w16sdtdh="http://schemas.microsoft.com/office/word/2020/wordml/sdtdatahash" xmlns:w16sdtfl="http://schemas.microsoft.com/office/word/2024/wordml/sdtformatlock" xmlns:w16se="http://schemas.microsoft.com/office/word/2015/wordml/symex" xmlns:w16du="http://schemas.microsoft.com/office/word/2023/wordml/word16du" xmlns:wne="http://schemas.microsoft.com/office/word/2006/wordml" mc:Ignorable="w14 w15 w16se w16cid w16 w16cex w16sdtdh w16sdtfl w16du wp14">
   <w:body>
     <w:p>
       <w:pPr>
@@ -2979,7 +2979,7 @@
         <w:tblLook w:val="04A0" w:firstRow="1" w:lastRow="0" w:firstColumn="1" w:lastColumn="0" w:noHBand="0" w:noVBand="1"/>
       </w:tblPr>
       <w:tblGrid>
-        <w:gridCol w:w="4370"/>
+        <w:gridCol w:w="4360"/>
       </w:tblGrid>
       <w:tr>
         <w:tc>
@@ -2995,51 +2995,6 @@
                 <w:szCs w:val="28"/>
               </w:rPr>
             </w:pPr>
-            <w:r>
-              <w:rPr>
-                <w:b/>
-                <w:bCs/>
-                <w:noProof/>
-                <w:sz w:val="28"/>
-                <w:szCs w:val="28"/>
-              </w:rPr>
-              <w:lastRenderedPageBreak/>
-              <w:drawing>
-                <wp:inline distT="0" distB="0" distL="0" distR="0" wp14:anchorId="1D776851" wp14:editId="08E9B0BD">
-                  <wp:extent cx="3048000" cy="2703443"/>
-                  <wp:effectExtent l="0" t="0" r="3810" b="1905"/>
-                  <wp:docPr id="1377836744" name="Picture 1"/>
-                  <wp:cNvGraphicFramePr>
-                    <a:graphicFrameLocks xmlns:a="http://schemas.openxmlformats.org/drawingml/2006/main" noChangeAspect="1"/>
-                  </wp:cNvGraphicFramePr>
-                  <a:graphic xmlns:a="http://schemas.openxmlformats.org/drawingml/2006/main">
-                    <a:graphicData uri="http://schemas.openxmlformats.org/drawingml/2006/picture">
-                      <pic:pic xmlns:pic="http://schemas.openxmlformats.org/drawingml/2006/picture">
-                        <pic:nvPicPr>
-                          <pic:cNvPr id="1377836744" name=""/>
-                          <pic:cNvPicPr/>
-                        </pic:nvPicPr>
-                        <pic:blipFill>
-                          <a:blip r:embed="rId10"/>
-                          <a:stretch>
-                            <a:fillRect/>
-                          </a:stretch>
-                        </pic:blipFill>
-                        <pic:spPr>
-                          <a:xfrm>
-                            <a:off x="0" y="0"/>
-                            <a:ext cx="3048000" cy="2703443"/>
-                          </a:xfrm>
-                          <a:prstGeom prst="rect">
-                            <a:avLst/>
-                          </a:prstGeom>
-                        </pic:spPr>
-                      </pic:pic>
-                    </a:graphicData>
-                  </a:graphic>
-                </wp:inline>
-              </w:drawing>
-            </w:r>
           </w:p>
         </w:tc>
       </w:tr>
@@ -3060,123 +3015,6 @@
           <w:docGrid w:linePitch="360"/>
         </w:sectPr>
       </w:pPr>
-      <w:r>
-        <w:rPr>
-          <w:b/>
-          <w:bCs/>
-          <w:sz w:val="32"/>
-          <w:szCs w:val="32"/>
-        </w:rPr>
-        <w:t xml:space="preserve"> </w:t>
-      </w:r>
-      <w:r>
-        <w:rPr>
-          <w:b/>
-          <w:bCs/>
-          <w:noProof/>
-          <w:sz w:val="28"/>
-          <w:szCs w:val="28"/>
-        </w:rPr>
-        <w:drawing>
-          <wp:inline distT="0" distB="0" distL="0" distR="0" wp14:anchorId="67A21158" wp14:editId="14239D5D">
-            <wp:extent cx="2774745" cy="2353540"/>
-            <wp:effectExtent l="0" t="0" r="6985" b="8890"/>
-            <wp:docPr id="177818327" name="Picture 1"/>
-            <wp:cNvGraphicFramePr>
-              <a:graphicFrameLocks xmlns:a="http://schemas.openxmlformats.org/drawingml/2006/main" noChangeAspect="1"/>
-            </wp:cNvGraphicFramePr>
-            <a:graphic xmlns:a="http://schemas.openxmlformats.org/drawingml/2006/main">
-              <a:graphicData uri="http://schemas.openxmlformats.org/drawingml/2006/picture">
-                <pic:pic xmlns:pic="http://schemas.openxmlformats.org/drawingml/2006/picture">
-                  <pic:nvPicPr>
-                    <pic:cNvPr id="177818327" name=""/>
-                    <pic:cNvPicPr/>
-                  </pic:nvPicPr>
-                  <pic:blipFill>
-                    <a:blip r:embed="rId11"/>
-                    <a:stretch>
-                      <a:fillRect/>
-                    </a:stretch>
-                  </pic:blipFill>
-                  <pic:spPr>
-                    <a:xfrm>
-                      <a:off x="0" y="0"/>
-                      <a:ext cx="2793743" cy="2369654"/>
-                    </a:xfrm>
-                    <a:prstGeom prst="rect">
-                      <a:avLst/>
-                    </a:prstGeom>
-                  </pic:spPr>
-                </pic:pic>
-              </a:graphicData>
-            </a:graphic>
-          </wp:inline>
-        </w:drawing>
-      </w:r>
-    </w:p>
-    <w:p>
-      <w:pPr>
-        <w:rPr>
-          <w:b/>
-          <w:bCs/>
-          <w:sz w:val="28"/>
-          <w:szCs w:val="28"/>
-        </w:rPr>
-      </w:pPr>
-    </w:p>
-    <w:p>
-      <w:pPr>
-        <w:rPr>
-          <w:b/>
-          <w:bCs/>
-          <w:sz w:val="28"/>
-          <w:szCs w:val="28"/>
-        </w:rPr>
-      </w:pPr>
-      <w:r>
-        <w:rPr>
-          <w:b/>
-          <w:bCs/>
-          <w:noProof/>
-          <w:sz w:val="28"/>
-          <w:szCs w:val="28"/>
-        </w:rPr>
-        <w:drawing>
-          <wp:inline distT="0" distB="0" distL="0" distR="0" wp14:anchorId="5CE242FB" wp14:editId="1AB3BA00">
-            <wp:extent cx="5731510" cy="2688590"/>
-            <wp:effectExtent l="0" t="0" r="2540" b="0"/>
-            <wp:docPr id="1683608470" name="Picture 1"/>
-            <wp:cNvGraphicFramePr>
-              <a:graphicFrameLocks xmlns:a="http://schemas.openxmlformats.org/drawingml/2006/main" noChangeAspect="1"/>
-            </wp:cNvGraphicFramePr>
-            <a:graphic xmlns:a="http://schemas.openxmlformats.org/drawingml/2006/main">
-              <a:graphicData uri="http://schemas.openxmlformats.org/drawingml/2006/picture">
-                <pic:pic xmlns:pic="http://schemas.openxmlformats.org/drawingml/2006/picture">
-                  <pic:nvPicPr>
-                    <pic:cNvPr id="1683608470" name=""/>
-                    <pic:cNvPicPr/>
-                  </pic:nvPicPr>
-                  <pic:blipFill>
-                    <a:blip r:embed="rId12"/>
-                    <a:stretch>
-                      <a:fillRect/>
-                    </a:stretch>
-                  </pic:blipFill>
-                  <pic:spPr>
-                    <a:xfrm>
-                      <a:off x="0" y="0"/>
-                      <a:ext cx="5731510" cy="2688590"/>
-                    </a:xfrm>
-                    <a:prstGeom prst="rect">
-                      <a:avLst/>
-                    </a:prstGeom>
-                  </pic:spPr>
-                </pic:pic>
-              </a:graphicData>
-            </a:graphic>
-          </wp:inline>
-        </w:drawing>
-      </w:r>
     </w:p>
     <w:p>
       <w:pPr>
@@ -3197,22 +3035,9 @@
     </w:p>
     <w:p>
       <w:pPr>
-        <w:rPr>
-          <w:rFonts w:asciiTheme="majorHAnsi" w:eastAsiaTheme="majorEastAsia" w:hAnsiTheme="majorHAnsi" w:cstheme="majorBidi"/>
-          <w:color w:val="0F4761" w:themeColor="accent1" w:themeShade="BF"/>
-          <w:sz w:val="40"/>
-          <w:szCs w:val="40"/>
-        </w:rPr>
+        <w:pStyle w:val="Heading1"/>
       </w:pPr>
       <w:bookmarkStart w:id="5" w:name="_Toc239535713"/>
-      <w:r>
-        <w:br w:type="page"/>
-      </w:r>
-    </w:p>
-    <w:p>
-      <w:pPr>
-        <w:pStyle w:val="Heading1"/>
-      </w:pPr>
       <w:r>
         <w:lastRenderedPageBreak/>
         <w:t>2. Data</w:t>
@@ -3374,7 +3199,7 @@
           <w:numId w:val="8"/>
         </w:numPr>
       </w:pPr>
-      <w:hyperlink r:id="rId13" w:history="1">
+      <w:hyperlink r:id="rId10" w:history="1">
         <w:r>
           <w:rPr>
             <w:rStyle w:val="Hyperlink"/>
@@ -3391,7 +3216,7 @@
           <w:numId w:val="8"/>
         </w:numPr>
       </w:pPr>
-      <w:hyperlink r:id="rId14" w:history="1">
+      <w:hyperlink r:id="rId11" w:history="1">
         <w:r>
           <w:rPr>
             <w:rStyle w:val="Hyperlink"/>
@@ -3432,15 +3257,7 @@
     </w:p>
     <w:p>
       <w:r>
-        <w:t xml:space="preserve">The OECD data sets include observations for </w:t>
-      </w:r>
-      <w:proofErr w:type="gramStart"/>
-      <w:r>
-        <w:t>a number of</w:t>
-      </w:r>
-      <w:proofErr w:type="gramEnd"/>
-      <w:r>
-        <w:t xml:space="preserve"> countries, years and health related measures. The data was limited to 10 countries chosen from the OECD countries to avoid being overwhelmed by the sheer volume of data in the visualisations that would be produced by including all countries: Australia, Canada, France, Germany, </w:t>
+        <w:t xml:space="preserve">The OECD data sets include observations for a number of countries, years and health related measures. The data was limited to 10 countries chosen from the OECD countries to avoid being overwhelmed by the sheer volume of data in the visualisations that would be produced by including all countries: Australia, Canada, France, Germany, </w:t>
       </w:r>
       <w:r>
         <w:lastRenderedPageBreak/>
@@ -3457,63 +3274,158 @@
         <w:t>The CSV files were loaded into the program with D3.js. Each data set was read to obtain the relevant country, year and numerical value. The expenditure and life expectancy observations for the health sector were then cross-matched based on country and year common keys. This produced a merged dataset containing four main attributes:</w:t>
       </w:r>
     </w:p>
-    <w:p>
-      <w:pPr>
-        <w:pStyle w:val="ListParagraph"/>
-        <w:numPr>
-          <w:ilvl w:val="0"/>
-          <w:numId w:val="20"/>
-        </w:numPr>
-      </w:pPr>
-      <w:r>
-        <w:rPr>
-          <w:b/>
-          <w:bCs/>
-        </w:rPr>
-        <w:t>Country:</w:t>
-      </w:r>
-      <w:r>
-        <w:t xml:space="preserve"> The country to be selected is the OECD country.</w:t>
-      </w:r>
-    </w:p>
-    <w:p>
-      <w:pPr>
-        <w:pStyle w:val="ListParagraph"/>
-        <w:numPr>
-          <w:ilvl w:val="0"/>
-          <w:numId w:val="20"/>
-        </w:numPr>
-      </w:pPr>
-      <w:r>
-        <w:rPr>
-          <w:b/>
-          <w:bCs/>
-        </w:rPr>
-        <w:t>Year:</w:t>
-      </w:r>
-      <w:r>
-        <w:t xml:space="preserve"> The year that observations are being made (2015-2024).</w:t>
-      </w:r>
-    </w:p>
-    <w:p>
-      <w:pPr>
-        <w:pStyle w:val="ListParagraph"/>
-        <w:numPr>
-          <w:ilvl w:val="0"/>
-          <w:numId w:val="20"/>
-        </w:numPr>
-      </w:pPr>
-      <w:r>
-        <w:rPr>
-          <w:b/>
-          <w:bCs/>
-        </w:rPr>
-        <w:t>Life expectancy at birth:</w:t>
-      </w:r>
-      <w:r>
-        <w:t xml:space="preserve"> Number of years a person can expect to live if they were born in 2012.</w:t>
-      </w:r>
-    </w:p>
+    <w:tbl>
+      <w:tblPr>
+        <w:tblStyle w:val="TableGrid"/>
+        <w:tblW w:w="0" w:type="auto"/>
+        <w:tblLook w:val="04A0" w:firstRow="1" w:lastRow="0" w:firstColumn="1" w:lastColumn="0" w:noHBand="0" w:noVBand="1"/>
+      </w:tblPr>
+      <w:tblGrid>
+        <w:gridCol w:w="3005"/>
+        <w:gridCol w:w="3005"/>
+        <w:gridCol w:w="3006"/>
+      </w:tblGrid>
+      <w:tr>
+        <w:tc>
+          <w:tcPr>
+            <w:tcW w:w="3005" w:type="dxa"/>
+          </w:tcPr>
+          <w:p>
+            <w:r>
+              <w:rPr>
+                <w:rStyle w:val="notion-enable-hover"/>
+                <w:b/>
+                <w:bCs/>
+              </w:rPr>
+              <w:t>Categorical</w:t>
+            </w:r>
+          </w:p>
+        </w:tc>
+        <w:tc>
+          <w:tcPr>
+            <w:tcW w:w="3005" w:type="dxa"/>
+          </w:tcPr>
+          <w:p>
+            <w:r>
+              <w:t>Country</w:t>
+            </w:r>
+          </w:p>
+          <w:p>
+            <w:r>
+              <w:t>Reference area</w:t>
+            </w:r>
+          </w:p>
+        </w:tc>
+        <w:tc>
+          <w:tcPr>
+            <w:tcW w:w="3006" w:type="dxa"/>
+          </w:tcPr>
+          <w:p>
+            <w:r>
+              <w:t>The country to be selected is the OECD country.</w:t>
+            </w:r>
+          </w:p>
+        </w:tc>
+      </w:tr>
+      <w:tr>
+        <w:tc>
+          <w:tcPr>
+            <w:tcW w:w="3005" w:type="dxa"/>
+          </w:tcPr>
+          <w:p>
+            <w:r>
+              <w:rPr>
+                <w:rStyle w:val="notion-enable-hover"/>
+                <w:b/>
+                <w:bCs/>
+              </w:rPr>
+              <w:t>Numerical</w:t>
+            </w:r>
+          </w:p>
+        </w:tc>
+        <w:tc>
+          <w:tcPr>
+            <w:tcW w:w="3005" w:type="dxa"/>
+          </w:tcPr>
+          <w:p>
+            <w:r>
+              <w:t>Calendar year</w:t>
+            </w:r>
+          </w:p>
+          <w:p>
+            <w:r>
+              <w:t>OBS_VALUE (spending USD PPP, life expectancy years)</w:t>
+            </w:r>
+          </w:p>
+        </w:tc>
+        <w:tc>
+          <w:tcPr>
+            <w:tcW w:w="3006" w:type="dxa"/>
+          </w:tcPr>
+          <w:p>
+            <w:r>
+              <w:t>The year that observations are being made (2015-2024).</w:t>
+            </w:r>
+          </w:p>
+        </w:tc>
+      </w:tr>
+      <w:tr>
+        <w:tc>
+          <w:tcPr>
+            <w:tcW w:w="3005" w:type="dxa"/>
+          </w:tcPr>
+          <w:p>
+            <w:pPr>
+              <w:jc w:val="center"/>
+            </w:pPr>
+            <w:r>
+              <w:rPr>
+                <w:rStyle w:val="notion-enable-hover"/>
+                <w:b/>
+                <w:bCs/>
+              </w:rPr>
+              <w:t>Temporal</w:t>
+            </w:r>
+          </w:p>
+        </w:tc>
+        <w:tc>
+          <w:tcPr>
+            <w:tcW w:w="3005" w:type="dxa"/>
+          </w:tcPr>
+          <w:p>
+            <w:pPr>
+              <w:rPr>
+                <w:b/>
+                <w:bCs/>
+              </w:rPr>
+            </w:pPr>
+            <w:r>
+              <w:rPr>
+                <w:b/>
+                <w:bCs/>
+              </w:rPr>
+              <w:t>Life expectancy at birth</w:t>
+            </w:r>
+          </w:p>
+          <w:p>
+            <w:r>
+              <w:t>TIME_PERIOD (2015–2024)</w:t>
+            </w:r>
+          </w:p>
+        </w:tc>
+        <w:tc>
+          <w:tcPr>
+            <w:tcW w:w="3006" w:type="dxa"/>
+          </w:tcPr>
+          <w:p>
+            <w:r>
+              <w:t>Number of years a person can expect to live if they were born in 2012.</w:t>
+            </w:r>
+          </w:p>
+        </w:tc>
+      </w:tr>
+    </w:tbl>
+    <w:p/>
     <w:p>
       <w:r>
         <w:t xml:space="preserve">Healthcare expenditure: Total per capita health spending (in US </w:t>
@@ -3529,15 +3441,7 @@
     </w:p>
     <w:p>
       <w:r>
-        <w:t xml:space="preserve">The data set that is merged at the end is of 100 observations (10 years x 10 countries). The data in this data set is used to create the scatter graph and the </w:t>
-      </w:r>
-      <w:proofErr w:type="gramStart"/>
-      <w:r>
-        <w:t>two line</w:t>
-      </w:r>
-      <w:proofErr w:type="gramEnd"/>
-      <w:r>
-        <w:t xml:space="preserve"> charts. The latest observation available for each country is used for the scatter plot and the annual observations are used to plot the line charts, to illustrate changes from 2015 to 2024.</w:t>
+        <w:t>The data set that is merged at the end is of 100 observations (10 years x 10 countries). The data in this data set is used to create the scatter graph and the two line charts. The latest observation available for each country is used for the scatter plot and the annual observations are used to plot the line charts, to illustrate changes from 2015 to 2024.</w:t>
       </w:r>
     </w:p>
     <w:p>
@@ -3548,6 +3452,34 @@
         <w:t>.</w:t>
       </w:r>
     </w:p>
+    <w:p/>
+    <w:p>
+      <w:r>
+        <w:t xml:space="preserve">The data was cleaned, filtered and joined using the D3 function </w:t>
+      </w:r>
+      <w:proofErr w:type="spellStart"/>
+      <w:r>
+        <w:t>Promise.all</w:t>
+      </w:r>
+      <w:proofErr w:type="spellEnd"/>
+      <w:r>
+        <w:t xml:space="preserve">. </w:t>
+      </w:r>
+    </w:p>
+    <w:p>
+      <w:r>
+        <w:t xml:space="preserve">Tableau10 was used for a consistent and unified colour palette and </w:t>
+      </w:r>
+      <w:proofErr w:type="spellStart"/>
+      <w:r>
+        <w:t>categoroical</w:t>
+      </w:r>
+      <w:proofErr w:type="spellEnd"/>
+      <w:r>
+        <w:t xml:space="preserve"> country distinction.</w:t>
+      </w:r>
+    </w:p>
+    <w:p/>
     <w:p>
       <w:pPr>
         <w:rPr>
@@ -3656,10 +3588,7 @@
           </w:tcPr>
           <w:p>
             <w:r>
-              <w:t>i</w:t>
-            </w:r>
-            <w:r>
-              <w:t>mport OECD health statistics into D3.js</w:t>
+              <w:t>import OECD health statistics into D3.js</w:t>
             </w:r>
           </w:p>
         </w:tc>
@@ -3669,10 +3598,7 @@
           </w:tcPr>
           <w:p>
             <w:r>
-              <w:t>Completed – Both CSV datasets are loaded and processed using D3.js</w:t>
-            </w:r>
-            <w:r>
-              <w:t>.</w:t>
+              <w:t>Completed – Both CSV datasets are loaded and processed using D3.js.</w:t>
             </w:r>
           </w:p>
         </w:tc>
@@ -3694,15 +3620,7 @@
           </w:tcPr>
           <w:p>
             <w:r>
-              <w:t xml:space="preserve">Completed – A scatter plot and </w:t>
-            </w:r>
-            <w:proofErr w:type="gramStart"/>
-            <w:r>
-              <w:t>two line</w:t>
-            </w:r>
-            <w:proofErr w:type="gramEnd"/>
-            <w:r>
-              <w:t xml:space="preserve"> charts were developed.</w:t>
+              <w:t>Completed – A scatter plot and two line charts were developed.</w:t>
             </w:r>
           </w:p>
         </w:tc>
@@ -3837,10 +3755,7 @@
           </w:tcPr>
           <w:p>
             <w:r>
-              <w:t>I</w:t>
-            </w:r>
-            <w:r>
-              <w:t>mplemented – The website includes five guiding questions, a consistent layout and interactive chart features. User testing will provide further feedback on usability.</w:t>
+              <w:t>Implemented – The website includes five guiding questions, a consistent layout and interactive chart features. User testing will provide further feedback on usability.</w:t>
             </w:r>
           </w:p>
           <w:p/>
@@ -4019,7 +3934,34 @@
           </w:tcPr>
           <w:p>
             <w:r>
-              <w:t>Not implemented – Users can highlight individual country trends by hovering, but there is no separate country filter.</w:t>
+              <w:t>Completed</w:t>
+            </w:r>
+            <w:r>
+              <w:t xml:space="preserve"> – Users can highlight individual country trends by </w:t>
+            </w:r>
+            <w:r>
+              <w:t>selecting the country name from Legend or within Visualisation 1, which isolates it in all visualisations.</w:t>
+            </w:r>
+          </w:p>
+          <w:p>
+            <w:r>
+              <w:t xml:space="preserve">Not </w:t>
+            </w:r>
+            <w:proofErr w:type="spellStart"/>
+            <w:r>
+              <w:t>impleneted</w:t>
+            </w:r>
+            <w:proofErr w:type="spellEnd"/>
+            <w:r>
+              <w:t xml:space="preserve"> – Unable to unselect a country by selecting </w:t>
+            </w:r>
+            <w:proofErr w:type="spellStart"/>
+            <w:r>
+              <w:t>elsewqhere</w:t>
+            </w:r>
+            <w:proofErr w:type="spellEnd"/>
+            <w:r>
+              <w:t xml:space="preserve"> on the website.</w:t>
             </w:r>
           </w:p>
         </w:tc>
@@ -4031,6 +3973,7 @@
           </w:tcPr>
           <w:p>
             <w:r>
+              <w:lastRenderedPageBreak/>
               <w:t>Year selection or filtering</w:t>
             </w:r>
           </w:p>
@@ -4053,7 +3996,6 @@
           </w:tcPr>
           <w:p>
             <w:r>
-              <w:lastRenderedPageBreak/>
               <w:t>Highlight individual countries</w:t>
             </w:r>
           </w:p>
@@ -4152,6 +4094,9 @@
       <w:r>
         <w:t>The optional features were prioritised according to their usefulness and the available development time. Interactive tooltips and country highlighting were implemented to support comparison without adding complex filtering controls.</w:t>
       </w:r>
+      <w:r>
+        <w:t xml:space="preserve"> The country filtering was added after user testing.</w:t>
+      </w:r>
     </w:p>
     <w:p>
       <w:pPr>
@@ -4171,80 +4116,2282 @@
     </w:p>
     <w:p>
       <w:pPr>
+        <w:pStyle w:val="Heading1"/>
+      </w:pPr>
+      <w:bookmarkStart w:id="13" w:name="_Toc239535721"/>
+      <w:r>
+        <w:lastRenderedPageBreak/>
+        <w:t>4. Visualisation Design</w:t>
+      </w:r>
+      <w:bookmarkEnd w:id="13"/>
+    </w:p>
+    <w:p>
+      <w:r>
+        <w:t>The project is currently in the early design stage. Several visualisation approaches will be considered before selecting the final design.</w:t>
+      </w:r>
+    </w:p>
+    <w:p/>
+    <w:p>
+      <w:r>
+        <w:t>Possible visualisation ideas include:</w:t>
+      </w:r>
+    </w:p>
+    <w:p>
+      <w:pPr>
+        <w:pStyle w:val="Heading4"/>
+      </w:pPr>
+      <w:r>
+        <w:t>Design Idea 1 – Scatter Plot</w:t>
+      </w:r>
+    </w:p>
+    <w:p>
+      <w:r>
+        <w:t>A scatter plot could display healthcare expenditure on the x-axis and life expectancy on the y-axis. Each point would represent a country. This would make it easier to investigate whether countries with higher healthcare expenditure also tend to have higher life expectancy.</w:t>
+      </w:r>
+    </w:p>
+    <w:p/>
+    <w:p>
+      <w:pPr>
+        <w:pStyle w:val="Heading4"/>
+      </w:pPr>
+      <w:r>
+        <w:t>Design Idea 2 – Line Chart</w:t>
+      </w:r>
+    </w:p>
+    <w:p>
+      <w:r>
+        <w:t>A line chart could show changes in healthcare expenditure or life expectancy over time. Users could select or compare countries to observe long-term trends.</w:t>
+      </w:r>
+    </w:p>
+    <w:p/>
+    <w:p>
+      <w:pPr>
+        <w:pStyle w:val="Heading4"/>
+      </w:pPr>
+      <w:r>
+        <w:t>Design Idea 3 – Combined Interactive Dashboard</w:t>
+      </w:r>
+    </w:p>
+    <w:p>
+      <w:r>
+        <w:t>A dashboard could combine the scatter plot and line chart with filters for country and year. Selecting a country or year could update the visualisations and allow users to explore the data interactively.</w:t>
+      </w:r>
+    </w:p>
+    <w:p/>
+    <w:p>
+      <w:pPr>
+        <w:pStyle w:val="Heading4"/>
+      </w:pPr>
+      <w:r>
+        <w:t xml:space="preserve">Design Idea </w:t>
+      </w:r>
+      <w:r>
+        <w:t>4</w:t>
+      </w:r>
+      <w:r>
+        <w:t xml:space="preserve"> – </w:t>
+      </w:r>
+      <w:r>
+        <w:t>Bar Chart</w:t>
+      </w:r>
+    </w:p>
+    <w:p>
+      <w:r>
+        <w:t>A bar chart could have been used to demonstrate the spending of each country to see how they visual stack against each other. This was rejected due to the cluttered look. A line chart was favoured due to its ability to display the two variables together.</w:t>
+      </w:r>
+    </w:p>
+    <w:p/>
+    <w:p/>
+    <w:p>
+      <w:pPr>
+        <w:pStyle w:val="Heading1"/>
+      </w:pPr>
+      <w:r>
+        <w:t>5. Validation</w:t>
+      </w:r>
+    </w:p>
+    <w:p>
+      <w:pPr>
+        <w:pStyle w:val="Heading2"/>
+      </w:pPr>
+      <w:r>
+        <w:t>5.1 Informed Consent</w:t>
+      </w:r>
+    </w:p>
+    <w:p>
+      <w:r>
+        <w:t xml:space="preserve">To adhere to academic research standards and guidelines, all user testing participants were provided with an informed Consent Form prior to testing – see </w:t>
+      </w:r>
+      <w:r>
+        <w:t>Appendix A: Participant Ethics &amp; Consent Form</w:t>
+      </w:r>
+      <w:r>
+        <w:t>.</w:t>
+      </w:r>
+    </w:p>
+    <w:p>
+      <w:pPr>
+        <w:pStyle w:val="ListParagraph"/>
+        <w:numPr>
+          <w:ilvl w:val="0"/>
+          <w:numId w:val="22"/>
+        </w:numPr>
+      </w:pPr>
+      <w:r>
+        <w:lastRenderedPageBreak/>
+        <w:t>Participants were informed that participation was voluntary and could withdraw at any point.</w:t>
+      </w:r>
+    </w:p>
+    <w:p>
+      <w:pPr>
+        <w:pStyle w:val="ListParagraph"/>
+        <w:numPr>
+          <w:ilvl w:val="0"/>
+          <w:numId w:val="22"/>
+        </w:numPr>
+      </w:pPr>
+      <w:r>
+        <w:t xml:space="preserve">No personal identifiers will be included in the </w:t>
+      </w:r>
+      <w:proofErr w:type="gramStart"/>
+      <w:r>
+        <w:t>reporting</w:t>
+      </w:r>
+      <w:proofErr w:type="gramEnd"/>
+      <w:r>
+        <w:t xml:space="preserve"> and codes were assigned to protect privacy.</w:t>
+      </w:r>
+    </w:p>
+    <w:p>
+      <w:pPr>
+        <w:pStyle w:val="Heading2"/>
+      </w:pPr>
+      <w:r>
+        <w:t>5.2 Participant Profile</w:t>
+      </w:r>
+    </w:p>
+    <w:p>
+      <w:r>
+        <w:t>The user testing was conducted with 2 participants across different levels of technical familiarity.</w:t>
+      </w:r>
+    </w:p>
+    <w:tbl>
+      <w:tblPr>
+        <w:tblW w:w="0" w:type="auto"/>
+        <w:tblCellSpacing w:w="15" w:type="dxa"/>
+        <w:tblCellMar>
+          <w:left w:w="0" w:type="dxa"/>
+          <w:right w:w="0" w:type="dxa"/>
+        </w:tblCellMar>
+        <w:tblLook w:val="04A0" w:firstRow="1" w:lastRow="0" w:firstColumn="1" w:lastColumn="0" w:noHBand="0" w:noVBand="1"/>
+      </w:tblPr>
+      <w:tblGrid>
+        <w:gridCol w:w="1775"/>
+        <w:gridCol w:w="1230"/>
+        <w:gridCol w:w="2044"/>
+        <w:gridCol w:w="2185"/>
+        <w:gridCol w:w="1776"/>
+      </w:tblGrid>
+      <w:tr>
+        <w:trPr>
+          <w:tblHeader/>
+          <w:tblCellSpacing w:w="15" w:type="dxa"/>
+        </w:trPr>
+        <w:tc>
+          <w:tcPr>
+            <w:tcW w:w="0" w:type="auto"/>
+            <w:tcBorders>
+              <w:top w:val="single" w:sz="6" w:space="0" w:color="C4C7C5"/>
+              <w:left w:val="single" w:sz="6" w:space="0" w:color="C4C7C5"/>
+              <w:bottom w:val="single" w:sz="6" w:space="0" w:color="C4C7C5"/>
+              <w:right w:val="single" w:sz="6" w:space="0" w:color="C4C7C5"/>
+            </w:tcBorders>
+            <w:tcMar>
+              <w:top w:w="120" w:type="dxa"/>
+              <w:left w:w="180" w:type="dxa"/>
+              <w:bottom w:w="120" w:type="dxa"/>
+              <w:right w:w="180" w:type="dxa"/>
+            </w:tcMar>
+            <w:vAlign w:val="center"/>
+            <w:hideMark/>
+          </w:tcPr>
+          <w:p>
+            <w:pPr>
+              <w:spacing w:after="0" w:line="240" w:lineRule="auto"/>
+              <w:rPr>
+                <w:rFonts w:ascii="Arial" w:eastAsia="Times New Roman" w:hAnsi="Arial" w:cs="Arial"/>
+                <w:color w:val="1F1F1F"/>
+                <w:kern w:val="0"/>
+                <w:lang w:eastAsia="en-GB"/>
+                <w14:ligatures w14:val="none"/>
+              </w:rPr>
+            </w:pPr>
+            <w:r>
+              <w:rPr>
+                <w:rFonts w:ascii="Arial" w:eastAsia="Times New Roman" w:hAnsi="Arial" w:cs="Arial"/>
+                <w:b/>
+                <w:bCs/>
+                <w:color w:val="1F1F1F"/>
+                <w:kern w:val="0"/>
+                <w:bdr w:val="none" w:sz="0" w:space="0" w:color="auto" w:frame="1"/>
+                <w:lang w:eastAsia="en-GB"/>
+                <w14:ligatures w14:val="none"/>
+              </w:rPr>
+              <w:t>Participant Code</w:t>
+            </w:r>
+          </w:p>
+        </w:tc>
+        <w:tc>
+          <w:tcPr>
+            <w:tcW w:w="0" w:type="auto"/>
+            <w:tcBorders>
+              <w:top w:val="single" w:sz="6" w:space="0" w:color="C4C7C5"/>
+              <w:left w:val="single" w:sz="6" w:space="0" w:color="C4C7C5"/>
+              <w:bottom w:val="single" w:sz="6" w:space="0" w:color="C4C7C5"/>
+              <w:right w:val="single" w:sz="6" w:space="0" w:color="C4C7C5"/>
+            </w:tcBorders>
+            <w:tcMar>
+              <w:top w:w="120" w:type="dxa"/>
+              <w:left w:w="180" w:type="dxa"/>
+              <w:bottom w:w="120" w:type="dxa"/>
+              <w:right w:w="180" w:type="dxa"/>
+            </w:tcMar>
+            <w:vAlign w:val="center"/>
+            <w:hideMark/>
+          </w:tcPr>
+          <w:p>
+            <w:pPr>
+              <w:spacing w:after="0" w:line="240" w:lineRule="auto"/>
+              <w:rPr>
+                <w:rFonts w:ascii="Arial" w:eastAsia="Times New Roman" w:hAnsi="Arial" w:cs="Arial"/>
+                <w:color w:val="1F1F1F"/>
+                <w:kern w:val="0"/>
+                <w:lang w:eastAsia="en-GB"/>
+                <w14:ligatures w14:val="none"/>
+              </w:rPr>
+            </w:pPr>
+            <w:r>
+              <w:rPr>
+                <w:rFonts w:ascii="Arial" w:eastAsia="Times New Roman" w:hAnsi="Arial" w:cs="Arial"/>
+                <w:b/>
+                <w:bCs/>
+                <w:color w:val="1F1F1F"/>
+                <w:kern w:val="0"/>
+                <w:bdr w:val="none" w:sz="0" w:space="0" w:color="auto" w:frame="1"/>
+                <w:lang w:eastAsia="en-GB"/>
+                <w14:ligatures w14:val="none"/>
+              </w:rPr>
+              <w:t>Age Range</w:t>
+            </w:r>
+          </w:p>
+        </w:tc>
+        <w:tc>
+          <w:tcPr>
+            <w:tcW w:w="0" w:type="auto"/>
+            <w:tcBorders>
+              <w:top w:val="single" w:sz="6" w:space="0" w:color="C4C7C5"/>
+              <w:left w:val="single" w:sz="6" w:space="0" w:color="C4C7C5"/>
+              <w:bottom w:val="single" w:sz="6" w:space="0" w:color="C4C7C5"/>
+              <w:right w:val="single" w:sz="6" w:space="0" w:color="C4C7C5"/>
+            </w:tcBorders>
+            <w:tcMar>
+              <w:top w:w="120" w:type="dxa"/>
+              <w:left w:w="180" w:type="dxa"/>
+              <w:bottom w:w="120" w:type="dxa"/>
+              <w:right w:w="180" w:type="dxa"/>
+            </w:tcMar>
+            <w:vAlign w:val="center"/>
+            <w:hideMark/>
+          </w:tcPr>
+          <w:p>
+            <w:pPr>
+              <w:spacing w:after="0" w:line="240" w:lineRule="auto"/>
+              <w:rPr>
+                <w:rFonts w:ascii="Arial" w:eastAsia="Times New Roman" w:hAnsi="Arial" w:cs="Arial"/>
+                <w:color w:val="1F1F1F"/>
+                <w:kern w:val="0"/>
+                <w:lang w:eastAsia="en-GB"/>
+                <w14:ligatures w14:val="none"/>
+              </w:rPr>
+            </w:pPr>
+            <w:r>
+              <w:rPr>
+                <w:rFonts w:ascii="Arial" w:eastAsia="Times New Roman" w:hAnsi="Arial" w:cs="Arial"/>
+                <w:b/>
+                <w:bCs/>
+                <w:color w:val="1F1F1F"/>
+                <w:kern w:val="0"/>
+                <w:bdr w:val="none" w:sz="0" w:space="0" w:color="auto" w:frame="1"/>
+                <w:lang w:eastAsia="en-GB"/>
+                <w14:ligatures w14:val="none"/>
+              </w:rPr>
+              <w:t>Occupation / Background</w:t>
+            </w:r>
+          </w:p>
+        </w:tc>
+        <w:tc>
+          <w:tcPr>
+            <w:tcW w:w="0" w:type="auto"/>
+            <w:tcBorders>
+              <w:top w:val="single" w:sz="6" w:space="0" w:color="C4C7C5"/>
+              <w:left w:val="single" w:sz="6" w:space="0" w:color="C4C7C5"/>
+              <w:bottom w:val="single" w:sz="6" w:space="0" w:color="C4C7C5"/>
+              <w:right w:val="single" w:sz="6" w:space="0" w:color="C4C7C5"/>
+            </w:tcBorders>
+            <w:tcMar>
+              <w:top w:w="120" w:type="dxa"/>
+              <w:left w:w="180" w:type="dxa"/>
+              <w:bottom w:w="120" w:type="dxa"/>
+              <w:right w:w="180" w:type="dxa"/>
+            </w:tcMar>
+            <w:vAlign w:val="center"/>
+            <w:hideMark/>
+          </w:tcPr>
+          <w:p>
+            <w:pPr>
+              <w:spacing w:after="0" w:line="240" w:lineRule="auto"/>
+              <w:rPr>
+                <w:rFonts w:ascii="Arial" w:eastAsia="Times New Roman" w:hAnsi="Arial" w:cs="Arial"/>
+                <w:color w:val="1F1F1F"/>
+                <w:kern w:val="0"/>
+                <w:lang w:eastAsia="en-GB"/>
+                <w14:ligatures w14:val="none"/>
+              </w:rPr>
+            </w:pPr>
+            <w:r>
+              <w:rPr>
+                <w:rFonts w:ascii="Arial" w:eastAsia="Times New Roman" w:hAnsi="Arial" w:cs="Arial"/>
+                <w:b/>
+                <w:bCs/>
+                <w:color w:val="1F1F1F"/>
+                <w:kern w:val="0"/>
+                <w:bdr w:val="none" w:sz="0" w:space="0" w:color="auto" w:frame="1"/>
+                <w:lang w:eastAsia="en-GB"/>
+                <w14:ligatures w14:val="none"/>
+              </w:rPr>
+              <w:t>Data Visualisation Experience</w:t>
+            </w:r>
+          </w:p>
+        </w:tc>
+        <w:tc>
+          <w:tcPr>
+            <w:tcW w:w="0" w:type="auto"/>
+            <w:tcBorders>
+              <w:top w:val="single" w:sz="6" w:space="0" w:color="C4C7C5"/>
+              <w:left w:val="single" w:sz="6" w:space="0" w:color="C4C7C5"/>
+              <w:bottom w:val="single" w:sz="6" w:space="0" w:color="C4C7C5"/>
+              <w:right w:val="single" w:sz="6" w:space="0" w:color="C4C7C5"/>
+            </w:tcBorders>
+            <w:tcMar>
+              <w:top w:w="120" w:type="dxa"/>
+              <w:left w:w="180" w:type="dxa"/>
+              <w:bottom w:w="120" w:type="dxa"/>
+              <w:right w:w="180" w:type="dxa"/>
+            </w:tcMar>
+            <w:vAlign w:val="center"/>
+            <w:hideMark/>
+          </w:tcPr>
+          <w:p>
+            <w:pPr>
+              <w:spacing w:after="0" w:line="240" w:lineRule="auto"/>
+              <w:rPr>
+                <w:rFonts w:ascii="Arial" w:eastAsia="Times New Roman" w:hAnsi="Arial" w:cs="Arial"/>
+                <w:color w:val="1F1F1F"/>
+                <w:kern w:val="0"/>
+                <w:lang w:eastAsia="en-GB"/>
+                <w14:ligatures w14:val="none"/>
+              </w:rPr>
+            </w:pPr>
+            <w:r>
+              <w:rPr>
+                <w:rFonts w:ascii="Arial" w:eastAsia="Times New Roman" w:hAnsi="Arial" w:cs="Arial"/>
+                <w:b/>
+                <w:bCs/>
+                <w:color w:val="1F1F1F"/>
+                <w:kern w:val="0"/>
+                <w:bdr w:val="none" w:sz="0" w:space="0" w:color="auto" w:frame="1"/>
+                <w:lang w:eastAsia="en-GB"/>
+                <w14:ligatures w14:val="none"/>
+              </w:rPr>
+              <w:t>Primary Device / Browser Used</w:t>
+            </w:r>
+          </w:p>
+        </w:tc>
+      </w:tr>
+      <w:tr>
+        <w:trPr>
+          <w:tblCellSpacing w:w="15" w:type="dxa"/>
+        </w:trPr>
+        <w:tc>
+          <w:tcPr>
+            <w:tcW w:w="0" w:type="auto"/>
+            <w:tcBorders>
+              <w:top w:val="single" w:sz="6" w:space="0" w:color="C4C7C5"/>
+              <w:left w:val="single" w:sz="6" w:space="0" w:color="C4C7C5"/>
+              <w:bottom w:val="single" w:sz="6" w:space="0" w:color="C4C7C5"/>
+              <w:right w:val="single" w:sz="6" w:space="0" w:color="C4C7C5"/>
+            </w:tcBorders>
+            <w:tcMar>
+              <w:top w:w="120" w:type="dxa"/>
+              <w:left w:w="180" w:type="dxa"/>
+              <w:bottom w:w="120" w:type="dxa"/>
+              <w:right w:w="180" w:type="dxa"/>
+            </w:tcMar>
+            <w:vAlign w:val="center"/>
+            <w:hideMark/>
+          </w:tcPr>
+          <w:p>
+            <w:pPr>
+              <w:spacing w:after="0" w:line="240" w:lineRule="auto"/>
+              <w:rPr>
+                <w:rFonts w:ascii="Arial" w:eastAsia="Times New Roman" w:hAnsi="Arial" w:cs="Arial"/>
+                <w:color w:val="1F1F1F"/>
+                <w:kern w:val="0"/>
+                <w:lang w:eastAsia="en-GB"/>
+                <w14:ligatures w14:val="none"/>
+              </w:rPr>
+            </w:pPr>
+            <w:r>
+              <w:rPr>
+                <w:rFonts w:ascii="Arial" w:eastAsia="Times New Roman" w:hAnsi="Arial" w:cs="Arial"/>
+                <w:b/>
+                <w:bCs/>
+                <w:color w:val="1F1F1F"/>
+                <w:kern w:val="0"/>
+                <w:bdr w:val="none" w:sz="0" w:space="0" w:color="auto" w:frame="1"/>
+                <w:lang w:eastAsia="en-GB"/>
+                <w14:ligatures w14:val="none"/>
+              </w:rPr>
+              <w:t>P1</w:t>
+            </w:r>
+          </w:p>
+        </w:tc>
+        <w:tc>
+          <w:tcPr>
+            <w:tcW w:w="0" w:type="auto"/>
+            <w:tcBorders>
+              <w:top w:val="single" w:sz="6" w:space="0" w:color="C4C7C5"/>
+              <w:left w:val="single" w:sz="6" w:space="0" w:color="C4C7C5"/>
+              <w:bottom w:val="single" w:sz="6" w:space="0" w:color="C4C7C5"/>
+              <w:right w:val="single" w:sz="6" w:space="0" w:color="C4C7C5"/>
+            </w:tcBorders>
+            <w:tcMar>
+              <w:top w:w="120" w:type="dxa"/>
+              <w:left w:w="180" w:type="dxa"/>
+              <w:bottom w:w="120" w:type="dxa"/>
+              <w:right w:w="180" w:type="dxa"/>
+            </w:tcMar>
+            <w:vAlign w:val="center"/>
+            <w:hideMark/>
+          </w:tcPr>
+          <w:p>
+            <w:pPr>
+              <w:spacing w:after="0" w:line="240" w:lineRule="auto"/>
+              <w:rPr>
+                <w:rFonts w:ascii="Arial" w:eastAsia="Times New Roman" w:hAnsi="Arial" w:cs="Arial"/>
+                <w:color w:val="1F1F1F"/>
+                <w:kern w:val="0"/>
+                <w:lang w:eastAsia="en-GB"/>
+                <w14:ligatures w14:val="none"/>
+              </w:rPr>
+            </w:pPr>
+            <w:r>
+              <w:rPr>
+                <w:rFonts w:ascii="Arial" w:eastAsia="Times New Roman" w:hAnsi="Arial" w:cs="Arial"/>
+                <w:color w:val="1F1F1F"/>
+                <w:kern w:val="0"/>
+                <w:bdr w:val="none" w:sz="0" w:space="0" w:color="auto" w:frame="1"/>
+                <w:lang w:eastAsia="en-GB"/>
+                <w14:ligatures w14:val="none"/>
+              </w:rPr>
+              <w:t>35 - 40</w:t>
+            </w:r>
+          </w:p>
+        </w:tc>
+        <w:tc>
+          <w:tcPr>
+            <w:tcW w:w="0" w:type="auto"/>
+            <w:tcBorders>
+              <w:top w:val="single" w:sz="6" w:space="0" w:color="C4C7C5"/>
+              <w:left w:val="single" w:sz="6" w:space="0" w:color="C4C7C5"/>
+              <w:bottom w:val="single" w:sz="6" w:space="0" w:color="C4C7C5"/>
+              <w:right w:val="single" w:sz="6" w:space="0" w:color="C4C7C5"/>
+            </w:tcBorders>
+            <w:tcMar>
+              <w:top w:w="120" w:type="dxa"/>
+              <w:left w:w="180" w:type="dxa"/>
+              <w:bottom w:w="120" w:type="dxa"/>
+              <w:right w:w="180" w:type="dxa"/>
+            </w:tcMar>
+            <w:vAlign w:val="center"/>
+            <w:hideMark/>
+          </w:tcPr>
+          <w:p>
+            <w:pPr>
+              <w:spacing w:after="0" w:line="240" w:lineRule="auto"/>
+              <w:rPr>
+                <w:rFonts w:ascii="Arial" w:eastAsia="Times New Roman" w:hAnsi="Arial" w:cs="Arial"/>
+                <w:color w:val="1F1F1F"/>
+                <w:kern w:val="0"/>
+                <w:lang w:eastAsia="en-GB"/>
+                <w14:ligatures w14:val="none"/>
+              </w:rPr>
+            </w:pPr>
+            <w:r>
+              <w:rPr>
+                <w:rFonts w:ascii="Arial" w:eastAsia="Times New Roman" w:hAnsi="Arial" w:cs="Arial"/>
+                <w:color w:val="1F1F1F"/>
+                <w:kern w:val="0"/>
+                <w:bdr w:val="none" w:sz="0" w:space="0" w:color="auto" w:frame="1"/>
+                <w:lang w:eastAsia="en-GB"/>
+                <w14:ligatures w14:val="none"/>
+              </w:rPr>
+              <w:t>Interior Designer</w:t>
+            </w:r>
+          </w:p>
+        </w:tc>
+        <w:tc>
+          <w:tcPr>
+            <w:tcW w:w="0" w:type="auto"/>
+            <w:tcBorders>
+              <w:top w:val="single" w:sz="6" w:space="0" w:color="C4C7C5"/>
+              <w:left w:val="single" w:sz="6" w:space="0" w:color="C4C7C5"/>
+              <w:bottom w:val="single" w:sz="6" w:space="0" w:color="C4C7C5"/>
+              <w:right w:val="single" w:sz="6" w:space="0" w:color="C4C7C5"/>
+            </w:tcBorders>
+            <w:tcMar>
+              <w:top w:w="120" w:type="dxa"/>
+              <w:left w:w="180" w:type="dxa"/>
+              <w:bottom w:w="120" w:type="dxa"/>
+              <w:right w:w="180" w:type="dxa"/>
+            </w:tcMar>
+            <w:vAlign w:val="center"/>
+            <w:hideMark/>
+          </w:tcPr>
+          <w:p>
+            <w:pPr>
+              <w:spacing w:after="0" w:line="240" w:lineRule="auto"/>
+              <w:rPr>
+                <w:rFonts w:ascii="Arial" w:eastAsia="Times New Roman" w:hAnsi="Arial" w:cs="Arial"/>
+                <w:color w:val="1F1F1F"/>
+                <w:kern w:val="0"/>
+                <w:lang w:eastAsia="en-GB"/>
+                <w14:ligatures w14:val="none"/>
+              </w:rPr>
+            </w:pPr>
+            <w:r>
+              <w:rPr>
+                <w:rFonts w:ascii="Arial" w:eastAsia="Times New Roman" w:hAnsi="Arial" w:cs="Arial"/>
+                <w:color w:val="1F1F1F"/>
+                <w:kern w:val="0"/>
+                <w:bdr w:val="none" w:sz="0" w:space="0" w:color="auto" w:frame="1"/>
+                <w:lang w:eastAsia="en-GB"/>
+                <w14:ligatures w14:val="none"/>
+              </w:rPr>
+              <w:t>Novice</w:t>
+            </w:r>
+          </w:p>
+        </w:tc>
+        <w:tc>
+          <w:tcPr>
+            <w:tcW w:w="0" w:type="auto"/>
+            <w:tcBorders>
+              <w:top w:val="single" w:sz="6" w:space="0" w:color="C4C7C5"/>
+              <w:left w:val="single" w:sz="6" w:space="0" w:color="C4C7C5"/>
+              <w:bottom w:val="single" w:sz="6" w:space="0" w:color="C4C7C5"/>
+              <w:right w:val="single" w:sz="6" w:space="0" w:color="C4C7C5"/>
+            </w:tcBorders>
+            <w:tcMar>
+              <w:top w:w="120" w:type="dxa"/>
+              <w:left w:w="180" w:type="dxa"/>
+              <w:bottom w:w="120" w:type="dxa"/>
+              <w:right w:w="180" w:type="dxa"/>
+            </w:tcMar>
+            <w:vAlign w:val="center"/>
+            <w:hideMark/>
+          </w:tcPr>
+          <w:p>
+            <w:pPr>
+              <w:spacing w:after="0" w:line="240" w:lineRule="auto"/>
+              <w:rPr>
+                <w:rFonts w:ascii="Arial" w:eastAsia="Times New Roman" w:hAnsi="Arial" w:cs="Arial"/>
+                <w:color w:val="1F1F1F"/>
+                <w:kern w:val="0"/>
+                <w:lang w:eastAsia="en-GB"/>
+                <w14:ligatures w14:val="none"/>
+              </w:rPr>
+            </w:pPr>
+            <w:r>
+              <w:rPr>
+                <w:rFonts w:ascii="Arial" w:eastAsia="Times New Roman" w:hAnsi="Arial" w:cs="Arial"/>
+                <w:color w:val="1F1F1F"/>
+                <w:kern w:val="0"/>
+                <w:bdr w:val="none" w:sz="0" w:space="0" w:color="auto" w:frame="1"/>
+                <w:lang w:eastAsia="en-GB"/>
+                <w14:ligatures w14:val="none"/>
+              </w:rPr>
+              <w:t>Desktop</w:t>
+            </w:r>
+          </w:p>
+        </w:tc>
+      </w:tr>
+      <w:tr>
+        <w:trPr>
+          <w:tblCellSpacing w:w="15" w:type="dxa"/>
+        </w:trPr>
+        <w:tc>
+          <w:tcPr>
+            <w:tcW w:w="0" w:type="auto"/>
+            <w:tcBorders>
+              <w:top w:val="single" w:sz="6" w:space="0" w:color="C4C7C5"/>
+              <w:left w:val="single" w:sz="6" w:space="0" w:color="C4C7C5"/>
+              <w:bottom w:val="single" w:sz="6" w:space="0" w:color="C4C7C5"/>
+              <w:right w:val="single" w:sz="6" w:space="0" w:color="C4C7C5"/>
+            </w:tcBorders>
+            <w:tcMar>
+              <w:top w:w="120" w:type="dxa"/>
+              <w:left w:w="180" w:type="dxa"/>
+              <w:bottom w:w="120" w:type="dxa"/>
+              <w:right w:w="180" w:type="dxa"/>
+            </w:tcMar>
+            <w:vAlign w:val="center"/>
+            <w:hideMark/>
+          </w:tcPr>
+          <w:p>
+            <w:pPr>
+              <w:spacing w:after="0" w:line="240" w:lineRule="auto"/>
+              <w:rPr>
+                <w:rFonts w:ascii="Arial" w:eastAsia="Times New Roman" w:hAnsi="Arial" w:cs="Arial"/>
+                <w:color w:val="1F1F1F"/>
+                <w:kern w:val="0"/>
+                <w:lang w:eastAsia="en-GB"/>
+                <w14:ligatures w14:val="none"/>
+              </w:rPr>
+            </w:pPr>
+            <w:r>
+              <w:rPr>
+                <w:rFonts w:ascii="Arial" w:eastAsia="Times New Roman" w:hAnsi="Arial" w:cs="Arial"/>
+                <w:b/>
+                <w:bCs/>
+                <w:color w:val="1F1F1F"/>
+                <w:kern w:val="0"/>
+                <w:bdr w:val="none" w:sz="0" w:space="0" w:color="auto" w:frame="1"/>
+                <w:lang w:eastAsia="en-GB"/>
+                <w14:ligatures w14:val="none"/>
+              </w:rPr>
+              <w:t>P2</w:t>
+            </w:r>
+          </w:p>
+        </w:tc>
+        <w:tc>
+          <w:tcPr>
+            <w:tcW w:w="0" w:type="auto"/>
+            <w:tcBorders>
+              <w:top w:val="single" w:sz="6" w:space="0" w:color="C4C7C5"/>
+              <w:left w:val="single" w:sz="6" w:space="0" w:color="C4C7C5"/>
+              <w:bottom w:val="single" w:sz="6" w:space="0" w:color="C4C7C5"/>
+              <w:right w:val="single" w:sz="6" w:space="0" w:color="C4C7C5"/>
+            </w:tcBorders>
+            <w:tcMar>
+              <w:top w:w="120" w:type="dxa"/>
+              <w:left w:w="180" w:type="dxa"/>
+              <w:bottom w:w="120" w:type="dxa"/>
+              <w:right w:w="180" w:type="dxa"/>
+            </w:tcMar>
+            <w:vAlign w:val="center"/>
+            <w:hideMark/>
+          </w:tcPr>
+          <w:p>
+            <w:pPr>
+              <w:spacing w:after="0" w:line="240" w:lineRule="auto"/>
+              <w:rPr>
+                <w:rFonts w:ascii="Arial" w:eastAsia="Times New Roman" w:hAnsi="Arial" w:cs="Arial"/>
+                <w:color w:val="1F1F1F"/>
+                <w:kern w:val="0"/>
+                <w:lang w:eastAsia="en-GB"/>
+                <w14:ligatures w14:val="none"/>
+              </w:rPr>
+            </w:pPr>
+            <w:r>
+              <w:rPr>
+                <w:rFonts w:ascii="Arial" w:eastAsia="Times New Roman" w:hAnsi="Arial" w:cs="Arial"/>
+                <w:color w:val="1F1F1F"/>
+                <w:kern w:val="0"/>
+                <w:bdr w:val="none" w:sz="0" w:space="0" w:color="auto" w:frame="1"/>
+                <w:lang w:eastAsia="en-GB"/>
+                <w14:ligatures w14:val="none"/>
+              </w:rPr>
+              <w:t>30 - 35</w:t>
+            </w:r>
+          </w:p>
+        </w:tc>
+        <w:tc>
+          <w:tcPr>
+            <w:tcW w:w="0" w:type="auto"/>
+            <w:tcBorders>
+              <w:top w:val="single" w:sz="6" w:space="0" w:color="C4C7C5"/>
+              <w:left w:val="single" w:sz="6" w:space="0" w:color="C4C7C5"/>
+              <w:bottom w:val="single" w:sz="6" w:space="0" w:color="C4C7C5"/>
+              <w:right w:val="single" w:sz="6" w:space="0" w:color="C4C7C5"/>
+            </w:tcBorders>
+            <w:tcMar>
+              <w:top w:w="120" w:type="dxa"/>
+              <w:left w:w="180" w:type="dxa"/>
+              <w:bottom w:w="120" w:type="dxa"/>
+              <w:right w:w="180" w:type="dxa"/>
+            </w:tcMar>
+            <w:vAlign w:val="center"/>
+            <w:hideMark/>
+          </w:tcPr>
+          <w:p>
+            <w:pPr>
+              <w:spacing w:after="0" w:line="240" w:lineRule="auto"/>
+              <w:rPr>
+                <w:rFonts w:ascii="Arial" w:eastAsia="Times New Roman" w:hAnsi="Arial" w:cs="Arial"/>
+                <w:color w:val="1F1F1F"/>
+                <w:kern w:val="0"/>
+                <w:lang w:eastAsia="en-GB"/>
+                <w14:ligatures w14:val="none"/>
+              </w:rPr>
+            </w:pPr>
+            <w:r>
+              <w:rPr>
+                <w:rFonts w:ascii="Arial" w:eastAsia="Times New Roman" w:hAnsi="Arial" w:cs="Arial"/>
+                <w:color w:val="1F1F1F"/>
+                <w:kern w:val="0"/>
+                <w:bdr w:val="none" w:sz="0" w:space="0" w:color="auto" w:frame="1"/>
+                <w:lang w:eastAsia="en-GB"/>
+                <w14:ligatures w14:val="none"/>
+              </w:rPr>
+              <w:t>IT Professional</w:t>
+            </w:r>
+          </w:p>
+        </w:tc>
+        <w:tc>
+          <w:tcPr>
+            <w:tcW w:w="0" w:type="auto"/>
+            <w:tcBorders>
+              <w:top w:val="single" w:sz="6" w:space="0" w:color="C4C7C5"/>
+              <w:left w:val="single" w:sz="6" w:space="0" w:color="C4C7C5"/>
+              <w:bottom w:val="single" w:sz="6" w:space="0" w:color="C4C7C5"/>
+              <w:right w:val="single" w:sz="6" w:space="0" w:color="C4C7C5"/>
+            </w:tcBorders>
+            <w:tcMar>
+              <w:top w:w="120" w:type="dxa"/>
+              <w:left w:w="180" w:type="dxa"/>
+              <w:bottom w:w="120" w:type="dxa"/>
+              <w:right w:w="180" w:type="dxa"/>
+            </w:tcMar>
+            <w:vAlign w:val="center"/>
+            <w:hideMark/>
+          </w:tcPr>
+          <w:p>
+            <w:pPr>
+              <w:spacing w:after="0" w:line="240" w:lineRule="auto"/>
+              <w:rPr>
+                <w:rFonts w:ascii="Arial" w:eastAsia="Times New Roman" w:hAnsi="Arial" w:cs="Arial"/>
+                <w:color w:val="1F1F1F"/>
+                <w:kern w:val="0"/>
+                <w:lang w:eastAsia="en-GB"/>
+                <w14:ligatures w14:val="none"/>
+              </w:rPr>
+            </w:pPr>
+            <w:r>
+              <w:rPr>
+                <w:rFonts w:ascii="Arial" w:eastAsia="Times New Roman" w:hAnsi="Arial" w:cs="Arial"/>
+                <w:color w:val="1F1F1F"/>
+                <w:kern w:val="0"/>
+                <w:bdr w:val="none" w:sz="0" w:space="0" w:color="auto" w:frame="1"/>
+                <w:lang w:eastAsia="en-GB"/>
+                <w14:ligatures w14:val="none"/>
+              </w:rPr>
+              <w:t>Advanced</w:t>
+            </w:r>
+          </w:p>
+        </w:tc>
+        <w:tc>
+          <w:tcPr>
+            <w:tcW w:w="0" w:type="auto"/>
+            <w:tcBorders>
+              <w:top w:val="single" w:sz="6" w:space="0" w:color="C4C7C5"/>
+              <w:left w:val="single" w:sz="6" w:space="0" w:color="C4C7C5"/>
+              <w:bottom w:val="single" w:sz="6" w:space="0" w:color="C4C7C5"/>
+              <w:right w:val="single" w:sz="6" w:space="0" w:color="C4C7C5"/>
+            </w:tcBorders>
+            <w:tcMar>
+              <w:top w:w="120" w:type="dxa"/>
+              <w:left w:w="180" w:type="dxa"/>
+              <w:bottom w:w="120" w:type="dxa"/>
+              <w:right w:w="180" w:type="dxa"/>
+            </w:tcMar>
+            <w:vAlign w:val="center"/>
+            <w:hideMark/>
+          </w:tcPr>
+          <w:p>
+            <w:pPr>
+              <w:spacing w:after="0" w:line="240" w:lineRule="auto"/>
+              <w:rPr>
+                <w:rFonts w:ascii="Arial" w:eastAsia="Times New Roman" w:hAnsi="Arial" w:cs="Arial"/>
+                <w:color w:val="1F1F1F"/>
+                <w:kern w:val="0"/>
+                <w:lang w:eastAsia="en-GB"/>
+                <w14:ligatures w14:val="none"/>
+              </w:rPr>
+            </w:pPr>
+            <w:r>
+              <w:rPr>
+                <w:rFonts w:ascii="Arial" w:eastAsia="Times New Roman" w:hAnsi="Arial" w:cs="Arial"/>
+                <w:color w:val="1F1F1F"/>
+                <w:kern w:val="0"/>
+                <w:bdr w:val="none" w:sz="0" w:space="0" w:color="auto" w:frame="1"/>
+                <w:lang w:eastAsia="en-GB"/>
+                <w14:ligatures w14:val="none"/>
+              </w:rPr>
+              <w:t>Laptop</w:t>
+            </w:r>
+          </w:p>
+        </w:tc>
+      </w:tr>
+    </w:tbl>
+    <w:p/>
+    <w:p>
+      <w:pPr>
+        <w:pStyle w:val="Heading2"/>
+      </w:pPr>
+      <w:r>
+        <w:t>5.3 Evaluation and Satisfaction Survey</w:t>
+      </w:r>
+    </w:p>
+    <w:p>
+      <w:r>
+        <w:t>Testing was conducted live, in-person, with observational walkthroughs. Participants were given zero instruction on how to interact with the visualisations to observe the user-interface intuitiveness. They were asked to verbally contextualise their attempts at 4 tasks:</w:t>
+      </w:r>
+    </w:p>
+    <w:p>
+      <w:pPr>
+        <w:pStyle w:val="ListParagraph"/>
+        <w:numPr>
+          <w:ilvl w:val="0"/>
+          <w:numId w:val="20"/>
+        </w:numPr>
+      </w:pPr>
+      <w:r>
         <w:rPr>
           <w:b/>
           <w:bCs/>
         </w:rPr>
-      </w:pPr>
+        <w:t>Task 1 (Data Retrieval):</w:t>
+      </w:r>
+      <w:r>
+        <w:t xml:space="preserve"> "Identify which country had the highest healthcare expenditure per person in 2024."</w:t>
+      </w:r>
+    </w:p>
+    <w:p>
+      <w:pPr>
+        <w:pStyle w:val="ListParagraph"/>
+        <w:numPr>
+          <w:ilvl w:val="0"/>
+          <w:numId w:val="20"/>
+        </w:numPr>
+      </w:pPr>
+      <w:r>
+        <w:rPr>
+          <w:b/>
+          <w:bCs/>
+        </w:rPr>
+        <w:t>Task 2 (Trend Analysis):</w:t>
+      </w:r>
+      <w:r>
+        <w:t xml:space="preserve"> "Find the period where life expectancy decreased significantly across multiple countries and explain what caused it."</w:t>
+      </w:r>
+    </w:p>
+    <w:p>
+      <w:pPr>
+        <w:pStyle w:val="ListParagraph"/>
+        <w:numPr>
+          <w:ilvl w:val="0"/>
+          <w:numId w:val="20"/>
+        </w:numPr>
+      </w:pPr>
+      <w:r>
+        <w:rPr>
+          <w:b/>
+          <w:bCs/>
+        </w:rPr>
+        <w:t>Task 3 (Comparative Outcome):</w:t>
+      </w:r>
+      <w:r>
+        <w:t xml:space="preserve"> "Identify a country that achieves a relatively high life expectancy despite having a lower healthcare budget than the US."</w:t>
+      </w:r>
+    </w:p>
+    <w:p>
+      <w:pPr>
+        <w:pStyle w:val="ListParagraph"/>
+        <w:numPr>
+          <w:ilvl w:val="0"/>
+          <w:numId w:val="20"/>
+        </w:numPr>
+      </w:pPr>
+      <w:r>
+        <w:rPr>
+          <w:b/>
+          <w:bCs/>
+        </w:rPr>
+        <w:t>Task 4 (Interaction &amp; Navigation):</w:t>
+      </w:r>
+      <w:r>
+        <w:t xml:space="preserve"> "Filter or highlight 'Australia' across all visualisations on the page."</w:t>
+      </w:r>
+    </w:p>
+    <w:p/>
+    <w:p>
+      <w:r>
+        <w:t>Following the task completion, the participants completed a post-test questionnaire using a 5-point scale.</w:t>
+      </w:r>
+    </w:p>
+    <w:tbl>
+      <w:tblPr>
+        <w:tblStyle w:val="TableGrid"/>
+        <w:tblW w:w="0" w:type="auto"/>
+        <w:tblLook w:val="04A0" w:firstRow="1" w:lastRow="0" w:firstColumn="1" w:lastColumn="0" w:noHBand="0" w:noVBand="1"/>
+      </w:tblPr>
+      <w:tblGrid>
+        <w:gridCol w:w="2222"/>
+        <w:gridCol w:w="4152"/>
+        <w:gridCol w:w="1321"/>
+        <w:gridCol w:w="1321"/>
+      </w:tblGrid>
+      <w:tr>
+        <w:tc>
+          <w:tcPr>
+            <w:tcW w:w="2222" w:type="dxa"/>
+          </w:tcPr>
+          <w:p>
+            <w:pPr>
+              <w:rPr>
+                <w:b/>
+                <w:bCs/>
+              </w:rPr>
+            </w:pPr>
+            <w:r>
+              <w:rPr>
+                <w:b/>
+                <w:bCs/>
+              </w:rPr>
+              <w:t>Evaluation Metric</w:t>
+            </w:r>
+          </w:p>
+        </w:tc>
+        <w:tc>
+          <w:tcPr>
+            <w:tcW w:w="4152" w:type="dxa"/>
+          </w:tcPr>
+          <w:p>
+            <w:pPr>
+              <w:rPr>
+                <w:b/>
+                <w:bCs/>
+              </w:rPr>
+            </w:pPr>
+            <w:r>
+              <w:rPr>
+                <w:b/>
+                <w:bCs/>
+              </w:rPr>
+              <w:t>Question Statement</w:t>
+            </w:r>
+          </w:p>
+        </w:tc>
+        <w:tc>
+          <w:tcPr>
+            <w:tcW w:w="1321" w:type="dxa"/>
+          </w:tcPr>
+          <w:p>
+            <w:pPr>
+              <w:rPr>
+                <w:b/>
+                <w:bCs/>
+              </w:rPr>
+            </w:pPr>
+            <w:r>
+              <w:rPr>
+                <w:b/>
+                <w:bCs/>
+              </w:rPr>
+              <w:t>P1 Score</w:t>
+            </w:r>
+          </w:p>
+        </w:tc>
+        <w:tc>
+          <w:tcPr>
+            <w:tcW w:w="1321" w:type="dxa"/>
+          </w:tcPr>
+          <w:p>
+            <w:pPr>
+              <w:rPr>
+                <w:b/>
+                <w:bCs/>
+              </w:rPr>
+            </w:pPr>
+            <w:r>
+              <w:rPr>
+                <w:b/>
+                <w:bCs/>
+              </w:rPr>
+              <w:t>P2 Score</w:t>
+            </w:r>
+          </w:p>
+        </w:tc>
+      </w:tr>
+      <w:tr>
+        <w:tc>
+          <w:tcPr>
+            <w:tcW w:w="2222" w:type="dxa"/>
+          </w:tcPr>
+          <w:p>
+            <w:r>
+              <w:t>Ease of Use</w:t>
+            </w:r>
+          </w:p>
+        </w:tc>
+        <w:tc>
+          <w:tcPr>
+            <w:tcW w:w="4152" w:type="dxa"/>
+          </w:tcPr>
+          <w:p>
+            <w:pPr>
+              <w:rPr>
+                <w:i/>
+                <w:iCs/>
+              </w:rPr>
+            </w:pPr>
+            <w:r>
+              <w:rPr>
+                <w:i/>
+                <w:iCs/>
+              </w:rPr>
+              <w:t>"The dashboard was easy and intuitive to navigate."</w:t>
+            </w:r>
+          </w:p>
+        </w:tc>
+        <w:tc>
+          <w:tcPr>
+            <w:tcW w:w="1321" w:type="dxa"/>
+          </w:tcPr>
+          <w:p>
+            <w:r>
+              <w:t>5</w:t>
+            </w:r>
+          </w:p>
+        </w:tc>
+        <w:tc>
+          <w:tcPr>
+            <w:tcW w:w="1321" w:type="dxa"/>
+          </w:tcPr>
+          <w:p>
+            <w:pPr>
+              <w:tabs>
+                <w:tab w:val="left" w:pos="527"/>
+              </w:tabs>
+            </w:pPr>
+            <w:r>
+              <w:tab/>
+              <w:t>5</w:t>
+            </w:r>
+          </w:p>
+        </w:tc>
+      </w:tr>
+      <w:tr>
+        <w:tc>
+          <w:tcPr>
+            <w:tcW w:w="2222" w:type="dxa"/>
+          </w:tcPr>
+          <w:p>
+            <w:r>
+              <w:lastRenderedPageBreak/>
+              <w:t>Visual Clarity</w:t>
+            </w:r>
+          </w:p>
+        </w:tc>
+        <w:tc>
+          <w:tcPr>
+            <w:tcW w:w="4152" w:type="dxa"/>
+          </w:tcPr>
+          <w:p>
+            <w:pPr>
+              <w:rPr>
+                <w:i/>
+                <w:iCs/>
+              </w:rPr>
+            </w:pPr>
+            <w:r>
+              <w:rPr>
+                <w:i/>
+                <w:iCs/>
+              </w:rPr>
+              <w:t xml:space="preserve">"The charts and </w:t>
+            </w:r>
+            <w:r>
+              <w:rPr>
+                <w:i/>
+                <w:iCs/>
+              </w:rPr>
+              <w:t>colour</w:t>
+            </w:r>
+            <w:r>
+              <w:rPr>
+                <w:i/>
+                <w:iCs/>
+              </w:rPr>
+              <w:t xml:space="preserve"> choices made it easy to distinguish countries."</w:t>
+            </w:r>
+          </w:p>
+        </w:tc>
+        <w:tc>
+          <w:tcPr>
+            <w:tcW w:w="1321" w:type="dxa"/>
+          </w:tcPr>
+          <w:p>
+            <w:r>
+              <w:t>5</w:t>
+            </w:r>
+          </w:p>
+        </w:tc>
+        <w:tc>
+          <w:tcPr>
+            <w:tcW w:w="1321" w:type="dxa"/>
+          </w:tcPr>
+          <w:p>
+            <w:r>
+              <w:t>4</w:t>
+            </w:r>
+          </w:p>
+        </w:tc>
+      </w:tr>
+      <w:tr>
+        <w:tc>
+          <w:tcPr>
+            <w:tcW w:w="2222" w:type="dxa"/>
+          </w:tcPr>
+          <w:p>
+            <w:r>
+              <w:t>Data Usefulness</w:t>
+            </w:r>
+          </w:p>
+        </w:tc>
+        <w:tc>
+          <w:tcPr>
+            <w:tcW w:w="4152" w:type="dxa"/>
+          </w:tcPr>
+          <w:p>
+            <w:pPr>
+              <w:rPr>
+                <w:i/>
+                <w:iCs/>
+              </w:rPr>
+            </w:pPr>
+            <w:r>
+              <w:rPr>
+                <w:i/>
+                <w:iCs/>
+              </w:rPr>
+              <w:t>"The interactive features helped me answer the research questions effectively."</w:t>
+            </w:r>
+          </w:p>
+        </w:tc>
+        <w:tc>
+          <w:tcPr>
+            <w:tcW w:w="1321" w:type="dxa"/>
+          </w:tcPr>
+          <w:p>
+            <w:r>
+              <w:t>3</w:t>
+            </w:r>
+          </w:p>
+        </w:tc>
+        <w:tc>
+          <w:tcPr>
+            <w:tcW w:w="1321" w:type="dxa"/>
+          </w:tcPr>
+          <w:p>
+            <w:r>
+              <w:t>2.5</w:t>
+            </w:r>
+          </w:p>
+        </w:tc>
+      </w:tr>
+      <w:tr>
+        <w:tc>
+          <w:tcPr>
+            <w:tcW w:w="2222" w:type="dxa"/>
+          </w:tcPr>
+          <w:p>
+            <w:r>
+              <w:t>Overall Satisfaction</w:t>
+            </w:r>
+          </w:p>
+        </w:tc>
+        <w:tc>
+          <w:tcPr>
+            <w:tcW w:w="4152" w:type="dxa"/>
+          </w:tcPr>
+          <w:p>
+            <w:pPr>
+              <w:rPr>
+                <w:i/>
+                <w:iCs/>
+              </w:rPr>
+            </w:pPr>
+            <w:r>
+              <w:rPr>
+                <w:i/>
+                <w:iCs/>
+              </w:rPr>
+              <w:t>"I enjoyed exploring the website and discovering health trends."</w:t>
+            </w:r>
+          </w:p>
+        </w:tc>
+        <w:tc>
+          <w:tcPr>
+            <w:tcW w:w="1321" w:type="dxa"/>
+          </w:tcPr>
+          <w:p>
+            <w:r>
+              <w:t>4</w:t>
+            </w:r>
+          </w:p>
+        </w:tc>
+        <w:tc>
+          <w:tcPr>
+            <w:tcW w:w="1321" w:type="dxa"/>
+          </w:tcPr>
+          <w:p>
+            <w:r>
+              <w:t>3</w:t>
+            </w:r>
+          </w:p>
+        </w:tc>
+      </w:tr>
+    </w:tbl>
+    <w:p/>
+    <w:p>
+      <w:pPr>
+        <w:pStyle w:val="Heading2"/>
+      </w:pPr>
+      <w:r>
+        <w:t xml:space="preserve">5.4 </w:t>
+      </w:r>
+      <w:r>
+        <w:t>Usability Findings &amp; Qualitative Feedback</w:t>
+      </w:r>
+    </w:p>
+    <w:p>
+      <w:pPr>
+        <w:pStyle w:val="Heading3"/>
+      </w:pPr>
+      <w:r>
+        <w:t>Positive Feedback</w:t>
+      </w:r>
+    </w:p>
+    <w:p>
+      <w:pPr>
+        <w:pStyle w:val="ListParagraph"/>
+        <w:numPr>
+          <w:ilvl w:val="0"/>
+          <w:numId w:val="22"/>
+        </w:numPr>
+      </w:pPr>
+      <w:r>
+        <w:t>The website layout is intuitive, and the text to visualisation ratio is good for readability.</w:t>
+      </w:r>
+    </w:p>
+    <w:p>
+      <w:pPr>
+        <w:pStyle w:val="ListParagraph"/>
+        <w:numPr>
+          <w:ilvl w:val="0"/>
+          <w:numId w:val="22"/>
+        </w:numPr>
+      </w:pPr>
+      <w:r>
+        <w:t>The conclusion, or key points are short and simple.</w:t>
+      </w:r>
+    </w:p>
+    <w:p>
+      <w:pPr>
+        <w:pStyle w:val="ListParagraph"/>
+        <w:numPr>
+          <w:ilvl w:val="0"/>
+          <w:numId w:val="22"/>
+        </w:numPr>
+      </w:pPr>
+      <w:r>
+        <w:t>The website is simple and easy to navigate.</w:t>
+      </w:r>
+    </w:p>
+    <w:p>
+      <w:pPr>
+        <w:pStyle w:val="Heading3"/>
+      </w:pPr>
+      <w:r>
+        <w:t>Pain Points</w:t>
+      </w:r>
+    </w:p>
+    <w:p>
+      <w:pPr>
+        <w:pStyle w:val="ListParagraph"/>
+        <w:numPr>
+          <w:ilvl w:val="0"/>
+          <w:numId w:val="24"/>
+        </w:numPr>
+      </w:pPr>
+      <w:r>
+        <w:t xml:space="preserve">The legend for visualisations 2 &amp; 3 </w:t>
+      </w:r>
+      <w:proofErr w:type="gramStart"/>
+      <w:r>
+        <w:t>aren’t</w:t>
+      </w:r>
+      <w:proofErr w:type="gramEnd"/>
+      <w:r>
+        <w:t xml:space="preserve"> clear</w:t>
+      </w:r>
+      <w:r>
+        <w:t xml:space="preserve"> as </w:t>
+      </w:r>
+      <w:proofErr w:type="gramStart"/>
+      <w:r>
+        <w:t>the it</w:t>
+      </w:r>
+      <w:proofErr w:type="gramEnd"/>
+      <w:r>
+        <w:t xml:space="preserve"> seems like the lines on the visual are directly lining up to the country in the legend</w:t>
+      </w:r>
+      <w:r>
+        <w:t>,</w:t>
+      </w:r>
+    </w:p>
+    <w:p>
+      <w:pPr>
+        <w:pStyle w:val="ListParagraph"/>
+        <w:numPr>
+          <w:ilvl w:val="0"/>
+          <w:numId w:val="24"/>
+        </w:numPr>
+      </w:pPr>
+      <w:r>
+        <w:t>I</w:t>
+      </w:r>
+      <w:r>
+        <w:t>t is hard to isolate information about a country</w:t>
+      </w:r>
+      <w:r>
+        <w:t>, need to hover the graph and have forgotten the information when looking at the different visuals</w:t>
+      </w:r>
+      <w:r>
+        <w:t>.</w:t>
+      </w:r>
+    </w:p>
+    <w:p>
+      <w:pPr>
+        <w:pStyle w:val="ListParagraph"/>
+        <w:numPr>
+          <w:ilvl w:val="0"/>
+          <w:numId w:val="24"/>
+        </w:numPr>
+      </w:pPr>
+      <w:r>
+        <w:t>Hard to see information when the lines crossed for visual 3.</w:t>
+      </w:r>
+    </w:p>
+    <w:p>
+      <w:pPr>
+        <w:pStyle w:val="Heading2"/>
+      </w:pPr>
+    </w:p>
+    <w:p>
+      <w:pPr>
+        <w:pStyle w:val="Heading2"/>
+      </w:pPr>
+      <w:r>
+        <w:t>5.5 Design Improvements</w:t>
+      </w:r>
+    </w:p>
+    <w:p>
+      <w:pPr>
+        <w:pStyle w:val="ListParagraph"/>
+        <w:ind w:left="0"/>
+      </w:pPr>
+      <w:r>
+        <w:t xml:space="preserve">Based on the feedback received the following enhancements were implemented into the final design. </w:t>
+      </w:r>
+    </w:p>
+    <w:p>
+      <w:pPr>
+        <w:pStyle w:val="ListParagraph"/>
+        <w:ind w:left="0"/>
+      </w:pPr>
+    </w:p>
+    <w:tbl>
+      <w:tblPr>
+        <w:tblStyle w:val="TableGrid"/>
+        <w:tblW w:w="0" w:type="auto"/>
+        <w:tblLook w:val="04A0" w:firstRow="1" w:lastRow="0" w:firstColumn="1" w:lastColumn="0" w:noHBand="0" w:noVBand="1"/>
+      </w:tblPr>
+      <w:tblGrid>
+        <w:gridCol w:w="4508"/>
+        <w:gridCol w:w="4508"/>
+      </w:tblGrid>
+      <w:tr>
+        <w:tc>
+          <w:tcPr>
+            <w:tcW w:w="4508" w:type="dxa"/>
+          </w:tcPr>
+          <w:p>
+            <w:pPr>
+              <w:rPr>
+                <w:rFonts w:ascii="Arial" w:hAnsi="Arial" w:cs="Arial"/>
+              </w:rPr>
+            </w:pPr>
+            <w:r>
+              <w:rPr>
+                <w:rStyle w:val="Strong"/>
+                <w:rFonts w:ascii="Arial" w:hAnsi="Arial" w:cs="Arial"/>
+              </w:rPr>
+              <w:t>Identified Usability Issue</w:t>
+            </w:r>
+          </w:p>
+        </w:tc>
+        <w:tc>
+          <w:tcPr>
+            <w:tcW w:w="4508" w:type="dxa"/>
+          </w:tcPr>
+          <w:p>
+            <w:pPr>
+              <w:pStyle w:val="ListParagraph"/>
+              <w:ind w:left="0"/>
+              <w:rPr>
+                <w:b/>
+                <w:bCs/>
+              </w:rPr>
+            </w:pPr>
+            <w:r>
+              <w:rPr>
+                <w:b/>
+                <w:bCs/>
+              </w:rPr>
+              <w:t>Action</w:t>
+            </w:r>
+          </w:p>
+        </w:tc>
+      </w:tr>
+      <w:tr>
+        <w:tc>
+          <w:tcPr>
+            <w:tcW w:w="4508" w:type="dxa"/>
+          </w:tcPr>
+          <w:p>
+            <w:pPr>
+              <w:pStyle w:val="ListParagraph"/>
+              <w:ind w:left="0"/>
+            </w:pPr>
+            <w:r>
+              <w:t xml:space="preserve">The legends aren’t clear, as they </w:t>
+            </w:r>
+          </w:p>
+        </w:tc>
+        <w:tc>
+          <w:tcPr>
+            <w:tcW w:w="4508" w:type="dxa"/>
+          </w:tcPr>
+          <w:p>
+            <w:pPr>
+              <w:pStyle w:val="ListParagraph"/>
+              <w:ind w:left="0"/>
+            </w:pPr>
+            <w:r>
+              <w:t>Implemented gridline for visual 1 to aid visual eye.1</w:t>
+            </w:r>
+          </w:p>
+        </w:tc>
+      </w:tr>
+      <w:tr>
+        <w:tc>
+          <w:tcPr>
+            <w:tcW w:w="4508" w:type="dxa"/>
+          </w:tcPr>
+          <w:p>
+            <w:pPr>
+              <w:pStyle w:val="ListParagraph"/>
+              <w:ind w:left="0"/>
+            </w:pPr>
+          </w:p>
+        </w:tc>
+        <w:tc>
+          <w:tcPr>
+            <w:tcW w:w="4508" w:type="dxa"/>
+          </w:tcPr>
+          <w:p>
+            <w:pPr>
+              <w:pStyle w:val="ListParagraph"/>
+              <w:ind w:left="0"/>
+            </w:pPr>
+            <w:r>
+              <w:t>Implemented country filtering, where a country can be selected from the legend or visual 1 and it is set like that until unselected.</w:t>
+            </w:r>
+          </w:p>
+        </w:tc>
+      </w:tr>
+      <w:tr>
+        <w:tc>
+          <w:tcPr>
+            <w:tcW w:w="4508" w:type="dxa"/>
+          </w:tcPr>
+          <w:p>
+            <w:pPr>
+              <w:pStyle w:val="ListParagraph"/>
+              <w:ind w:left="0"/>
+            </w:pPr>
+            <w:r>
+              <w:t>Hard to follow the overall story/</w:t>
+            </w:r>
+            <w:r>
+              <w:t>answers</w:t>
+            </w:r>
+            <w:r>
+              <w:t xml:space="preserve"> to the guiding questions.</w:t>
+            </w:r>
+          </w:p>
+        </w:tc>
+        <w:tc>
+          <w:tcPr>
+            <w:tcW w:w="4508" w:type="dxa"/>
+          </w:tcPr>
+          <w:p>
+            <w:pPr>
+              <w:pStyle w:val="ListParagraph"/>
+              <w:ind w:left="0"/>
+            </w:pPr>
+            <w:r>
+              <w:t xml:space="preserve">Implemented short blurb answers to all the questions. </w:t>
+            </w:r>
+          </w:p>
+        </w:tc>
+      </w:tr>
+      <w:tr>
+        <w:tc>
+          <w:tcPr>
+            <w:tcW w:w="4508" w:type="dxa"/>
+          </w:tcPr>
+          <w:p>
+            <w:pPr>
+              <w:pStyle w:val="ListParagraph"/>
+              <w:ind w:left="0"/>
+            </w:pPr>
+          </w:p>
+        </w:tc>
+        <w:tc>
+          <w:tcPr>
+            <w:tcW w:w="4508" w:type="dxa"/>
+          </w:tcPr>
+          <w:p>
+            <w:pPr>
+              <w:pStyle w:val="ListParagraph"/>
+              <w:ind w:left="0"/>
+            </w:pPr>
+            <w:r>
+              <w:t>Changed the visual 1 colours to the Tableau10 colours for consistency with the other visuals as there is no legend for visual 1.</w:t>
+            </w:r>
+          </w:p>
+        </w:tc>
+      </w:tr>
+      <w:tr>
+        <w:tc>
+          <w:tcPr>
+            <w:tcW w:w="4508" w:type="dxa"/>
+          </w:tcPr>
+          <w:p>
+            <w:pPr>
+              <w:pStyle w:val="ListParagraph"/>
+              <w:ind w:left="0"/>
+            </w:pPr>
+          </w:p>
+        </w:tc>
+        <w:tc>
+          <w:tcPr>
+            <w:tcW w:w="4508" w:type="dxa"/>
+          </w:tcPr>
+          <w:p>
+            <w:pPr>
+              <w:pStyle w:val="ListParagraph"/>
+              <w:ind w:left="0"/>
+            </w:pPr>
+          </w:p>
+        </w:tc>
+      </w:tr>
+    </w:tbl>
+    <w:p>
+      <w:pPr>
+        <w:pStyle w:val="ListParagraph"/>
+        <w:ind w:left="0"/>
+      </w:pPr>
+      <w:r>
+        <w:t xml:space="preserve"> </w:t>
+      </w:r>
     </w:p>
     <w:p>
       <w:pPr>
         <w:pStyle w:val="Heading1"/>
       </w:pPr>
-      <w:bookmarkStart w:id="13" w:name="_Toc239535721"/>
-      <w:r>
-        <w:t>4. Visualisation Design</w:t>
-      </w:r>
-      <w:bookmarkEnd w:id="13"/>
-    </w:p>
-    <w:p>
-      <w:r>
-        <w:t>The project is currently in the early design stage. Several visualisation approaches will be considered before selecting the final design.</w:t>
+      <w:r>
+        <w:t>6. Conclusion</w:t>
       </w:r>
     </w:p>
     <w:p/>
     <w:p>
-      <w:r>
-        <w:t>Possible visualisation ideas include:</w:t>
-      </w:r>
-    </w:p>
-    <w:p>
-      <w:pPr>
-        <w:pStyle w:val="Heading4"/>
-      </w:pPr>
-      <w:r>
-        <w:t>Design Idea 1 – Scatter Plot</w:t>
-      </w:r>
-    </w:p>
-    <w:p>
-      <w:r>
-        <w:t>A scatter plot could display healthcare expenditure on the x-axis and life expectancy on the y-axis. Each point would represent a country. This would make it easier to investigate whether countries with higher healthcare expenditure also tend to have higher life expectancy.</w:t>
-      </w:r>
-    </w:p>
+      <w:pPr>
+        <w:rPr>
+          <w:rFonts w:asciiTheme="majorHAnsi" w:eastAsiaTheme="majorEastAsia" w:hAnsiTheme="majorHAnsi" w:cstheme="majorBidi"/>
+          <w:color w:val="0F4761" w:themeColor="accent1" w:themeShade="BF"/>
+          <w:sz w:val="40"/>
+          <w:szCs w:val="40"/>
+        </w:rPr>
+      </w:pPr>
+      <w:r>
+        <w:br w:type="page"/>
+      </w:r>
+    </w:p>
+    <w:p>
+      <w:pPr>
+        <w:pStyle w:val="Heading1"/>
+      </w:pPr>
+      <w:r>
+        <w:lastRenderedPageBreak/>
+        <w:t>Appendix</w:t>
+      </w:r>
+    </w:p>
+    <w:p>
+      <w:pPr>
+        <w:pStyle w:val="Heading2"/>
+      </w:pPr>
+      <w:r>
+        <w:t xml:space="preserve">Appendix </w:t>
+      </w:r>
+      <w:r>
+        <w:t>A</w:t>
+      </w:r>
+      <w:r>
+        <w:t xml:space="preserve">: </w:t>
+      </w:r>
+      <w:r>
+        <w:t>Team Collaboration setup</w:t>
+      </w:r>
+    </w:p>
+    <w:tbl>
+      <w:tblPr>
+        <w:tblStyle w:val="TableGrid"/>
+        <w:tblW w:w="0" w:type="auto"/>
+        <w:tblLook w:val="04A0" w:firstRow="1" w:lastRow="0" w:firstColumn="1" w:lastColumn="0" w:noHBand="0" w:noVBand="1"/>
+      </w:tblPr>
+      <w:tblGrid>
+        <w:gridCol w:w="9016"/>
+      </w:tblGrid>
+      <w:tr>
+        <w:tc>
+          <w:tcPr>
+            <w:tcW w:w="9016" w:type="dxa"/>
+          </w:tcPr>
+          <w:p>
+            <w:r>
+              <w:rPr>
+                <w:b/>
+                <w:bCs/>
+                <w:noProof/>
+                <w:sz w:val="28"/>
+                <w:szCs w:val="28"/>
+              </w:rPr>
+              <w:drawing>
+                <wp:anchor distT="0" distB="0" distL="114300" distR="114300" simplePos="0" relativeHeight="251658240" behindDoc="0" locked="0" layoutInCell="1" allowOverlap="1" wp14:anchorId="2AEF8A1F" wp14:editId="797B7868">
+                  <wp:simplePos x="0" y="0"/>
+                  <wp:positionH relativeFrom="column">
+                    <wp:posOffset>2605405</wp:posOffset>
+                  </wp:positionH>
+                  <wp:positionV relativeFrom="paragraph">
+                    <wp:posOffset>154983</wp:posOffset>
+                  </wp:positionV>
+                  <wp:extent cx="3048000" cy="2703195"/>
+                  <wp:effectExtent l="0" t="0" r="0" b="1905"/>
+                  <wp:wrapTopAndBottom/>
+                  <wp:docPr id="1377836744" name="Picture 1"/>
+                  <wp:cNvGraphicFramePr>
+                    <a:graphicFrameLocks xmlns:a="http://schemas.openxmlformats.org/drawingml/2006/main" noChangeAspect="1"/>
+                  </wp:cNvGraphicFramePr>
+                  <a:graphic xmlns:a="http://schemas.openxmlformats.org/drawingml/2006/main">
+                    <a:graphicData uri="http://schemas.openxmlformats.org/drawingml/2006/picture">
+                      <pic:pic xmlns:pic="http://schemas.openxmlformats.org/drawingml/2006/picture">
+                        <pic:nvPicPr>
+                          <pic:cNvPr id="1377836744" name=""/>
+                          <pic:cNvPicPr/>
+                        </pic:nvPicPr>
+                        <pic:blipFill>
+                          <a:blip r:embed="rId12" cstate="print">
+                            <a:extLst>
+                              <a:ext uri="{28A0092B-C50C-407E-A947-70E740481C1C}">
+                                <a14:useLocalDpi xmlns:a14="http://schemas.microsoft.com/office/drawing/2010/main" val="0"/>
+                              </a:ext>
+                            </a:extLst>
+                          </a:blip>
+                          <a:stretch>
+                            <a:fillRect/>
+                          </a:stretch>
+                        </pic:blipFill>
+                        <pic:spPr>
+                          <a:xfrm>
+                            <a:off x="0" y="0"/>
+                            <a:ext cx="3048000" cy="2703195"/>
+                          </a:xfrm>
+                          <a:prstGeom prst="rect">
+                            <a:avLst/>
+                          </a:prstGeom>
+                        </pic:spPr>
+                      </pic:pic>
+                    </a:graphicData>
+                  </a:graphic>
+                  <wp14:sizeRelH relativeFrom="page">
+                    <wp14:pctWidth>0</wp14:pctWidth>
+                  </wp14:sizeRelH>
+                  <wp14:sizeRelV relativeFrom="page">
+                    <wp14:pctHeight>0</wp14:pctHeight>
+                  </wp14:sizeRelV>
+                </wp:anchor>
+              </w:drawing>
+            </w:r>
+            <w:r>
+              <w:rPr>
+                <w:b/>
+                <w:bCs/>
+                <w:noProof/>
+                <w:sz w:val="28"/>
+                <w:szCs w:val="28"/>
+              </w:rPr>
+              <w:drawing>
+                <wp:anchor distT="0" distB="0" distL="114300" distR="114300" simplePos="0" relativeHeight="251659264" behindDoc="0" locked="0" layoutInCell="1" allowOverlap="1" wp14:anchorId="46301693" wp14:editId="6FBB24B0">
+                  <wp:simplePos x="0" y="0"/>
+                  <wp:positionH relativeFrom="column">
+                    <wp:posOffset>-64770</wp:posOffset>
+                  </wp:positionH>
+                  <wp:positionV relativeFrom="paragraph">
+                    <wp:posOffset>154983</wp:posOffset>
+                  </wp:positionV>
+                  <wp:extent cx="2774745" cy="2353540"/>
+                  <wp:effectExtent l="0" t="0" r="0" b="0"/>
+                  <wp:wrapTopAndBottom/>
+                  <wp:docPr id="177818327" name="Picture 1"/>
+                  <wp:cNvGraphicFramePr>
+                    <a:graphicFrameLocks xmlns:a="http://schemas.openxmlformats.org/drawingml/2006/main" noChangeAspect="1"/>
+                  </wp:cNvGraphicFramePr>
+                  <a:graphic xmlns:a="http://schemas.openxmlformats.org/drawingml/2006/main">
+                    <a:graphicData uri="http://schemas.openxmlformats.org/drawingml/2006/picture">
+                      <pic:pic xmlns:pic="http://schemas.openxmlformats.org/drawingml/2006/picture">
+                        <pic:nvPicPr>
+                          <pic:cNvPr id="177818327" name=""/>
+                          <pic:cNvPicPr/>
+                        </pic:nvPicPr>
+                        <pic:blipFill>
+                          <a:blip r:embed="rId13" cstate="print">
+                            <a:extLst>
+                              <a:ext uri="{28A0092B-C50C-407E-A947-70E740481C1C}">
+                                <a14:useLocalDpi xmlns:a14="http://schemas.microsoft.com/office/drawing/2010/main" val="0"/>
+                              </a:ext>
+                            </a:extLst>
+                          </a:blip>
+                          <a:stretch>
+                            <a:fillRect/>
+                          </a:stretch>
+                        </pic:blipFill>
+                        <pic:spPr>
+                          <a:xfrm>
+                            <a:off x="0" y="0"/>
+                            <a:ext cx="2774745" cy="2353540"/>
+                          </a:xfrm>
+                          <a:prstGeom prst="rect">
+                            <a:avLst/>
+                          </a:prstGeom>
+                        </pic:spPr>
+                      </pic:pic>
+                    </a:graphicData>
+                  </a:graphic>
+                  <wp14:sizeRelH relativeFrom="page">
+                    <wp14:pctWidth>0</wp14:pctWidth>
+                  </wp14:sizeRelH>
+                  <wp14:sizeRelV relativeFrom="page">
+                    <wp14:pctHeight>0</wp14:pctHeight>
+                  </wp14:sizeRelV>
+                </wp:anchor>
+              </w:drawing>
+            </w:r>
+          </w:p>
+        </w:tc>
+      </w:tr>
+      <w:tr>
+        <w:tc>
+          <w:tcPr>
+            <w:tcW w:w="9016" w:type="dxa"/>
+          </w:tcPr>
+          <w:p>
+            <w:r>
+              <w:rPr>
+                <w:b/>
+                <w:bCs/>
+                <w:noProof/>
+                <w:sz w:val="28"/>
+                <w:szCs w:val="28"/>
+              </w:rPr>
+              <w:drawing>
+                <wp:anchor distT="0" distB="0" distL="114300" distR="114300" simplePos="0" relativeHeight="251660288" behindDoc="0" locked="0" layoutInCell="1" allowOverlap="1" wp14:anchorId="352BE701" wp14:editId="46380F98">
+                  <wp:simplePos x="0" y="0"/>
+                  <wp:positionH relativeFrom="column">
+                    <wp:posOffset>-64877</wp:posOffset>
+                  </wp:positionH>
+                  <wp:positionV relativeFrom="paragraph">
+                    <wp:posOffset>147234</wp:posOffset>
+                  </wp:positionV>
+                  <wp:extent cx="5731510" cy="2688590"/>
+                  <wp:effectExtent l="0" t="0" r="0" b="3810"/>
+                  <wp:wrapTopAndBottom/>
+                  <wp:docPr id="1683608470" name="Picture 1"/>
+                  <wp:cNvGraphicFramePr>
+                    <a:graphicFrameLocks xmlns:a="http://schemas.openxmlformats.org/drawingml/2006/main" noChangeAspect="1"/>
+                  </wp:cNvGraphicFramePr>
+                  <a:graphic xmlns:a="http://schemas.openxmlformats.org/drawingml/2006/main">
+                    <a:graphicData uri="http://schemas.openxmlformats.org/drawingml/2006/picture">
+                      <pic:pic xmlns:pic="http://schemas.openxmlformats.org/drawingml/2006/picture">
+                        <pic:nvPicPr>
+                          <pic:cNvPr id="1683608470" name=""/>
+                          <pic:cNvPicPr/>
+                        </pic:nvPicPr>
+                        <pic:blipFill>
+                          <a:blip r:embed="rId14" cstate="print">
+                            <a:extLst>
+                              <a:ext uri="{28A0092B-C50C-407E-A947-70E740481C1C}">
+                                <a14:useLocalDpi xmlns:a14="http://schemas.microsoft.com/office/drawing/2010/main" val="0"/>
+                              </a:ext>
+                            </a:extLst>
+                          </a:blip>
+                          <a:stretch>
+                            <a:fillRect/>
+                          </a:stretch>
+                        </pic:blipFill>
+                        <pic:spPr>
+                          <a:xfrm>
+                            <a:off x="0" y="0"/>
+                            <a:ext cx="5731510" cy="2688590"/>
+                          </a:xfrm>
+                          <a:prstGeom prst="rect">
+                            <a:avLst/>
+                          </a:prstGeom>
+                        </pic:spPr>
+                      </pic:pic>
+                    </a:graphicData>
+                  </a:graphic>
+                  <wp14:sizeRelH relativeFrom="page">
+                    <wp14:pctWidth>0</wp14:pctWidth>
+                  </wp14:sizeRelH>
+                  <wp14:sizeRelV relativeFrom="page">
+                    <wp14:pctHeight>0</wp14:pctHeight>
+                  </wp14:sizeRelV>
+                </wp:anchor>
+              </w:drawing>
+            </w:r>
+          </w:p>
+        </w:tc>
+      </w:tr>
+    </w:tbl>
     <w:p/>
-    <w:p>
-      <w:pPr>
-        <w:pStyle w:val="Heading4"/>
-      </w:pPr>
-      <w:r>
-        <w:t>Design Idea 2 – Line Chart</w:t>
-      </w:r>
-    </w:p>
-    <w:p>
-      <w:r>
-        <w:t>A line chart could show changes in healthcare expenditure or life expectancy over time. Users could select or compare countries to observe long-term trends.</w:t>
-      </w:r>
-    </w:p>
     <w:p/>
     <w:p>
       <w:pPr>
-        <w:pStyle w:val="Heading4"/>
-      </w:pPr>
-      <w:r>
-        <w:t>Design Idea 3 – Combined Interactive Dashboard</w:t>
-      </w:r>
-    </w:p>
-    <w:p>
-      <w:r>
-        <w:t>A dashboard could combine the scatter plot and line chart with filters for country and year. Selecting a country or year could update the visualisations and allow users to explore the data interactively.</w:t>
-      </w:r>
-    </w:p>
-    <w:p>
-      <w:r>
-        <w:t>These designs are preliminary and will be refined as the project progresses. Sketches and screenshots showing the evolution of the design will be added later.</w:t>
-      </w:r>
-    </w:p>
-    <w:p/>
+        <w:rPr>
+          <w:rFonts w:asciiTheme="majorHAnsi" w:eastAsiaTheme="majorEastAsia" w:hAnsiTheme="majorHAnsi" w:cstheme="majorBidi"/>
+          <w:color w:val="0F4761" w:themeColor="accent1" w:themeShade="BF"/>
+          <w:sz w:val="32"/>
+          <w:szCs w:val="32"/>
+        </w:rPr>
+      </w:pPr>
+      <w:r>
+        <w:br w:type="page"/>
+      </w:r>
+    </w:p>
+    <w:p>
+      <w:pPr>
+        <w:pStyle w:val="Heading2"/>
+      </w:pPr>
+      <w:r>
+        <w:lastRenderedPageBreak/>
+        <w:t xml:space="preserve">Appendix </w:t>
+      </w:r>
+      <w:r>
+        <w:t>B</w:t>
+      </w:r>
+      <w:r>
+        <w:t>: Participant Ethics &amp; Consent Form</w:t>
+      </w:r>
+    </w:p>
+    <w:p>
+      <w:pPr>
+        <w:pStyle w:val="NormalWeb"/>
+        <w:spacing w:before="0" w:beforeAutospacing="0"/>
+        <w:rPr>
+          <w:rFonts w:ascii="Arial" w:hAnsi="Arial" w:cs="Arial"/>
+          <w:i/>
+          <w:iCs/>
+        </w:rPr>
+      </w:pPr>
+      <w:r>
+        <w:rPr>
+          <w:rFonts w:ascii="Arial" w:hAnsi="Arial" w:cs="Arial"/>
+          <w:b/>
+          <w:bCs/>
+          <w:i/>
+          <w:iCs/>
+        </w:rPr>
+        <w:t>Project Title:</w:t>
+      </w:r>
+      <w:r>
+        <w:rPr>
+          <w:rFonts w:ascii="Arial" w:hAnsi="Arial" w:cs="Arial"/>
+          <w:i/>
+          <w:iCs/>
+        </w:rPr>
+        <w:t xml:space="preserve"> OECD Healthcare Expenditure &amp; Life Expectancy Visualisation Dashboard</w:t>
+      </w:r>
+    </w:p>
+    <w:p>
+      <w:pPr>
+        <w:pStyle w:val="NormalWeb"/>
+        <w:spacing w:before="0" w:beforeAutospacing="0"/>
+        <w:rPr>
+          <w:rFonts w:ascii="Arial" w:hAnsi="Arial" w:cs="Arial"/>
+          <w:i/>
+          <w:iCs/>
+        </w:rPr>
+      </w:pPr>
+      <w:r>
+        <w:rPr>
+          <w:rFonts w:ascii="Arial" w:hAnsi="Arial" w:cs="Arial"/>
+          <w:b/>
+          <w:bCs/>
+          <w:i/>
+          <w:iCs/>
+        </w:rPr>
+        <w:t>Course:</w:t>
+      </w:r>
+      <w:r>
+        <w:rPr>
+          <w:rFonts w:ascii="Arial" w:hAnsi="Arial" w:cs="Arial"/>
+          <w:i/>
+          <w:iCs/>
+        </w:rPr>
+        <w:t xml:space="preserve"> COS30045 Data Visualisation (Assignment 3) </w:t>
+      </w:r>
+    </w:p>
+    <w:p>
+      <w:pPr>
+        <w:pStyle w:val="NormalWeb"/>
+        <w:spacing w:before="0" w:beforeAutospacing="0"/>
+        <w:rPr>
+          <w:rFonts w:ascii="Arial" w:hAnsi="Arial" w:cs="Arial"/>
+          <w:i/>
+          <w:iCs/>
+        </w:rPr>
+      </w:pPr>
+      <w:r>
+        <w:rPr>
+          <w:rFonts w:ascii="Arial" w:hAnsi="Arial" w:cs="Arial"/>
+          <w:b/>
+          <w:bCs/>
+          <w:i/>
+          <w:iCs/>
+        </w:rPr>
+        <w:t>1. Purpose of Study:</w:t>
+      </w:r>
+      <w:r>
+        <w:rPr>
+          <w:rFonts w:ascii="Arial" w:hAnsi="Arial" w:cs="Arial"/>
+          <w:i/>
+          <w:iCs/>
+        </w:rPr>
+        <w:t xml:space="preserve"> You are invited to participate in a usability evaluation of an interactive data visuali</w:t>
+      </w:r>
+      <w:r>
+        <w:rPr>
+          <w:rFonts w:ascii="Arial" w:hAnsi="Arial" w:cs="Arial"/>
+          <w:i/>
+          <w:iCs/>
+        </w:rPr>
+        <w:t>s</w:t>
+      </w:r>
+      <w:r>
+        <w:rPr>
+          <w:rFonts w:ascii="Arial" w:hAnsi="Arial" w:cs="Arial"/>
+          <w:i/>
+          <w:iCs/>
+        </w:rPr>
+        <w:t xml:space="preserve">ation </w:t>
+      </w:r>
+      <w:r>
+        <w:rPr>
+          <w:rFonts w:ascii="Arial" w:hAnsi="Arial" w:cs="Arial"/>
+          <w:i/>
+          <w:iCs/>
+        </w:rPr>
+        <w:t>website</w:t>
+      </w:r>
+      <w:r>
+        <w:rPr>
+          <w:rFonts w:ascii="Arial" w:hAnsi="Arial" w:cs="Arial"/>
+          <w:i/>
+          <w:iCs/>
+        </w:rPr>
+        <w:t xml:space="preserve"> exploring healthcare spending and life expectancy across OECD nations. </w:t>
+      </w:r>
+    </w:p>
+    <w:p>
+      <w:pPr>
+        <w:pStyle w:val="NormalWeb"/>
+        <w:spacing w:before="0" w:beforeAutospacing="0"/>
+        <w:rPr>
+          <w:rFonts w:ascii="Arial" w:hAnsi="Arial" w:cs="Arial"/>
+          <w:i/>
+          <w:iCs/>
+        </w:rPr>
+      </w:pPr>
+      <w:r>
+        <w:rPr>
+          <w:rFonts w:ascii="Arial" w:hAnsi="Arial" w:cs="Arial"/>
+          <w:b/>
+          <w:bCs/>
+          <w:i/>
+          <w:iCs/>
+        </w:rPr>
+        <w:t>2. Participant Involvement:</w:t>
+      </w:r>
+      <w:r>
+        <w:rPr>
+          <w:rFonts w:ascii="Arial" w:hAnsi="Arial" w:cs="Arial"/>
+          <w:i/>
+          <w:iCs/>
+        </w:rPr>
+        <w:t xml:space="preserve"> You will be asked to perform 4 brief data discovery tasks using the website and complete a short 4-question feedback survey. This session takes approximately 10–15 minutes. </w:t>
+      </w:r>
+    </w:p>
+    <w:p>
+      <w:pPr>
+        <w:pStyle w:val="NormalWeb"/>
+        <w:spacing w:before="0" w:beforeAutospacing="0"/>
+        <w:rPr>
+          <w:rFonts w:ascii="Arial" w:hAnsi="Arial" w:cs="Arial"/>
+          <w:i/>
+          <w:iCs/>
+        </w:rPr>
+      </w:pPr>
+      <w:r>
+        <w:rPr>
+          <w:rFonts w:ascii="Arial" w:hAnsi="Arial" w:cs="Arial"/>
+          <w:b/>
+          <w:bCs/>
+          <w:i/>
+          <w:iCs/>
+        </w:rPr>
+        <w:t>3. Confidentiality:</w:t>
+      </w:r>
+      <w:r>
+        <w:rPr>
+          <w:rFonts w:ascii="Arial" w:hAnsi="Arial" w:cs="Arial"/>
+          <w:i/>
+          <w:iCs/>
+        </w:rPr>
+        <w:t xml:space="preserve"> All collected data is completely anonymous. No personal identifiers, name, or contact details will be stored or published in the final academic report. </w:t>
+      </w:r>
+    </w:p>
+    <w:p>
+      <w:pPr>
+        <w:pStyle w:val="NormalWeb"/>
+        <w:spacing w:before="0" w:beforeAutospacing="0"/>
+        <w:rPr>
+          <w:rFonts w:ascii="Arial" w:hAnsi="Arial" w:cs="Arial"/>
+          <w:i/>
+          <w:iCs/>
+        </w:rPr>
+      </w:pPr>
+      <w:r>
+        <w:rPr>
+          <w:rFonts w:ascii="Arial" w:hAnsi="Arial" w:cs="Arial"/>
+          <w:b/>
+          <w:bCs/>
+          <w:i/>
+          <w:iCs/>
+        </w:rPr>
+        <w:t>4. Voluntary Participation:</w:t>
+      </w:r>
+      <w:r>
+        <w:rPr>
+          <w:rFonts w:ascii="Arial" w:hAnsi="Arial" w:cs="Arial"/>
+          <w:i/>
+          <w:iCs/>
+        </w:rPr>
+        <w:t xml:space="preserve"> Your participation is completely voluntary. You may choose to stop at any time without providing a reason. </w:t>
+      </w:r>
+    </w:p>
+    <w:p>
+      <w:pPr>
+        <w:pStyle w:val="NormalWeb"/>
+        <w:spacing w:before="0" w:beforeAutospacing="0"/>
+        <w:rPr>
+          <w:rFonts w:ascii="Arial" w:hAnsi="Arial" w:cs="Arial"/>
+          <w:b/>
+          <w:bCs/>
+          <w:i/>
+          <w:iCs/>
+        </w:rPr>
+      </w:pPr>
+    </w:p>
+    <w:p>
+      <w:pPr>
+        <w:pStyle w:val="NormalWeb"/>
+        <w:spacing w:before="0" w:beforeAutospacing="0"/>
+        <w:rPr>
+          <w:rFonts w:ascii="Arial" w:hAnsi="Arial" w:cs="Arial"/>
+          <w:i/>
+          <w:iCs/>
+        </w:rPr>
+      </w:pPr>
+      <w:r>
+        <w:rPr>
+          <w:rFonts w:ascii="Arial" w:hAnsi="Arial" w:cs="Arial"/>
+          <w:b/>
+          <w:bCs/>
+          <w:i/>
+          <w:iCs/>
+        </w:rPr>
+        <w:t>Participant Declaration:</w:t>
+      </w:r>
+    </w:p>
+    <w:p>
+      <w:pPr>
+        <w:pStyle w:val="NormalWeb"/>
+        <w:spacing w:before="0" w:beforeAutospacing="0"/>
+        <w:rPr>
+          <w:rFonts w:ascii="Arial" w:hAnsi="Arial" w:cs="Arial"/>
+          <w:i/>
+          <w:iCs/>
+        </w:rPr>
+      </w:pPr>
+      <w:r>
+        <w:rPr>
+          <w:rFonts w:ascii="Arial" w:hAnsi="Arial" w:cs="Arial"/>
+          <w:i/>
+          <w:iCs/>
+        </w:rPr>
+        <w:t xml:space="preserve">I have read and understood the information above and voluntarily agree to participate in this evaluation study. </w:t>
+      </w:r>
+    </w:p>
+    <w:p>
+      <w:pPr>
+        <w:pStyle w:val="NormalWeb"/>
+        <w:spacing w:before="0" w:beforeAutospacing="0"/>
+        <w:rPr>
+          <w:rFonts w:ascii="Arial" w:hAnsi="Arial" w:cs="Arial"/>
+          <w:i/>
+          <w:iCs/>
+        </w:rPr>
+      </w:pPr>
+      <w:r>
+        <w:rPr>
+          <w:rFonts w:ascii="Arial" w:hAnsi="Arial" w:cs="Arial"/>
+          <w:b/>
+          <w:bCs/>
+          <w:i/>
+          <w:iCs/>
+        </w:rPr>
+        <w:t>Participant Code:</w:t>
+      </w:r>
+      <w:r>
+        <w:rPr>
+          <w:rFonts w:ascii="Arial" w:hAnsi="Arial" w:cs="Arial"/>
+          <w:i/>
+          <w:iCs/>
+        </w:rPr>
+        <w:t xml:space="preserve"> </w:t>
+      </w:r>
+    </w:p>
+    <w:p>
+      <w:pPr>
+        <w:pStyle w:val="NormalWeb"/>
+        <w:spacing w:before="0" w:beforeAutospacing="0"/>
+        <w:rPr>
+          <w:rFonts w:ascii="Arial" w:hAnsi="Arial" w:cs="Arial"/>
+          <w:i/>
+          <w:iCs/>
+        </w:rPr>
+      </w:pPr>
+      <w:r>
+        <w:rPr>
+          <w:rFonts w:ascii="Arial" w:hAnsi="Arial" w:cs="Arial"/>
+          <w:b/>
+          <w:bCs/>
+          <w:i/>
+          <w:iCs/>
+        </w:rPr>
+        <w:t>Date:</w:t>
+      </w:r>
+      <w:r>
+        <w:rPr>
+          <w:rFonts w:ascii="Arial" w:hAnsi="Arial" w:cs="Arial"/>
+          <w:i/>
+          <w:iCs/>
+        </w:rPr>
+        <w:t xml:space="preserve"> </w:t>
+      </w:r>
+    </w:p>
+    <w:p>
+      <w:pPr>
+        <w:pStyle w:val="NormalWeb"/>
+        <w:spacing w:before="0" w:beforeAutospacing="0"/>
+        <w:rPr>
+          <w:i/>
+          <w:iCs/>
+        </w:rPr>
+      </w:pPr>
+      <w:r>
+        <w:rPr>
+          <w:rFonts w:ascii="Arial" w:hAnsi="Arial" w:cs="Arial"/>
+          <w:b/>
+          <w:bCs/>
+          <w:i/>
+          <w:iCs/>
+        </w:rPr>
+        <w:t>Initials (digital signature)</w:t>
+      </w:r>
+      <w:r>
+        <w:rPr>
+          <w:rFonts w:ascii="Arial" w:hAnsi="Arial" w:cs="Arial"/>
+          <w:b/>
+          <w:bCs/>
+          <w:i/>
+          <w:iCs/>
+        </w:rPr>
+        <w:t>:</w:t>
+      </w:r>
+      <w:r>
+        <w:rPr>
+          <w:rFonts w:ascii="Arial" w:hAnsi="Arial" w:cs="Arial"/>
+          <w:i/>
+          <w:iCs/>
+        </w:rPr>
+        <w:t xml:space="preserve"> </w:t>
+      </w:r>
+    </w:p>
     <w:sectPr>
       <w:type w:val="continuous"/>
       <w:pgSz w:w="11906" w:h="16838"/>
@@ -4257,7 +6404,7 @@
 </file>
 
 <file path=word/endnotes.xml><?xml version="1.0" encoding="utf-8"?>
-<w:endnotes xmlns:wpc="http://schemas.microsoft.com/office/word/2010/wordprocessingCanvas" xmlns:cx="http://schemas.microsoft.com/office/drawing/2014/chartex" xmlns:cx1="http://schemas.microsoft.com/office/drawing/2015/9/8/chartex" xmlns:cx2="http://schemas.microsoft.com/office/drawing/2015/10/21/chartex" xmlns:cx3="http://schemas.microsoft.com/office/drawing/2016/5/9/chartex" xmlns:cx4="http://schemas.microsoft.com/office/drawing/2016/5/10/chartex" xmlns:cx5="http://schemas.microsoft.com/office/drawing/2016/5/11/chartex" xmlns:cx6="http://schemas.microsoft.com/office/drawing/2016/5/12/chartex" xmlns:cx7="http://schemas.microsoft.com/office/drawing/2016/5/13/chartex" xmlns:cx8="http://schemas.microsoft.com/office/drawing/2016/5/14/chartex" xmlns:mc="http://schemas.openxmlformats.org/markup-compatibility/2006" xmlns:aink="http://schemas.microsoft.com/office/drawing/2016/ink" xmlns:am3d="http://schemas.microsoft.com/office/drawing/2017/model3d" xmlns:o="urn:schemas-microsoft-com:office:office" xmlns:oel="http://schemas.microsoft.com/office/2019/extlst" xmlns:r="http://schemas.openxmlformats.org/officeDocument/2006/relationships" xmlns:m="http://schemas.openxmlformats.org/officeDocument/2006/math" xmlns:v="urn:schemas-microsoft-com:vml" xmlns:wp14="http://schemas.microsoft.com/office/word/2010/wordprocessingDrawing" xmlns:wp="http://schemas.openxmlformats.org/drawingml/2006/wordprocessingDrawing" xmlns:w10="urn:schemas-microsoft-com:office:word" xmlns:w="http://schemas.openxmlformats.org/wordprocessingml/2006/main" xmlns:w14="http://schemas.microsoft.com/office/word/2010/wordml" xmlns:w15="http://schemas.microsoft.com/office/word/2012/wordml" xmlns:w16cex="http://schemas.microsoft.com/office/word/2018/wordml/cex" xmlns:w16cid="http://schemas.microsoft.com/office/word/2016/wordml/cid" xmlns:w16="http://schemas.microsoft.com/office/word/2018/wordml" xmlns:w16du="http://schemas.microsoft.com/office/word/2023/wordml/word16du" xmlns:w16sdtdh="http://schemas.microsoft.com/office/word/2020/wordml/sdtdatahash" xmlns:w16sdtfl="http://schemas.microsoft.com/office/word/2024/wordml/sdtformatlock" xmlns:w16se="http://schemas.microsoft.com/office/word/2015/wordml/symex" xmlns:wpg="http://schemas.microsoft.com/office/word/2010/wordprocessingGroup" xmlns:wpi="http://schemas.microsoft.com/office/word/2010/wordprocessingInk" xmlns:wne="http://schemas.microsoft.com/office/word/2006/wordml" xmlns:wps="http://schemas.microsoft.com/office/word/2010/wordprocessingShape" mc:Ignorable="w14 w15 w16se w16cid w16 w16cex w16sdtdh w16sdtfl w16du wp14">
+<w:endnotes xmlns:wpc="http://schemas.microsoft.com/office/word/2010/wordprocessingCanvas" xmlns:cx="http://schemas.microsoft.com/office/drawing/2014/chartex" xmlns:cx1="http://schemas.microsoft.com/office/drawing/2015/9/8/chartex" xmlns:cx2="http://schemas.microsoft.com/office/drawing/2015/10/21/chartex" xmlns:cx3="http://schemas.microsoft.com/office/drawing/2016/5/9/chartex" xmlns:cx4="http://schemas.microsoft.com/office/drawing/2016/5/10/chartex" xmlns:cx5="http://schemas.microsoft.com/office/drawing/2016/5/11/chartex" xmlns:cx6="http://schemas.microsoft.com/office/drawing/2016/5/12/chartex" xmlns:cx7="http://schemas.microsoft.com/office/drawing/2016/5/13/chartex" xmlns:cx8="http://schemas.microsoft.com/office/drawing/2016/5/14/chartex" xmlns:mc="http://schemas.openxmlformats.org/markup-compatibility/2006" xmlns:m="http://schemas.openxmlformats.org/officeDocument/2006/math" xmlns:aink="http://schemas.microsoft.com/office/drawing/2016/ink" xmlns:am3d="http://schemas.microsoft.com/office/drawing/2017/model3d" xmlns:oel="http://schemas.microsoft.com/office/2019/extlst" xmlns:r="http://schemas.openxmlformats.org/officeDocument/2006/relationships" xmlns:wp14="http://schemas.microsoft.com/office/word/2010/wordprocessingDrawing" xmlns:wp="http://schemas.openxmlformats.org/drawingml/2006/wordprocessingDrawing" xmlns:wpg="http://schemas.microsoft.com/office/word/2010/wordprocessingGroup" xmlns:wpi="http://schemas.microsoft.com/office/word/2010/wordprocessingInk" xmlns:wps="http://schemas.microsoft.com/office/word/2010/wordprocessingShape" xmlns:o="urn:schemas-microsoft-com:office:office" xmlns:v="urn:schemas-microsoft-com:vml" xmlns:w10="urn:schemas-microsoft-com:office:word" xmlns:w="http://schemas.openxmlformats.org/wordprocessingml/2006/main" xmlns:w14="http://schemas.microsoft.com/office/word/2010/wordml" xmlns:w15="http://schemas.microsoft.com/office/word/2012/wordml" xmlns:w16cex="http://schemas.microsoft.com/office/word/2018/wordml/cex" xmlns:w16cid="http://schemas.microsoft.com/office/word/2016/wordml/cid" xmlns:w16="http://schemas.microsoft.com/office/word/2018/wordml" xmlns:w16sdtdh="http://schemas.microsoft.com/office/word/2020/wordml/sdtdatahash" xmlns:w16sdtfl="http://schemas.microsoft.com/office/word/2024/wordml/sdtformatlock" xmlns:w16se="http://schemas.microsoft.com/office/word/2015/wordml/symex" xmlns:w16du="http://schemas.microsoft.com/office/word/2023/wordml/word16du" xmlns:wne="http://schemas.microsoft.com/office/word/2006/wordml" mc:Ignorable="w14 w15 w16se w16cid w16 w16cex w16sdtdh w16sdtfl w16du wp14">
   <w:endnote w:type="separator" w:id="-1">
     <w:p>
       <w:pPr>
@@ -4282,7 +6429,7 @@
 </file>
 
 <file path=word/footnotes.xml><?xml version="1.0" encoding="utf-8"?>
-<w:footnotes xmlns:wpc="http://schemas.microsoft.com/office/word/2010/wordprocessingCanvas" xmlns:cx="http://schemas.microsoft.com/office/drawing/2014/chartex" xmlns:cx1="http://schemas.microsoft.com/office/drawing/2015/9/8/chartex" xmlns:cx2="http://schemas.microsoft.com/office/drawing/2015/10/21/chartex" xmlns:cx3="http://schemas.microsoft.com/office/drawing/2016/5/9/chartex" xmlns:cx4="http://schemas.microsoft.com/office/drawing/2016/5/10/chartex" xmlns:cx5="http://schemas.microsoft.com/office/drawing/2016/5/11/chartex" xmlns:cx6="http://schemas.microsoft.com/office/drawing/2016/5/12/chartex" xmlns:cx7="http://schemas.microsoft.com/office/drawing/2016/5/13/chartex" xmlns:cx8="http://schemas.microsoft.com/office/drawing/2016/5/14/chartex" xmlns:mc="http://schemas.openxmlformats.org/markup-compatibility/2006" xmlns:aink="http://schemas.microsoft.com/office/drawing/2016/ink" xmlns:am3d="http://schemas.microsoft.com/office/drawing/2017/model3d" xmlns:o="urn:schemas-microsoft-com:office:office" xmlns:oel="http://schemas.microsoft.com/office/2019/extlst" xmlns:r="http://schemas.openxmlformats.org/officeDocument/2006/relationships" xmlns:m="http://schemas.openxmlformats.org/officeDocument/2006/math" xmlns:v="urn:schemas-microsoft-com:vml" xmlns:wp14="http://schemas.microsoft.com/office/word/2010/wordprocessingDrawing" xmlns:wp="http://schemas.openxmlformats.org/drawingml/2006/wordprocessingDrawing" xmlns:w10="urn:schemas-microsoft-com:office:word" xmlns:w="http://schemas.openxmlformats.org/wordprocessingml/2006/main" xmlns:w14="http://schemas.microsoft.com/office/word/2010/wordml" xmlns:w15="http://schemas.microsoft.com/office/word/2012/wordml" xmlns:w16cex="http://schemas.microsoft.com/office/word/2018/wordml/cex" xmlns:w16cid="http://schemas.microsoft.com/office/word/2016/wordml/cid" xmlns:w16="http://schemas.microsoft.com/office/word/2018/wordml" xmlns:w16du="http://schemas.microsoft.com/office/word/2023/wordml/word16du" xmlns:w16sdtdh="http://schemas.microsoft.com/office/word/2020/wordml/sdtdatahash" xmlns:w16sdtfl="http://schemas.microsoft.com/office/word/2024/wordml/sdtformatlock" xmlns:w16se="http://schemas.microsoft.com/office/word/2015/wordml/symex" xmlns:wpg="http://schemas.microsoft.com/office/word/2010/wordprocessingGroup" xmlns:wpi="http://schemas.microsoft.com/office/word/2010/wordprocessingInk" xmlns:wne="http://schemas.microsoft.com/office/word/2006/wordml" xmlns:wps="http://schemas.microsoft.com/office/word/2010/wordprocessingShape" mc:Ignorable="w14 w15 w16se w16cid w16 w16cex w16sdtdh w16sdtfl w16du wp14">
+<w:footnotes xmlns:wpc="http://schemas.microsoft.com/office/word/2010/wordprocessingCanvas" xmlns:cx="http://schemas.microsoft.com/office/drawing/2014/chartex" xmlns:cx1="http://schemas.microsoft.com/office/drawing/2015/9/8/chartex" xmlns:cx2="http://schemas.microsoft.com/office/drawing/2015/10/21/chartex" xmlns:cx3="http://schemas.microsoft.com/office/drawing/2016/5/9/chartex" xmlns:cx4="http://schemas.microsoft.com/office/drawing/2016/5/10/chartex" xmlns:cx5="http://schemas.microsoft.com/office/drawing/2016/5/11/chartex" xmlns:cx6="http://schemas.microsoft.com/office/drawing/2016/5/12/chartex" xmlns:cx7="http://schemas.microsoft.com/office/drawing/2016/5/13/chartex" xmlns:cx8="http://schemas.microsoft.com/office/drawing/2016/5/14/chartex" xmlns:mc="http://schemas.openxmlformats.org/markup-compatibility/2006" xmlns:m="http://schemas.openxmlformats.org/officeDocument/2006/math" xmlns:aink="http://schemas.microsoft.com/office/drawing/2016/ink" xmlns:am3d="http://schemas.microsoft.com/office/drawing/2017/model3d" xmlns:oel="http://schemas.microsoft.com/office/2019/extlst" xmlns:r="http://schemas.openxmlformats.org/officeDocument/2006/relationships" xmlns:wp14="http://schemas.microsoft.com/office/word/2010/wordprocessingDrawing" xmlns:wp="http://schemas.openxmlformats.org/drawingml/2006/wordprocessingDrawing" xmlns:wpg="http://schemas.microsoft.com/office/word/2010/wordprocessingGroup" xmlns:wpi="http://schemas.microsoft.com/office/word/2010/wordprocessingInk" xmlns:wps="http://schemas.microsoft.com/office/word/2010/wordprocessingShape" xmlns:o="urn:schemas-microsoft-com:office:office" xmlns:v="urn:schemas-microsoft-com:vml" xmlns:w10="urn:schemas-microsoft-com:office:word" xmlns:w="http://schemas.openxmlformats.org/wordprocessingml/2006/main" xmlns:w14="http://schemas.microsoft.com/office/word/2010/wordml" xmlns:w15="http://schemas.microsoft.com/office/word/2012/wordml" xmlns:w16cex="http://schemas.microsoft.com/office/word/2018/wordml/cex" xmlns:w16cid="http://schemas.microsoft.com/office/word/2016/wordml/cid" xmlns:w16="http://schemas.microsoft.com/office/word/2018/wordml" xmlns:w16sdtdh="http://schemas.microsoft.com/office/word/2020/wordml/sdtdatahash" xmlns:w16sdtfl="http://schemas.microsoft.com/office/word/2024/wordml/sdtformatlock" xmlns:w16se="http://schemas.microsoft.com/office/word/2015/wordml/symex" xmlns:w16du="http://schemas.microsoft.com/office/word/2023/wordml/word16du" xmlns:wne="http://schemas.microsoft.com/office/word/2006/wordml" mc:Ignorable="w14 w15 w16se w16cid w16 w16cex w16sdtdh w16sdtfl w16du wp14">
   <w:footnote w:type="separator" w:id="-1">
     <w:p>
       <w:pPr>
@@ -4307,7 +6454,7 @@
 </file>
 
 <file path=word/header1.xml><?xml version="1.0" encoding="utf-8"?>
-<w:hdr xmlns:wpc="http://schemas.microsoft.com/office/word/2010/wordprocessingCanvas" xmlns:cx="http://schemas.microsoft.com/office/drawing/2014/chartex" xmlns:cx1="http://schemas.microsoft.com/office/drawing/2015/9/8/chartex" xmlns:cx2="http://schemas.microsoft.com/office/drawing/2015/10/21/chartex" xmlns:cx3="http://schemas.microsoft.com/office/drawing/2016/5/9/chartex" xmlns:cx4="http://schemas.microsoft.com/office/drawing/2016/5/10/chartex" xmlns:cx5="http://schemas.microsoft.com/office/drawing/2016/5/11/chartex" xmlns:cx6="http://schemas.microsoft.com/office/drawing/2016/5/12/chartex" xmlns:cx7="http://schemas.microsoft.com/office/drawing/2016/5/13/chartex" xmlns:cx8="http://schemas.microsoft.com/office/drawing/2016/5/14/chartex" xmlns:mc="http://schemas.openxmlformats.org/markup-compatibility/2006" xmlns:aink="http://schemas.microsoft.com/office/drawing/2016/ink" xmlns:am3d="http://schemas.microsoft.com/office/drawing/2017/model3d" xmlns:o="urn:schemas-microsoft-com:office:office" xmlns:oel="http://schemas.microsoft.com/office/2019/extlst" xmlns:r="http://schemas.openxmlformats.org/officeDocument/2006/relationships" xmlns:m="http://schemas.openxmlformats.org/officeDocument/2006/math" xmlns:v="urn:schemas-microsoft-com:vml" xmlns:wp14="http://schemas.microsoft.com/office/word/2010/wordprocessingDrawing" xmlns:wp="http://schemas.openxmlformats.org/drawingml/2006/wordprocessingDrawing" xmlns:w10="urn:schemas-microsoft-com:office:word" xmlns:w="http://schemas.openxmlformats.org/wordprocessingml/2006/main" xmlns:w14="http://schemas.microsoft.com/office/word/2010/wordml" xmlns:w15="http://schemas.microsoft.com/office/word/2012/wordml" xmlns:w16cex="http://schemas.microsoft.com/office/word/2018/wordml/cex" xmlns:w16cid="http://schemas.microsoft.com/office/word/2016/wordml/cid" xmlns:w16="http://schemas.microsoft.com/office/word/2018/wordml" xmlns:w16du="http://schemas.microsoft.com/office/word/2023/wordml/word16du" xmlns:w16sdtdh="http://schemas.microsoft.com/office/word/2020/wordml/sdtdatahash" xmlns:w16sdtfl="http://schemas.microsoft.com/office/word/2024/wordml/sdtformatlock" xmlns:w16se="http://schemas.microsoft.com/office/word/2015/wordml/symex" xmlns:wpg="http://schemas.microsoft.com/office/word/2010/wordprocessingGroup" xmlns:wpi="http://schemas.microsoft.com/office/word/2010/wordprocessingInk" xmlns:wne="http://schemas.microsoft.com/office/word/2006/wordml" xmlns:wps="http://schemas.microsoft.com/office/word/2010/wordprocessingShape" mc:Ignorable="w14 w15 w16se w16cid w16 w16cex w16sdtdh w16sdtfl w16du wp14">
+<w:hdr xmlns:wpc="http://schemas.microsoft.com/office/word/2010/wordprocessingCanvas" xmlns:cx="http://schemas.microsoft.com/office/drawing/2014/chartex" xmlns:cx1="http://schemas.microsoft.com/office/drawing/2015/9/8/chartex" xmlns:cx2="http://schemas.microsoft.com/office/drawing/2015/10/21/chartex" xmlns:cx3="http://schemas.microsoft.com/office/drawing/2016/5/9/chartex" xmlns:cx4="http://schemas.microsoft.com/office/drawing/2016/5/10/chartex" xmlns:cx5="http://schemas.microsoft.com/office/drawing/2016/5/11/chartex" xmlns:cx6="http://schemas.microsoft.com/office/drawing/2016/5/12/chartex" xmlns:cx7="http://schemas.microsoft.com/office/drawing/2016/5/13/chartex" xmlns:cx8="http://schemas.microsoft.com/office/drawing/2016/5/14/chartex" xmlns:mc="http://schemas.openxmlformats.org/markup-compatibility/2006" xmlns:m="http://schemas.openxmlformats.org/officeDocument/2006/math" xmlns:aink="http://schemas.microsoft.com/office/drawing/2016/ink" xmlns:am3d="http://schemas.microsoft.com/office/drawing/2017/model3d" xmlns:oel="http://schemas.microsoft.com/office/2019/extlst" xmlns:r="http://schemas.openxmlformats.org/officeDocument/2006/relationships" xmlns:wp14="http://schemas.microsoft.com/office/word/2010/wordprocessingDrawing" xmlns:wp="http://schemas.openxmlformats.org/drawingml/2006/wordprocessingDrawing" xmlns:wpg="http://schemas.microsoft.com/office/word/2010/wordprocessingGroup" xmlns:wpi="http://schemas.microsoft.com/office/word/2010/wordprocessingInk" xmlns:wps="http://schemas.microsoft.com/office/word/2010/wordprocessingShape" xmlns:o="urn:schemas-microsoft-com:office:office" xmlns:v="urn:schemas-microsoft-com:vml" xmlns:w10="urn:schemas-microsoft-com:office:word" xmlns:w="http://schemas.openxmlformats.org/wordprocessingml/2006/main" xmlns:w14="http://schemas.microsoft.com/office/word/2010/wordml" xmlns:w15="http://schemas.microsoft.com/office/word/2012/wordml" xmlns:w16cex="http://schemas.microsoft.com/office/word/2018/wordml/cex" xmlns:w16cid="http://schemas.microsoft.com/office/word/2016/wordml/cid" xmlns:w16="http://schemas.microsoft.com/office/word/2018/wordml" xmlns:w16sdtdh="http://schemas.microsoft.com/office/word/2020/wordml/sdtdatahash" xmlns:w16sdtfl="http://schemas.microsoft.com/office/word/2024/wordml/sdtformatlock" xmlns:w16se="http://schemas.microsoft.com/office/word/2015/wordml/symex" xmlns:w16du="http://schemas.microsoft.com/office/word/2023/wordml/word16du" xmlns:wne="http://schemas.microsoft.com/office/word/2006/wordml" mc:Ignorable="w14 w15 w16se w16cid w16 w16cex w16sdtdh w16sdtfl w16du wp14">
   <w:p>
     <w:pPr>
       <w:pStyle w:val="Header"/>
@@ -4330,7 +6477,7 @@
 </file>
 
 <file path=word/numbering.xml><?xml version="1.0" encoding="utf-8"?>
-<w:numbering xmlns:wpc="http://schemas.microsoft.com/office/word/2010/wordprocessingCanvas" xmlns:cx="http://schemas.microsoft.com/office/drawing/2014/chartex" xmlns:cx1="http://schemas.microsoft.com/office/drawing/2015/9/8/chartex" xmlns:cx2="http://schemas.microsoft.com/office/drawing/2015/10/21/chartex" xmlns:cx3="http://schemas.microsoft.com/office/drawing/2016/5/9/chartex" xmlns:cx4="http://schemas.microsoft.com/office/drawing/2016/5/10/chartex" xmlns:cx5="http://schemas.microsoft.com/office/drawing/2016/5/11/chartex" xmlns:cx6="http://schemas.microsoft.com/office/drawing/2016/5/12/chartex" xmlns:cx7="http://schemas.microsoft.com/office/drawing/2016/5/13/chartex" xmlns:cx8="http://schemas.microsoft.com/office/drawing/2016/5/14/chartex" xmlns:mc="http://schemas.openxmlformats.org/markup-compatibility/2006" xmlns:aink="http://schemas.microsoft.com/office/drawing/2016/ink" xmlns:am3d="http://schemas.microsoft.com/office/drawing/2017/model3d" xmlns:o="urn:schemas-microsoft-com:office:office" xmlns:oel="http://schemas.microsoft.com/office/2019/extlst" xmlns:r="http://schemas.openxmlformats.org/officeDocument/2006/relationships" xmlns:m="http://schemas.openxmlformats.org/officeDocument/2006/math" xmlns:v="urn:schemas-microsoft-com:vml" xmlns:wp14="http://schemas.microsoft.com/office/word/2010/wordprocessingDrawing" xmlns:wp="http://schemas.openxmlformats.org/drawingml/2006/wordprocessingDrawing" xmlns:w10="urn:schemas-microsoft-com:office:word" xmlns:w="http://schemas.openxmlformats.org/wordprocessingml/2006/main" xmlns:w14="http://schemas.microsoft.com/office/word/2010/wordml" xmlns:w15="http://schemas.microsoft.com/office/word/2012/wordml" xmlns:w16cex="http://schemas.microsoft.com/office/word/2018/wordml/cex" xmlns:w16cid="http://schemas.microsoft.com/office/word/2016/wordml/cid" xmlns:w16="http://schemas.microsoft.com/office/word/2018/wordml" xmlns:w16du="http://schemas.microsoft.com/office/word/2023/wordml/word16du" xmlns:w16sdtdh="http://schemas.microsoft.com/office/word/2020/wordml/sdtdatahash" xmlns:w16sdtfl="http://schemas.microsoft.com/office/word/2024/wordml/sdtformatlock" xmlns:w16se="http://schemas.microsoft.com/office/word/2015/wordml/symex" xmlns:wpg="http://schemas.microsoft.com/office/word/2010/wordprocessingGroup" xmlns:wpi="http://schemas.microsoft.com/office/word/2010/wordprocessingInk" xmlns:wne="http://schemas.microsoft.com/office/word/2006/wordml" xmlns:wps="http://schemas.microsoft.com/office/word/2010/wordprocessingShape" mc:Ignorable="w14 w15 w16se w16cid w16 w16cex w16sdtdh w16sdtfl w16du wp14">
+<w:numbering xmlns:wpc="http://schemas.microsoft.com/office/word/2010/wordprocessingCanvas" xmlns:cx="http://schemas.microsoft.com/office/drawing/2014/chartex" xmlns:cx1="http://schemas.microsoft.com/office/drawing/2015/9/8/chartex" xmlns:cx2="http://schemas.microsoft.com/office/drawing/2015/10/21/chartex" xmlns:cx3="http://schemas.microsoft.com/office/drawing/2016/5/9/chartex" xmlns:cx4="http://schemas.microsoft.com/office/drawing/2016/5/10/chartex" xmlns:cx5="http://schemas.microsoft.com/office/drawing/2016/5/11/chartex" xmlns:cx6="http://schemas.microsoft.com/office/drawing/2016/5/12/chartex" xmlns:cx7="http://schemas.microsoft.com/office/drawing/2016/5/13/chartex" xmlns:cx8="http://schemas.microsoft.com/office/drawing/2016/5/14/chartex" xmlns:mc="http://schemas.openxmlformats.org/markup-compatibility/2006" xmlns:m="http://schemas.openxmlformats.org/officeDocument/2006/math" xmlns:aink="http://schemas.microsoft.com/office/drawing/2016/ink" xmlns:am3d="http://schemas.microsoft.com/office/drawing/2017/model3d" xmlns:oel="http://schemas.microsoft.com/office/2019/extlst" xmlns:r="http://schemas.openxmlformats.org/officeDocument/2006/relationships" xmlns:wp14="http://schemas.microsoft.com/office/word/2010/wordprocessingDrawing" xmlns:wp="http://schemas.openxmlformats.org/drawingml/2006/wordprocessingDrawing" xmlns:wpg="http://schemas.microsoft.com/office/word/2010/wordprocessingGroup" xmlns:wpi="http://schemas.microsoft.com/office/word/2010/wordprocessingInk" xmlns:wps="http://schemas.microsoft.com/office/word/2010/wordprocessingShape" xmlns:o="urn:schemas-microsoft-com:office:office" xmlns:v="urn:schemas-microsoft-com:vml" xmlns:w10="urn:schemas-microsoft-com:office:word" xmlns:w="http://schemas.openxmlformats.org/wordprocessingml/2006/main" xmlns:w14="http://schemas.microsoft.com/office/word/2010/wordml" xmlns:w15="http://schemas.microsoft.com/office/word/2012/wordml" xmlns:w16cex="http://schemas.microsoft.com/office/word/2018/wordml/cex" xmlns:w16cid="http://schemas.microsoft.com/office/word/2016/wordml/cid" xmlns:w16="http://schemas.microsoft.com/office/word/2018/wordml" xmlns:w16sdtdh="http://schemas.microsoft.com/office/word/2020/wordml/sdtdatahash" xmlns:w16sdtfl="http://schemas.microsoft.com/office/word/2024/wordml/sdtformatlock" xmlns:w16se="http://schemas.microsoft.com/office/word/2015/wordml/symex" xmlns:w16du="http://schemas.microsoft.com/office/word/2023/wordml/word16du" xmlns:wne="http://schemas.microsoft.com/office/word/2006/wordml" mc:Ignorable="w14 w15 w16se w16cid w16 w16cex w16sdtdh w16sdtfl w16du wp14">
   <w:abstractNum w:abstractNumId="0" w15:restartNumberingAfterBreak="0">
     <w:nsid w:val="021F1635"/>
     <w:multiLevelType w:val="hybridMultilevel"/>
@@ -5850,9 +7997,9 @@
   </w:abstractNum>
   <w:abstractNum w:abstractNumId="13" w15:restartNumberingAfterBreak="0">
     <w:nsid w:val="3BD05FFD"/>
-    <w:multiLevelType w:val="hybridMultilevel"/>
-    <w:tmpl w:val="4BB85826"/>
-    <w:lvl w:ilvl="0" w:tplc="0C09000F">
+    <w:multiLevelType w:val="multilevel"/>
+    <w:tmpl w:val="678A9064"/>
+    <w:lvl w:ilvl="0">
       <w:start w:val="1"/>
       <w:numFmt w:val="decimal"/>
       <w:lvlText w:val="%1."/>
@@ -5861,80 +8008,225 @@
         <w:ind w:left="720" w:hanging="360"/>
       </w:pPr>
     </w:lvl>
-    <w:lvl w:ilvl="1" w:tplc="0C090019" w:tentative="1">
-      <w:start w:val="1"/>
-      <w:numFmt w:val="lowerLetter"/>
-      <w:lvlText w:val="%2."/>
-      <w:lvlJc w:val="left"/>
-      <w:pPr>
-        <w:ind w:left="1440" w:hanging="360"/>
-      </w:pPr>
-    </w:lvl>
-    <w:lvl w:ilvl="2" w:tplc="0C09001B" w:tentative="1">
-      <w:start w:val="1"/>
-      <w:numFmt w:val="lowerRoman"/>
-      <w:lvlText w:val="%3."/>
-      <w:lvlJc w:val="right"/>
-      <w:pPr>
-        <w:ind w:left="2160" w:hanging="180"/>
-      </w:pPr>
-    </w:lvl>
-    <w:lvl w:ilvl="3" w:tplc="0C09000F" w:tentative="1">
-      <w:start w:val="1"/>
+    <w:lvl w:ilvl="1">
+      <w:start w:val="5"/>
       <w:numFmt w:val="decimal"/>
-      <w:lvlText w:val="%4."/>
-      <w:lvlJc w:val="left"/>
-      <w:pPr>
-        <w:ind w:left="2880" w:hanging="360"/>
-      </w:pPr>
-    </w:lvl>
-    <w:lvl w:ilvl="4" w:tplc="0C090019" w:tentative="1">
-      <w:start w:val="1"/>
-      <w:numFmt w:val="lowerLetter"/>
-      <w:lvlText w:val="%5."/>
-      <w:lvlJc w:val="left"/>
-      <w:pPr>
-        <w:ind w:left="3600" w:hanging="360"/>
-      </w:pPr>
-    </w:lvl>
-    <w:lvl w:ilvl="5" w:tplc="0C09001B" w:tentative="1">
-      <w:start w:val="1"/>
-      <w:numFmt w:val="lowerRoman"/>
-      <w:lvlText w:val="%6."/>
-      <w:lvlJc w:val="right"/>
-      <w:pPr>
-        <w:ind w:left="4320" w:hanging="180"/>
-      </w:pPr>
-    </w:lvl>
-    <w:lvl w:ilvl="6" w:tplc="0C09000F" w:tentative="1">
+      <w:isLgl/>
+      <w:lvlText w:val="%1.%2"/>
+      <w:lvlJc w:val="left"/>
+      <w:pPr>
+        <w:ind w:left="840" w:hanging="480"/>
+      </w:pPr>
+      <w:rPr>
+        <w:rFonts w:hint="default"/>
+      </w:rPr>
+    </w:lvl>
+    <w:lvl w:ilvl="2">
       <w:start w:val="1"/>
       <w:numFmt w:val="decimal"/>
-      <w:lvlText w:val="%7."/>
-      <w:lvlJc w:val="left"/>
-      <w:pPr>
-        <w:ind w:left="5040" w:hanging="360"/>
-      </w:pPr>
-    </w:lvl>
-    <w:lvl w:ilvl="7" w:tplc="0C090019" w:tentative="1">
-      <w:start w:val="1"/>
-      <w:numFmt w:val="lowerLetter"/>
-      <w:lvlText w:val="%8."/>
-      <w:lvlJc w:val="left"/>
-      <w:pPr>
-        <w:ind w:left="5760" w:hanging="360"/>
-      </w:pPr>
-    </w:lvl>
-    <w:lvl w:ilvl="8" w:tplc="0C09001B" w:tentative="1">
-      <w:start w:val="1"/>
-      <w:numFmt w:val="lowerRoman"/>
-      <w:lvlText w:val="%9."/>
-      <w:lvlJc w:val="right"/>
-      <w:pPr>
-        <w:ind w:left="6480" w:hanging="180"/>
-      </w:pPr>
+      <w:isLgl/>
+      <w:lvlText w:val="%1.%2.%3"/>
+      <w:lvlJc w:val="left"/>
+      <w:pPr>
+        <w:ind w:left="1080" w:hanging="720"/>
+      </w:pPr>
+      <w:rPr>
+        <w:rFonts w:hint="default"/>
+      </w:rPr>
+    </w:lvl>
+    <w:lvl w:ilvl="3">
+      <w:start w:val="1"/>
+      <w:numFmt w:val="decimal"/>
+      <w:isLgl/>
+      <w:lvlText w:val="%1.%2.%3.%4"/>
+      <w:lvlJc w:val="left"/>
+      <w:pPr>
+        <w:ind w:left="1440" w:hanging="1080"/>
+      </w:pPr>
+      <w:rPr>
+        <w:rFonts w:hint="default"/>
+      </w:rPr>
+    </w:lvl>
+    <w:lvl w:ilvl="4">
+      <w:start w:val="1"/>
+      <w:numFmt w:val="decimal"/>
+      <w:isLgl/>
+      <w:lvlText w:val="%1.%2.%3.%4.%5"/>
+      <w:lvlJc w:val="left"/>
+      <w:pPr>
+        <w:ind w:left="1440" w:hanging="1080"/>
+      </w:pPr>
+      <w:rPr>
+        <w:rFonts w:hint="default"/>
+      </w:rPr>
+    </w:lvl>
+    <w:lvl w:ilvl="5">
+      <w:start w:val="1"/>
+      <w:numFmt w:val="decimal"/>
+      <w:isLgl/>
+      <w:lvlText w:val="%1.%2.%3.%4.%5.%6"/>
+      <w:lvlJc w:val="left"/>
+      <w:pPr>
+        <w:ind w:left="1800" w:hanging="1440"/>
+      </w:pPr>
+      <w:rPr>
+        <w:rFonts w:hint="default"/>
+      </w:rPr>
+    </w:lvl>
+    <w:lvl w:ilvl="6">
+      <w:start w:val="1"/>
+      <w:numFmt w:val="decimal"/>
+      <w:isLgl/>
+      <w:lvlText w:val="%1.%2.%3.%4.%5.%6.%7"/>
+      <w:lvlJc w:val="left"/>
+      <w:pPr>
+        <w:ind w:left="1800" w:hanging="1440"/>
+      </w:pPr>
+      <w:rPr>
+        <w:rFonts w:hint="default"/>
+      </w:rPr>
+    </w:lvl>
+    <w:lvl w:ilvl="7">
+      <w:start w:val="1"/>
+      <w:numFmt w:val="decimal"/>
+      <w:isLgl/>
+      <w:lvlText w:val="%1.%2.%3.%4.%5.%6.%7.%8"/>
+      <w:lvlJc w:val="left"/>
+      <w:pPr>
+        <w:ind w:left="2160" w:hanging="1800"/>
+      </w:pPr>
+      <w:rPr>
+        <w:rFonts w:hint="default"/>
+      </w:rPr>
+    </w:lvl>
+    <w:lvl w:ilvl="8">
+      <w:start w:val="1"/>
+      <w:numFmt w:val="decimal"/>
+      <w:isLgl/>
+      <w:lvlText w:val="%1.%2.%3.%4.%5.%6.%7.%8.%9"/>
+      <w:lvlJc w:val="left"/>
+      <w:pPr>
+        <w:ind w:left="2160" w:hanging="1800"/>
+      </w:pPr>
+      <w:rPr>
+        <w:rFonts w:hint="default"/>
+      </w:rPr>
     </w:lvl>
   </w:abstractNum>
   <w:abstractNum w:abstractNumId="14" w15:restartNumberingAfterBreak="0">
+    <w:nsid w:val="41383FE0"/>
+    <w:multiLevelType w:val="hybridMultilevel"/>
+    <w:tmpl w:val="5B7E7FBA"/>
+    <w:lvl w:ilvl="0" w:tplc="9ED8675A">
+      <w:start w:val="5"/>
+      <w:numFmt w:val="bullet"/>
+      <w:lvlText w:val="-"/>
+      <w:lvlJc w:val="left"/>
+      <w:pPr>
+        <w:ind w:left="720" w:hanging="360"/>
+      </w:pPr>
+      <w:rPr>
+        <w:rFonts w:ascii="Aptos" w:eastAsiaTheme="minorHAnsi" w:hAnsi="Aptos" w:cstheme="minorBidi" w:hint="default"/>
+      </w:rPr>
+    </w:lvl>
+    <w:lvl w:ilvl="1" w:tplc="08090003" w:tentative="1">
+      <w:start w:val="1"/>
+      <w:numFmt w:val="bullet"/>
+      <w:lvlText w:val="o"/>
+      <w:lvlJc w:val="left"/>
+      <w:pPr>
+        <w:ind w:left="1440" w:hanging="360"/>
+      </w:pPr>
+      <w:rPr>
+        <w:rFonts w:ascii="Courier New" w:hAnsi="Courier New" w:hint="default"/>
+      </w:rPr>
+    </w:lvl>
+    <w:lvl w:ilvl="2" w:tplc="08090005" w:tentative="1">
+      <w:start w:val="1"/>
+      <w:numFmt w:val="bullet"/>
+      <w:lvlText w:val=""/>
+      <w:lvlJc w:val="left"/>
+      <w:pPr>
+        <w:ind w:left="2160" w:hanging="360"/>
+      </w:pPr>
+      <w:rPr>
+        <w:rFonts w:ascii="Wingdings" w:hAnsi="Wingdings" w:hint="default"/>
+      </w:rPr>
+    </w:lvl>
+    <w:lvl w:ilvl="3" w:tplc="08090001" w:tentative="1">
+      <w:start w:val="1"/>
+      <w:numFmt w:val="bullet"/>
+      <w:lvlText w:val=""/>
+      <w:lvlJc w:val="left"/>
+      <w:pPr>
+        <w:ind w:left="2880" w:hanging="360"/>
+      </w:pPr>
+      <w:rPr>
+        <w:rFonts w:ascii="Symbol" w:hAnsi="Symbol" w:hint="default"/>
+      </w:rPr>
+    </w:lvl>
+    <w:lvl w:ilvl="4" w:tplc="08090003" w:tentative="1">
+      <w:start w:val="1"/>
+      <w:numFmt w:val="bullet"/>
+      <w:lvlText w:val="o"/>
+      <w:lvlJc w:val="left"/>
+      <w:pPr>
+        <w:ind w:left="3600" w:hanging="360"/>
+      </w:pPr>
+      <w:rPr>
+        <w:rFonts w:ascii="Courier New" w:hAnsi="Courier New" w:hint="default"/>
+      </w:rPr>
+    </w:lvl>
+    <w:lvl w:ilvl="5" w:tplc="08090005" w:tentative="1">
+      <w:start w:val="1"/>
+      <w:numFmt w:val="bullet"/>
+      <w:lvlText w:val=""/>
+      <w:lvlJc w:val="left"/>
+      <w:pPr>
+        <w:ind w:left="4320" w:hanging="360"/>
+      </w:pPr>
+      <w:rPr>
+        <w:rFonts w:ascii="Wingdings" w:hAnsi="Wingdings" w:hint="default"/>
+      </w:rPr>
+    </w:lvl>
+    <w:lvl w:ilvl="6" w:tplc="08090001" w:tentative="1">
+      <w:start w:val="1"/>
+      <w:numFmt w:val="bullet"/>
+      <w:lvlText w:val=""/>
+      <w:lvlJc w:val="left"/>
+      <w:pPr>
+        <w:ind w:left="5040" w:hanging="360"/>
+      </w:pPr>
+      <w:rPr>
+        <w:rFonts w:ascii="Symbol" w:hAnsi="Symbol" w:hint="default"/>
+      </w:rPr>
+    </w:lvl>
+    <w:lvl w:ilvl="7" w:tplc="08090003" w:tentative="1">
+      <w:start w:val="1"/>
+      <w:numFmt w:val="bullet"/>
+      <w:lvlText w:val="o"/>
+      <w:lvlJc w:val="left"/>
+      <w:pPr>
+        <w:ind w:left="5760" w:hanging="360"/>
+      </w:pPr>
+      <w:rPr>
+        <w:rFonts w:ascii="Courier New" w:hAnsi="Courier New" w:hint="default"/>
+      </w:rPr>
+    </w:lvl>
+    <w:lvl w:ilvl="8" w:tplc="08090005" w:tentative="1">
+      <w:start w:val="1"/>
+      <w:numFmt w:val="bullet"/>
+      <w:lvlText w:val=""/>
+      <w:lvlJc w:val="left"/>
+      <w:pPr>
+        <w:ind w:left="6480" w:hanging="360"/>
+      </w:pPr>
+      <w:rPr>
+        <w:rFonts w:ascii="Wingdings" w:hAnsi="Wingdings" w:hint="default"/>
+      </w:rPr>
+    </w:lvl>
+  </w:abstractNum>
+  <w:abstractNum w:abstractNumId="15" w15:restartNumberingAfterBreak="0">
     <w:nsid w:val="4FDC6496"/>
     <w:multiLevelType w:val="multilevel"/>
     <w:tmpl w:val="48F4121C"/>
@@ -6083,7 +8375,7 @@
       </w:rPr>
     </w:lvl>
   </w:abstractNum>
-  <w:abstractNum w:abstractNumId="15" w15:restartNumberingAfterBreak="0">
+  <w:abstractNum w:abstractNumId="16" w15:restartNumberingAfterBreak="0">
     <w:nsid w:val="64084BC9"/>
     <w:multiLevelType w:val="hybridMultilevel"/>
     <w:tmpl w:val="593CE5C8"/>
@@ -6196,7 +8488,7 @@
       </w:rPr>
     </w:lvl>
   </w:abstractNum>
-  <w:abstractNum w:abstractNumId="16" w15:restartNumberingAfterBreak="0">
+  <w:abstractNum w:abstractNumId="17" w15:restartNumberingAfterBreak="0">
     <w:nsid w:val="64E20DBE"/>
     <w:multiLevelType w:val="hybridMultilevel"/>
     <w:tmpl w:val="E2B83AFE"/>
@@ -6309,7 +8601,7 @@
       </w:rPr>
     </w:lvl>
   </w:abstractNum>
-  <w:abstractNum w:abstractNumId="17" w15:restartNumberingAfterBreak="0">
+  <w:abstractNum w:abstractNumId="18" w15:restartNumberingAfterBreak="0">
     <w:nsid w:val="656A5517"/>
     <w:multiLevelType w:val="hybridMultilevel"/>
     <w:tmpl w:val="4A64655C"/>
@@ -6422,7 +8714,7 @@
       </w:rPr>
     </w:lvl>
   </w:abstractNum>
-  <w:abstractNum w:abstractNumId="18" w15:restartNumberingAfterBreak="0">
+  <w:abstractNum w:abstractNumId="19" w15:restartNumberingAfterBreak="0">
     <w:nsid w:val="712F6703"/>
     <w:multiLevelType w:val="hybridMultilevel"/>
     <w:tmpl w:val="D41E36E2"/>
@@ -6512,7 +8804,206 @@
       </w:pPr>
     </w:lvl>
   </w:abstractNum>
-  <w:abstractNum w:abstractNumId="19" w15:restartNumberingAfterBreak="0">
+  <w:abstractNum w:abstractNumId="20" w15:restartNumberingAfterBreak="0">
+    <w:nsid w:val="7217335B"/>
+    <w:multiLevelType w:val="hybridMultilevel"/>
+    <w:tmpl w:val="4BB85826"/>
+    <w:lvl w:ilvl="0" w:tplc="FFFFFFFF">
+      <w:start w:val="1"/>
+      <w:numFmt w:val="decimal"/>
+      <w:lvlText w:val="%1."/>
+      <w:lvlJc w:val="left"/>
+      <w:pPr>
+        <w:ind w:left="720" w:hanging="360"/>
+      </w:pPr>
+    </w:lvl>
+    <w:lvl w:ilvl="1" w:tplc="FFFFFFFF" w:tentative="1">
+      <w:start w:val="1"/>
+      <w:numFmt w:val="lowerLetter"/>
+      <w:lvlText w:val="%2."/>
+      <w:lvlJc w:val="left"/>
+      <w:pPr>
+        <w:ind w:left="1440" w:hanging="360"/>
+      </w:pPr>
+    </w:lvl>
+    <w:lvl w:ilvl="2" w:tplc="FFFFFFFF" w:tentative="1">
+      <w:start w:val="1"/>
+      <w:numFmt w:val="lowerRoman"/>
+      <w:lvlText w:val="%3."/>
+      <w:lvlJc w:val="right"/>
+      <w:pPr>
+        <w:ind w:left="2160" w:hanging="180"/>
+      </w:pPr>
+    </w:lvl>
+    <w:lvl w:ilvl="3" w:tplc="FFFFFFFF" w:tentative="1">
+      <w:start w:val="1"/>
+      <w:numFmt w:val="decimal"/>
+      <w:lvlText w:val="%4."/>
+      <w:lvlJc w:val="left"/>
+      <w:pPr>
+        <w:ind w:left="2880" w:hanging="360"/>
+      </w:pPr>
+    </w:lvl>
+    <w:lvl w:ilvl="4" w:tplc="FFFFFFFF" w:tentative="1">
+      <w:start w:val="1"/>
+      <w:numFmt w:val="lowerLetter"/>
+      <w:lvlText w:val="%5."/>
+      <w:lvlJc w:val="left"/>
+      <w:pPr>
+        <w:ind w:left="3600" w:hanging="360"/>
+      </w:pPr>
+    </w:lvl>
+    <w:lvl w:ilvl="5" w:tplc="FFFFFFFF" w:tentative="1">
+      <w:start w:val="1"/>
+      <w:numFmt w:val="lowerRoman"/>
+      <w:lvlText w:val="%6."/>
+      <w:lvlJc w:val="right"/>
+      <w:pPr>
+        <w:ind w:left="4320" w:hanging="180"/>
+      </w:pPr>
+    </w:lvl>
+    <w:lvl w:ilvl="6" w:tplc="FFFFFFFF" w:tentative="1">
+      <w:start w:val="1"/>
+      <w:numFmt w:val="decimal"/>
+      <w:lvlText w:val="%7."/>
+      <w:lvlJc w:val="left"/>
+      <w:pPr>
+        <w:ind w:left="5040" w:hanging="360"/>
+      </w:pPr>
+    </w:lvl>
+    <w:lvl w:ilvl="7" w:tplc="FFFFFFFF" w:tentative="1">
+      <w:start w:val="1"/>
+      <w:numFmt w:val="lowerLetter"/>
+      <w:lvlText w:val="%8."/>
+      <w:lvlJc w:val="left"/>
+      <w:pPr>
+        <w:ind w:left="5760" w:hanging="360"/>
+      </w:pPr>
+    </w:lvl>
+    <w:lvl w:ilvl="8" w:tplc="FFFFFFFF" w:tentative="1">
+      <w:start w:val="1"/>
+      <w:numFmt w:val="lowerRoman"/>
+      <w:lvlText w:val="%9."/>
+      <w:lvlJc w:val="right"/>
+      <w:pPr>
+        <w:ind w:left="6480" w:hanging="180"/>
+      </w:pPr>
+    </w:lvl>
+  </w:abstractNum>
+  <w:abstractNum w:abstractNumId="21" w15:restartNumberingAfterBreak="0">
+    <w:nsid w:val="721F5C70"/>
+    <w:multiLevelType w:val="hybridMultilevel"/>
+    <w:tmpl w:val="13CCFB1C"/>
+    <w:lvl w:ilvl="0" w:tplc="9ED8675A">
+      <w:start w:val="5"/>
+      <w:numFmt w:val="bullet"/>
+      <w:lvlText w:val="-"/>
+      <w:lvlJc w:val="left"/>
+      <w:pPr>
+        <w:ind w:left="720" w:hanging="360"/>
+      </w:pPr>
+      <w:rPr>
+        <w:rFonts w:ascii="Aptos" w:eastAsiaTheme="minorHAnsi" w:hAnsi="Aptos" w:cstheme="minorBidi" w:hint="default"/>
+      </w:rPr>
+    </w:lvl>
+    <w:lvl w:ilvl="1" w:tplc="08090003" w:tentative="1">
+      <w:start w:val="1"/>
+      <w:numFmt w:val="bullet"/>
+      <w:lvlText w:val="o"/>
+      <w:lvlJc w:val="left"/>
+      <w:pPr>
+        <w:ind w:left="1440" w:hanging="360"/>
+      </w:pPr>
+      <w:rPr>
+        <w:rFonts w:ascii="Courier New" w:hAnsi="Courier New" w:hint="default"/>
+      </w:rPr>
+    </w:lvl>
+    <w:lvl w:ilvl="2" w:tplc="08090005" w:tentative="1">
+      <w:start w:val="1"/>
+      <w:numFmt w:val="bullet"/>
+      <w:lvlText w:val=""/>
+      <w:lvlJc w:val="left"/>
+      <w:pPr>
+        <w:ind w:left="2160" w:hanging="360"/>
+      </w:pPr>
+      <w:rPr>
+        <w:rFonts w:ascii="Wingdings" w:hAnsi="Wingdings" w:hint="default"/>
+      </w:rPr>
+    </w:lvl>
+    <w:lvl w:ilvl="3" w:tplc="08090001" w:tentative="1">
+      <w:start w:val="1"/>
+      <w:numFmt w:val="bullet"/>
+      <w:lvlText w:val=""/>
+      <w:lvlJc w:val="left"/>
+      <w:pPr>
+        <w:ind w:left="2880" w:hanging="360"/>
+      </w:pPr>
+      <w:rPr>
+        <w:rFonts w:ascii="Symbol" w:hAnsi="Symbol" w:hint="default"/>
+      </w:rPr>
+    </w:lvl>
+    <w:lvl w:ilvl="4" w:tplc="08090003" w:tentative="1">
+      <w:start w:val="1"/>
+      <w:numFmt w:val="bullet"/>
+      <w:lvlText w:val="o"/>
+      <w:lvlJc w:val="left"/>
+      <w:pPr>
+        <w:ind w:left="3600" w:hanging="360"/>
+      </w:pPr>
+      <w:rPr>
+        <w:rFonts w:ascii="Courier New" w:hAnsi="Courier New" w:hint="default"/>
+      </w:rPr>
+    </w:lvl>
+    <w:lvl w:ilvl="5" w:tplc="08090005" w:tentative="1">
+      <w:start w:val="1"/>
+      <w:numFmt w:val="bullet"/>
+      <w:lvlText w:val=""/>
+      <w:lvlJc w:val="left"/>
+      <w:pPr>
+        <w:ind w:left="4320" w:hanging="360"/>
+      </w:pPr>
+      <w:rPr>
+        <w:rFonts w:ascii="Wingdings" w:hAnsi="Wingdings" w:hint="default"/>
+      </w:rPr>
+    </w:lvl>
+    <w:lvl w:ilvl="6" w:tplc="08090001" w:tentative="1">
+      <w:start w:val="1"/>
+      <w:numFmt w:val="bullet"/>
+      <w:lvlText w:val=""/>
+      <w:lvlJc w:val="left"/>
+      <w:pPr>
+        <w:ind w:left="5040" w:hanging="360"/>
+      </w:pPr>
+      <w:rPr>
+        <w:rFonts w:ascii="Symbol" w:hAnsi="Symbol" w:hint="default"/>
+      </w:rPr>
+    </w:lvl>
+    <w:lvl w:ilvl="7" w:tplc="08090003" w:tentative="1">
+      <w:start w:val="1"/>
+      <w:numFmt w:val="bullet"/>
+      <w:lvlText w:val="o"/>
+      <w:lvlJc w:val="left"/>
+      <w:pPr>
+        <w:ind w:left="5760" w:hanging="360"/>
+      </w:pPr>
+      <w:rPr>
+        <w:rFonts w:ascii="Courier New" w:hAnsi="Courier New" w:hint="default"/>
+      </w:rPr>
+    </w:lvl>
+    <w:lvl w:ilvl="8" w:tplc="08090005" w:tentative="1">
+      <w:start w:val="1"/>
+      <w:numFmt w:val="bullet"/>
+      <w:lvlText w:val=""/>
+      <w:lvlJc w:val="left"/>
+      <w:pPr>
+        <w:ind w:left="6480" w:hanging="360"/>
+      </w:pPr>
+      <w:rPr>
+        <w:rFonts w:ascii="Wingdings" w:hAnsi="Wingdings" w:hint="default"/>
+      </w:rPr>
+    </w:lvl>
+  </w:abstractNum>
+  <w:abstractNum w:abstractNumId="22" w15:restartNumberingAfterBreak="0">
     <w:nsid w:val="72575468"/>
     <w:multiLevelType w:val="hybridMultilevel"/>
     <w:tmpl w:val="E30E1D48"/>
@@ -6619,6 +9110,119 @@
       <w:lvlJc w:val="left"/>
       <w:pPr>
         <w:ind w:left="6120" w:hanging="360"/>
+      </w:pPr>
+      <w:rPr>
+        <w:rFonts w:ascii="Wingdings" w:hAnsi="Wingdings" w:hint="default"/>
+      </w:rPr>
+    </w:lvl>
+  </w:abstractNum>
+  <w:abstractNum w:abstractNumId="23" w15:restartNumberingAfterBreak="0">
+    <w:nsid w:val="73E73FFA"/>
+    <w:multiLevelType w:val="hybridMultilevel"/>
+    <w:tmpl w:val="8598A616"/>
+    <w:lvl w:ilvl="0" w:tplc="9ED8675A">
+      <w:start w:val="5"/>
+      <w:numFmt w:val="bullet"/>
+      <w:lvlText w:val="-"/>
+      <w:lvlJc w:val="left"/>
+      <w:pPr>
+        <w:ind w:left="720" w:hanging="360"/>
+      </w:pPr>
+      <w:rPr>
+        <w:rFonts w:ascii="Aptos" w:eastAsiaTheme="minorHAnsi" w:hAnsi="Aptos" w:cstheme="minorBidi" w:hint="default"/>
+      </w:rPr>
+    </w:lvl>
+    <w:lvl w:ilvl="1" w:tplc="08090003" w:tentative="1">
+      <w:start w:val="1"/>
+      <w:numFmt w:val="bullet"/>
+      <w:lvlText w:val="o"/>
+      <w:lvlJc w:val="left"/>
+      <w:pPr>
+        <w:ind w:left="1440" w:hanging="360"/>
+      </w:pPr>
+      <w:rPr>
+        <w:rFonts w:ascii="Courier New" w:hAnsi="Courier New" w:hint="default"/>
+      </w:rPr>
+    </w:lvl>
+    <w:lvl w:ilvl="2" w:tplc="08090005" w:tentative="1">
+      <w:start w:val="1"/>
+      <w:numFmt w:val="bullet"/>
+      <w:lvlText w:val=""/>
+      <w:lvlJc w:val="left"/>
+      <w:pPr>
+        <w:ind w:left="2160" w:hanging="360"/>
+      </w:pPr>
+      <w:rPr>
+        <w:rFonts w:ascii="Wingdings" w:hAnsi="Wingdings" w:hint="default"/>
+      </w:rPr>
+    </w:lvl>
+    <w:lvl w:ilvl="3" w:tplc="08090001" w:tentative="1">
+      <w:start w:val="1"/>
+      <w:numFmt w:val="bullet"/>
+      <w:lvlText w:val=""/>
+      <w:lvlJc w:val="left"/>
+      <w:pPr>
+        <w:ind w:left="2880" w:hanging="360"/>
+      </w:pPr>
+      <w:rPr>
+        <w:rFonts w:ascii="Symbol" w:hAnsi="Symbol" w:hint="default"/>
+      </w:rPr>
+    </w:lvl>
+    <w:lvl w:ilvl="4" w:tplc="08090003" w:tentative="1">
+      <w:start w:val="1"/>
+      <w:numFmt w:val="bullet"/>
+      <w:lvlText w:val="o"/>
+      <w:lvlJc w:val="left"/>
+      <w:pPr>
+        <w:ind w:left="3600" w:hanging="360"/>
+      </w:pPr>
+      <w:rPr>
+        <w:rFonts w:ascii="Courier New" w:hAnsi="Courier New" w:hint="default"/>
+      </w:rPr>
+    </w:lvl>
+    <w:lvl w:ilvl="5" w:tplc="08090005" w:tentative="1">
+      <w:start w:val="1"/>
+      <w:numFmt w:val="bullet"/>
+      <w:lvlText w:val=""/>
+      <w:lvlJc w:val="left"/>
+      <w:pPr>
+        <w:ind w:left="4320" w:hanging="360"/>
+      </w:pPr>
+      <w:rPr>
+        <w:rFonts w:ascii="Wingdings" w:hAnsi="Wingdings" w:hint="default"/>
+      </w:rPr>
+    </w:lvl>
+    <w:lvl w:ilvl="6" w:tplc="08090001" w:tentative="1">
+      <w:start w:val="1"/>
+      <w:numFmt w:val="bullet"/>
+      <w:lvlText w:val=""/>
+      <w:lvlJc w:val="left"/>
+      <w:pPr>
+        <w:ind w:left="5040" w:hanging="360"/>
+      </w:pPr>
+      <w:rPr>
+        <w:rFonts w:ascii="Symbol" w:hAnsi="Symbol" w:hint="default"/>
+      </w:rPr>
+    </w:lvl>
+    <w:lvl w:ilvl="7" w:tplc="08090003" w:tentative="1">
+      <w:start w:val="1"/>
+      <w:numFmt w:val="bullet"/>
+      <w:lvlText w:val="o"/>
+      <w:lvlJc w:val="left"/>
+      <w:pPr>
+        <w:ind w:left="5760" w:hanging="360"/>
+      </w:pPr>
+      <w:rPr>
+        <w:rFonts w:ascii="Courier New" w:hAnsi="Courier New" w:hint="default"/>
+      </w:rPr>
+    </w:lvl>
+    <w:lvl w:ilvl="8" w:tplc="08090005" w:tentative="1">
+      <w:start w:val="1"/>
+      <w:numFmt w:val="bullet"/>
+      <w:lvlText w:val=""/>
+      <w:lvlJc w:val="left"/>
+      <w:pPr>
+        <w:ind w:left="6480" w:hanging="360"/>
       </w:pPr>
       <w:rPr>
         <w:rFonts w:ascii="Wingdings" w:hAnsi="Wingdings" w:hint="default"/>
@@ -6638,7 +9242,7 @@
     <w:abstractNumId w:val="5"/>
   </w:num>
   <w:num w:numId="5" w16cid:durableId="512846499">
-    <w:abstractNumId w:val="14"/>
+    <w:abstractNumId w:val="15"/>
   </w:num>
   <w:num w:numId="6" w16cid:durableId="409474260">
     <w:abstractNumId w:val="11"/>
@@ -6656,13 +9260,13 @@
     <w:abstractNumId w:val="10"/>
   </w:num>
   <w:num w:numId="11" w16cid:durableId="834565320">
-    <w:abstractNumId w:val="16"/>
+    <w:abstractNumId w:val="17"/>
   </w:num>
   <w:num w:numId="12" w16cid:durableId="752698583">
     <w:abstractNumId w:val="8"/>
   </w:num>
   <w:num w:numId="13" w16cid:durableId="686908962">
-    <w:abstractNumId w:val="17"/>
+    <w:abstractNumId w:val="18"/>
   </w:num>
   <w:num w:numId="14" w16cid:durableId="358966890">
     <w:abstractNumId w:val="9"/>
@@ -6674,22 +9278,34 @@
     <w:abstractNumId w:val="6"/>
   </w:num>
   <w:num w:numId="17" w16cid:durableId="2003701343">
-    <w:abstractNumId w:val="19"/>
+    <w:abstractNumId w:val="22"/>
   </w:num>
   <w:num w:numId="18" w16cid:durableId="1808934357">
     <w:abstractNumId w:val="4"/>
   </w:num>
   <w:num w:numId="19" w16cid:durableId="2079935832">
-    <w:abstractNumId w:val="18"/>
+    <w:abstractNumId w:val="19"/>
   </w:num>
   <w:num w:numId="20" w16cid:durableId="68117886">
-    <w:abstractNumId w:val="15"/>
+    <w:abstractNumId w:val="16"/>
+  </w:num>
+  <w:num w:numId="21" w16cid:durableId="1487013228">
+    <w:abstractNumId w:val="20"/>
+  </w:num>
+  <w:num w:numId="22" w16cid:durableId="1999380743">
+    <w:abstractNumId w:val="23"/>
+  </w:num>
+  <w:num w:numId="23" w16cid:durableId="2098402843">
+    <w:abstractNumId w:val="14"/>
+  </w:num>
+  <w:num w:numId="24" w16cid:durableId="295568156">
+    <w:abstractNumId w:val="21"/>
   </w:num>
 </w:numbering>
 </file>
 
 <file path=word/styles.xml><?xml version="1.0" encoding="utf-8"?>
-<w:styles xmlns:mc="http://schemas.openxmlformats.org/markup-compatibility/2006" xmlns:r="http://schemas.openxmlformats.org/officeDocument/2006/relationships" xmlns:w="http://schemas.openxmlformats.org/wordprocessingml/2006/main" xmlns:w14="http://schemas.microsoft.com/office/word/2010/wordml" xmlns:w15="http://schemas.microsoft.com/office/word/2012/wordml" xmlns:w16cex="http://schemas.microsoft.com/office/word/2018/wordml/cex" xmlns:w16cid="http://schemas.microsoft.com/office/word/2016/wordml/cid" xmlns:w16="http://schemas.microsoft.com/office/word/2018/wordml" xmlns:w16du="http://schemas.microsoft.com/office/word/2023/wordml/word16du" xmlns:w16sdtdh="http://schemas.microsoft.com/office/word/2020/wordml/sdtdatahash" xmlns:w16sdtfl="http://schemas.microsoft.com/office/word/2024/wordml/sdtformatlock" xmlns:w16se="http://schemas.microsoft.com/office/word/2015/wordml/symex" mc:Ignorable="w14 w15 w16se w16cid w16 w16cex w16sdtdh w16sdtfl w16du">
+<w:styles xmlns:mc="http://schemas.openxmlformats.org/markup-compatibility/2006" xmlns:r="http://schemas.openxmlformats.org/officeDocument/2006/relationships" xmlns:w="http://schemas.openxmlformats.org/wordprocessingml/2006/main" xmlns:w14="http://schemas.microsoft.com/office/word/2010/wordml" xmlns:w15="http://schemas.microsoft.com/office/word/2012/wordml" xmlns:w16cex="http://schemas.microsoft.com/office/word/2018/wordml/cex" xmlns:w16cid="http://schemas.microsoft.com/office/word/2016/wordml/cid" xmlns:w16="http://schemas.microsoft.com/office/word/2018/wordml" xmlns:w16sdtdh="http://schemas.microsoft.com/office/word/2020/wordml/sdtdatahash" xmlns:w16sdtfl="http://schemas.microsoft.com/office/word/2024/wordml/sdtformatlock" xmlns:w16se="http://schemas.microsoft.com/office/word/2015/wordml/symex" xmlns:w16du="http://schemas.microsoft.com/office/word/2023/wordml/word16du" mc:Ignorable="w14 w15 w16se w16cid w16 w16cex w16sdtdh w16sdtfl w16du">
   <w:docDefaults>
     <w:rPrDefault>
       <w:rPr>
@@ -7288,6 +9904,7 @@
   <w:style w:type="character" w:default="1" w:styleId="DefaultParagraphFont">
     <w:name w:val="Default Paragraph Font"/>
     <w:uiPriority w:val="1"/>
+    <w:semiHidden/>
     <w:unhideWhenUsed/>
   </w:style>
   <w:style w:type="table" w:default="1" w:styleId="TableNormal">
@@ -7770,6 +10387,37 @@
       </w:tblBorders>
     </w:tblPr>
   </w:style>
+  <w:style w:type="paragraph" w:styleId="NormalWeb">
+    <w:name w:val="Normal (Web)"/>
+    <w:basedOn w:val="Normal"/>
+    <w:uiPriority w:val="99"/>
+    <w:unhideWhenUsed/>
+    <w:rsid w:val="006248B7"/>
+    <w:pPr>
+      <w:spacing w:before="100" w:beforeAutospacing="1" w:after="100" w:afterAutospacing="1" w:line="240" w:lineRule="auto"/>
+    </w:pPr>
+    <w:rPr>
+      <w:rFonts w:ascii="Times New Roman" w:eastAsia="Times New Roman" w:hAnsi="Times New Roman" w:cs="Times New Roman"/>
+      <w:kern w:val="0"/>
+      <w:lang w:eastAsia="en-GB"/>
+      <w14:ligatures w14:val="none"/>
+    </w:rPr>
+  </w:style>
+  <w:style w:type="character" w:styleId="PlaceholderText">
+    <w:name w:val="Placeholder Text"/>
+    <w:basedOn w:val="DefaultParagraphFont"/>
+    <w:uiPriority w:val="99"/>
+    <w:semiHidden/>
+    <w:rsid w:val="006248B7"/>
+    <w:rPr>
+      <w:color w:val="666666"/>
+    </w:rPr>
+  </w:style>
+  <w:style w:type="character" w:customStyle="1" w:styleId="notion-enable-hover">
+    <w:name w:val="notion-enable-hover"/>
+    <w:basedOn w:val="DefaultParagraphFont"/>
+    <w:rsid w:val="000A790C"/>
+  </w:style>
 </w:styles>
 </file>
 

</xml_diff>

<commit_message>
Finalise Assignment 3B Process Book
Updated visualisation design and conclusion.
Corrected spelling, word count, table of contents and page numbers.
</commit_message>
<xml_diff>
--- a/Assignment 3B_Project process book/Assignment 3B - Project process book.docx
+++ b/Assignment 3B_Project process book/Assignment 3B - Project process book.docx
@@ -496,23 +496,7 @@
             <w:sz w:val="28"/>
             <w:szCs w:val="28"/>
           </w:rPr>
-          <w:t>Does increased health-care spending</w:t>
-        </w:r>
-        <w:r>
-          <w:rPr>
-            <w:rStyle w:val="Hyperlink"/>
-            <w:sz w:val="28"/>
-            <w:szCs w:val="28"/>
-          </w:rPr>
-          <w:t xml:space="preserve"> </w:t>
-        </w:r>
-        <w:r>
-          <w:rPr>
-            <w:rStyle w:val="Hyperlink"/>
-            <w:sz w:val="28"/>
-            <w:szCs w:val="28"/>
-          </w:rPr>
-          <w:t>increase life expectancy?</w:t>
+          <w:t>Does increased health-care spending increase life expectancy?</w:t>
         </w:r>
       </w:hyperlink>
     </w:p>
@@ -579,7 +563,15 @@
           <w:sz w:val="28"/>
           <w:szCs w:val="28"/>
         </w:rPr>
-        <w:t xml:space="preserve"> [To be added]</w:t>
+        <w:t xml:space="preserve"> </w:t>
+      </w:r>
+      <w:r>
+        <w:rPr>
+          <w:color w:val="000000" w:themeColor="text1"/>
+          <w:sz w:val="28"/>
+          <w:szCs w:val="28"/>
+        </w:rPr>
+        <w:t>2868</w:t>
       </w:r>
     </w:p>
     <w:p>
@@ -649,7 +641,7 @@
           <w:noProof/>
           <w:sz w:val="24"/>
           <w:szCs w:val="24"/>
-          <w:lang w:eastAsia="en-GB"/>
+          <w:lang w:eastAsia="en-AU"/>
         </w:rPr>
       </w:pPr>
       <w:r>
@@ -676,7 +668,7 @@
         </w:rPr>
         <w:fldChar w:fldCharType="separate"/>
       </w:r>
-      <w:hyperlink w:anchor="_Toc239535708" w:history="1">
+      <w:hyperlink w:anchor="_Toc242056847" w:history="1">
         <w:r>
           <w:rPr>
             <w:rStyle w:val="Hyperlink"/>
@@ -703,7 +695,7 @@
             <w:noProof/>
             <w:webHidden/>
           </w:rPr>
-          <w:instrText xml:space="preserve"> PAGEREF _Toc239535708 \h </w:instrText>
+          <w:instrText xml:space="preserve"> PAGEREF _Toc242056847 \h </w:instrText>
         </w:r>
         <w:r>
           <w:rPr>
@@ -746,10 +738,10 @@
           <w:noProof/>
           <w:sz w:val="24"/>
           <w:szCs w:val="24"/>
-          <w:lang w:eastAsia="en-GB"/>
-        </w:rPr>
-      </w:pPr>
-      <w:hyperlink w:anchor="_Toc239535709" w:history="1">
+          <w:lang w:eastAsia="en-AU"/>
+        </w:rPr>
+      </w:pPr>
+      <w:hyperlink w:anchor="_Toc242056848" w:history="1">
         <w:r>
           <w:rPr>
             <w:rStyle w:val="Hyperlink"/>
@@ -776,7 +768,7 @@
             <w:noProof/>
             <w:webHidden/>
           </w:rPr>
-          <w:instrText xml:space="preserve"> PAGEREF _Toc239535709 \h </w:instrText>
+          <w:instrText xml:space="preserve"> PAGEREF _Toc242056848 \h </w:instrText>
         </w:r>
         <w:r>
           <w:rPr>
@@ -819,10 +811,10 @@
           <w:noProof/>
           <w:sz w:val="24"/>
           <w:szCs w:val="24"/>
-          <w:lang w:eastAsia="en-GB"/>
-        </w:rPr>
-      </w:pPr>
-      <w:hyperlink w:anchor="_Toc239535710" w:history="1">
+          <w:lang w:eastAsia="en-AU"/>
+        </w:rPr>
+      </w:pPr>
+      <w:hyperlink w:anchor="_Toc242056849" w:history="1">
         <w:r>
           <w:rPr>
             <w:rStyle w:val="Hyperlink"/>
@@ -849,7 +841,7 @@
             <w:noProof/>
             <w:webHidden/>
           </w:rPr>
-          <w:instrText xml:space="preserve"> PAGEREF _Toc239535710 \h </w:instrText>
+          <w:instrText xml:space="preserve"> PAGEREF _Toc242056849 \h </w:instrText>
         </w:r>
         <w:r>
           <w:rPr>
@@ -892,10 +884,10 @@
           <w:noProof/>
           <w:sz w:val="24"/>
           <w:szCs w:val="24"/>
-          <w:lang w:eastAsia="en-GB"/>
-        </w:rPr>
-      </w:pPr>
-      <w:hyperlink w:anchor="_Toc239535711" w:history="1">
+          <w:lang w:eastAsia="en-AU"/>
+        </w:rPr>
+      </w:pPr>
+      <w:hyperlink w:anchor="_Toc242056850" w:history="1">
         <w:r>
           <w:rPr>
             <w:rStyle w:val="Hyperlink"/>
@@ -922,7 +914,7 @@
             <w:noProof/>
             <w:webHidden/>
           </w:rPr>
-          <w:instrText xml:space="preserve"> PAGEREF _Toc239535711 \h </w:instrText>
+          <w:instrText xml:space="preserve"> PAGEREF _Toc242056850 \h </w:instrText>
         </w:r>
         <w:r>
           <w:rPr>
@@ -942,7 +934,7 @@
             <w:noProof/>
             <w:webHidden/>
           </w:rPr>
-          <w:t>3</w:t>
+          <w:t>4</w:t>
         </w:r>
         <w:r>
           <w:rPr>
@@ -965,10 +957,10 @@
           <w:noProof/>
           <w:sz w:val="24"/>
           <w:szCs w:val="24"/>
-          <w:lang w:eastAsia="en-GB"/>
-        </w:rPr>
-      </w:pPr>
-      <w:hyperlink w:anchor="_Toc239535712" w:history="1">
+          <w:lang w:eastAsia="en-AU"/>
+        </w:rPr>
+      </w:pPr>
+      <w:hyperlink w:anchor="_Toc242056851" w:history="1">
         <w:r>
           <w:rPr>
             <w:rStyle w:val="Hyperlink"/>
@@ -995,7 +987,7 @@
             <w:noProof/>
             <w:webHidden/>
           </w:rPr>
-          <w:instrText xml:space="preserve"> PAGEREF _Toc239535712 \h </w:instrText>
+          <w:instrText xml:space="preserve"> PAGEREF _Toc242056851 \h </w:instrText>
         </w:r>
         <w:r>
           <w:rPr>
@@ -1015,7 +1007,7 @@
             <w:noProof/>
             <w:webHidden/>
           </w:rPr>
-          <w:t>4</w:t>
+          <w:t>5</w:t>
         </w:r>
         <w:r>
           <w:rPr>
@@ -1040,10 +1032,10 @@
           <w:noProof/>
           <w:sz w:val="24"/>
           <w:szCs w:val="24"/>
-          <w:lang w:eastAsia="en-GB"/>
-        </w:rPr>
-      </w:pPr>
-      <w:hyperlink w:anchor="_Toc239535713" w:history="1">
+          <w:lang w:eastAsia="en-AU"/>
+        </w:rPr>
+      </w:pPr>
+      <w:hyperlink w:anchor="_Toc242056852" w:history="1">
         <w:r>
           <w:rPr>
             <w:rStyle w:val="Hyperlink"/>
@@ -1070,7 +1062,7 @@
             <w:noProof/>
             <w:webHidden/>
           </w:rPr>
-          <w:instrText xml:space="preserve"> PAGEREF _Toc239535713 \h </w:instrText>
+          <w:instrText xml:space="preserve"> PAGEREF _Toc242056852 \h </w:instrText>
         </w:r>
         <w:r>
           <w:rPr>
@@ -1113,10 +1105,10 @@
           <w:noProof/>
           <w:sz w:val="24"/>
           <w:szCs w:val="24"/>
-          <w:lang w:eastAsia="en-GB"/>
-        </w:rPr>
-      </w:pPr>
-      <w:hyperlink w:anchor="_Toc239535714" w:history="1">
+          <w:lang w:eastAsia="en-AU"/>
+        </w:rPr>
+      </w:pPr>
+      <w:hyperlink w:anchor="_Toc242056853" w:history="1">
         <w:r>
           <w:rPr>
             <w:rStyle w:val="Hyperlink"/>
@@ -1143,155 +1135,7 @@
             <w:noProof/>
             <w:webHidden/>
           </w:rPr>
-          <w:instrText xml:space="preserve"> PAGEREF _Toc239535714 \h </w:instrText>
-        </w:r>
-        <w:r>
-          <w:rPr>
-            <w:noProof/>
-            <w:webHidden/>
-          </w:rPr>
-        </w:r>
-        <w:r>
-          <w:rPr>
-            <w:noProof/>
-            <w:webHidden/>
-          </w:rPr>
-          <w:fldChar w:fldCharType="separate"/>
-        </w:r>
-        <w:r>
-          <w:rPr>
-            <w:noProof/>
-            <w:webHidden/>
-          </w:rPr>
-          <w:t>6</w:t>
-        </w:r>
-        <w:r>
-          <w:rPr>
-            <w:noProof/>
-            <w:webHidden/>
-          </w:rPr>
-          <w:fldChar w:fldCharType="end"/>
-        </w:r>
-      </w:hyperlink>
-    </w:p>
-    <w:p>
-      <w:pPr>
-        <w:pStyle w:val="TOC3"/>
-        <w:tabs>
-          <w:tab w:val="right" w:leader="dot" w:pos="9016"/>
-        </w:tabs>
-        <w:rPr>
-          <w:rFonts w:eastAsiaTheme="minorEastAsia"/>
-          <w:i w:val="0"/>
-          <w:iCs w:val="0"/>
-          <w:noProof/>
-          <w:sz w:val="24"/>
-          <w:szCs w:val="24"/>
-          <w:lang w:eastAsia="en-GB"/>
-        </w:rPr>
-      </w:pPr>
-      <w:hyperlink w:anchor="_Toc239535715" w:history="1">
-        <w:r>
-          <w:rPr>
-            <w:rStyle w:val="Hyperlink"/>
-            <w:noProof/>
-          </w:rPr>
-          <w:t>Data source:</w:t>
-        </w:r>
-        <w:r>
-          <w:rPr>
-            <w:noProof/>
-            <w:webHidden/>
-          </w:rPr>
-          <w:tab/>
-        </w:r>
-        <w:r>
-          <w:rPr>
-            <w:noProof/>
-            <w:webHidden/>
-          </w:rPr>
-          <w:fldChar w:fldCharType="begin"/>
-        </w:r>
-        <w:r>
-          <w:rPr>
-            <w:noProof/>
-            <w:webHidden/>
-          </w:rPr>
-          <w:instrText xml:space="preserve"> PAGEREF _Toc239535715 \h </w:instrText>
-        </w:r>
-        <w:r>
-          <w:rPr>
-            <w:noProof/>
-            <w:webHidden/>
-          </w:rPr>
-        </w:r>
-        <w:r>
-          <w:rPr>
-            <w:noProof/>
-            <w:webHidden/>
-          </w:rPr>
-          <w:fldChar w:fldCharType="separate"/>
-        </w:r>
-        <w:r>
-          <w:rPr>
-            <w:noProof/>
-            <w:webHidden/>
-          </w:rPr>
-          <w:t>6</w:t>
-        </w:r>
-        <w:r>
-          <w:rPr>
-            <w:noProof/>
-            <w:webHidden/>
-          </w:rPr>
-          <w:fldChar w:fldCharType="end"/>
-        </w:r>
-      </w:hyperlink>
-    </w:p>
-    <w:p>
-      <w:pPr>
-        <w:pStyle w:val="TOC3"/>
-        <w:tabs>
-          <w:tab w:val="right" w:leader="dot" w:pos="9016"/>
-        </w:tabs>
-        <w:rPr>
-          <w:rFonts w:eastAsiaTheme="minorEastAsia"/>
-          <w:i w:val="0"/>
-          <w:iCs w:val="0"/>
-          <w:noProof/>
-          <w:sz w:val="24"/>
-          <w:szCs w:val="24"/>
-          <w:lang w:eastAsia="en-GB"/>
-        </w:rPr>
-      </w:pPr>
-      <w:hyperlink w:anchor="_Toc239535716" w:history="1">
-        <w:r>
-          <w:rPr>
-            <w:rStyle w:val="Hyperlink"/>
-            <w:noProof/>
-          </w:rPr>
-          <w:t>Source link:</w:t>
-        </w:r>
-        <w:r>
-          <w:rPr>
-            <w:noProof/>
-            <w:webHidden/>
-          </w:rPr>
-          <w:tab/>
-        </w:r>
-        <w:r>
-          <w:rPr>
-            <w:noProof/>
-            <w:webHidden/>
-          </w:rPr>
-          <w:fldChar w:fldCharType="begin"/>
-        </w:r>
-        <w:r>
-          <w:rPr>
-            <w:noProof/>
-            <w:webHidden/>
-          </w:rPr>
-          <w:instrText xml:space="preserve"> PAGEREF _Toc239535716 \h </w:instrText>
+          <w:instrText xml:space="preserve"> PAGEREF _Toc242056853 \h </w:instrText>
         </w:r>
         <w:r>
           <w:rPr>
@@ -1334,10 +1178,10 @@
           <w:noProof/>
           <w:sz w:val="24"/>
           <w:szCs w:val="24"/>
-          <w:lang w:eastAsia="en-GB"/>
-        </w:rPr>
-      </w:pPr>
-      <w:hyperlink w:anchor="_Toc239535717" w:history="1">
+          <w:lang w:eastAsia="en-AU"/>
+        </w:rPr>
+      </w:pPr>
+      <w:hyperlink w:anchor="_Toc242056854" w:history="1">
         <w:r>
           <w:rPr>
             <w:rStyle w:val="Hyperlink"/>
@@ -1364,7 +1208,7 @@
             <w:noProof/>
             <w:webHidden/>
           </w:rPr>
-          <w:instrText xml:space="preserve"> PAGEREF _Toc239535717 \h </w:instrText>
+          <w:instrText xml:space="preserve"> PAGEREF _Toc242056854 \h </w:instrText>
         </w:r>
         <w:r>
           <w:rPr>
@@ -1409,10 +1253,10 @@
           <w:noProof/>
           <w:sz w:val="24"/>
           <w:szCs w:val="24"/>
-          <w:lang w:eastAsia="en-GB"/>
-        </w:rPr>
-      </w:pPr>
-      <w:hyperlink w:anchor="_Toc239535718" w:history="1">
+          <w:lang w:eastAsia="en-AU"/>
+        </w:rPr>
+      </w:pPr>
+      <w:hyperlink w:anchor="_Toc242056855" w:history="1">
         <w:r>
           <w:rPr>
             <w:rStyle w:val="Hyperlink"/>
@@ -1439,7 +1283,7 @@
             <w:noProof/>
             <w:webHidden/>
           </w:rPr>
-          <w:instrText xml:space="preserve"> PAGEREF _Toc239535718 \h </w:instrText>
+          <w:instrText xml:space="preserve"> PAGEREF _Toc242056855 \h </w:instrText>
         </w:r>
         <w:r>
           <w:rPr>
@@ -1482,10 +1326,10 @@
           <w:noProof/>
           <w:sz w:val="24"/>
           <w:szCs w:val="24"/>
-          <w:lang w:eastAsia="en-GB"/>
-        </w:rPr>
-      </w:pPr>
-      <w:hyperlink w:anchor="_Toc239535719" w:history="1">
+          <w:lang w:eastAsia="en-AU"/>
+        </w:rPr>
+      </w:pPr>
+      <w:hyperlink w:anchor="_Toc242056856" w:history="1">
         <w:r>
           <w:rPr>
             <w:rStyle w:val="Hyperlink"/>
@@ -1512,7 +1356,7 @@
             <w:noProof/>
             <w:webHidden/>
           </w:rPr>
-          <w:instrText xml:space="preserve"> PAGEREF _Toc239535719 \h </w:instrText>
+          <w:instrText xml:space="preserve"> PAGEREF _Toc242056856 \h </w:instrText>
         </w:r>
         <w:r>
           <w:rPr>
@@ -1555,10 +1399,10 @@
           <w:noProof/>
           <w:sz w:val="24"/>
           <w:szCs w:val="24"/>
-          <w:lang w:eastAsia="en-GB"/>
-        </w:rPr>
-      </w:pPr>
-      <w:hyperlink w:anchor="_Toc239535720" w:history="1">
+          <w:lang w:eastAsia="en-AU"/>
+        </w:rPr>
+      </w:pPr>
+      <w:hyperlink w:anchor="_Toc242056857" w:history="1">
         <w:r>
           <w:rPr>
             <w:rStyle w:val="Hyperlink"/>
@@ -1585,7 +1429,7 @@
             <w:noProof/>
             <w:webHidden/>
           </w:rPr>
-          <w:instrText xml:space="preserve"> PAGEREF _Toc239535720 \h </w:instrText>
+          <w:instrText xml:space="preserve"> PAGEREF _Toc242056857 \h </w:instrText>
         </w:r>
         <w:r>
           <w:rPr>
@@ -1630,10 +1474,10 @@
           <w:noProof/>
           <w:sz w:val="24"/>
           <w:szCs w:val="24"/>
-          <w:lang w:eastAsia="en-GB"/>
-        </w:rPr>
-      </w:pPr>
-      <w:hyperlink w:anchor="_Toc239535721" w:history="1">
+          <w:lang w:eastAsia="en-AU"/>
+        </w:rPr>
+      </w:pPr>
+      <w:hyperlink w:anchor="_Toc242056858" w:history="1">
         <w:r>
           <w:rPr>
             <w:rStyle w:val="Hyperlink"/>
@@ -1660,7 +1504,7 @@
             <w:noProof/>
             <w:webHidden/>
           </w:rPr>
-          <w:instrText xml:space="preserve"> PAGEREF _Toc239535721 \h </w:instrText>
+          <w:instrText xml:space="preserve"> PAGEREF _Toc242056858 \h </w:instrText>
         </w:r>
         <w:r>
           <w:rPr>
@@ -1680,7 +1524,743 @@
             <w:noProof/>
             <w:webHidden/>
           </w:rPr>
-          <w:t>8</w:t>
+          <w:t>10</w:t>
+        </w:r>
+        <w:r>
+          <w:rPr>
+            <w:noProof/>
+            <w:webHidden/>
+          </w:rPr>
+          <w:fldChar w:fldCharType="end"/>
+        </w:r>
+      </w:hyperlink>
+    </w:p>
+    <w:p>
+      <w:pPr>
+        <w:pStyle w:val="TOC1"/>
+        <w:tabs>
+          <w:tab w:val="right" w:leader="dot" w:pos="9016"/>
+        </w:tabs>
+        <w:rPr>
+          <w:rFonts w:eastAsiaTheme="minorEastAsia"/>
+          <w:b w:val="0"/>
+          <w:bCs w:val="0"/>
+          <w:caps w:val="0"/>
+          <w:noProof/>
+          <w:sz w:val="24"/>
+          <w:szCs w:val="24"/>
+          <w:lang w:eastAsia="en-AU"/>
+        </w:rPr>
+      </w:pPr>
+      <w:hyperlink w:anchor="_Toc242056859" w:history="1">
+        <w:r>
+          <w:rPr>
+            <w:rStyle w:val="Hyperlink"/>
+            <w:noProof/>
+          </w:rPr>
+          <w:t>5. Validation</w:t>
+        </w:r>
+        <w:r>
+          <w:rPr>
+            <w:noProof/>
+            <w:webHidden/>
+          </w:rPr>
+          <w:tab/>
+        </w:r>
+        <w:r>
+          <w:rPr>
+            <w:noProof/>
+            <w:webHidden/>
+          </w:rPr>
+          <w:fldChar w:fldCharType="begin"/>
+        </w:r>
+        <w:r>
+          <w:rPr>
+            <w:noProof/>
+            <w:webHidden/>
+          </w:rPr>
+          <w:instrText xml:space="preserve"> PAGEREF _Toc242056859 \h </w:instrText>
+        </w:r>
+        <w:r>
+          <w:rPr>
+            <w:noProof/>
+            <w:webHidden/>
+          </w:rPr>
+        </w:r>
+        <w:r>
+          <w:rPr>
+            <w:noProof/>
+            <w:webHidden/>
+          </w:rPr>
+          <w:fldChar w:fldCharType="separate"/>
+        </w:r>
+        <w:r>
+          <w:rPr>
+            <w:noProof/>
+            <w:webHidden/>
+          </w:rPr>
+          <w:t>11</w:t>
+        </w:r>
+        <w:r>
+          <w:rPr>
+            <w:noProof/>
+            <w:webHidden/>
+          </w:rPr>
+          <w:fldChar w:fldCharType="end"/>
+        </w:r>
+      </w:hyperlink>
+    </w:p>
+    <w:p>
+      <w:pPr>
+        <w:pStyle w:val="TOC2"/>
+        <w:tabs>
+          <w:tab w:val="right" w:leader="dot" w:pos="9016"/>
+        </w:tabs>
+        <w:rPr>
+          <w:rFonts w:eastAsiaTheme="minorEastAsia"/>
+          <w:smallCaps w:val="0"/>
+          <w:noProof/>
+          <w:sz w:val="24"/>
+          <w:szCs w:val="24"/>
+          <w:lang w:eastAsia="en-AU"/>
+        </w:rPr>
+      </w:pPr>
+      <w:hyperlink w:anchor="_Toc242056860" w:history="1">
+        <w:r>
+          <w:rPr>
+            <w:rStyle w:val="Hyperlink"/>
+            <w:noProof/>
+          </w:rPr>
+          <w:t>5.1 Informed Consent</w:t>
+        </w:r>
+        <w:r>
+          <w:rPr>
+            <w:noProof/>
+            <w:webHidden/>
+          </w:rPr>
+          <w:tab/>
+        </w:r>
+        <w:r>
+          <w:rPr>
+            <w:noProof/>
+            <w:webHidden/>
+          </w:rPr>
+          <w:fldChar w:fldCharType="begin"/>
+        </w:r>
+        <w:r>
+          <w:rPr>
+            <w:noProof/>
+            <w:webHidden/>
+          </w:rPr>
+          <w:instrText xml:space="preserve"> PAGEREF _Toc242056860 \h </w:instrText>
+        </w:r>
+        <w:r>
+          <w:rPr>
+            <w:noProof/>
+            <w:webHidden/>
+          </w:rPr>
+        </w:r>
+        <w:r>
+          <w:rPr>
+            <w:noProof/>
+            <w:webHidden/>
+          </w:rPr>
+          <w:fldChar w:fldCharType="separate"/>
+        </w:r>
+        <w:r>
+          <w:rPr>
+            <w:noProof/>
+            <w:webHidden/>
+          </w:rPr>
+          <w:t>11</w:t>
+        </w:r>
+        <w:r>
+          <w:rPr>
+            <w:noProof/>
+            <w:webHidden/>
+          </w:rPr>
+          <w:fldChar w:fldCharType="end"/>
+        </w:r>
+      </w:hyperlink>
+    </w:p>
+    <w:p>
+      <w:pPr>
+        <w:pStyle w:val="TOC2"/>
+        <w:tabs>
+          <w:tab w:val="right" w:leader="dot" w:pos="9016"/>
+        </w:tabs>
+        <w:rPr>
+          <w:rFonts w:eastAsiaTheme="minorEastAsia"/>
+          <w:smallCaps w:val="0"/>
+          <w:noProof/>
+          <w:sz w:val="24"/>
+          <w:szCs w:val="24"/>
+          <w:lang w:eastAsia="en-AU"/>
+        </w:rPr>
+      </w:pPr>
+      <w:hyperlink w:anchor="_Toc242056861" w:history="1">
+        <w:r>
+          <w:rPr>
+            <w:rStyle w:val="Hyperlink"/>
+            <w:noProof/>
+          </w:rPr>
+          <w:t>5.2 Participant Profile</w:t>
+        </w:r>
+        <w:r>
+          <w:rPr>
+            <w:noProof/>
+            <w:webHidden/>
+          </w:rPr>
+          <w:tab/>
+        </w:r>
+        <w:r>
+          <w:rPr>
+            <w:noProof/>
+            <w:webHidden/>
+          </w:rPr>
+          <w:fldChar w:fldCharType="begin"/>
+        </w:r>
+        <w:r>
+          <w:rPr>
+            <w:noProof/>
+            <w:webHidden/>
+          </w:rPr>
+          <w:instrText xml:space="preserve"> PAGEREF _Toc242056861 \h </w:instrText>
+        </w:r>
+        <w:r>
+          <w:rPr>
+            <w:noProof/>
+            <w:webHidden/>
+          </w:rPr>
+        </w:r>
+        <w:r>
+          <w:rPr>
+            <w:noProof/>
+            <w:webHidden/>
+          </w:rPr>
+          <w:fldChar w:fldCharType="separate"/>
+        </w:r>
+        <w:r>
+          <w:rPr>
+            <w:noProof/>
+            <w:webHidden/>
+          </w:rPr>
+          <w:t>11</w:t>
+        </w:r>
+        <w:r>
+          <w:rPr>
+            <w:noProof/>
+            <w:webHidden/>
+          </w:rPr>
+          <w:fldChar w:fldCharType="end"/>
+        </w:r>
+      </w:hyperlink>
+    </w:p>
+    <w:p>
+      <w:pPr>
+        <w:pStyle w:val="TOC2"/>
+        <w:tabs>
+          <w:tab w:val="right" w:leader="dot" w:pos="9016"/>
+        </w:tabs>
+        <w:rPr>
+          <w:rFonts w:eastAsiaTheme="minorEastAsia"/>
+          <w:smallCaps w:val="0"/>
+          <w:noProof/>
+          <w:sz w:val="24"/>
+          <w:szCs w:val="24"/>
+          <w:lang w:eastAsia="en-AU"/>
+        </w:rPr>
+      </w:pPr>
+      <w:hyperlink w:anchor="_Toc242056862" w:history="1">
+        <w:r>
+          <w:rPr>
+            <w:rStyle w:val="Hyperlink"/>
+            <w:noProof/>
+          </w:rPr>
+          <w:t>5.3 Evaluation and Satisfaction Survey</w:t>
+        </w:r>
+        <w:r>
+          <w:rPr>
+            <w:noProof/>
+            <w:webHidden/>
+          </w:rPr>
+          <w:tab/>
+        </w:r>
+        <w:r>
+          <w:rPr>
+            <w:noProof/>
+            <w:webHidden/>
+          </w:rPr>
+          <w:fldChar w:fldCharType="begin"/>
+        </w:r>
+        <w:r>
+          <w:rPr>
+            <w:noProof/>
+            <w:webHidden/>
+          </w:rPr>
+          <w:instrText xml:space="preserve"> PAGEREF _Toc242056862 \h </w:instrText>
+        </w:r>
+        <w:r>
+          <w:rPr>
+            <w:noProof/>
+            <w:webHidden/>
+          </w:rPr>
+        </w:r>
+        <w:r>
+          <w:rPr>
+            <w:noProof/>
+            <w:webHidden/>
+          </w:rPr>
+          <w:fldChar w:fldCharType="separate"/>
+        </w:r>
+        <w:r>
+          <w:rPr>
+            <w:noProof/>
+            <w:webHidden/>
+          </w:rPr>
+          <w:t>11</w:t>
+        </w:r>
+        <w:r>
+          <w:rPr>
+            <w:noProof/>
+            <w:webHidden/>
+          </w:rPr>
+          <w:fldChar w:fldCharType="end"/>
+        </w:r>
+      </w:hyperlink>
+    </w:p>
+    <w:p>
+      <w:pPr>
+        <w:pStyle w:val="TOC2"/>
+        <w:tabs>
+          <w:tab w:val="right" w:leader="dot" w:pos="9016"/>
+        </w:tabs>
+        <w:rPr>
+          <w:rFonts w:eastAsiaTheme="minorEastAsia"/>
+          <w:smallCaps w:val="0"/>
+          <w:noProof/>
+          <w:sz w:val="24"/>
+          <w:szCs w:val="24"/>
+          <w:lang w:eastAsia="en-AU"/>
+        </w:rPr>
+      </w:pPr>
+      <w:hyperlink w:anchor="_Toc242056863" w:history="1">
+        <w:r>
+          <w:rPr>
+            <w:rStyle w:val="Hyperlink"/>
+            <w:noProof/>
+          </w:rPr>
+          <w:t>5.4 Usability Findings &amp; Qualitative Feedback</w:t>
+        </w:r>
+        <w:r>
+          <w:rPr>
+            <w:noProof/>
+            <w:webHidden/>
+          </w:rPr>
+          <w:tab/>
+        </w:r>
+        <w:r>
+          <w:rPr>
+            <w:noProof/>
+            <w:webHidden/>
+          </w:rPr>
+          <w:fldChar w:fldCharType="begin"/>
+        </w:r>
+        <w:r>
+          <w:rPr>
+            <w:noProof/>
+            <w:webHidden/>
+          </w:rPr>
+          <w:instrText xml:space="preserve"> PAGEREF _Toc242056863 \h </w:instrText>
+        </w:r>
+        <w:r>
+          <w:rPr>
+            <w:noProof/>
+            <w:webHidden/>
+          </w:rPr>
+        </w:r>
+        <w:r>
+          <w:rPr>
+            <w:noProof/>
+            <w:webHidden/>
+          </w:rPr>
+          <w:fldChar w:fldCharType="separate"/>
+        </w:r>
+        <w:r>
+          <w:rPr>
+            <w:noProof/>
+            <w:webHidden/>
+          </w:rPr>
+          <w:t>12</w:t>
+        </w:r>
+        <w:r>
+          <w:rPr>
+            <w:noProof/>
+            <w:webHidden/>
+          </w:rPr>
+          <w:fldChar w:fldCharType="end"/>
+        </w:r>
+      </w:hyperlink>
+    </w:p>
+    <w:p>
+      <w:pPr>
+        <w:pStyle w:val="TOC2"/>
+        <w:tabs>
+          <w:tab w:val="right" w:leader="dot" w:pos="9016"/>
+        </w:tabs>
+        <w:rPr>
+          <w:rFonts w:eastAsiaTheme="minorEastAsia"/>
+          <w:smallCaps w:val="0"/>
+          <w:noProof/>
+          <w:sz w:val="24"/>
+          <w:szCs w:val="24"/>
+          <w:lang w:eastAsia="en-AU"/>
+        </w:rPr>
+      </w:pPr>
+      <w:hyperlink w:anchor="_Toc242056864" w:history="1">
+        <w:r>
+          <w:rPr>
+            <w:rStyle w:val="Hyperlink"/>
+            <w:noProof/>
+          </w:rPr>
+          <w:t>5.5 Design Improvements</w:t>
+        </w:r>
+        <w:r>
+          <w:rPr>
+            <w:noProof/>
+            <w:webHidden/>
+          </w:rPr>
+          <w:tab/>
+        </w:r>
+        <w:r>
+          <w:rPr>
+            <w:noProof/>
+            <w:webHidden/>
+          </w:rPr>
+          <w:fldChar w:fldCharType="begin"/>
+        </w:r>
+        <w:r>
+          <w:rPr>
+            <w:noProof/>
+            <w:webHidden/>
+          </w:rPr>
+          <w:instrText xml:space="preserve"> PAGEREF _Toc242056864 \h </w:instrText>
+        </w:r>
+        <w:r>
+          <w:rPr>
+            <w:noProof/>
+            <w:webHidden/>
+          </w:rPr>
+        </w:r>
+        <w:r>
+          <w:rPr>
+            <w:noProof/>
+            <w:webHidden/>
+          </w:rPr>
+          <w:fldChar w:fldCharType="separate"/>
+        </w:r>
+        <w:r>
+          <w:rPr>
+            <w:noProof/>
+            <w:webHidden/>
+          </w:rPr>
+          <w:t>13</w:t>
+        </w:r>
+        <w:r>
+          <w:rPr>
+            <w:noProof/>
+            <w:webHidden/>
+          </w:rPr>
+          <w:fldChar w:fldCharType="end"/>
+        </w:r>
+      </w:hyperlink>
+    </w:p>
+    <w:p>
+      <w:pPr>
+        <w:pStyle w:val="TOC1"/>
+        <w:tabs>
+          <w:tab w:val="right" w:leader="dot" w:pos="9016"/>
+        </w:tabs>
+        <w:rPr>
+          <w:rFonts w:eastAsiaTheme="minorEastAsia"/>
+          <w:b w:val="0"/>
+          <w:bCs w:val="0"/>
+          <w:caps w:val="0"/>
+          <w:noProof/>
+          <w:sz w:val="24"/>
+          <w:szCs w:val="24"/>
+          <w:lang w:eastAsia="en-AU"/>
+        </w:rPr>
+      </w:pPr>
+      <w:hyperlink w:anchor="_Toc242056865" w:history="1">
+        <w:r>
+          <w:rPr>
+            <w:rStyle w:val="Hyperlink"/>
+            <w:noProof/>
+          </w:rPr>
+          <w:t>6. Conclusion</w:t>
+        </w:r>
+        <w:r>
+          <w:rPr>
+            <w:noProof/>
+            <w:webHidden/>
+          </w:rPr>
+          <w:tab/>
+        </w:r>
+        <w:r>
+          <w:rPr>
+            <w:noProof/>
+            <w:webHidden/>
+          </w:rPr>
+          <w:fldChar w:fldCharType="begin"/>
+        </w:r>
+        <w:r>
+          <w:rPr>
+            <w:noProof/>
+            <w:webHidden/>
+          </w:rPr>
+          <w:instrText xml:space="preserve"> PAGEREF _Toc242056865 \h </w:instrText>
+        </w:r>
+        <w:r>
+          <w:rPr>
+            <w:noProof/>
+            <w:webHidden/>
+          </w:rPr>
+        </w:r>
+        <w:r>
+          <w:rPr>
+            <w:noProof/>
+            <w:webHidden/>
+          </w:rPr>
+          <w:fldChar w:fldCharType="separate"/>
+        </w:r>
+        <w:r>
+          <w:rPr>
+            <w:noProof/>
+            <w:webHidden/>
+          </w:rPr>
+          <w:t>13</w:t>
+        </w:r>
+        <w:r>
+          <w:rPr>
+            <w:noProof/>
+            <w:webHidden/>
+          </w:rPr>
+          <w:fldChar w:fldCharType="end"/>
+        </w:r>
+      </w:hyperlink>
+    </w:p>
+    <w:p>
+      <w:pPr>
+        <w:pStyle w:val="TOC1"/>
+        <w:tabs>
+          <w:tab w:val="right" w:leader="dot" w:pos="9016"/>
+        </w:tabs>
+        <w:rPr>
+          <w:rFonts w:eastAsiaTheme="minorEastAsia"/>
+          <w:b w:val="0"/>
+          <w:bCs w:val="0"/>
+          <w:caps w:val="0"/>
+          <w:noProof/>
+          <w:sz w:val="24"/>
+          <w:szCs w:val="24"/>
+          <w:lang w:eastAsia="en-AU"/>
+        </w:rPr>
+      </w:pPr>
+      <w:hyperlink w:anchor="_Toc242056866" w:history="1">
+        <w:r>
+          <w:rPr>
+            <w:rStyle w:val="Hyperlink"/>
+            <w:noProof/>
+          </w:rPr>
+          <w:t>Appendix</w:t>
+        </w:r>
+        <w:r>
+          <w:rPr>
+            <w:noProof/>
+            <w:webHidden/>
+          </w:rPr>
+          <w:tab/>
+        </w:r>
+        <w:r>
+          <w:rPr>
+            <w:noProof/>
+            <w:webHidden/>
+          </w:rPr>
+          <w:fldChar w:fldCharType="begin"/>
+        </w:r>
+        <w:r>
+          <w:rPr>
+            <w:noProof/>
+            <w:webHidden/>
+          </w:rPr>
+          <w:instrText xml:space="preserve"> PAGEREF _Toc242056866 \h </w:instrText>
+        </w:r>
+        <w:r>
+          <w:rPr>
+            <w:noProof/>
+            <w:webHidden/>
+          </w:rPr>
+        </w:r>
+        <w:r>
+          <w:rPr>
+            <w:noProof/>
+            <w:webHidden/>
+          </w:rPr>
+          <w:fldChar w:fldCharType="separate"/>
+        </w:r>
+        <w:r>
+          <w:rPr>
+            <w:noProof/>
+            <w:webHidden/>
+          </w:rPr>
+          <w:t>15</w:t>
+        </w:r>
+        <w:r>
+          <w:rPr>
+            <w:noProof/>
+            <w:webHidden/>
+          </w:rPr>
+          <w:fldChar w:fldCharType="end"/>
+        </w:r>
+      </w:hyperlink>
+    </w:p>
+    <w:p>
+      <w:pPr>
+        <w:pStyle w:val="TOC2"/>
+        <w:tabs>
+          <w:tab w:val="right" w:leader="dot" w:pos="9016"/>
+        </w:tabs>
+        <w:rPr>
+          <w:rFonts w:eastAsiaTheme="minorEastAsia"/>
+          <w:smallCaps w:val="0"/>
+          <w:noProof/>
+          <w:sz w:val="24"/>
+          <w:szCs w:val="24"/>
+          <w:lang w:eastAsia="en-AU"/>
+        </w:rPr>
+      </w:pPr>
+      <w:hyperlink w:anchor="_Toc242056867" w:history="1">
+        <w:r>
+          <w:rPr>
+            <w:rStyle w:val="Hyperlink"/>
+            <w:noProof/>
+          </w:rPr>
+          <w:t>Appendix A: Team Collaboration setup</w:t>
+        </w:r>
+        <w:r>
+          <w:rPr>
+            <w:noProof/>
+            <w:webHidden/>
+          </w:rPr>
+          <w:tab/>
+        </w:r>
+        <w:r>
+          <w:rPr>
+            <w:noProof/>
+            <w:webHidden/>
+          </w:rPr>
+          <w:fldChar w:fldCharType="begin"/>
+        </w:r>
+        <w:r>
+          <w:rPr>
+            <w:noProof/>
+            <w:webHidden/>
+          </w:rPr>
+          <w:instrText xml:space="preserve"> PAGEREF _Toc242056867 \h </w:instrText>
+        </w:r>
+        <w:r>
+          <w:rPr>
+            <w:noProof/>
+            <w:webHidden/>
+          </w:rPr>
+        </w:r>
+        <w:r>
+          <w:rPr>
+            <w:noProof/>
+            <w:webHidden/>
+          </w:rPr>
+          <w:fldChar w:fldCharType="separate"/>
+        </w:r>
+        <w:r>
+          <w:rPr>
+            <w:noProof/>
+            <w:webHidden/>
+          </w:rPr>
+          <w:t>15</w:t>
+        </w:r>
+        <w:r>
+          <w:rPr>
+            <w:noProof/>
+            <w:webHidden/>
+          </w:rPr>
+          <w:fldChar w:fldCharType="end"/>
+        </w:r>
+      </w:hyperlink>
+    </w:p>
+    <w:p>
+      <w:pPr>
+        <w:pStyle w:val="TOC2"/>
+        <w:tabs>
+          <w:tab w:val="right" w:leader="dot" w:pos="9016"/>
+        </w:tabs>
+        <w:rPr>
+          <w:rFonts w:eastAsiaTheme="minorEastAsia"/>
+          <w:smallCaps w:val="0"/>
+          <w:noProof/>
+          <w:sz w:val="24"/>
+          <w:szCs w:val="24"/>
+          <w:lang w:eastAsia="en-AU"/>
+        </w:rPr>
+      </w:pPr>
+      <w:hyperlink w:anchor="_Toc242056868" w:history="1">
+        <w:r>
+          <w:rPr>
+            <w:rStyle w:val="Hyperlink"/>
+            <w:noProof/>
+          </w:rPr>
+          <w:t>Appendix B: Participant Ethics &amp; Consent Form</w:t>
+        </w:r>
+        <w:r>
+          <w:rPr>
+            <w:noProof/>
+            <w:webHidden/>
+          </w:rPr>
+          <w:tab/>
+        </w:r>
+        <w:r>
+          <w:rPr>
+            <w:noProof/>
+            <w:webHidden/>
+          </w:rPr>
+          <w:fldChar w:fldCharType="begin"/>
+        </w:r>
+        <w:r>
+          <w:rPr>
+            <w:noProof/>
+            <w:webHidden/>
+          </w:rPr>
+          <w:instrText xml:space="preserve"> PAGEREF _Toc242056868 \h </w:instrText>
+        </w:r>
+        <w:r>
+          <w:rPr>
+            <w:noProof/>
+            <w:webHidden/>
+          </w:rPr>
+        </w:r>
+        <w:r>
+          <w:rPr>
+            <w:noProof/>
+            <w:webHidden/>
+          </w:rPr>
+          <w:fldChar w:fldCharType="separate"/>
+        </w:r>
+        <w:r>
+          <w:rPr>
+            <w:noProof/>
+            <w:webHidden/>
+          </w:rPr>
+          <w:t>16</w:t>
         </w:r>
         <w:r>
           <w:rPr>
@@ -1734,7 +2314,7 @@
       <w:pPr>
         <w:pStyle w:val="Heading1"/>
       </w:pPr>
-      <w:bookmarkStart w:id="0" w:name="_Toc239535708"/>
+      <w:bookmarkStart w:id="0" w:name="_Toc242056847"/>
       <w:r>
         <w:lastRenderedPageBreak/>
         <w:t>1</w:t>
@@ -1748,7 +2328,7 @@
       <w:pPr>
         <w:pStyle w:val="Heading2"/>
       </w:pPr>
-      <w:bookmarkStart w:id="1" w:name="_Toc239535709"/>
+      <w:bookmarkStart w:id="1" w:name="_Toc242056848"/>
       <w:r>
         <w:t>1.1 Background and Motivation</w:t>
       </w:r>
@@ -1769,7 +2349,7 @@
       <w:pPr>
         <w:pStyle w:val="Heading2"/>
       </w:pPr>
-      <w:bookmarkStart w:id="2" w:name="_Toc239535710"/>
+      <w:bookmarkStart w:id="2" w:name="_Toc242056849"/>
       <w:r>
         <w:t>1.2 Visualisation Purpose</w:t>
       </w:r>
@@ -1860,7 +2440,7 @@
       <w:pPr>
         <w:pStyle w:val="Heading2"/>
       </w:pPr>
-      <w:bookmarkStart w:id="3" w:name="_Toc239535711"/>
+      <w:bookmarkStart w:id="3" w:name="_Toc242056850"/>
       <w:r>
         <w:lastRenderedPageBreak/>
         <w:t>1.3 Project Schedule</w:t>
@@ -2924,7 +3504,7 @@
       <w:pPr>
         <w:pStyle w:val="Heading2"/>
       </w:pPr>
-      <w:bookmarkStart w:id="4" w:name="_Toc239535712"/>
+      <w:bookmarkStart w:id="4" w:name="_Toc242056851"/>
       <w:r>
         <w:t>1.4 Team Collaboration and Project Setup</w:t>
       </w:r>
@@ -2983,9 +3563,17 @@
         </w:rPr>
         <w:sectPr>
           <w:headerReference w:type="default" r:id="rId10"/>
+          <w:footerReference w:type="default" r:id="rId11"/>
           <w:pgSz w:w="11906" w:h="16838"/>
           <w:pgMar w:top="1440" w:right="1440" w:bottom="1440" w:left="1440" w:header="708" w:footer="708" w:gutter="0"/>
+          <w:pgBorders w:offsetFrom="page">
+            <w:top w:val="thinThickSmallGap" w:sz="24" w:space="24" w:color="auto"/>
+            <w:left w:val="thinThickSmallGap" w:sz="24" w:space="24" w:color="auto"/>
+            <w:bottom w:val="thickThinSmallGap" w:sz="24" w:space="24" w:color="auto"/>
+            <w:right w:val="thickThinSmallGap" w:sz="24" w:space="24" w:color="auto"/>
+          </w:pgBorders>
           <w:cols w:space="708"/>
+          <w:titlePg/>
           <w:docGrid w:linePitch="360"/>
         </w:sectPr>
       </w:pPr>
@@ -3037,6 +3625,12 @@
           <w:type w:val="continuous"/>
           <w:pgSz w:w="11906" w:h="16838"/>
           <w:pgMar w:top="1440" w:right="1440" w:bottom="1440" w:left="1440" w:header="708" w:footer="708" w:gutter="0"/>
+          <w:pgBorders w:offsetFrom="page">
+            <w:top w:val="thinThickSmallGap" w:sz="24" w:space="24" w:color="auto"/>
+            <w:left w:val="thinThickSmallGap" w:sz="24" w:space="24" w:color="auto"/>
+            <w:bottom w:val="thickThinSmallGap" w:sz="24" w:space="24" w:color="auto"/>
+            <w:right w:val="thickThinSmallGap" w:sz="24" w:space="24" w:color="auto"/>
+          </w:pgBorders>
           <w:cols w:num="2" w:space="286"/>
           <w:docGrid w:linePitch="360"/>
         </w:sectPr>
@@ -3054,6 +3648,12 @@
           <w:type w:val="continuous"/>
           <w:pgSz w:w="11906" w:h="16838"/>
           <w:pgMar w:top="1440" w:right="1440" w:bottom="1440" w:left="1440" w:header="708" w:footer="708" w:gutter="0"/>
+          <w:pgBorders w:offsetFrom="page">
+            <w:top w:val="thinThickSmallGap" w:sz="24" w:space="24" w:color="auto"/>
+            <w:left w:val="thinThickSmallGap" w:sz="24" w:space="24" w:color="auto"/>
+            <w:bottom w:val="thickThinSmallGap" w:sz="24" w:space="24" w:color="auto"/>
+            <w:right w:val="thickThinSmallGap" w:sz="24" w:space="24" w:color="auto"/>
+          </w:pgBorders>
           <w:cols w:space="286"/>
           <w:docGrid w:linePitch="360"/>
         </w:sectPr>
@@ -3063,7 +3663,7 @@
       <w:pPr>
         <w:pStyle w:val="Heading1"/>
       </w:pPr>
-      <w:bookmarkStart w:id="5" w:name="_Toc239535713"/>
+      <w:bookmarkStart w:id="5" w:name="_Toc242056852"/>
       <w:r>
         <w:lastRenderedPageBreak/>
         <w:t>2. Data</w:t>
@@ -3074,7 +3674,7 @@
       <w:pPr>
         <w:pStyle w:val="Heading2"/>
       </w:pPr>
-      <w:bookmarkStart w:id="6" w:name="_Toc239535714"/>
+      <w:bookmarkStart w:id="6" w:name="_Toc242056853"/>
       <w:r>
         <w:t>2.1 Data Sources</w:t>
       </w:r>
@@ -3161,21 +3761,16 @@
     <w:p>
       <w:pPr>
         <w:rPr>
-          <w:color w:val="000000" w:themeColor="text1"/>
-        </w:rPr>
-      </w:pPr>
-    </w:p>
-    <w:p>
-      <w:pPr>
-        <w:pStyle w:val="Heading3"/>
-      </w:pPr>
-      <w:bookmarkStart w:id="7" w:name="_Toc239535715"/>
-      <w:r>
-        <w:t>Data source:</w:t>
-      </w:r>
-      <w:bookmarkEnd w:id="7"/>
-      <w:r>
-        <w:t xml:space="preserve"> </w:t>
+          <w:b/>
+          <w:bCs/>
+        </w:rPr>
+      </w:pPr>
+      <w:r>
+        <w:rPr>
+          <w:b/>
+          <w:bCs/>
+        </w:rPr>
+        <w:t xml:space="preserve">Data source: </w:t>
       </w:r>
     </w:p>
     <w:p>
@@ -3204,18 +3799,18 @@
     </w:p>
     <w:p>
       <w:pPr>
-        <w:pStyle w:val="ListParagraph"/>
-      </w:pPr>
-    </w:p>
-    <w:p>
-      <w:pPr>
-        <w:pStyle w:val="Heading3"/>
-      </w:pPr>
-      <w:bookmarkStart w:id="8" w:name="_Toc239535716"/>
-      <w:r>
+        <w:rPr>
+          <w:b/>
+          <w:bCs/>
+        </w:rPr>
+      </w:pPr>
+      <w:r>
+        <w:rPr>
+          <w:b/>
+          <w:bCs/>
+        </w:rPr>
         <w:t>Source link:</w:t>
       </w:r>
-      <w:bookmarkEnd w:id="8"/>
     </w:p>
     <w:p>
       <w:pPr>
@@ -3225,7 +3820,7 @@
           <w:numId w:val="8"/>
         </w:numPr>
       </w:pPr>
-      <w:hyperlink r:id="rId11" w:history="1">
+      <w:hyperlink r:id="rId12" w:history="1">
         <w:r>
           <w:rPr>
             <w:rStyle w:val="Hyperlink"/>
@@ -3242,7 +3837,7 @@
           <w:numId w:val="8"/>
         </w:numPr>
       </w:pPr>
-      <w:hyperlink r:id="rId12" w:history="1">
+      <w:hyperlink r:id="rId13" w:history="1">
         <w:r>
           <w:rPr>
             <w:rStyle w:val="Hyperlink"/>
@@ -3270,29 +3865,28 @@
         <w:t>.</w:t>
       </w:r>
     </w:p>
-    <w:p/>
     <w:p>
       <w:pPr>
         <w:pStyle w:val="Heading2"/>
       </w:pPr>
-      <w:bookmarkStart w:id="9" w:name="_Toc239535717"/>
+      <w:bookmarkStart w:id="7" w:name="_Toc242056854"/>
       <w:r>
         <w:t>2.2 Data Processing</w:t>
       </w:r>
-      <w:bookmarkEnd w:id="9"/>
-    </w:p>
-    <w:p>
-      <w:r>
-        <w:t xml:space="preserve">The OECD data sets include observations for a number of countries, years and health related measures. The data was limited to 10 countries chosen from the OECD countries to avoid being overwhelmed by the sheer volume of data in the visualisations that would be produced by including all countries: Australia, Canada, France, Germany, </w:t>
+      <w:bookmarkEnd w:id="7"/>
+    </w:p>
+    <w:p>
+      <w:r>
+        <w:t>The OECD data sets include observations for a number of countries, years and health related measures. The data was limited to 10 countries chosen from the OECD countries to avoid being overwhelmed by the sheer volume of data in the visualisations that would be produced by including all countries: Australia, Canada, France, Germany, Italy, Japan, Korea, New Zealand, the United Kingdom and the United States. The selected period was 2015 to 2024.</w:t>
+      </w:r>
+    </w:p>
+    <w:p>
+      <w:r>
+        <w:t xml:space="preserve">The Life Expectancy dataset was restricted to only include annual observations for life expectancy at 0 years, sex = Total. The Healthcare Expenditure dataset was selected to </w:t>
       </w:r>
       <w:r>
         <w:lastRenderedPageBreak/>
-        <w:t>Italy, Japan, Korea, New Zealand, the United Kingdom and the United States. The selected period was 2015 to 2024.</w:t>
-      </w:r>
-    </w:p>
-    <w:p>
-      <w:r>
-        <w:t>The Life Expectancy dataset was restricted to only include annual observations for life expectancy at 0 years, sex = Total. The Healthcare Expenditure dataset was selected to provide data for total annual expenditure on healthcare items per capita at current prices in US dollars in purchasing power parity (PPP) terms. The filters provided the possibility to be sure that the values presented on the charts were common measures in the selected countries.</w:t>
+        <w:t>provide data for total annual expenditure on healthcare items per capita at current prices in US dollars in purchasing power parity (PPP) terms. The filters provided the possibility to be sure that the values presented on the charts were common measures in the selected countries.</w:t>
       </w:r>
     </w:p>
     <w:p>
@@ -3478,29 +4072,24 @@
         <w:t>.</w:t>
       </w:r>
     </w:p>
-    <w:p/>
-    <w:p>
-      <w:r>
-        <w:t xml:space="preserve">The data was cleaned, filtered and joined using the D3 function </w:t>
-      </w:r>
-      <w:proofErr w:type="spellStart"/>
-      <w:r>
-        <w:t>Promise.all</w:t>
-      </w:r>
-      <w:proofErr w:type="spellEnd"/>
-      <w:r>
-        <w:t xml:space="preserve">. </w:t>
+    <w:p>
+      <w:r>
+        <w:t>The data was cleaned, filtered and joined using the D3 function Promise</w:t>
+      </w:r>
+      <w:r>
+        <w:t xml:space="preserve"> </w:t>
+      </w:r>
+      <w:r>
+        <w:t xml:space="preserve">all. </w:t>
       </w:r>
     </w:p>
     <w:p>
       <w:r>
         <w:t xml:space="preserve">Tableau10 was used for a consistent and unified colour palette and </w:t>
       </w:r>
-      <w:proofErr w:type="spellStart"/>
-      <w:r>
-        <w:t>categoroical</w:t>
-      </w:r>
-      <w:proofErr w:type="spellEnd"/>
+      <w:r>
+        <w:t>categorical</w:t>
+      </w:r>
       <w:r>
         <w:t xml:space="preserve"> country distinction.</w:t>
       </w:r>
@@ -3525,22 +4114,22 @@
       <w:pPr>
         <w:pStyle w:val="Heading1"/>
       </w:pPr>
-      <w:bookmarkStart w:id="10" w:name="_Toc239535718"/>
+      <w:bookmarkStart w:id="8" w:name="_Toc242056855"/>
       <w:r>
         <w:lastRenderedPageBreak/>
         <w:t>3. Requirements</w:t>
       </w:r>
-      <w:bookmarkEnd w:id="10"/>
+      <w:bookmarkEnd w:id="8"/>
     </w:p>
     <w:p>
       <w:pPr>
         <w:pStyle w:val="Heading2"/>
       </w:pPr>
-      <w:bookmarkStart w:id="11" w:name="_Toc239535719"/>
+      <w:bookmarkStart w:id="9" w:name="_Toc242056856"/>
       <w:r>
         <w:t>3.1 Must-have Features</w:t>
       </w:r>
-      <w:bookmarkEnd w:id="11"/>
+      <w:bookmarkEnd w:id="9"/>
     </w:p>
     <w:p>
       <w:r>
@@ -3793,11 +4382,11 @@
       <w:pPr>
         <w:pStyle w:val="Heading2"/>
       </w:pPr>
-      <w:bookmarkStart w:id="12" w:name="_Toc239535720"/>
+      <w:bookmarkStart w:id="10" w:name="_Toc242056857"/>
       <w:r>
         <w:t>3.2 Optional Features</w:t>
       </w:r>
-      <w:bookmarkEnd w:id="12"/>
+      <w:bookmarkEnd w:id="10"/>
     </w:p>
     <w:p>
       <w:r>
@@ -4144,105 +4733,169 @@
       <w:pPr>
         <w:pStyle w:val="Heading1"/>
       </w:pPr>
-      <w:bookmarkStart w:id="13" w:name="_Toc239535721"/>
+      <w:bookmarkStart w:id="11" w:name="_Toc242056858"/>
       <w:r>
         <w:lastRenderedPageBreak/>
         <w:t>4. Visualisation Design</w:t>
       </w:r>
+      <w:bookmarkEnd w:id="11"/>
+    </w:p>
+    <w:p>
+      <w:pPr>
+        <w:pStyle w:val="Heading4"/>
+        <w:rPr>
+          <w:rFonts w:eastAsiaTheme="minorHAnsi" w:cstheme="minorBidi"/>
+          <w:i w:val="0"/>
+          <w:iCs w:val="0"/>
+          <w:color w:val="auto"/>
+        </w:rPr>
+      </w:pPr>
+      <w:r>
+        <w:rPr>
+          <w:rFonts w:eastAsiaTheme="minorHAnsi" w:cstheme="minorBidi"/>
+          <w:i w:val="0"/>
+          <w:iCs w:val="0"/>
+          <w:color w:val="auto"/>
+        </w:rPr>
+        <w:t xml:space="preserve">The final website features three interactive visualisations: a scatter plot that relates healthcare expenditure to life expectancy, and </w:t>
+      </w:r>
+      <w:r>
+        <w:rPr>
+          <w:rFonts w:eastAsiaTheme="minorHAnsi" w:cstheme="minorBidi"/>
+          <w:i w:val="0"/>
+          <w:iCs w:val="0"/>
+          <w:color w:val="auto"/>
+        </w:rPr>
+        <w:t>two-line</w:t>
+      </w:r>
+      <w:r>
+        <w:rPr>
+          <w:rFonts w:eastAsiaTheme="minorHAnsi" w:cstheme="minorBidi"/>
+          <w:i w:val="0"/>
+          <w:iCs w:val="0"/>
+          <w:color w:val="auto"/>
+        </w:rPr>
+        <w:t xml:space="preserve"> charts, that represent changes to health expenditure over time, and to life expectancy over time. The visualisations were chosen to answer the research questions, and help the user to compare 10 countries selected from the OECD, between 2015 and 2024.</w:t>
+      </w:r>
+    </w:p>
+    <w:p>
+      <w:pPr>
+        <w:pStyle w:val="Heading4"/>
+      </w:pPr>
+      <w:r>
+        <w:t>Design Idea 1 – Scatter Plot</w:t>
+      </w:r>
+    </w:p>
+    <w:p>
+      <w:r>
+        <w:t xml:space="preserve">The graph is a scatter graph with healthcare expenditure (in PPp in United States dollars) plotted on the x axis and life expectancy (in years) on the y axis. The data points are for selected OECD countries and are chosen and reflect its most current data. This design enables users to explore the linkage between healthcare spending and life </w:t>
+      </w:r>
+      <w:r>
+        <w:t>expectancy and</w:t>
+      </w:r>
+      <w:r>
+        <w:t xml:space="preserve"> discover countries with varying healthcare spending and life expectancy. Interactive tooltips provide detail values, and on blowing up a single country, can concentrate on that country.</w:t>
+      </w:r>
+    </w:p>
+    <w:p>
+      <w:pPr>
+        <w:pStyle w:val="Heading4"/>
+      </w:pPr>
+      <w:r>
+        <w:t>Design Idea 2 – Line Chart</w:t>
+      </w:r>
+    </w:p>
+    <w:p>
+      <w:r>
+        <w:t xml:space="preserve">The first graph shows southern health spending per person (1000 USD) per year from 2015 to 2024. The countries are coloured using the Colour palette: Tableau10. A legend is presented to indicate the country to help users identify the country they want, and interactive highlighting increases the visibility of the selected </w:t>
+      </w:r>
+      <w:proofErr w:type="gramStart"/>
+      <w:r>
+        <w:t>country, and</w:t>
+      </w:r>
+      <w:proofErr w:type="gramEnd"/>
+      <w:r>
+        <w:t xml:space="preserve"> decreases visual clutter by highlighting all other countries. This chart will help users to compare spending trends and look for changes over time.</w:t>
+      </w:r>
+    </w:p>
+    <w:p>
+      <w:pPr>
+        <w:pStyle w:val="Heading4"/>
+      </w:pPr>
+      <w:r>
+        <w:t>Design Idea 3 – Combined Interactive Dashboard</w:t>
+      </w:r>
+    </w:p>
+    <w:p>
+      <w:r>
+        <w:t xml:space="preserve">The second graph shows that during those 10 </w:t>
+      </w:r>
+      <w:proofErr w:type="gramStart"/>
+      <w:r>
+        <w:t>countries,</w:t>
+      </w:r>
+      <w:proofErr w:type="gramEnd"/>
+      <w:r>
+        <w:t xml:space="preserve"> life expectancy has improved over the years from 2015 to 2024. Using a consistent colour for each country across the visualisations helps users make comparisons. Note that interactive tooltips and highlighting enable users to trace each trend, even when they are meeting in the graph</w:t>
+      </w:r>
+      <w:r>
+        <w:t>.</w:t>
+      </w:r>
+    </w:p>
+    <w:p>
+      <w:pPr>
+        <w:rPr>
+          <w:rFonts w:eastAsiaTheme="majorEastAsia" w:cstheme="majorBidi"/>
+          <w:i/>
+          <w:iCs/>
+          <w:color w:val="0F4761" w:themeColor="accent1" w:themeShade="BF"/>
+        </w:rPr>
+      </w:pPr>
+      <w:r>
+        <w:rPr>
+          <w:rFonts w:eastAsiaTheme="majorEastAsia" w:cstheme="majorBidi"/>
+          <w:i/>
+          <w:iCs/>
+          <w:color w:val="0F4761" w:themeColor="accent1" w:themeShade="BF"/>
+        </w:rPr>
+        <w:t>Design Decisions and Improvements</w:t>
+      </w:r>
+    </w:p>
+    <w:p>
+      <w:r>
+        <w:t>The concept of making comparisons between countries based on the expenditure of health care systems was entertained but a bar chart was not used. Line charts were chosen for the final website as they convey a change over time better. The scatter graph shows that there is a relationship between the two numerical variables and was therefore not removed.</w:t>
+      </w:r>
+    </w:p>
+    <w:p>
+      <w:r>
+        <w:t>After some usability testing, country filtering was added so that people could click on a country from the scatter plot or chart legend and filter it on the various visualisations. Two or three short answers were also included in the five guiding questions (orienteering questions) to assist the user in understanding the charts. The use of the grid lines and the uniformity of the country colours further facilitated the visual clarity.</w:t>
+      </w:r>
+    </w:p>
+    <w:p>
+      <w:r>
+        <w:lastRenderedPageBreak/>
+        <w:t>Web site responsive to screen size. If the device is small, horizontal scrolling for the charts ensures that they remain readable and not cramped. These design features enable a comparative, analytical and interactive approach to the OECD data.</w:t>
+      </w:r>
+    </w:p>
+    <w:p>
+      <w:pPr>
+        <w:pStyle w:val="Heading1"/>
+      </w:pPr>
+      <w:bookmarkStart w:id="12" w:name="_Toc242056859"/>
+      <w:r>
+        <w:t>5. Validation</w:t>
+      </w:r>
+      <w:bookmarkEnd w:id="12"/>
+    </w:p>
+    <w:p>
+      <w:pPr>
+        <w:pStyle w:val="Heading2"/>
+      </w:pPr>
+      <w:bookmarkStart w:id="13" w:name="_Toc242056860"/>
+      <w:r>
+        <w:t>5.1 Informed Consent</w:t>
+      </w:r>
       <w:bookmarkEnd w:id="13"/>
-    </w:p>
-    <w:p>
-      <w:r>
-        <w:t>The project is currently in the early design stage. Several visualisation approaches will be considered before selecting the final design.</w:t>
-      </w:r>
-    </w:p>
-    <w:p/>
-    <w:p>
-      <w:r>
-        <w:t>Possible visualisation ideas include:</w:t>
-      </w:r>
-    </w:p>
-    <w:p>
-      <w:pPr>
-        <w:pStyle w:val="Heading4"/>
-      </w:pPr>
-      <w:r>
-        <w:t>Design Idea 1 – Scatter Plot</w:t>
-      </w:r>
-    </w:p>
-    <w:p>
-      <w:r>
-        <w:t>A scatter plot could display healthcare expenditure on the x-axis and life expectancy on the y-axis. Each point would represent a country. This would make it easier to investigate whether countries with higher healthcare expenditure also tend to have higher life expectancy.</w:t>
-      </w:r>
-    </w:p>
-    <w:p/>
-    <w:p>
-      <w:pPr>
-        <w:pStyle w:val="Heading4"/>
-      </w:pPr>
-      <w:r>
-        <w:t>Design Idea 2 – Line Chart</w:t>
-      </w:r>
-    </w:p>
-    <w:p>
-      <w:r>
-        <w:t>A line chart could show changes in healthcare expenditure or life expectancy over time. Users could select or compare countries to observe long-term trends.</w:t>
-      </w:r>
-    </w:p>
-    <w:p/>
-    <w:p>
-      <w:pPr>
-        <w:pStyle w:val="Heading4"/>
-      </w:pPr>
-      <w:r>
-        <w:t>Design Idea 3 – Combined Interactive Dashboard</w:t>
-      </w:r>
-    </w:p>
-    <w:p>
-      <w:r>
-        <w:t>A dashboard could combine the scatter plot and line chart with filters for country and year. Selecting a country or year could update the visualisations and allow users to explore the data interactively.</w:t>
-      </w:r>
-    </w:p>
-    <w:p/>
-    <w:p>
-      <w:pPr>
-        <w:pStyle w:val="Heading4"/>
-      </w:pPr>
-      <w:r>
-        <w:t xml:space="preserve">Design Idea </w:t>
-      </w:r>
-      <w:r>
-        <w:t>4</w:t>
-      </w:r>
-      <w:r>
-        <w:t xml:space="preserve"> – </w:t>
-      </w:r>
-      <w:r>
-        <w:t>Bar Chart</w:t>
-      </w:r>
-    </w:p>
-    <w:p>
-      <w:r>
-        <w:t>A bar chart could have been used to demonstrate the spending of each country to see how they visual stack against each other. This was rejected due to the cluttered look. A line chart was favoured due to its ability to display the two variables together.</w:t>
-      </w:r>
-    </w:p>
-    <w:p/>
-    <w:p/>
-    <w:p>
-      <w:pPr>
-        <w:pStyle w:val="Heading1"/>
-      </w:pPr>
-      <w:r>
-        <w:t>5. Validation</w:t>
-      </w:r>
-    </w:p>
-    <w:p>
-      <w:pPr>
-        <w:pStyle w:val="Heading2"/>
-      </w:pPr>
-      <w:r>
-        <w:t>5.1 Informed Consent</w:t>
-      </w:r>
     </w:p>
     <w:p>
       <w:r>
@@ -4264,7 +4917,6 @@
         </w:numPr>
       </w:pPr>
       <w:r>
-        <w:lastRenderedPageBreak/>
         <w:t>Participants were informed that participation was voluntary and could withdraw at any point.</w:t>
       </w:r>
     </w:p>
@@ -4292,9 +4944,11 @@
       <w:pPr>
         <w:pStyle w:val="Heading2"/>
       </w:pPr>
+      <w:bookmarkStart w:id="14" w:name="_Toc242056861"/>
       <w:r>
         <w:t>5.2 Participant Profile</w:t>
       </w:r>
+      <w:bookmarkEnd w:id="14"/>
     </w:p>
     <w:p>
       <w:r>
@@ -4984,9 +5638,11 @@
       <w:pPr>
         <w:pStyle w:val="Heading2"/>
       </w:pPr>
+      <w:bookmarkStart w:id="15" w:name="_Toc242056862"/>
       <w:r>
         <w:t>5.3 Evaluation and Satisfaction Survey</w:t>
       </w:r>
+      <w:bookmarkEnd w:id="15"/>
     </w:p>
     <w:p>
       <w:r>
@@ -5044,6 +5700,7 @@
           <w:b/>
           <w:bCs/>
         </w:rPr>
+        <w:lastRenderedPageBreak/>
         <w:t>Task 3 (Comparative Outcome):</w:t>
       </w:r>
       <w:r>
@@ -5069,7 +5726,6 @@
         <w:t xml:space="preserve"> "Filter or highlight 'Australia' across all visualisations on the page."</w:t>
       </w:r>
     </w:p>
-    <w:p/>
     <w:p>
       <w:r>
         <w:t>Following the task completion, the participants completed a post-test questionnaire using a 5-point scale.</w:t>
@@ -5234,7 +5890,6 @@
           </w:tcPr>
           <w:p>
             <w:r>
-              <w:lastRenderedPageBreak/>
               <w:t>Visual Clarity</w:t>
             </w:r>
           </w:p>
@@ -5404,18 +6059,27 @@
       <w:pPr>
         <w:pStyle w:val="Heading2"/>
       </w:pPr>
+      <w:bookmarkStart w:id="16" w:name="_Toc242056863"/>
       <w:r>
         <w:t xml:space="preserve">5.4 </w:t>
       </w:r>
       <w:r>
         <w:t>Usability Findings &amp; Qualitative Feedback</w:t>
       </w:r>
-    </w:p>
-    <w:p>
-      <w:pPr>
-        <w:pStyle w:val="Heading3"/>
-      </w:pPr>
-      <w:r>
+      <w:bookmarkEnd w:id="16"/>
+    </w:p>
+    <w:p>
+      <w:pPr>
+        <w:rPr>
+          <w:b/>
+          <w:bCs/>
+        </w:rPr>
+      </w:pPr>
+      <w:r>
+        <w:rPr>
+          <w:b/>
+          <w:bCs/>
+        </w:rPr>
         <w:t>Positive Feedback</w:t>
       </w:r>
     </w:p>
@@ -5457,9 +6121,16 @@
     </w:p>
     <w:p>
       <w:pPr>
-        <w:pStyle w:val="Heading3"/>
-      </w:pPr>
-      <w:r>
+        <w:rPr>
+          <w:b/>
+          <w:bCs/>
+        </w:rPr>
+      </w:pPr>
+      <w:r>
+        <w:rPr>
+          <w:b/>
+          <w:bCs/>
+        </w:rPr>
         <w:t>Pain Points</w:t>
       </w:r>
     </w:p>
@@ -5530,18 +6201,22 @@
         <w:t>Hard to see information when the lines crossed for visual 3.</w:t>
       </w:r>
     </w:p>
+    <w:p/>
+    <w:p/>
+    <w:p/>
+    <w:p/>
+    <w:p/>
+    <w:p/>
     <w:p>
       <w:pPr>
         <w:pStyle w:val="Heading2"/>
       </w:pPr>
-    </w:p>
-    <w:p>
-      <w:pPr>
-        <w:pStyle w:val="Heading2"/>
-      </w:pPr>
-      <w:r>
+      <w:bookmarkStart w:id="17" w:name="_Toc242056864"/>
+      <w:r>
+        <w:lastRenderedPageBreak/>
         <w:t>5.5 Design Improvements</w:t>
       </w:r>
+      <w:bookmarkEnd w:id="17"/>
     </w:p>
     <w:p>
       <w:pPr>
@@ -5763,11 +6438,62 @@
       <w:pPr>
         <w:pStyle w:val="Heading1"/>
       </w:pPr>
+      <w:bookmarkStart w:id="18" w:name="_Toc242056865"/>
       <w:r>
         <w:t>6. Conclusion</w:t>
       </w:r>
-    </w:p>
-    <w:p/>
+      <w:bookmarkEnd w:id="18"/>
+    </w:p>
+    <w:p>
+      <w:r>
+        <w:t>Team 1E have successfully created an interactive data visualisation webpage that investigates in 30 years the relationship between healthcare expenditure and life expectancy for ten selected OECD countries from 2015 to 2024. The project used two OECD datasets, which were filtered and combined using JavaScript and D3.js to produce 100 observations for the selected countries and years.</w:t>
+      </w:r>
+    </w:p>
+    <w:p>
+      <w:r>
+        <w:t xml:space="preserve">The final site consists of three interactive visualisations: a scatter graph comparing healthcare expenditure and life expectancy, a healthcare expenditure line chart and a life expectancy line chart. When used in unison, these charts enable users to compare countries, </w:t>
+      </w:r>
+      <w:proofErr w:type="spellStart"/>
+      <w:r>
+        <w:t>analyze</w:t>
+      </w:r>
+      <w:proofErr w:type="spellEnd"/>
+      <w:r>
+        <w:t xml:space="preserve"> trends over time, and </w:t>
+      </w:r>
+      <w:proofErr w:type="spellStart"/>
+      <w:r>
+        <w:t>analyze</w:t>
+      </w:r>
+      <w:proofErr w:type="spellEnd"/>
+      <w:r>
+        <w:t xml:space="preserve"> variations in population health and spending on health care. To enhance comprehension, interactive tooltips, highlighting the countries and consistent colours and guiding questions were added.</w:t>
+      </w:r>
+    </w:p>
+    <w:p>
+      <w:r>
+        <w:t>Two different technical skill levels were used to conduct usability testing. Their feedback highlighted problems with chart legends, and with finding isolated data for individual countries and with focusing on trends where they were relevant. The team suggested a solution in the form of country filtering arguments, added short answers to the guiding questions, and improved the visual consistency. The alterations made these changes were effective uses to the website in being able to support data exploration.</w:t>
+      </w:r>
+    </w:p>
+    <w:p>
+      <w:r>
+        <w:lastRenderedPageBreak/>
+        <w:t>In the process our hands-on data preparation, D3.js coding, responsive web design, and usability testing and project collaboration skills were also enhanced. However, I was able to communicate with them on a regular basis thanks to Microsoft Teams and GitHub.</w:t>
+      </w:r>
+    </w:p>
+    <w:p>
+      <w:r>
+        <w:t xml:space="preserve">Year based filtering, use of animated transitions and easier user interaction/control methods would be enhancements to the final </w:t>
+      </w:r>
+      <w:proofErr w:type="gramStart"/>
+      <w:r>
+        <w:t>site, but</w:t>
+      </w:r>
+      <w:proofErr w:type="gramEnd"/>
+      <w:r>
+        <w:t xml:space="preserve"> fit within main project requirements. Overall, the project shows how interactive data visualisation can make complex data relating to healthcare expenditure more approachable while inviting the audience to carefully consider the relationship between the two.</w:t>
+      </w:r>
+    </w:p>
     <w:p>
       <w:pPr>
         <w:rPr>
@@ -5785,18 +6511,22 @@
       <w:pPr>
         <w:pStyle w:val="Heading1"/>
       </w:pPr>
+      <w:bookmarkStart w:id="19" w:name="_Toc242056866"/>
       <w:r>
         <w:lastRenderedPageBreak/>
         <w:t>Appendix</w:t>
       </w:r>
+      <w:bookmarkEnd w:id="19"/>
     </w:p>
     <w:p>
       <w:pPr>
         <w:pStyle w:val="Heading2"/>
       </w:pPr>
+      <w:bookmarkStart w:id="20" w:name="_Toc242056867"/>
       <w:r>
         <w:t>Appendix A: Team Collaboration setup</w:t>
       </w:r>
+      <w:bookmarkEnd w:id="20"/>
     </w:p>
     <w:tbl>
       <w:tblPr>
@@ -5845,7 +6575,7 @@
                           <pic:cNvPicPr/>
                         </pic:nvPicPr>
                         <pic:blipFill>
-                          <a:blip r:embed="rId13" cstate="print">
+                          <a:blip r:embed="rId14" cstate="print">
                             <a:extLst>
                               <a:ext uri="{28A0092B-C50C-407E-A947-70E740481C1C}">
                                 <a14:useLocalDpi xmlns:a14="http://schemas.microsoft.com/office/drawing/2010/main" val="0"/>
@@ -5909,7 +6639,7 @@
                           <pic:cNvPicPr/>
                         </pic:nvPicPr>
                         <pic:blipFill>
-                          <a:blip r:embed="rId14" cstate="print">
+                          <a:blip r:embed="rId15" cstate="print">
                             <a:extLst>
                               <a:ext uri="{28A0092B-C50C-407E-A947-70E740481C1C}">
                                 <a14:useLocalDpi xmlns:a14="http://schemas.microsoft.com/office/drawing/2010/main" val="0"/>
@@ -5982,7 +6712,7 @@
                           <pic:cNvPicPr/>
                         </pic:nvPicPr>
                         <pic:blipFill>
-                          <a:blip r:embed="rId15" cstate="print">
+                          <a:blip r:embed="rId16" cstate="print">
                             <a:extLst>
                               <a:ext uri="{28A0092B-C50C-407E-A947-70E740481C1C}">
                                 <a14:useLocalDpi xmlns:a14="http://schemas.microsoft.com/office/drawing/2010/main" val="0"/>
@@ -6037,6 +6767,7 @@
       <w:pPr>
         <w:pStyle w:val="Heading2"/>
       </w:pPr>
+      <w:bookmarkStart w:id="21" w:name="_Toc242056868"/>
       <w:r>
         <w:lastRenderedPageBreak/>
         <w:t xml:space="preserve">Appendix </w:t>
@@ -6047,6 +6778,7 @@
       <w:r>
         <w:t>: Participant Ethics &amp; Consent Form</w:t>
       </w:r>
+      <w:bookmarkEnd w:id="21"/>
     </w:p>
     <w:p>
       <w:pPr>
@@ -6375,6 +7107,12 @@
       <w:type w:val="continuous"/>
       <w:pgSz w:w="11906" w:h="16838"/>
       <w:pgMar w:top="1440" w:right="1440" w:bottom="1440" w:left="1440" w:header="708" w:footer="708" w:gutter="0"/>
+      <w:pgBorders w:offsetFrom="page">
+        <w:top w:val="thinThickSmallGap" w:sz="24" w:space="24" w:color="auto"/>
+        <w:left w:val="thinThickSmallGap" w:sz="24" w:space="24" w:color="auto"/>
+        <w:bottom w:val="thickThinSmallGap" w:sz="24" w:space="24" w:color="auto"/>
+        <w:right w:val="thickThinSmallGap" w:sz="24" w:space="24" w:color="auto"/>
+      </w:pgBorders>
       <w:cols w:space="708"/>
       <w:docGrid w:linePitch="360"/>
     </w:sectPr>
@@ -6405,6 +7143,59 @@
     </w:p>
   </w:endnote>
 </w:endnotes>
+</file>
+
+<file path=word/footer1.xml><?xml version="1.0" encoding="utf-8"?>
+<w:ftr xmlns:wpc="http://schemas.microsoft.com/office/word/2010/wordprocessingCanvas" xmlns:cx="http://schemas.microsoft.com/office/drawing/2014/chartex" xmlns:cx1="http://schemas.microsoft.com/office/drawing/2015/9/8/chartex" xmlns:cx2="http://schemas.microsoft.com/office/drawing/2015/10/21/chartex" xmlns:cx3="http://schemas.microsoft.com/office/drawing/2016/5/9/chartex" xmlns:cx4="http://schemas.microsoft.com/office/drawing/2016/5/10/chartex" xmlns:cx5="http://schemas.microsoft.com/office/drawing/2016/5/11/chartex" xmlns:cx6="http://schemas.microsoft.com/office/drawing/2016/5/12/chartex" xmlns:cx7="http://schemas.microsoft.com/office/drawing/2016/5/13/chartex" xmlns:cx8="http://schemas.microsoft.com/office/drawing/2016/5/14/chartex" xmlns:mc="http://schemas.openxmlformats.org/markup-compatibility/2006" xmlns:aink="http://schemas.microsoft.com/office/drawing/2016/ink" xmlns:am3d="http://schemas.microsoft.com/office/drawing/2017/model3d" xmlns:o="urn:schemas-microsoft-com:office:office" xmlns:oel="http://schemas.microsoft.com/office/2019/extlst" xmlns:r="http://schemas.openxmlformats.org/officeDocument/2006/relationships" xmlns:m="http://schemas.openxmlformats.org/officeDocument/2006/math" xmlns:v="urn:schemas-microsoft-com:vml" xmlns:wp14="http://schemas.microsoft.com/office/word/2010/wordprocessingDrawing" xmlns:wp="http://schemas.openxmlformats.org/drawingml/2006/wordprocessingDrawing" xmlns:w10="urn:schemas-microsoft-com:office:word" xmlns:w="http://schemas.openxmlformats.org/wordprocessingml/2006/main" xmlns:w14="http://schemas.microsoft.com/office/word/2010/wordml" xmlns:w15="http://schemas.microsoft.com/office/word/2012/wordml" xmlns:w16cex="http://schemas.microsoft.com/office/word/2018/wordml/cex" xmlns:w16cid="http://schemas.microsoft.com/office/word/2016/wordml/cid" xmlns:w16="http://schemas.microsoft.com/office/word/2018/wordml" xmlns:w16du="http://schemas.microsoft.com/office/word/2023/wordml/word16du" xmlns:w16sdtdh="http://schemas.microsoft.com/office/word/2020/wordml/sdtdatahash" xmlns:w16sdtfl="http://schemas.microsoft.com/office/word/2024/wordml/sdtformatlock" xmlns:w16se="http://schemas.microsoft.com/office/word/2015/wordml/symex" xmlns:wpg="http://schemas.microsoft.com/office/word/2010/wordprocessingGroup" xmlns:wpi="http://schemas.microsoft.com/office/word/2010/wordprocessingInk" xmlns:wne="http://schemas.microsoft.com/office/word/2006/wordml" xmlns:wps="http://schemas.microsoft.com/office/word/2010/wordprocessingShape" mc:Ignorable="w14 w15 w16se w16cid w16 w16cex w16sdtdh w16sdtfl w16du wp14">
+  <w:sdt>
+    <w:sdtPr>
+      <w:id w:val="-394210903"/>
+      <w:docPartObj>
+        <w:docPartGallery w:val="Page Numbers (Bottom of Page)"/>
+        <w:docPartUnique/>
+      </w:docPartObj>
+    </w:sdtPr>
+    <w:sdtEndPr>
+      <w:rPr>
+        <w:noProof/>
+      </w:rPr>
+    </w:sdtEndPr>
+    <w:sdtContent>
+      <w:p>
+        <w:pPr>
+          <w:pStyle w:val="Footer"/>
+          <w:jc w:val="center"/>
+        </w:pPr>
+        <w:r>
+          <w:fldChar w:fldCharType="begin"/>
+        </w:r>
+        <w:r>
+          <w:instrText xml:space="preserve"> PAGE   \* MERGEFORMAT </w:instrText>
+        </w:r>
+        <w:r>
+          <w:fldChar w:fldCharType="separate"/>
+        </w:r>
+        <w:r>
+          <w:rPr>
+            <w:noProof/>
+          </w:rPr>
+          <w:t>2</w:t>
+        </w:r>
+        <w:r>
+          <w:rPr>
+            <w:noProof/>
+          </w:rPr>
+          <w:fldChar w:fldCharType="end"/>
+        </w:r>
+      </w:p>
+    </w:sdtContent>
+  </w:sdt>
+  <w:p>
+    <w:pPr>
+      <w:pStyle w:val="Footer"/>
+    </w:pPr>
+  </w:p>
+</w:ftr>
 </file>
 
 <file path=word/footnotes.xml><?xml version="1.0" encoding="utf-8"?>

</xml_diff>

<commit_message>
updates to the process book content
</commit_message>
<xml_diff>
--- a/Assignment 3B_Project process book/Assignment 3B - Project process book.docx
+++ b/Assignment 3B_Project process book/Assignment 3B - Project process book.docx
@@ -1,6 +1,6 @@
 
 <file path=word/document.xml><?xml version="1.0" encoding="utf-8"?>
-<w:document xmlns:wpc="http://schemas.microsoft.com/office/word/2010/wordprocessingCanvas" xmlns:cx="http://schemas.microsoft.com/office/drawing/2014/chartex" xmlns:cx1="http://schemas.microsoft.com/office/drawing/2015/9/8/chartex" xmlns:cx2="http://schemas.microsoft.com/office/drawing/2015/10/21/chartex" xmlns:cx3="http://schemas.microsoft.com/office/drawing/2016/5/9/chartex" xmlns:cx4="http://schemas.microsoft.com/office/drawing/2016/5/10/chartex" xmlns:cx5="http://schemas.microsoft.com/office/drawing/2016/5/11/chartex" xmlns:cx6="http://schemas.microsoft.com/office/drawing/2016/5/12/chartex" xmlns:cx7="http://schemas.microsoft.com/office/drawing/2016/5/13/chartex" xmlns:cx8="http://schemas.microsoft.com/office/drawing/2016/5/14/chartex" xmlns:mc="http://schemas.openxmlformats.org/markup-compatibility/2006" xmlns:aink="http://schemas.microsoft.com/office/drawing/2016/ink" xmlns:am3d="http://schemas.microsoft.com/office/drawing/2017/model3d" xmlns:o="urn:schemas-microsoft-com:office:office" xmlns:oel="http://schemas.microsoft.com/office/2019/extlst" xmlns:r="http://schemas.openxmlformats.org/officeDocument/2006/relationships" xmlns:m="http://schemas.openxmlformats.org/officeDocument/2006/math" xmlns:v="urn:schemas-microsoft-com:vml" xmlns:wp14="http://schemas.microsoft.com/office/word/2010/wordprocessingDrawing" xmlns:wp="http://schemas.openxmlformats.org/drawingml/2006/wordprocessingDrawing" xmlns:w10="urn:schemas-microsoft-com:office:word" xmlns:w="http://schemas.openxmlformats.org/wordprocessingml/2006/main" xmlns:w14="http://schemas.microsoft.com/office/word/2010/wordml" xmlns:w15="http://schemas.microsoft.com/office/word/2012/wordml" xmlns:w16cex="http://schemas.microsoft.com/office/word/2018/wordml/cex" xmlns:w16cid="http://schemas.microsoft.com/office/word/2016/wordml/cid" xmlns:w16="http://schemas.microsoft.com/office/word/2018/wordml" xmlns:w16du="http://schemas.microsoft.com/office/word/2023/wordml/word16du" xmlns:w16sdtdh="http://schemas.microsoft.com/office/word/2020/wordml/sdtdatahash" xmlns:w16sdtfl="http://schemas.microsoft.com/office/word/2024/wordml/sdtformatlock" xmlns:w16se="http://schemas.microsoft.com/office/word/2015/wordml/symex" xmlns:wpg="http://schemas.microsoft.com/office/word/2010/wordprocessingGroup" xmlns:wpi="http://schemas.microsoft.com/office/word/2010/wordprocessingInk" xmlns:wne="http://schemas.microsoft.com/office/word/2006/wordml" xmlns:wps="http://schemas.microsoft.com/office/word/2010/wordprocessingShape" mc:Ignorable="w14 w15 w16se w16cid w16 w16cex w16sdtdh w16sdtfl w16du wp14">
+<w:document xmlns:wpc="http://schemas.microsoft.com/office/word/2010/wordprocessingCanvas" xmlns:cx="http://schemas.microsoft.com/office/drawing/2014/chartex" xmlns:cx1="http://schemas.microsoft.com/office/drawing/2015/9/8/chartex" xmlns:cx2="http://schemas.microsoft.com/office/drawing/2015/10/21/chartex" xmlns:cx3="http://schemas.microsoft.com/office/drawing/2016/5/9/chartex" xmlns:cx4="http://schemas.microsoft.com/office/drawing/2016/5/10/chartex" xmlns:cx5="http://schemas.microsoft.com/office/drawing/2016/5/11/chartex" xmlns:cx6="http://schemas.microsoft.com/office/drawing/2016/5/12/chartex" xmlns:cx7="http://schemas.microsoft.com/office/drawing/2016/5/13/chartex" xmlns:cx8="http://schemas.microsoft.com/office/drawing/2016/5/14/chartex" xmlns:mc="http://schemas.openxmlformats.org/markup-compatibility/2006" xmlns:m="http://schemas.openxmlformats.org/officeDocument/2006/math" xmlns:aink="http://schemas.microsoft.com/office/drawing/2016/ink" xmlns:am3d="http://schemas.microsoft.com/office/drawing/2017/model3d" xmlns:oel="http://schemas.microsoft.com/office/2019/extlst" xmlns:r="http://schemas.openxmlformats.org/officeDocument/2006/relationships" xmlns:wp14="http://schemas.microsoft.com/office/word/2010/wordprocessingDrawing" xmlns:wp="http://schemas.openxmlformats.org/drawingml/2006/wordprocessingDrawing" xmlns:wpg="http://schemas.microsoft.com/office/word/2010/wordprocessingGroup" xmlns:wpi="http://schemas.microsoft.com/office/word/2010/wordprocessingInk" xmlns:wps="http://schemas.microsoft.com/office/word/2010/wordprocessingShape" xmlns:o="urn:schemas-microsoft-com:office:office" xmlns:v="urn:schemas-microsoft-com:vml" xmlns:w10="urn:schemas-microsoft-com:office:word" xmlns:w="http://schemas.openxmlformats.org/wordprocessingml/2006/main" xmlns:w14="http://schemas.microsoft.com/office/word/2010/wordml" xmlns:w15="http://schemas.microsoft.com/office/word/2012/wordml" xmlns:w16cex="http://schemas.microsoft.com/office/word/2018/wordml/cex" xmlns:w16cid="http://schemas.microsoft.com/office/word/2016/wordml/cid" xmlns:w16="http://schemas.microsoft.com/office/word/2018/wordml" xmlns:w16sdtdh="http://schemas.microsoft.com/office/word/2020/wordml/sdtdatahash" xmlns:w16sdtfl="http://schemas.microsoft.com/office/word/2024/wordml/sdtformatlock" xmlns:w16se="http://schemas.microsoft.com/office/word/2015/wordml/symex" xmlns:w16du="http://schemas.microsoft.com/office/word/2023/wordml/word16du" xmlns:wne="http://schemas.microsoft.com/office/word/2006/wordml" mc:Ignorable="w14 w15 w16se w16cid w16 w16cex w16sdtdh w16sdtfl w16du wp14">
   <w:body>
     <w:p>
       <w:pPr>
@@ -496,7 +496,7 @@
             <w:sz w:val="28"/>
             <w:szCs w:val="28"/>
           </w:rPr>
-          <w:t>Does increased health-care spending</w:t>
+          <w:t>Does increas</w:t>
         </w:r>
         <w:r>
           <w:rPr>
@@ -504,7 +504,7 @@
             <w:sz w:val="28"/>
             <w:szCs w:val="28"/>
           </w:rPr>
-          <w:t xml:space="preserve"> </w:t>
+          <w:t>e</w:t>
         </w:r>
         <w:r>
           <w:rPr>
@@ -512,7 +512,7 @@
             <w:sz w:val="28"/>
             <w:szCs w:val="28"/>
           </w:rPr>
-          <w:t>increase life expectancy?</w:t>
+          <w:t>d health-care spending increase life expectancy?</w:t>
         </w:r>
       </w:hyperlink>
     </w:p>
@@ -676,7 +676,7 @@
         </w:rPr>
         <w:fldChar w:fldCharType="separate"/>
       </w:r>
-      <w:hyperlink w:anchor="_Toc239535708" w:history="1">
+      <w:hyperlink w:anchor="_Toc242042075" w:history="1">
         <w:r>
           <w:rPr>
             <w:rStyle w:val="Hyperlink"/>
@@ -703,7 +703,7 @@
             <w:noProof/>
             <w:webHidden/>
           </w:rPr>
-          <w:instrText xml:space="preserve"> PAGEREF _Toc239535708 \h </w:instrText>
+          <w:instrText xml:space="preserve"> PAGEREF _Toc242042075 \h </w:instrText>
         </w:r>
         <w:r>
           <w:rPr>
@@ -749,7 +749,7 @@
           <w:lang w:eastAsia="en-GB"/>
         </w:rPr>
       </w:pPr>
-      <w:hyperlink w:anchor="_Toc239535709" w:history="1">
+      <w:hyperlink w:anchor="_Toc242042076" w:history="1">
         <w:r>
           <w:rPr>
             <w:rStyle w:val="Hyperlink"/>
@@ -776,7 +776,7 @@
             <w:noProof/>
             <w:webHidden/>
           </w:rPr>
-          <w:instrText xml:space="preserve"> PAGEREF _Toc239535709 \h </w:instrText>
+          <w:instrText xml:space="preserve"> PAGEREF _Toc242042076 \h </w:instrText>
         </w:r>
         <w:r>
           <w:rPr>
@@ -822,7 +822,7 @@
           <w:lang w:eastAsia="en-GB"/>
         </w:rPr>
       </w:pPr>
-      <w:hyperlink w:anchor="_Toc239535710" w:history="1">
+      <w:hyperlink w:anchor="_Toc242042077" w:history="1">
         <w:r>
           <w:rPr>
             <w:rStyle w:val="Hyperlink"/>
@@ -849,7 +849,7 @@
             <w:noProof/>
             <w:webHidden/>
           </w:rPr>
-          <w:instrText xml:space="preserve"> PAGEREF _Toc239535710 \h </w:instrText>
+          <w:instrText xml:space="preserve"> PAGEREF _Toc242042077 \h </w:instrText>
         </w:r>
         <w:r>
           <w:rPr>
@@ -895,7 +895,7 @@
           <w:lang w:eastAsia="en-GB"/>
         </w:rPr>
       </w:pPr>
-      <w:hyperlink w:anchor="_Toc239535711" w:history="1">
+      <w:hyperlink w:anchor="_Toc242042078" w:history="1">
         <w:r>
           <w:rPr>
             <w:rStyle w:val="Hyperlink"/>
@@ -922,7 +922,7 @@
             <w:noProof/>
             <w:webHidden/>
           </w:rPr>
-          <w:instrText xml:space="preserve"> PAGEREF _Toc239535711 \h </w:instrText>
+          <w:instrText xml:space="preserve"> PAGEREF _Toc242042078 \h </w:instrText>
         </w:r>
         <w:r>
           <w:rPr>
@@ -942,7 +942,7 @@
             <w:noProof/>
             <w:webHidden/>
           </w:rPr>
-          <w:t>3</w:t>
+          <w:t>4</w:t>
         </w:r>
         <w:r>
           <w:rPr>
@@ -968,7 +968,7 @@
           <w:lang w:eastAsia="en-GB"/>
         </w:rPr>
       </w:pPr>
-      <w:hyperlink w:anchor="_Toc239535712" w:history="1">
+      <w:hyperlink w:anchor="_Toc242042079" w:history="1">
         <w:r>
           <w:rPr>
             <w:rStyle w:val="Hyperlink"/>
@@ -995,7 +995,7 @@
             <w:noProof/>
             <w:webHidden/>
           </w:rPr>
-          <w:instrText xml:space="preserve"> PAGEREF _Toc239535712 \h </w:instrText>
+          <w:instrText xml:space="preserve"> PAGEREF _Toc242042079 \h </w:instrText>
         </w:r>
         <w:r>
           <w:rPr>
@@ -1015,7 +1015,7 @@
             <w:noProof/>
             <w:webHidden/>
           </w:rPr>
-          <w:t>4</w:t>
+          <w:t>5</w:t>
         </w:r>
         <w:r>
           <w:rPr>
@@ -1043,7 +1043,7 @@
           <w:lang w:eastAsia="en-GB"/>
         </w:rPr>
       </w:pPr>
-      <w:hyperlink w:anchor="_Toc239535713" w:history="1">
+      <w:hyperlink w:anchor="_Toc242042080" w:history="1">
         <w:r>
           <w:rPr>
             <w:rStyle w:val="Hyperlink"/>
@@ -1070,7 +1070,7 @@
             <w:noProof/>
             <w:webHidden/>
           </w:rPr>
-          <w:instrText xml:space="preserve"> PAGEREF _Toc239535713 \h </w:instrText>
+          <w:instrText xml:space="preserve"> PAGEREF _Toc242042080 \h </w:instrText>
         </w:r>
         <w:r>
           <w:rPr>
@@ -1116,7 +1116,7 @@
           <w:lang w:eastAsia="en-GB"/>
         </w:rPr>
       </w:pPr>
-      <w:hyperlink w:anchor="_Toc239535714" w:history="1">
+      <w:hyperlink w:anchor="_Toc242042081" w:history="1">
         <w:r>
           <w:rPr>
             <w:rStyle w:val="Hyperlink"/>
@@ -1143,155 +1143,7 @@
             <w:noProof/>
             <w:webHidden/>
           </w:rPr>
-          <w:instrText xml:space="preserve"> PAGEREF _Toc239535714 \h </w:instrText>
-        </w:r>
-        <w:r>
-          <w:rPr>
-            <w:noProof/>
-            <w:webHidden/>
-          </w:rPr>
-        </w:r>
-        <w:r>
-          <w:rPr>
-            <w:noProof/>
-            <w:webHidden/>
-          </w:rPr>
-          <w:fldChar w:fldCharType="separate"/>
-        </w:r>
-        <w:r>
-          <w:rPr>
-            <w:noProof/>
-            <w:webHidden/>
-          </w:rPr>
-          <w:t>6</w:t>
-        </w:r>
-        <w:r>
-          <w:rPr>
-            <w:noProof/>
-            <w:webHidden/>
-          </w:rPr>
-          <w:fldChar w:fldCharType="end"/>
-        </w:r>
-      </w:hyperlink>
-    </w:p>
-    <w:p>
-      <w:pPr>
-        <w:pStyle w:val="TOC3"/>
-        <w:tabs>
-          <w:tab w:val="right" w:leader="dot" w:pos="9016"/>
-        </w:tabs>
-        <w:rPr>
-          <w:rFonts w:eastAsiaTheme="minorEastAsia"/>
-          <w:i w:val="0"/>
-          <w:iCs w:val="0"/>
-          <w:noProof/>
-          <w:sz w:val="24"/>
-          <w:szCs w:val="24"/>
-          <w:lang w:eastAsia="en-GB"/>
-        </w:rPr>
-      </w:pPr>
-      <w:hyperlink w:anchor="_Toc239535715" w:history="1">
-        <w:r>
-          <w:rPr>
-            <w:rStyle w:val="Hyperlink"/>
-            <w:noProof/>
-          </w:rPr>
-          <w:t>Data source:</w:t>
-        </w:r>
-        <w:r>
-          <w:rPr>
-            <w:noProof/>
-            <w:webHidden/>
-          </w:rPr>
-          <w:tab/>
-        </w:r>
-        <w:r>
-          <w:rPr>
-            <w:noProof/>
-            <w:webHidden/>
-          </w:rPr>
-          <w:fldChar w:fldCharType="begin"/>
-        </w:r>
-        <w:r>
-          <w:rPr>
-            <w:noProof/>
-            <w:webHidden/>
-          </w:rPr>
-          <w:instrText xml:space="preserve"> PAGEREF _Toc239535715 \h </w:instrText>
-        </w:r>
-        <w:r>
-          <w:rPr>
-            <w:noProof/>
-            <w:webHidden/>
-          </w:rPr>
-        </w:r>
-        <w:r>
-          <w:rPr>
-            <w:noProof/>
-            <w:webHidden/>
-          </w:rPr>
-          <w:fldChar w:fldCharType="separate"/>
-        </w:r>
-        <w:r>
-          <w:rPr>
-            <w:noProof/>
-            <w:webHidden/>
-          </w:rPr>
-          <w:t>6</w:t>
-        </w:r>
-        <w:r>
-          <w:rPr>
-            <w:noProof/>
-            <w:webHidden/>
-          </w:rPr>
-          <w:fldChar w:fldCharType="end"/>
-        </w:r>
-      </w:hyperlink>
-    </w:p>
-    <w:p>
-      <w:pPr>
-        <w:pStyle w:val="TOC3"/>
-        <w:tabs>
-          <w:tab w:val="right" w:leader="dot" w:pos="9016"/>
-        </w:tabs>
-        <w:rPr>
-          <w:rFonts w:eastAsiaTheme="minorEastAsia"/>
-          <w:i w:val="0"/>
-          <w:iCs w:val="0"/>
-          <w:noProof/>
-          <w:sz w:val="24"/>
-          <w:szCs w:val="24"/>
-          <w:lang w:eastAsia="en-GB"/>
-        </w:rPr>
-      </w:pPr>
-      <w:hyperlink w:anchor="_Toc239535716" w:history="1">
-        <w:r>
-          <w:rPr>
-            <w:rStyle w:val="Hyperlink"/>
-            <w:noProof/>
-          </w:rPr>
-          <w:t>Source link:</w:t>
-        </w:r>
-        <w:r>
-          <w:rPr>
-            <w:noProof/>
-            <w:webHidden/>
-          </w:rPr>
-          <w:tab/>
-        </w:r>
-        <w:r>
-          <w:rPr>
-            <w:noProof/>
-            <w:webHidden/>
-          </w:rPr>
-          <w:fldChar w:fldCharType="begin"/>
-        </w:r>
-        <w:r>
-          <w:rPr>
-            <w:noProof/>
-            <w:webHidden/>
-          </w:rPr>
-          <w:instrText xml:space="preserve"> PAGEREF _Toc239535716 \h </w:instrText>
+          <w:instrText xml:space="preserve"> PAGEREF _Toc242042081 \h </w:instrText>
         </w:r>
         <w:r>
           <w:rPr>
@@ -1337,7 +1189,7 @@
           <w:lang w:eastAsia="en-GB"/>
         </w:rPr>
       </w:pPr>
-      <w:hyperlink w:anchor="_Toc239535717" w:history="1">
+      <w:hyperlink w:anchor="_Toc242042082" w:history="1">
         <w:r>
           <w:rPr>
             <w:rStyle w:val="Hyperlink"/>
@@ -1364,7 +1216,7 @@
             <w:noProof/>
             <w:webHidden/>
           </w:rPr>
-          <w:instrText xml:space="preserve"> PAGEREF _Toc239535717 \h </w:instrText>
+          <w:instrText xml:space="preserve"> PAGEREF _Toc242042082 \h </w:instrText>
         </w:r>
         <w:r>
           <w:rPr>
@@ -1412,7 +1264,7 @@
           <w:lang w:eastAsia="en-GB"/>
         </w:rPr>
       </w:pPr>
-      <w:hyperlink w:anchor="_Toc239535718" w:history="1">
+      <w:hyperlink w:anchor="_Toc242042083" w:history="1">
         <w:r>
           <w:rPr>
             <w:rStyle w:val="Hyperlink"/>
@@ -1439,7 +1291,7 @@
             <w:noProof/>
             <w:webHidden/>
           </w:rPr>
-          <w:instrText xml:space="preserve"> PAGEREF _Toc239535718 \h </w:instrText>
+          <w:instrText xml:space="preserve"> PAGEREF _Toc242042083 \h </w:instrText>
         </w:r>
         <w:r>
           <w:rPr>
@@ -1485,7 +1337,7 @@
           <w:lang w:eastAsia="en-GB"/>
         </w:rPr>
       </w:pPr>
-      <w:hyperlink w:anchor="_Toc239535719" w:history="1">
+      <w:hyperlink w:anchor="_Toc242042084" w:history="1">
         <w:r>
           <w:rPr>
             <w:rStyle w:val="Hyperlink"/>
@@ -1512,7 +1364,7 @@
             <w:noProof/>
             <w:webHidden/>
           </w:rPr>
-          <w:instrText xml:space="preserve"> PAGEREF _Toc239535719 \h </w:instrText>
+          <w:instrText xml:space="preserve"> PAGEREF _Toc242042084 \h </w:instrText>
         </w:r>
         <w:r>
           <w:rPr>
@@ -1558,7 +1410,7 @@
           <w:lang w:eastAsia="en-GB"/>
         </w:rPr>
       </w:pPr>
-      <w:hyperlink w:anchor="_Toc239535720" w:history="1">
+      <w:hyperlink w:anchor="_Toc242042085" w:history="1">
         <w:r>
           <w:rPr>
             <w:rStyle w:val="Hyperlink"/>
@@ -1585,7 +1437,7 @@
             <w:noProof/>
             <w:webHidden/>
           </w:rPr>
-          <w:instrText xml:space="preserve"> PAGEREF _Toc239535720 \h </w:instrText>
+          <w:instrText xml:space="preserve"> PAGEREF _Toc242042085 \h </w:instrText>
         </w:r>
         <w:r>
           <w:rPr>
@@ -1633,7 +1485,7 @@
           <w:lang w:eastAsia="en-GB"/>
         </w:rPr>
       </w:pPr>
-      <w:hyperlink w:anchor="_Toc239535721" w:history="1">
+      <w:hyperlink w:anchor="_Toc242042086" w:history="1">
         <w:r>
           <w:rPr>
             <w:rStyle w:val="Hyperlink"/>
@@ -1660,7 +1512,7 @@
             <w:noProof/>
             <w:webHidden/>
           </w:rPr>
-          <w:instrText xml:space="preserve"> PAGEREF _Toc239535721 \h </w:instrText>
+          <w:instrText xml:space="preserve"> PAGEREF _Toc242042086 \h </w:instrText>
         </w:r>
         <w:r>
           <w:rPr>
@@ -1680,7 +1532,964 @@
             <w:noProof/>
             <w:webHidden/>
           </w:rPr>
-          <w:t>8</w:t>
+          <w:t>10</w:t>
+        </w:r>
+        <w:r>
+          <w:rPr>
+            <w:noProof/>
+            <w:webHidden/>
+          </w:rPr>
+          <w:fldChar w:fldCharType="end"/>
+        </w:r>
+      </w:hyperlink>
+    </w:p>
+    <w:p>
+      <w:pPr>
+        <w:pStyle w:val="TOC1"/>
+        <w:tabs>
+          <w:tab w:val="right" w:leader="dot" w:pos="9016"/>
+        </w:tabs>
+        <w:rPr>
+          <w:rFonts w:eastAsiaTheme="minorEastAsia"/>
+          <w:b w:val="0"/>
+          <w:bCs w:val="0"/>
+          <w:caps w:val="0"/>
+          <w:noProof/>
+          <w:sz w:val="24"/>
+          <w:szCs w:val="24"/>
+          <w:lang w:eastAsia="en-GB"/>
+        </w:rPr>
+      </w:pPr>
+      <w:hyperlink w:anchor="_Toc242042087" w:history="1">
+        <w:r>
+          <w:rPr>
+            <w:rStyle w:val="Hyperlink"/>
+            <w:noProof/>
+          </w:rPr>
+          <w:t>5. Validation</w:t>
+        </w:r>
+        <w:r>
+          <w:rPr>
+            <w:noProof/>
+            <w:webHidden/>
+          </w:rPr>
+          <w:tab/>
+        </w:r>
+        <w:r>
+          <w:rPr>
+            <w:noProof/>
+            <w:webHidden/>
+          </w:rPr>
+          <w:fldChar w:fldCharType="begin"/>
+        </w:r>
+        <w:r>
+          <w:rPr>
+            <w:noProof/>
+            <w:webHidden/>
+          </w:rPr>
+          <w:instrText xml:space="preserve"> PAGEREF _Toc242042087 \h </w:instrText>
+        </w:r>
+        <w:r>
+          <w:rPr>
+            <w:noProof/>
+            <w:webHidden/>
+          </w:rPr>
+        </w:r>
+        <w:r>
+          <w:rPr>
+            <w:noProof/>
+            <w:webHidden/>
+          </w:rPr>
+          <w:fldChar w:fldCharType="separate"/>
+        </w:r>
+        <w:r>
+          <w:rPr>
+            <w:noProof/>
+            <w:webHidden/>
+          </w:rPr>
+          <w:t>11</w:t>
+        </w:r>
+        <w:r>
+          <w:rPr>
+            <w:noProof/>
+            <w:webHidden/>
+          </w:rPr>
+          <w:fldChar w:fldCharType="end"/>
+        </w:r>
+      </w:hyperlink>
+    </w:p>
+    <w:p>
+      <w:pPr>
+        <w:pStyle w:val="TOC2"/>
+        <w:tabs>
+          <w:tab w:val="right" w:leader="dot" w:pos="9016"/>
+        </w:tabs>
+        <w:rPr>
+          <w:rFonts w:eastAsiaTheme="minorEastAsia"/>
+          <w:smallCaps w:val="0"/>
+          <w:noProof/>
+          <w:sz w:val="24"/>
+          <w:szCs w:val="24"/>
+          <w:lang w:eastAsia="en-GB"/>
+        </w:rPr>
+      </w:pPr>
+      <w:hyperlink w:anchor="_Toc242042088" w:history="1">
+        <w:r>
+          <w:rPr>
+            <w:rStyle w:val="Hyperlink"/>
+            <w:noProof/>
+          </w:rPr>
+          <w:t>5.1 Informed Consent</w:t>
+        </w:r>
+        <w:r>
+          <w:rPr>
+            <w:noProof/>
+            <w:webHidden/>
+          </w:rPr>
+          <w:tab/>
+        </w:r>
+        <w:r>
+          <w:rPr>
+            <w:noProof/>
+            <w:webHidden/>
+          </w:rPr>
+          <w:fldChar w:fldCharType="begin"/>
+        </w:r>
+        <w:r>
+          <w:rPr>
+            <w:noProof/>
+            <w:webHidden/>
+          </w:rPr>
+          <w:instrText xml:space="preserve"> PAGEREF _Toc242042088 \h </w:instrText>
+        </w:r>
+        <w:r>
+          <w:rPr>
+            <w:noProof/>
+            <w:webHidden/>
+          </w:rPr>
+        </w:r>
+        <w:r>
+          <w:rPr>
+            <w:noProof/>
+            <w:webHidden/>
+          </w:rPr>
+          <w:fldChar w:fldCharType="separate"/>
+        </w:r>
+        <w:r>
+          <w:rPr>
+            <w:noProof/>
+            <w:webHidden/>
+          </w:rPr>
+          <w:t>11</w:t>
+        </w:r>
+        <w:r>
+          <w:rPr>
+            <w:noProof/>
+            <w:webHidden/>
+          </w:rPr>
+          <w:fldChar w:fldCharType="end"/>
+        </w:r>
+      </w:hyperlink>
+    </w:p>
+    <w:p>
+      <w:pPr>
+        <w:pStyle w:val="TOC2"/>
+        <w:tabs>
+          <w:tab w:val="right" w:leader="dot" w:pos="9016"/>
+        </w:tabs>
+        <w:rPr>
+          <w:rFonts w:eastAsiaTheme="minorEastAsia"/>
+          <w:smallCaps w:val="0"/>
+          <w:noProof/>
+          <w:sz w:val="24"/>
+          <w:szCs w:val="24"/>
+          <w:lang w:eastAsia="en-GB"/>
+        </w:rPr>
+      </w:pPr>
+      <w:hyperlink w:anchor="_Toc242042089" w:history="1">
+        <w:r>
+          <w:rPr>
+            <w:rStyle w:val="Hyperlink"/>
+            <w:noProof/>
+          </w:rPr>
+          <w:t>5.2 Participant Profile</w:t>
+        </w:r>
+        <w:r>
+          <w:rPr>
+            <w:noProof/>
+            <w:webHidden/>
+          </w:rPr>
+          <w:tab/>
+        </w:r>
+        <w:r>
+          <w:rPr>
+            <w:noProof/>
+            <w:webHidden/>
+          </w:rPr>
+          <w:fldChar w:fldCharType="begin"/>
+        </w:r>
+        <w:r>
+          <w:rPr>
+            <w:noProof/>
+            <w:webHidden/>
+          </w:rPr>
+          <w:instrText xml:space="preserve"> PAGEREF _Toc242042089 \h </w:instrText>
+        </w:r>
+        <w:r>
+          <w:rPr>
+            <w:noProof/>
+            <w:webHidden/>
+          </w:rPr>
+        </w:r>
+        <w:r>
+          <w:rPr>
+            <w:noProof/>
+            <w:webHidden/>
+          </w:rPr>
+          <w:fldChar w:fldCharType="separate"/>
+        </w:r>
+        <w:r>
+          <w:rPr>
+            <w:noProof/>
+            <w:webHidden/>
+          </w:rPr>
+          <w:t>11</w:t>
+        </w:r>
+        <w:r>
+          <w:rPr>
+            <w:noProof/>
+            <w:webHidden/>
+          </w:rPr>
+          <w:fldChar w:fldCharType="end"/>
+        </w:r>
+      </w:hyperlink>
+    </w:p>
+    <w:p>
+      <w:pPr>
+        <w:pStyle w:val="TOC2"/>
+        <w:tabs>
+          <w:tab w:val="right" w:leader="dot" w:pos="9016"/>
+        </w:tabs>
+        <w:rPr>
+          <w:rFonts w:eastAsiaTheme="minorEastAsia"/>
+          <w:smallCaps w:val="0"/>
+          <w:noProof/>
+          <w:sz w:val="24"/>
+          <w:szCs w:val="24"/>
+          <w:lang w:eastAsia="en-GB"/>
+        </w:rPr>
+      </w:pPr>
+      <w:hyperlink w:anchor="_Toc242042090" w:history="1">
+        <w:r>
+          <w:rPr>
+            <w:rStyle w:val="Hyperlink"/>
+            <w:noProof/>
+          </w:rPr>
+          <w:t>5.3 Evaluation and Satisfaction Survey</w:t>
+        </w:r>
+        <w:r>
+          <w:rPr>
+            <w:noProof/>
+            <w:webHidden/>
+          </w:rPr>
+          <w:tab/>
+        </w:r>
+        <w:r>
+          <w:rPr>
+            <w:noProof/>
+            <w:webHidden/>
+          </w:rPr>
+          <w:fldChar w:fldCharType="begin"/>
+        </w:r>
+        <w:r>
+          <w:rPr>
+            <w:noProof/>
+            <w:webHidden/>
+          </w:rPr>
+          <w:instrText xml:space="preserve"> PAGEREF _Toc242042090 \h </w:instrText>
+        </w:r>
+        <w:r>
+          <w:rPr>
+            <w:noProof/>
+            <w:webHidden/>
+          </w:rPr>
+        </w:r>
+        <w:r>
+          <w:rPr>
+            <w:noProof/>
+            <w:webHidden/>
+          </w:rPr>
+          <w:fldChar w:fldCharType="separate"/>
+        </w:r>
+        <w:r>
+          <w:rPr>
+            <w:noProof/>
+            <w:webHidden/>
+          </w:rPr>
+          <w:t>11</w:t>
+        </w:r>
+        <w:r>
+          <w:rPr>
+            <w:noProof/>
+            <w:webHidden/>
+          </w:rPr>
+          <w:fldChar w:fldCharType="end"/>
+        </w:r>
+      </w:hyperlink>
+    </w:p>
+    <w:p>
+      <w:pPr>
+        <w:pStyle w:val="TOC2"/>
+        <w:tabs>
+          <w:tab w:val="right" w:leader="dot" w:pos="9016"/>
+        </w:tabs>
+        <w:rPr>
+          <w:rFonts w:eastAsiaTheme="minorEastAsia"/>
+          <w:smallCaps w:val="0"/>
+          <w:noProof/>
+          <w:sz w:val="24"/>
+          <w:szCs w:val="24"/>
+          <w:lang w:eastAsia="en-GB"/>
+        </w:rPr>
+      </w:pPr>
+      <w:hyperlink w:anchor="_Toc242042091" w:history="1">
+        <w:r>
+          <w:rPr>
+            <w:rStyle w:val="Hyperlink"/>
+            <w:noProof/>
+          </w:rPr>
+          <w:t>5.4 Usability Findings &amp; Qualitative Feedback</w:t>
+        </w:r>
+        <w:r>
+          <w:rPr>
+            <w:noProof/>
+            <w:webHidden/>
+          </w:rPr>
+          <w:tab/>
+        </w:r>
+        <w:r>
+          <w:rPr>
+            <w:noProof/>
+            <w:webHidden/>
+          </w:rPr>
+          <w:fldChar w:fldCharType="begin"/>
+        </w:r>
+        <w:r>
+          <w:rPr>
+            <w:noProof/>
+            <w:webHidden/>
+          </w:rPr>
+          <w:instrText xml:space="preserve"> PAGEREF _Toc242042091 \h </w:instrText>
+        </w:r>
+        <w:r>
+          <w:rPr>
+            <w:noProof/>
+            <w:webHidden/>
+          </w:rPr>
+        </w:r>
+        <w:r>
+          <w:rPr>
+            <w:noProof/>
+            <w:webHidden/>
+          </w:rPr>
+          <w:fldChar w:fldCharType="separate"/>
+        </w:r>
+        <w:r>
+          <w:rPr>
+            <w:noProof/>
+            <w:webHidden/>
+          </w:rPr>
+          <w:t>12</w:t>
+        </w:r>
+        <w:r>
+          <w:rPr>
+            <w:noProof/>
+            <w:webHidden/>
+          </w:rPr>
+          <w:fldChar w:fldCharType="end"/>
+        </w:r>
+      </w:hyperlink>
+    </w:p>
+    <w:p>
+      <w:pPr>
+        <w:pStyle w:val="TOC3"/>
+        <w:tabs>
+          <w:tab w:val="right" w:leader="dot" w:pos="9016"/>
+        </w:tabs>
+        <w:rPr>
+          <w:rFonts w:eastAsiaTheme="minorEastAsia"/>
+          <w:i w:val="0"/>
+          <w:iCs w:val="0"/>
+          <w:noProof/>
+          <w:sz w:val="24"/>
+          <w:szCs w:val="24"/>
+          <w:lang w:eastAsia="en-GB"/>
+        </w:rPr>
+      </w:pPr>
+      <w:hyperlink w:anchor="_Toc242042092" w:history="1">
+        <w:r>
+          <w:rPr>
+            <w:rStyle w:val="Hyperlink"/>
+            <w:noProof/>
+          </w:rPr>
+          <w:t>Positive Feedback</w:t>
+        </w:r>
+        <w:r>
+          <w:rPr>
+            <w:noProof/>
+            <w:webHidden/>
+          </w:rPr>
+          <w:tab/>
+        </w:r>
+        <w:r>
+          <w:rPr>
+            <w:noProof/>
+            <w:webHidden/>
+          </w:rPr>
+          <w:fldChar w:fldCharType="begin"/>
+        </w:r>
+        <w:r>
+          <w:rPr>
+            <w:noProof/>
+            <w:webHidden/>
+          </w:rPr>
+          <w:instrText xml:space="preserve"> PAGEREF _Toc242042092 \h </w:instrText>
+        </w:r>
+        <w:r>
+          <w:rPr>
+            <w:noProof/>
+            <w:webHidden/>
+          </w:rPr>
+        </w:r>
+        <w:r>
+          <w:rPr>
+            <w:noProof/>
+            <w:webHidden/>
+          </w:rPr>
+          <w:fldChar w:fldCharType="separate"/>
+        </w:r>
+        <w:r>
+          <w:rPr>
+            <w:noProof/>
+            <w:webHidden/>
+          </w:rPr>
+          <w:t>12</w:t>
+        </w:r>
+        <w:r>
+          <w:rPr>
+            <w:noProof/>
+            <w:webHidden/>
+          </w:rPr>
+          <w:fldChar w:fldCharType="end"/>
+        </w:r>
+      </w:hyperlink>
+    </w:p>
+    <w:p>
+      <w:pPr>
+        <w:pStyle w:val="TOC3"/>
+        <w:tabs>
+          <w:tab w:val="right" w:leader="dot" w:pos="9016"/>
+        </w:tabs>
+        <w:rPr>
+          <w:rFonts w:eastAsiaTheme="minorEastAsia"/>
+          <w:i w:val="0"/>
+          <w:iCs w:val="0"/>
+          <w:noProof/>
+          <w:sz w:val="24"/>
+          <w:szCs w:val="24"/>
+          <w:lang w:eastAsia="en-GB"/>
+        </w:rPr>
+      </w:pPr>
+      <w:hyperlink w:anchor="_Toc242042093" w:history="1">
+        <w:r>
+          <w:rPr>
+            <w:rStyle w:val="Hyperlink"/>
+            <w:noProof/>
+          </w:rPr>
+          <w:t>Pain Points</w:t>
+        </w:r>
+        <w:r>
+          <w:rPr>
+            <w:noProof/>
+            <w:webHidden/>
+          </w:rPr>
+          <w:tab/>
+        </w:r>
+        <w:r>
+          <w:rPr>
+            <w:noProof/>
+            <w:webHidden/>
+          </w:rPr>
+          <w:fldChar w:fldCharType="begin"/>
+        </w:r>
+        <w:r>
+          <w:rPr>
+            <w:noProof/>
+            <w:webHidden/>
+          </w:rPr>
+          <w:instrText xml:space="preserve"> PAGEREF _Toc242042093 \h </w:instrText>
+        </w:r>
+        <w:r>
+          <w:rPr>
+            <w:noProof/>
+            <w:webHidden/>
+          </w:rPr>
+        </w:r>
+        <w:r>
+          <w:rPr>
+            <w:noProof/>
+            <w:webHidden/>
+          </w:rPr>
+          <w:fldChar w:fldCharType="separate"/>
+        </w:r>
+        <w:r>
+          <w:rPr>
+            <w:noProof/>
+            <w:webHidden/>
+          </w:rPr>
+          <w:t>12</w:t>
+        </w:r>
+        <w:r>
+          <w:rPr>
+            <w:noProof/>
+            <w:webHidden/>
+          </w:rPr>
+          <w:fldChar w:fldCharType="end"/>
+        </w:r>
+      </w:hyperlink>
+    </w:p>
+    <w:p>
+      <w:pPr>
+        <w:pStyle w:val="TOC2"/>
+        <w:tabs>
+          <w:tab w:val="right" w:leader="dot" w:pos="9016"/>
+        </w:tabs>
+        <w:rPr>
+          <w:rFonts w:eastAsiaTheme="minorEastAsia"/>
+          <w:smallCaps w:val="0"/>
+          <w:noProof/>
+          <w:sz w:val="24"/>
+          <w:szCs w:val="24"/>
+          <w:lang w:eastAsia="en-GB"/>
+        </w:rPr>
+      </w:pPr>
+      <w:hyperlink w:anchor="_Toc242042094" w:history="1">
+        <w:r>
+          <w:rPr>
+            <w:rStyle w:val="Hyperlink"/>
+            <w:noProof/>
+          </w:rPr>
+          <w:t>5.5 Design Improvements</w:t>
+        </w:r>
+        <w:r>
+          <w:rPr>
+            <w:noProof/>
+            <w:webHidden/>
+          </w:rPr>
+          <w:tab/>
+        </w:r>
+        <w:r>
+          <w:rPr>
+            <w:noProof/>
+            <w:webHidden/>
+          </w:rPr>
+          <w:fldChar w:fldCharType="begin"/>
+        </w:r>
+        <w:r>
+          <w:rPr>
+            <w:noProof/>
+            <w:webHidden/>
+          </w:rPr>
+          <w:instrText xml:space="preserve"> PAGEREF _Toc242042094 \h </w:instrText>
+        </w:r>
+        <w:r>
+          <w:rPr>
+            <w:noProof/>
+            <w:webHidden/>
+          </w:rPr>
+        </w:r>
+        <w:r>
+          <w:rPr>
+            <w:noProof/>
+            <w:webHidden/>
+          </w:rPr>
+          <w:fldChar w:fldCharType="separate"/>
+        </w:r>
+        <w:r>
+          <w:rPr>
+            <w:noProof/>
+            <w:webHidden/>
+          </w:rPr>
+          <w:t>12</w:t>
+        </w:r>
+        <w:r>
+          <w:rPr>
+            <w:noProof/>
+            <w:webHidden/>
+          </w:rPr>
+          <w:fldChar w:fldCharType="end"/>
+        </w:r>
+      </w:hyperlink>
+    </w:p>
+    <w:p>
+      <w:pPr>
+        <w:pStyle w:val="TOC1"/>
+        <w:tabs>
+          <w:tab w:val="right" w:leader="dot" w:pos="9016"/>
+        </w:tabs>
+        <w:rPr>
+          <w:rFonts w:eastAsiaTheme="minorEastAsia"/>
+          <w:b w:val="0"/>
+          <w:bCs w:val="0"/>
+          <w:caps w:val="0"/>
+          <w:noProof/>
+          <w:sz w:val="24"/>
+          <w:szCs w:val="24"/>
+          <w:lang w:eastAsia="en-GB"/>
+        </w:rPr>
+      </w:pPr>
+      <w:hyperlink w:anchor="_Toc242042095" w:history="1">
+        <w:r>
+          <w:rPr>
+            <w:rStyle w:val="Hyperlink"/>
+            <w:noProof/>
+          </w:rPr>
+          <w:t>6. Conclusion</w:t>
+        </w:r>
+        <w:r>
+          <w:rPr>
+            <w:noProof/>
+            <w:webHidden/>
+          </w:rPr>
+          <w:tab/>
+        </w:r>
+        <w:r>
+          <w:rPr>
+            <w:noProof/>
+            <w:webHidden/>
+          </w:rPr>
+          <w:fldChar w:fldCharType="begin"/>
+        </w:r>
+        <w:r>
+          <w:rPr>
+            <w:noProof/>
+            <w:webHidden/>
+          </w:rPr>
+          <w:instrText xml:space="preserve"> PAGEREF _Toc242042095 \h </w:instrText>
+        </w:r>
+        <w:r>
+          <w:rPr>
+            <w:noProof/>
+            <w:webHidden/>
+          </w:rPr>
+        </w:r>
+        <w:r>
+          <w:rPr>
+            <w:noProof/>
+            <w:webHidden/>
+          </w:rPr>
+          <w:fldChar w:fldCharType="separate"/>
+        </w:r>
+        <w:r>
+          <w:rPr>
+            <w:noProof/>
+            <w:webHidden/>
+          </w:rPr>
+          <w:t>13</w:t>
+        </w:r>
+        <w:r>
+          <w:rPr>
+            <w:noProof/>
+            <w:webHidden/>
+          </w:rPr>
+          <w:fldChar w:fldCharType="end"/>
+        </w:r>
+      </w:hyperlink>
+    </w:p>
+    <w:p>
+      <w:pPr>
+        <w:pStyle w:val="TOC1"/>
+        <w:tabs>
+          <w:tab w:val="right" w:leader="dot" w:pos="9016"/>
+        </w:tabs>
+        <w:rPr>
+          <w:rFonts w:eastAsiaTheme="minorEastAsia"/>
+          <w:b w:val="0"/>
+          <w:bCs w:val="0"/>
+          <w:caps w:val="0"/>
+          <w:noProof/>
+          <w:sz w:val="24"/>
+          <w:szCs w:val="24"/>
+          <w:lang w:eastAsia="en-GB"/>
+        </w:rPr>
+      </w:pPr>
+      <w:hyperlink w:anchor="_Toc242042096" w:history="1">
+        <w:r>
+          <w:rPr>
+            <w:rStyle w:val="Hyperlink"/>
+            <w:noProof/>
+          </w:rPr>
+          <w:t>Appendix</w:t>
+        </w:r>
+        <w:r>
+          <w:rPr>
+            <w:noProof/>
+            <w:webHidden/>
+          </w:rPr>
+          <w:tab/>
+        </w:r>
+        <w:r>
+          <w:rPr>
+            <w:noProof/>
+            <w:webHidden/>
+          </w:rPr>
+          <w:fldChar w:fldCharType="begin"/>
+        </w:r>
+        <w:r>
+          <w:rPr>
+            <w:noProof/>
+            <w:webHidden/>
+          </w:rPr>
+          <w:instrText xml:space="preserve"> PAGEREF _Toc242042096 \h </w:instrText>
+        </w:r>
+        <w:r>
+          <w:rPr>
+            <w:noProof/>
+            <w:webHidden/>
+          </w:rPr>
+        </w:r>
+        <w:r>
+          <w:rPr>
+            <w:noProof/>
+            <w:webHidden/>
+          </w:rPr>
+          <w:fldChar w:fldCharType="separate"/>
+        </w:r>
+        <w:r>
+          <w:rPr>
+            <w:noProof/>
+            <w:webHidden/>
+          </w:rPr>
+          <w:t>14</w:t>
+        </w:r>
+        <w:r>
+          <w:rPr>
+            <w:noProof/>
+            <w:webHidden/>
+          </w:rPr>
+          <w:fldChar w:fldCharType="end"/>
+        </w:r>
+      </w:hyperlink>
+    </w:p>
+    <w:p>
+      <w:pPr>
+        <w:pStyle w:val="TOC2"/>
+        <w:tabs>
+          <w:tab w:val="right" w:leader="dot" w:pos="9016"/>
+        </w:tabs>
+        <w:rPr>
+          <w:rFonts w:eastAsiaTheme="minorEastAsia"/>
+          <w:smallCaps w:val="0"/>
+          <w:noProof/>
+          <w:sz w:val="24"/>
+          <w:szCs w:val="24"/>
+          <w:lang w:eastAsia="en-GB"/>
+        </w:rPr>
+      </w:pPr>
+      <w:hyperlink w:anchor="_Toc242042097" w:history="1">
+        <w:r>
+          <w:rPr>
+            <w:rStyle w:val="Hyperlink"/>
+            <w:noProof/>
+          </w:rPr>
+          <w:t>Appendix A: Team Collaboration setup</w:t>
+        </w:r>
+        <w:r>
+          <w:rPr>
+            <w:noProof/>
+            <w:webHidden/>
+          </w:rPr>
+          <w:tab/>
+        </w:r>
+        <w:r>
+          <w:rPr>
+            <w:noProof/>
+            <w:webHidden/>
+          </w:rPr>
+          <w:fldChar w:fldCharType="begin"/>
+        </w:r>
+        <w:r>
+          <w:rPr>
+            <w:noProof/>
+            <w:webHidden/>
+          </w:rPr>
+          <w:instrText xml:space="preserve"> PAGEREF _Toc242042097 \h </w:instrText>
+        </w:r>
+        <w:r>
+          <w:rPr>
+            <w:noProof/>
+            <w:webHidden/>
+          </w:rPr>
+        </w:r>
+        <w:r>
+          <w:rPr>
+            <w:noProof/>
+            <w:webHidden/>
+          </w:rPr>
+          <w:fldChar w:fldCharType="separate"/>
+        </w:r>
+        <w:r>
+          <w:rPr>
+            <w:noProof/>
+            <w:webHidden/>
+          </w:rPr>
+          <w:t>14</w:t>
+        </w:r>
+        <w:r>
+          <w:rPr>
+            <w:noProof/>
+            <w:webHidden/>
+          </w:rPr>
+          <w:fldChar w:fldCharType="end"/>
+        </w:r>
+      </w:hyperlink>
+    </w:p>
+    <w:p>
+      <w:pPr>
+        <w:pStyle w:val="TOC2"/>
+        <w:tabs>
+          <w:tab w:val="right" w:leader="dot" w:pos="9016"/>
+        </w:tabs>
+        <w:rPr>
+          <w:rFonts w:eastAsiaTheme="minorEastAsia"/>
+          <w:smallCaps w:val="0"/>
+          <w:noProof/>
+          <w:sz w:val="24"/>
+          <w:szCs w:val="24"/>
+          <w:lang w:eastAsia="en-GB"/>
+        </w:rPr>
+      </w:pPr>
+      <w:hyperlink w:anchor="_Toc242042098" w:history="1">
+        <w:r>
+          <w:rPr>
+            <w:rStyle w:val="Hyperlink"/>
+            <w:noProof/>
+          </w:rPr>
+          <w:t>Appendix C: Visualisation Iteration Example</w:t>
+        </w:r>
+        <w:r>
+          <w:rPr>
+            <w:noProof/>
+            <w:webHidden/>
+          </w:rPr>
+          <w:tab/>
+        </w:r>
+        <w:r>
+          <w:rPr>
+            <w:noProof/>
+            <w:webHidden/>
+          </w:rPr>
+          <w:fldChar w:fldCharType="begin"/>
+        </w:r>
+        <w:r>
+          <w:rPr>
+            <w:noProof/>
+            <w:webHidden/>
+          </w:rPr>
+          <w:instrText xml:space="preserve"> PAGEREF _Toc242042098 \h </w:instrText>
+        </w:r>
+        <w:r>
+          <w:rPr>
+            <w:noProof/>
+            <w:webHidden/>
+          </w:rPr>
+        </w:r>
+        <w:r>
+          <w:rPr>
+            <w:noProof/>
+            <w:webHidden/>
+          </w:rPr>
+          <w:fldChar w:fldCharType="separate"/>
+        </w:r>
+        <w:r>
+          <w:rPr>
+            <w:noProof/>
+            <w:webHidden/>
+          </w:rPr>
+          <w:t>15</w:t>
+        </w:r>
+        <w:r>
+          <w:rPr>
+            <w:noProof/>
+            <w:webHidden/>
+          </w:rPr>
+          <w:fldChar w:fldCharType="end"/>
+        </w:r>
+      </w:hyperlink>
+    </w:p>
+    <w:p>
+      <w:pPr>
+        <w:pStyle w:val="TOC2"/>
+        <w:tabs>
+          <w:tab w:val="right" w:leader="dot" w:pos="9016"/>
+        </w:tabs>
+        <w:rPr>
+          <w:rFonts w:eastAsiaTheme="minorEastAsia"/>
+          <w:smallCaps w:val="0"/>
+          <w:noProof/>
+          <w:sz w:val="24"/>
+          <w:szCs w:val="24"/>
+          <w:lang w:eastAsia="en-GB"/>
+        </w:rPr>
+      </w:pPr>
+      <w:hyperlink w:anchor="_Toc242042099" w:history="1">
+        <w:r>
+          <w:rPr>
+            <w:rStyle w:val="Hyperlink"/>
+            <w:noProof/>
+          </w:rPr>
+          <w:t>Appendix C: Participant Ethics &amp; Consent Form</w:t>
+        </w:r>
+        <w:r>
+          <w:rPr>
+            <w:noProof/>
+            <w:webHidden/>
+          </w:rPr>
+          <w:tab/>
+        </w:r>
+        <w:r>
+          <w:rPr>
+            <w:noProof/>
+            <w:webHidden/>
+          </w:rPr>
+          <w:fldChar w:fldCharType="begin"/>
+        </w:r>
+        <w:r>
+          <w:rPr>
+            <w:noProof/>
+            <w:webHidden/>
+          </w:rPr>
+          <w:instrText xml:space="preserve"> PAGEREF _Toc242042099 \h </w:instrText>
+        </w:r>
+        <w:r>
+          <w:rPr>
+            <w:noProof/>
+            <w:webHidden/>
+          </w:rPr>
+        </w:r>
+        <w:r>
+          <w:rPr>
+            <w:noProof/>
+            <w:webHidden/>
+          </w:rPr>
+          <w:fldChar w:fldCharType="separate"/>
+        </w:r>
+        <w:r>
+          <w:rPr>
+            <w:noProof/>
+            <w:webHidden/>
+          </w:rPr>
+          <w:t>16</w:t>
         </w:r>
         <w:r>
           <w:rPr>
@@ -1734,7 +2543,7 @@
       <w:pPr>
         <w:pStyle w:val="Heading1"/>
       </w:pPr>
-      <w:bookmarkStart w:id="0" w:name="_Toc239535708"/>
+      <w:bookmarkStart w:id="0" w:name="_Toc242042075"/>
       <w:r>
         <w:lastRenderedPageBreak/>
         <w:t>1</w:t>
@@ -1748,7 +2557,7 @@
       <w:pPr>
         <w:pStyle w:val="Heading2"/>
       </w:pPr>
-      <w:bookmarkStart w:id="1" w:name="_Toc239535709"/>
+      <w:bookmarkStart w:id="1" w:name="_Toc242042076"/>
       <w:r>
         <w:t>1.1 Background and Motivation</w:t>
       </w:r>
@@ -1756,12 +2565,143 @@
     </w:p>
     <w:p>
       <w:r>
-        <w:t>Two key measures of a country's healthcare system and population health are healthcare expenditure and life expectancy. However, countries invest varying levels of resources into their healthcare and systems and have varying life expectancy results as a result. The aim of this project is to examine the link between healthcare expenditure and life expectancy at the national level by investigating the spending patterns and life expectancy of selected OECD countries.</w:t>
-      </w:r>
-    </w:p>
-    <w:p>
-      <w:r>
-        <w:t>The visualisation will be beneficial to students, researchers, policymakers and the public interested in public health. Users will be able to compare countries, look at changes over time and find relationships between the cost of health care and the length of life. These comparisons will be easier to understand if presented visually as opposed to a large mass of raw data for analysis.</w:t>
+        <w:t xml:space="preserve">The aim of this project is to </w:t>
+      </w:r>
+      <w:r>
+        <w:t>explore</w:t>
+      </w:r>
+      <w:r>
+        <w:t xml:space="preserve"> the link between healthcare expenditure and life expectancy at the national level by investigating the spending patterns and life expectancy of selected OECD countries</w:t>
+      </w:r>
+      <w:r>
+        <w:t xml:space="preserve"> across the decade of 2015 to 2024 inclusive</w:t>
+      </w:r>
+      <w:r>
+        <w:t>.</w:t>
+      </w:r>
+      <w:r>
+        <w:t xml:space="preserve"> The study of health expenditures </w:t>
+      </w:r>
+      <w:r>
+        <w:t>is</w:t>
+      </w:r>
+      <w:r>
+        <w:t xml:space="preserve"> integral to the formation of public health policy. </w:t>
+      </w:r>
+      <w:r>
+        <w:t>Two key measures of a country's healthcare system and population health are healthcare expenditure and life expectancy. However, countries invest varying levels of resources into their healthcare systems and have varying life expectancy results as a result.</w:t>
+      </w:r>
+      <w:r>
+        <w:t xml:space="preserve"> Anwar et al. (2023) suggest that healthcare bring</w:t>
+      </w:r>
+      <w:r>
+        <w:t>s</w:t>
+      </w:r>
+      <w:r>
+        <w:t xml:space="preserve"> short-term and long-term </w:t>
+      </w:r>
+      <w:r>
+        <w:t>benefits and</w:t>
+      </w:r>
+      <w:r>
+        <w:t xml:space="preserve"> is a prerequisite of long-term sustainable economic development by turn of e</w:t>
+      </w:r>
+      <w:r>
+        <w:t>n</w:t>
+      </w:r>
+      <w:r>
+        <w:t xml:space="preserve">hancing the value of human life leading to higher productivity and economic performance. However, government spending isn’t the full story – there needs to be focus on other measures like economic and environmental to ensure positive health outcomes, as the </w:t>
+      </w:r>
+      <w:r>
+        <w:t>deterioration</w:t>
+      </w:r>
+      <w:r>
+        <w:t xml:space="preserve"> of the environment increases the occurrence of illnesses </w:t>
+      </w:r>
+      <w:r>
+        <w:t>which raises illness rates and therefore health spending</w:t>
+      </w:r>
+      <w:r>
+        <w:t>.</w:t>
+      </w:r>
+    </w:p>
+    <w:p>
+      <w:r>
+        <w:t xml:space="preserve">In this project, the </w:t>
+      </w:r>
+      <w:r>
+        <w:t>countries</w:t>
+      </w:r>
+      <w:r>
+        <w:t xml:space="preserve"> examined are</w:t>
+      </w:r>
+      <w:r>
+        <w:t>: A</w:t>
+      </w:r>
+      <w:r>
+        <w:t>ustralia, Canada, France, Germany, Italy, Japan, Korea, New Zealand, United Kingdom and</w:t>
+      </w:r>
+      <w:r>
+        <w:t xml:space="preserve"> the</w:t>
+      </w:r>
+      <w:r>
+        <w:t xml:space="preserve"> United States.</w:t>
+      </w:r>
+    </w:p>
+    <w:p>
+      <w:r>
+        <w:t>The</w:t>
+      </w:r>
+      <w:r>
+        <w:t>se</w:t>
+      </w:r>
+      <w:r>
+        <w:t xml:space="preserve"> visualisation</w:t>
+      </w:r>
+      <w:r>
+        <w:t>s</w:t>
+      </w:r>
+      <w:r>
+        <w:t xml:space="preserve"> will be beneficial to students, researchers, policymakers and the public interested in public health. Users will be able to compare countries, look at changes over time and find relationships between the cost of health care and the length of life. These comparisons </w:t>
+      </w:r>
+      <w:r>
+        <w:t>are</w:t>
+      </w:r>
+      <w:r>
+        <w:t xml:space="preserve"> easier to understand </w:t>
+      </w:r>
+      <w:r>
+        <w:t xml:space="preserve">when </w:t>
+      </w:r>
+      <w:r>
+        <w:t>presented visually as opposed to a large mass of raw data for analysis.</w:t>
+      </w:r>
+      <w:r>
+        <w:t xml:space="preserve"> When analysing the presented data users should be able to understand that </w:t>
+      </w:r>
+      <w:r>
+        <w:t>higher health spending does not necessarily yield a proportionate return</w:t>
+      </w:r>
+      <w:r>
+        <w:t>, for example, the United States has the highest expenditure but lowest life expectancy over time</w:t>
+      </w:r>
+      <w:r>
+        <w:t xml:space="preserve"> after </w:t>
+      </w:r>
+      <w:r>
+        <w:t>analysing</w:t>
+      </w:r>
+      <w:r>
+        <w:t xml:space="preserve"> the 2015-2024 OECD data</w:t>
+      </w:r>
+      <w:r>
+        <w:t xml:space="preserve">. </w:t>
+      </w:r>
+      <w:r>
+        <w:t>In contrast</w:t>
+      </w:r>
+      <w:r>
+        <w:t>, some East Asian and European countries had low health expenditure but high life expectancy denoting highly efficient systems and other social factors.</w:t>
       </w:r>
     </w:p>
     <w:p/>
@@ -1769,7 +2709,7 @@
       <w:pPr>
         <w:pStyle w:val="Heading2"/>
       </w:pPr>
-      <w:bookmarkStart w:id="2" w:name="_Toc239535710"/>
+      <w:bookmarkStart w:id="2" w:name="_Toc242042077"/>
       <w:r>
         <w:t>1.2 Visualisation Purpose</w:t>
       </w:r>
@@ -1782,7 +2722,10 @@
     </w:p>
     <w:p>
       <w:r>
-        <w:t>The aim of the visualisation will be to investigate the following questions:</w:t>
+        <w:t>The guiding research questions for this project are</w:t>
+      </w:r>
+      <w:r>
+        <w:t>:</w:t>
       </w:r>
     </w:p>
     <w:p>
@@ -1794,7 +2737,7 @@
         </w:numPr>
       </w:pPr>
       <w:r>
-        <w:t xml:space="preserve">Do countries with higher health expenditure have a longer life expectancy? </w:t>
+        <w:t>Do countries that spend more on healthcare tend to have longer life expectancy?</w:t>
       </w:r>
     </w:p>
     <w:p>
@@ -1806,7 +2749,7 @@
         </w:numPr>
       </w:pPr>
       <w:r>
-        <w:t xml:space="preserve">What are OECD countries' differences in spent per person on health care? </w:t>
+        <w:t>How does healthcare spending per person differ across the selected OECD countries?</w:t>
       </w:r>
     </w:p>
     <w:p>
@@ -1818,7 +2761,8 @@
         </w:numPr>
       </w:pPr>
       <w:r>
-        <w:t xml:space="preserve">In how many years does the average person live in the selected OECD countries? </w:t>
+        <w:lastRenderedPageBreak/>
+        <w:t>What is the life expectancy in each of the selected OECD countries?</w:t>
       </w:r>
     </w:p>
     <w:p>
@@ -1830,7 +2774,10 @@
         </w:numPr>
       </w:pPr>
       <w:r>
-        <w:t xml:space="preserve">What is the pattern of change in healthcare cost &amp; life expectancy over time? </w:t>
+        <w:t>How have healthcare expenditure and life expectancy changed between 2015 and 2024</w:t>
+      </w:r>
+      <w:r>
+        <w:t xml:space="preserve">? </w:t>
       </w:r>
     </w:p>
     <w:p>
@@ -1842,7 +2789,7 @@
         </w:numPr>
       </w:pPr>
       <w:r>
-        <w:t xml:space="preserve">Which countries have a "satisfactory" life expectancy for their spending on health and care? </w:t>
+        <w:t>Which countries have a relatively long life expectancy compared to their healthcare spending?</w:t>
       </w:r>
     </w:p>
     <w:p>
@@ -1851,18 +2798,12 @@
       </w:r>
     </w:p>
     <w:p/>
-    <w:p/>
-    <w:p/>
-    <w:p/>
-    <w:p/>
-    <w:p/>
     <w:p>
       <w:pPr>
         <w:pStyle w:val="Heading2"/>
       </w:pPr>
-      <w:bookmarkStart w:id="3" w:name="_Toc239535711"/>
-      <w:r>
-        <w:lastRenderedPageBreak/>
+      <w:bookmarkStart w:id="3" w:name="_Toc242042078"/>
+      <w:r>
         <w:t>1.3 Project Schedule</w:t>
       </w:r>
       <w:bookmarkEnd w:id="3"/>
@@ -2368,6 +3309,7 @@
               <w:spacing w:before="120" w:after="120"/>
             </w:pPr>
             <w:r>
+              <w:lastRenderedPageBreak/>
               <w:t>Week 8</w:t>
             </w:r>
           </w:p>
@@ -2546,7 +3488,6 @@
               <w:spacing w:before="120" w:after="120"/>
             </w:pPr>
             <w:r>
-              <w:lastRenderedPageBreak/>
               <w:t>Week 10</w:t>
             </w:r>
           </w:p>
@@ -2924,7 +3865,7 @@
       <w:pPr>
         <w:pStyle w:val="Heading2"/>
       </w:pPr>
-      <w:bookmarkStart w:id="4" w:name="_Toc239535712"/>
+      <w:bookmarkStart w:id="4" w:name="_Toc242042079"/>
       <w:r>
         <w:t>1.4 Team Collaboration and Project Setup</w:t>
       </w:r>
@@ -2932,7 +3873,11 @@
     </w:p>
     <w:p>
       <w:r>
-        <w:t>As Team 1E we established communication via Canvas messages and decided to continue collaboration via Microsoft Teams. We quickly established that team members had opposite personal schedules, therefore making it difficult to settle on a consistent meeting time. Text communication has been the default method with space for ad-hoc meetings via call as required. The team agreed to consolidate project version control and document management to a shared GitHub repository for ease of use.</w:t>
+        <w:t xml:space="preserve">As Team 1E we established communication via Canvas messages and decided to continue collaboration via Microsoft Teams. We quickly established that team members had opposite personal schedules, therefore making it difficult to settle on a consistent meeting time. Text communication has been the default method with space for ad-hoc </w:t>
+      </w:r>
+      <w:r>
+        <w:lastRenderedPageBreak/>
+        <w:t>meetings via call as required. The team agreed to consolidate project version control and document management to a shared GitHub repository for ease of use.</w:t>
       </w:r>
     </w:p>
     <w:p>
@@ -2983,6 +3928,8 @@
         </w:rPr>
         <w:sectPr>
           <w:headerReference w:type="default" r:id="rId10"/>
+          <w:footerReference w:type="even" r:id="rId11"/>
+          <w:footerReference w:type="default" r:id="rId12"/>
           <w:pgSz w:w="11906" w:h="16838"/>
           <w:pgMar w:top="1440" w:right="1440" w:bottom="1440" w:left="1440" w:header="708" w:footer="708" w:gutter="0"/>
           <w:cols w:space="708"/>
@@ -3027,45 +3974,10 @@
     </w:tbl>
     <w:p>
       <w:pPr>
-        <w:rPr>
-          <w:b/>
-          <w:bCs/>
-          <w:sz w:val="32"/>
-          <w:szCs w:val="32"/>
-        </w:rPr>
-        <w:sectPr>
-          <w:type w:val="continuous"/>
-          <w:pgSz w:w="11906" w:h="16838"/>
-          <w:pgMar w:top="1440" w:right="1440" w:bottom="1440" w:left="1440" w:header="708" w:footer="708" w:gutter="0"/>
-          <w:cols w:num="2" w:space="286"/>
-          <w:docGrid w:linePitch="360"/>
-        </w:sectPr>
-      </w:pPr>
-    </w:p>
-    <w:p>
-      <w:pPr>
-        <w:rPr>
-          <w:b/>
-          <w:bCs/>
-          <w:sz w:val="28"/>
-          <w:szCs w:val="28"/>
-        </w:rPr>
-        <w:sectPr>
-          <w:type w:val="continuous"/>
-          <w:pgSz w:w="11906" w:h="16838"/>
-          <w:pgMar w:top="1440" w:right="1440" w:bottom="1440" w:left="1440" w:header="708" w:footer="708" w:gutter="0"/>
-          <w:cols w:space="286"/>
-          <w:docGrid w:linePitch="360"/>
-        </w:sectPr>
-      </w:pPr>
-    </w:p>
-    <w:p>
-      <w:pPr>
         <w:pStyle w:val="Heading1"/>
       </w:pPr>
-      <w:bookmarkStart w:id="5" w:name="_Toc239535713"/>
-      <w:r>
-        <w:lastRenderedPageBreak/>
+      <w:bookmarkStart w:id="5" w:name="_Toc242042080"/>
+      <w:r>
         <w:t>2. Data</w:t>
       </w:r>
       <w:bookmarkEnd w:id="5"/>
@@ -3074,7 +3986,7 @@
       <w:pPr>
         <w:pStyle w:val="Heading2"/>
       </w:pPr>
-      <w:bookmarkStart w:id="6" w:name="_Toc239535714"/>
+      <w:bookmarkStart w:id="6" w:name="_Toc242042081"/>
       <w:r>
         <w:t>2.1 Data Sources</w:t>
       </w:r>
@@ -3090,7 +4002,13 @@
         <w:rPr>
           <w:color w:val="000000" w:themeColor="text1"/>
         </w:rPr>
-        <w:t>Currently, two datasets on OECD health statistics are used in the project:</w:t>
+        <w:t>Two</w:t>
+      </w:r>
+      <w:r>
+        <w:rPr>
+          <w:color w:val="000000" w:themeColor="text1"/>
+        </w:rPr>
+        <w:t xml:space="preserve"> datasets on OECD health statistics are used in the project:</w:t>
       </w:r>
     </w:p>
     <w:p>
@@ -3123,7 +4041,13 @@
         <w:rPr>
           <w:color w:val="000000" w:themeColor="text1"/>
         </w:rPr>
-        <w:t>This set of data is used to create a plot of life expectancy versus country for years. The country name and year value are relevant attributes, so is life expectancy value.</w:t>
+        <w:t>These datasets are used to</w:t>
+      </w:r>
+      <w:r>
+        <w:rPr>
+          <w:color w:val="000000" w:themeColor="text1"/>
+        </w:rPr>
+        <w:t xml:space="preserve"> create a plot of life expectancy versus country for years. The country name and year value are relevant attributes, so is life expectancy value.</w:t>
       </w:r>
       <w:r>
         <w:rPr>
@@ -3155,27 +4079,27 @@
         <w:rPr>
           <w:color w:val="000000" w:themeColor="text1"/>
         </w:rPr>
-        <w:t xml:space="preserve"> the project's GitHub repository and loaded on the website with D3.js.</w:t>
-      </w:r>
-    </w:p>
-    <w:p>
-      <w:pPr>
+        <w:t xml:space="preserve"> the project's GitHub repository and loaded </w:t>
+      </w:r>
+      <w:r>
         <w:rPr>
           <w:color w:val="000000" w:themeColor="text1"/>
         </w:rPr>
-      </w:pPr>
-    </w:p>
-    <w:p>
-      <w:pPr>
-        <w:pStyle w:val="Heading3"/>
-      </w:pPr>
-      <w:bookmarkStart w:id="7" w:name="_Toc239535715"/>
-      <w:r>
-        <w:t>Data source:</w:t>
-      </w:r>
-      <w:bookmarkEnd w:id="7"/>
-      <w:r>
-        <w:t xml:space="preserve"> </w:t>
+        <w:t>to</w:t>
+      </w:r>
+      <w:r>
+        <w:rPr>
+          <w:color w:val="000000" w:themeColor="text1"/>
+        </w:rPr>
+        <w:t xml:space="preserve"> the website with D3.js.</w:t>
+      </w:r>
+    </w:p>
+    <w:p>
+      <w:pPr>
+        <w:pStyle w:val="Heading4"/>
+      </w:pPr>
+      <w:r>
+        <w:t xml:space="preserve">Data source: </w:t>
       </w:r>
     </w:p>
     <w:p>
@@ -3186,9 +4110,14 @@
           <w:numId w:val="7"/>
         </w:numPr>
       </w:pPr>
-      <w:r>
-        <w:t>OECD Health Statistics – Life Expectancy</w:t>
-      </w:r>
+      <w:hyperlink r:id="rId13" w:history="1">
+        <w:r>
+          <w:rPr>
+            <w:rStyle w:val="Hyperlink"/>
+          </w:rPr>
+          <w:t>OECD Health Statistics – Life Expectancy</w:t>
+        </w:r>
+      </w:hyperlink>
     </w:p>
     <w:p>
       <w:pPr>
@@ -3198,9 +4127,14 @@
           <w:numId w:val="7"/>
         </w:numPr>
       </w:pPr>
-      <w:r>
-        <w:t>OECD Health Statistics – Health Expenditure and Financing</w:t>
-      </w:r>
+      <w:hyperlink r:id="rId14" w:history="1">
+        <w:r>
+          <w:rPr>
+            <w:rStyle w:val="Hyperlink"/>
+          </w:rPr>
+          <w:t>OECD Health Statistics – Health Expenditure and Financing</w:t>
+        </w:r>
+      </w:hyperlink>
     </w:p>
     <w:p>
       <w:pPr>
@@ -3208,50 +4142,6 @@
       </w:pPr>
     </w:p>
     <w:p>
-      <w:pPr>
-        <w:pStyle w:val="Heading3"/>
-      </w:pPr>
-      <w:bookmarkStart w:id="8" w:name="_Toc239535716"/>
-      <w:r>
-        <w:t>Source link:</w:t>
-      </w:r>
-      <w:bookmarkEnd w:id="8"/>
-    </w:p>
-    <w:p>
-      <w:pPr>
-        <w:pStyle w:val="ListParagraph"/>
-        <w:numPr>
-          <w:ilvl w:val="0"/>
-          <w:numId w:val="8"/>
-        </w:numPr>
-      </w:pPr>
-      <w:hyperlink r:id="rId11" w:history="1">
-        <w:r>
-          <w:rPr>
-            <w:rStyle w:val="Hyperlink"/>
-          </w:rPr>
-          <w:t>OECD Data Explorer • Life expectancy</w:t>
-        </w:r>
-      </w:hyperlink>
-    </w:p>
-    <w:p>
-      <w:pPr>
-        <w:pStyle w:val="ListParagraph"/>
-        <w:numPr>
-          <w:ilvl w:val="0"/>
-          <w:numId w:val="8"/>
-        </w:numPr>
-      </w:pPr>
-      <w:hyperlink r:id="rId12" w:history="1">
-        <w:r>
-          <w:rPr>
-            <w:rStyle w:val="Hyperlink"/>
-          </w:rPr>
-          <w:t>OECD Data Explorer • Health expenditure and financing</w:t>
-        </w:r>
-      </w:hyperlink>
-    </w:p>
-    <w:p>
       <w:r>
         <w:t>The datasets are mostly tabular data including categorical and quantitative data. The attributes are categorical for country, then numerical for life expectancy, year and healthcare expenditure that are used for visualisations.</w:t>
       </w:r>
@@ -3275,24 +4165,30 @@
       <w:pPr>
         <w:pStyle w:val="Heading2"/>
       </w:pPr>
-      <w:bookmarkStart w:id="9" w:name="_Toc239535717"/>
+      <w:bookmarkStart w:id="7" w:name="_Toc242042082"/>
       <w:r>
         <w:t>2.2 Data Processing</w:t>
       </w:r>
-      <w:bookmarkEnd w:id="9"/>
-    </w:p>
-    <w:p>
-      <w:r>
-        <w:t xml:space="preserve">The OECD data sets include observations for a number of countries, years and health related measures. The data was limited to 10 countries chosen from the OECD countries to avoid being overwhelmed by the sheer volume of data in the visualisations that would be produced by including all countries: Australia, Canada, France, Germany, </w:t>
+      <w:bookmarkEnd w:id="7"/>
+    </w:p>
+    <w:p>
+      <w:r>
+        <w:t xml:space="preserve">The OECD data sets include observations for a number of countries, years and health related measures. The data was limited to 10 countries chosen from the OECD countries to avoid being overwhelmed by the sheer volume of data in the visualisations </w:t>
       </w:r>
       <w:r>
         <w:lastRenderedPageBreak/>
-        <w:t>Italy, Japan, Korea, New Zealand, the United Kingdom and the United States. The selected period was 2015 to 2024.</w:t>
-      </w:r>
-    </w:p>
-    <w:p>
-      <w:r>
-        <w:t>The Life Expectancy dataset was restricted to only include annual observations for life expectancy at 0 years, sex = Total. The Healthcare Expenditure dataset was selected to provide data for total annual expenditure on healthcare items per capita at current prices in US dollars in purchasing power parity (PPP) terms. The filters provided the possibility to be sure that the values presented on the charts were common measures in the selected countries.</w:t>
+        <w:t>that would be produced by including all countries: Australia, Canada, France, Germany, Italy, Japan, Korea, New Zealand, the United Kingdom and the United States. The selected period was 2015 to 2024.</w:t>
+      </w:r>
+    </w:p>
+    <w:p>
+      <w:r>
+        <w:t xml:space="preserve">The Life Expectancy dataset was restricted to only include annual observations for life expectancy at 0 years, sex = Total. The Healthcare Expenditure dataset was selected to provide data for total annual expenditure on </w:t>
+      </w:r>
+      <w:r>
+        <w:t>total health expenditure per capita</w:t>
+      </w:r>
+      <w:r>
+        <w:t xml:space="preserve"> at current prices in US dollars in purchasing power parity (PPP) terms. The filters provided the possibility to be sure that the values presented on the charts were common measures in the selected countries.</w:t>
       </w:r>
     </w:p>
     <w:p>
@@ -3337,7 +4233,15 @@
             </w:r>
           </w:p>
           <w:p>
-            <w:r>
+            <w:pPr>
+              <w:rPr>
+                <w:rFonts w:ascii="Courier New" w:hAnsi="Courier New" w:cs="Courier New"/>
+              </w:rPr>
+            </w:pPr>
+            <w:r>
+              <w:rPr>
+                <w:rFonts w:ascii="Courier New" w:hAnsi="Courier New" w:cs="Courier New"/>
+              </w:rPr>
               <w:t>Reference area</w:t>
             </w:r>
           </w:p>
@@ -3379,8 +4283,21 @@
             </w:r>
           </w:p>
           <w:p>
-            <w:r>
-              <w:t>OBS_VALUE (spending USD PPP, life expectancy years)</w:t>
+            <w:pPr>
+              <w:rPr>
+                <w:rFonts w:ascii="Courier New" w:hAnsi="Courier New" w:cs="Courier New"/>
+              </w:rPr>
+            </w:pPr>
+            <w:r>
+              <w:rPr>
+                <w:rFonts w:ascii="Courier New" w:hAnsi="Courier New" w:cs="Courier New"/>
+              </w:rPr>
+              <w:t xml:space="preserve">OBS_VALUE </w:t>
+            </w:r>
+          </w:p>
+          <w:p>
+            <w:r>
+              <w:t>(spending USD PPP, life expectancy years)</w:t>
             </w:r>
           </w:p>
         </w:tc>
@@ -3401,9 +4318,6 @@
             <w:tcW w:w="3005" w:type="dxa"/>
           </w:tcPr>
           <w:p>
-            <w:pPr>
-              <w:jc w:val="center"/>
-            </w:pPr>
             <w:r>
               <w:rPr>
                 <w:rStyle w:val="notion-enable-hover"/>
@@ -3419,23 +4333,19 @@
             <w:tcW w:w="3005" w:type="dxa"/>
           </w:tcPr>
           <w:p>
-            <w:pPr>
-              <w:rPr>
-                <w:b/>
-                <w:bCs/>
-              </w:rPr>
-            </w:pPr>
-            <w:r>
-              <w:rPr>
-                <w:b/>
-                <w:bCs/>
-              </w:rPr>
+            <w:r>
               <w:t>Life expectancy at birth</w:t>
             </w:r>
           </w:p>
           <w:p>
             <w:r>
-              <w:t>TIME_PERIOD (2015–2024)</w:t>
+              <w:rPr>
+                <w:rFonts w:ascii="Courier New" w:hAnsi="Courier New" w:cs="Courier New"/>
+              </w:rPr>
+              <w:t>TIME_PERIOD</w:t>
+            </w:r>
+            <w:r>
+              <w:t xml:space="preserve"> (2015–2024)</w:t>
             </w:r>
           </w:p>
         </w:tc>
@@ -3445,7 +4355,13 @@
           </w:tcPr>
           <w:p>
             <w:r>
-              <w:t>Number of years a person can expect to live if they were born in 2012.</w:t>
+              <w:t xml:space="preserve">Number of years a person can expect to live if they were born in </w:t>
+            </w:r>
+            <w:r>
+              <w:t>the observation year</w:t>
+            </w:r>
+            <w:r>
+              <w:t>.</w:t>
             </w:r>
           </w:p>
         </w:tc>
@@ -3454,15 +4370,13 @@
     <w:p/>
     <w:p>
       <w:r>
-        <w:t xml:space="preserve">Healthcare expenditure: Total per capita health spending (in US </w:t>
-      </w:r>
-      <w:proofErr w:type="gramStart"/>
-      <w:r>
-        <w:t>dollars(</w:t>
-      </w:r>
-      <w:proofErr w:type="gramEnd"/>
-      <w:r>
-        <w:t>PPP)).</w:t>
+        <w:t>Healthcare expenditure: Total per capita health spending (in US dollars</w:t>
+      </w:r>
+      <w:r>
+        <w:t xml:space="preserve"> </w:t>
+      </w:r>
+      <w:r>
+        <w:t>(PPP)).</w:t>
       </w:r>
     </w:p>
     <w:p>
@@ -3478,16 +4392,30 @@
         <w:t>.</w:t>
       </w:r>
     </w:p>
-    <w:p/>
-    <w:p>
-      <w:r>
-        <w:t xml:space="preserve">The data was cleaned, filtered and joined using the D3 function </w:t>
+    <w:p>
+      <w:r>
+        <w:t xml:space="preserve">The D3 function </w:t>
       </w:r>
       <w:proofErr w:type="spellStart"/>
       <w:r>
         <w:t>Promise.all</w:t>
       </w:r>
       <w:proofErr w:type="spellEnd"/>
+      <w:r>
+        <w:t xml:space="preserve"> was used to load the datasets into the code. </w:t>
+      </w:r>
+      <w:r>
+        <w:t>The data was cleaned, filtered and joined</w:t>
+      </w:r>
+      <w:r>
+        <w:t xml:space="preserve"> </w:t>
+      </w:r>
+      <w:r>
+        <w:rPr>
+          <w:highlight w:val="yellow"/>
+        </w:rPr>
+        <w:t>&lt;insert&gt;</w:t>
+      </w:r>
       <w:r>
         <w:t xml:space="preserve">. </w:t>
       </w:r>
@@ -3518,6 +4446,7 @@
           <w:b/>
           <w:bCs/>
         </w:rPr>
+        <w:lastRenderedPageBreak/>
         <w:br w:type="page"/>
       </w:r>
     </w:p>
@@ -3525,32 +4454,30 @@
       <w:pPr>
         <w:pStyle w:val="Heading1"/>
       </w:pPr>
-      <w:bookmarkStart w:id="10" w:name="_Toc239535718"/>
+      <w:bookmarkStart w:id="8" w:name="_Toc242042083"/>
       <w:r>
         <w:lastRenderedPageBreak/>
         <w:t>3. Requirements</w:t>
       </w:r>
-      <w:bookmarkEnd w:id="10"/>
+      <w:bookmarkEnd w:id="8"/>
     </w:p>
     <w:p>
       <w:pPr>
         <w:pStyle w:val="Heading2"/>
       </w:pPr>
-      <w:bookmarkStart w:id="11" w:name="_Toc239535719"/>
+      <w:bookmarkStart w:id="9" w:name="_Toc242042084"/>
       <w:r>
         <w:t>3.1 Must-have Features</w:t>
       </w:r>
-      <w:bookmarkEnd w:id="11"/>
+      <w:bookmarkEnd w:id="9"/>
     </w:p>
     <w:p>
       <w:r>
         <w:t xml:space="preserve">The following requirements were identified during the planning stage. All must-have features were implemented in the </w:t>
       </w:r>
-      <w:proofErr w:type="spellStart"/>
-      <w:r>
-        <w:t>fi.nal</w:t>
-      </w:r>
-      <w:proofErr w:type="spellEnd"/>
+      <w:r>
+        <w:t>final</w:t>
+      </w:r>
       <w:r>
         <w:t xml:space="preserve"> website</w:t>
       </w:r>
@@ -3614,7 +4541,10 @@
           </w:tcPr>
           <w:p>
             <w:r>
-              <w:t>import OECD health statistics into D3.js</w:t>
+              <w:t>I</w:t>
+            </w:r>
+            <w:r>
+              <w:t>mport OECD health statistics into D3.js</w:t>
             </w:r>
           </w:p>
         </w:tc>
@@ -3793,11 +4723,11 @@
       <w:pPr>
         <w:pStyle w:val="Heading2"/>
       </w:pPr>
-      <w:bookmarkStart w:id="12" w:name="_Toc239535720"/>
+      <w:bookmarkStart w:id="10" w:name="_Toc242042085"/>
       <w:r>
         <w:t>3.2 Optional Features</w:t>
       </w:r>
-      <w:bookmarkEnd w:id="12"/>
+      <w:bookmarkEnd w:id="10"/>
     </w:p>
     <w:p>
       <w:r>
@@ -3966,28 +4896,7 @@
               <w:t xml:space="preserve"> – Users can highlight individual country trends by </w:t>
             </w:r>
             <w:r>
-              <w:t>selecting the country name from Legend or within Visualisation 1, which isolates it in all visualisations.</w:t>
-            </w:r>
-          </w:p>
-          <w:p>
-            <w:r>
-              <w:t xml:space="preserve">Not </w:t>
-            </w:r>
-            <w:proofErr w:type="spellStart"/>
-            <w:r>
-              <w:t>impleneted</w:t>
-            </w:r>
-            <w:proofErr w:type="spellEnd"/>
-            <w:r>
-              <w:t xml:space="preserve"> – Unable to unselect a country by selecting </w:t>
-            </w:r>
-            <w:proofErr w:type="spellStart"/>
-            <w:r>
-              <w:t>elsewqhere</w:t>
-            </w:r>
-            <w:proofErr w:type="spellEnd"/>
-            <w:r>
-              <w:t xml:space="preserve"> on the website.</w:t>
+              <w:t>selecting the country name from Legend or within Visual 1, which isolates it in all visualisations.</w:t>
             </w:r>
           </w:p>
         </w:tc>
@@ -3999,6 +4908,34 @@
           </w:tcPr>
           <w:p>
             <w:r>
+              <w:t xml:space="preserve">Country </w:t>
+            </w:r>
+            <w:r>
+              <w:t>de</w:t>
+            </w:r>
+            <w:r>
+              <w:t>selection</w:t>
+            </w:r>
+          </w:p>
+        </w:tc>
+        <w:tc>
+          <w:tcPr>
+            <w:tcW w:w="4508" w:type="dxa"/>
+          </w:tcPr>
+          <w:p>
+            <w:r>
+              <w:t>Not implemented – Unable to unselect a country by selecting elsewhere on the website.</w:t>
+            </w:r>
+          </w:p>
+        </w:tc>
+      </w:tr>
+      <w:tr>
+        <w:tc>
+          <w:tcPr>
+            <w:tcW w:w="4508" w:type="dxa"/>
+          </w:tcPr>
+          <w:p>
+            <w:r>
               <w:lastRenderedPageBreak/>
               <w:t>Year selection or filtering</w:t>
             </w:r>
@@ -4054,7 +4991,10 @@
           </w:tcPr>
           <w:p>
             <w:r>
-              <w:t>Not implemented – No filter-based animations were added.</w:t>
+              <w:t>Im</w:t>
+            </w:r>
+            <w:r>
+              <w:t>plemented</w:t>
             </w:r>
           </w:p>
         </w:tc>
@@ -4144,112 +5084,629 @@
       <w:pPr>
         <w:pStyle w:val="Heading1"/>
       </w:pPr>
-      <w:bookmarkStart w:id="13" w:name="_Toc239535721"/>
+      <w:bookmarkStart w:id="11" w:name="_Toc242042086"/>
       <w:r>
         <w:lastRenderedPageBreak/>
         <w:t>4. Visualisation Design</w:t>
       </w:r>
+      <w:bookmarkEnd w:id="11"/>
+    </w:p>
+    <w:p>
+      <w:r>
+        <w:t>During the early design stage, several visualisation approaches were considered. Before selecting the final design.</w:t>
+      </w:r>
+    </w:p>
+    <w:p>
+      <w:r>
+        <w:t>The visualisations that were considered include:</w:t>
+      </w:r>
+    </w:p>
+    <w:p>
+      <w:pPr>
+        <w:pStyle w:val="Heading4"/>
+      </w:pPr>
+      <w:r>
+        <w:t xml:space="preserve">Design Idea </w:t>
+      </w:r>
+      <w:r>
+        <w:t>1</w:t>
+      </w:r>
+      <w:r>
+        <w:t xml:space="preserve"> – </w:t>
+      </w:r>
+      <w:r>
+        <w:t>Bar Chart</w:t>
+      </w:r>
+    </w:p>
+    <w:p>
+      <w:r>
+        <w:t>A bar chart could have been used to demonstrate the spending of each country to see how they visually stack against each other. This was rejected due to the cluttered look. A line chart was favoured due to its ability to display the two variables together.</w:t>
+      </w:r>
+    </w:p>
+    <w:p/>
+    <w:p>
+      <w:pPr>
+        <w:pStyle w:val="Heading4"/>
+      </w:pPr>
+      <w:r>
+        <w:t xml:space="preserve">Design Idea </w:t>
+      </w:r>
+      <w:r>
+        <w:t>2 – Dumbbell</w:t>
+      </w:r>
+    </w:p>
+    <w:p>
+      <w:r>
+        <w:t>A dumbbell chart was considered as a simpl</w:t>
+      </w:r>
+      <w:r>
+        <w:t>e</w:t>
+      </w:r>
+      <w:r>
+        <w:t xml:space="preserve"> way to show the progression of time.</w:t>
+      </w:r>
+    </w:p>
+    <w:p>
+      <w:pPr>
+        <w:pStyle w:val="Heading4"/>
+      </w:pPr>
+    </w:p>
+    <w:p>
+      <w:pPr>
+        <w:pStyle w:val="Heading4"/>
+      </w:pPr>
+      <w:r>
+        <w:t>Design Idea 3</w:t>
+      </w:r>
+      <w:r>
+        <w:t xml:space="preserve"> – Scatter Plot</w:t>
+      </w:r>
+    </w:p>
+    <w:p>
+      <w:r>
+        <w:t>A scatter plot could display healthcare expenditure on the x-axis and life expectancy on the y-axis. Each point would represent a country. This would make it easier to investigate whether countries with higher healthcare expenditure also tend to have higher life expectancy.</w:t>
+      </w:r>
+    </w:p>
+    <w:p/>
+    <w:p>
+      <w:pPr>
+        <w:pStyle w:val="Heading4"/>
+      </w:pPr>
+      <w:r>
+        <w:t xml:space="preserve">Design Idea </w:t>
+      </w:r>
+      <w:r>
+        <w:t>4</w:t>
+      </w:r>
+      <w:r>
+        <w:t xml:space="preserve"> – Line Chart</w:t>
+      </w:r>
+    </w:p>
+    <w:p>
+      <w:r>
+        <w:t>A line chart could show changes in healthcare expenditure or life expectancy over time. Users could select or compare countries to observe long-term trends.</w:t>
+      </w:r>
+    </w:p>
+    <w:p/>
+    <w:p>
+      <w:pPr>
+        <w:pStyle w:val="Heading4"/>
+      </w:pPr>
+      <w:r>
+        <w:t xml:space="preserve">Design Idea </w:t>
+      </w:r>
+      <w:r>
+        <w:t>5</w:t>
+      </w:r>
+      <w:r>
+        <w:t xml:space="preserve"> – Combined Interactive Dashboard</w:t>
+      </w:r>
+    </w:p>
+    <w:p>
+      <w:r>
+        <w:t>A dashboard could combine the scatter plot and line chart with filters for country and year. Selecting a country or year could update the visualisations and allow users to explore the data interactively.</w:t>
+      </w:r>
+    </w:p>
+    <w:p/>
+    <w:p>
+      <w:r>
+        <w:t xml:space="preserve">The team selected, </w:t>
+      </w:r>
+      <w:r>
+        <w:t xml:space="preserve">to go with a scatterplot and line </w:t>
+      </w:r>
+      <w:r>
+        <w:t>graphs</w:t>
+      </w:r>
+      <w:r>
+        <w:t xml:space="preserve"> as the variables being presented (time &amp; numerical) are best suited for these.</w:t>
+      </w:r>
+    </w:p>
+    <w:p>
+      <w:r>
+        <w:t>The visualisations were further refined with user testing. See Appendix B for an example</w:t>
+      </w:r>
+      <w:r>
+        <w:t>, after the feedback was implemented</w:t>
+      </w:r>
+      <w:r>
+        <w:t>.</w:t>
+      </w:r>
+    </w:p>
+    <w:p/>
+    <w:tbl>
+      <w:tblPr>
+        <w:tblStyle w:val="TableGrid"/>
+        <w:tblW w:w="0" w:type="auto"/>
+        <w:tblLook w:val="04A0" w:firstRow="1" w:lastRow="0" w:firstColumn="1" w:lastColumn="0" w:noHBand="0" w:noVBand="1"/>
+      </w:tblPr>
+      <w:tblGrid>
+        <w:gridCol w:w="3443"/>
+        <w:gridCol w:w="2361"/>
+        <w:gridCol w:w="3212"/>
+      </w:tblGrid>
+      <w:tr>
+        <w:tc>
+          <w:tcPr>
+            <w:tcW w:w="0" w:type="auto"/>
+            <w:hideMark/>
+          </w:tcPr>
+          <w:p>
+            <w:pPr>
+              <w:rPr>
+                <w:b/>
+                <w:bCs/>
+                <w:lang w:eastAsia="en-GB"/>
+              </w:rPr>
+            </w:pPr>
+            <w:r>
+              <w:rPr>
+                <w:b/>
+                <w:bCs/>
+                <w:lang w:eastAsia="en-GB"/>
+              </w:rPr>
+              <w:lastRenderedPageBreak/>
+              <w:t>User Question</w:t>
+            </w:r>
+          </w:p>
+        </w:tc>
+        <w:tc>
+          <w:tcPr>
+            <w:tcW w:w="0" w:type="auto"/>
+            <w:hideMark/>
+          </w:tcPr>
+          <w:p>
+            <w:pPr>
+              <w:rPr>
+                <w:b/>
+                <w:bCs/>
+                <w:lang w:eastAsia="en-GB"/>
+              </w:rPr>
+            </w:pPr>
+            <w:r>
+              <w:rPr>
+                <w:b/>
+                <w:bCs/>
+                <w:lang w:eastAsia="en-GB"/>
+              </w:rPr>
+              <w:t>Visualisation</w:t>
+            </w:r>
+          </w:p>
+        </w:tc>
+        <w:tc>
+          <w:tcPr>
+            <w:tcW w:w="0" w:type="auto"/>
+            <w:hideMark/>
+          </w:tcPr>
+          <w:p>
+            <w:pPr>
+              <w:rPr>
+                <w:b/>
+                <w:bCs/>
+                <w:lang w:eastAsia="en-GB"/>
+              </w:rPr>
+            </w:pPr>
+            <w:r>
+              <w:rPr>
+                <w:b/>
+                <w:bCs/>
+                <w:lang w:eastAsia="en-GB"/>
+              </w:rPr>
+              <w:t>Insight Provided</w:t>
+            </w:r>
+          </w:p>
+        </w:tc>
+      </w:tr>
+      <w:tr>
+        <w:tc>
+          <w:tcPr>
+            <w:tcW w:w="0" w:type="auto"/>
+            <w:hideMark/>
+          </w:tcPr>
+          <w:p>
+            <w:pPr>
+              <w:rPr>
+                <w:lang w:eastAsia="en-GB"/>
+              </w:rPr>
+            </w:pPr>
+            <w:r>
+              <w:rPr>
+                <w:lang w:eastAsia="en-GB"/>
+              </w:rPr>
+              <w:t>Q1: Do higher spending countries have longer life expectancy?</w:t>
+            </w:r>
+          </w:p>
+        </w:tc>
+        <w:tc>
+          <w:tcPr>
+            <w:tcW w:w="0" w:type="auto"/>
+            <w:hideMark/>
+          </w:tcPr>
+          <w:p>
+            <w:pPr>
+              <w:rPr>
+                <w:lang w:eastAsia="en-GB"/>
+              </w:rPr>
+            </w:pPr>
+            <w:r>
+              <w:rPr>
+                <w:lang w:eastAsia="en-GB"/>
+              </w:rPr>
+              <w:t>Visual 1: Scatter Plot</w:t>
+            </w:r>
+          </w:p>
+        </w:tc>
+        <w:tc>
+          <w:tcPr>
+            <w:tcW w:w="0" w:type="auto"/>
+            <w:hideMark/>
+          </w:tcPr>
+          <w:p>
+            <w:pPr>
+              <w:rPr>
+                <w:lang w:eastAsia="en-GB"/>
+              </w:rPr>
+            </w:pPr>
+            <w:r>
+              <w:rPr>
+                <w:lang w:eastAsia="en-GB"/>
+              </w:rPr>
+              <w:t xml:space="preserve">Displays correlation and returns </w:t>
+            </w:r>
+            <w:r>
+              <w:rPr>
+                <w:lang w:eastAsia="en-GB"/>
+              </w:rPr>
+              <w:t>of</w:t>
+            </w:r>
+            <w:r>
+              <w:rPr>
+                <w:lang w:eastAsia="en-GB"/>
+              </w:rPr>
+              <w:t xml:space="preserve"> spending</w:t>
+            </w:r>
+            <w:r>
+              <w:rPr>
+                <w:lang w:eastAsia="en-GB"/>
+              </w:rPr>
+              <w:t xml:space="preserve"> over time</w:t>
+            </w:r>
+            <w:r>
+              <w:rPr>
+                <w:lang w:eastAsia="en-GB"/>
+              </w:rPr>
+              <w:t>.</w:t>
+            </w:r>
+          </w:p>
+        </w:tc>
+      </w:tr>
+      <w:tr>
+        <w:tc>
+          <w:tcPr>
+            <w:tcW w:w="0" w:type="auto"/>
+            <w:hideMark/>
+          </w:tcPr>
+          <w:p>
+            <w:pPr>
+              <w:rPr>
+                <w:lang w:eastAsia="en-GB"/>
+              </w:rPr>
+            </w:pPr>
+            <w:r>
+              <w:rPr>
+                <w:lang w:eastAsia="en-GB"/>
+              </w:rPr>
+              <w:t>Q2: How does spending per person differ across countries?</w:t>
+            </w:r>
+          </w:p>
+        </w:tc>
+        <w:tc>
+          <w:tcPr>
+            <w:tcW w:w="0" w:type="auto"/>
+            <w:hideMark/>
+          </w:tcPr>
+          <w:p>
+            <w:pPr>
+              <w:rPr>
+                <w:lang w:eastAsia="en-GB"/>
+              </w:rPr>
+            </w:pPr>
+            <w:r>
+              <w:rPr>
+                <w:lang w:eastAsia="en-GB"/>
+              </w:rPr>
+              <w:t xml:space="preserve">Visual 2: </w:t>
+            </w:r>
+            <w:r>
+              <w:rPr>
+                <w:lang w:eastAsia="en-GB"/>
+              </w:rPr>
+              <w:t>Expenditure</w:t>
+            </w:r>
+            <w:r>
+              <w:rPr>
+                <w:lang w:eastAsia="en-GB"/>
+              </w:rPr>
+              <w:t xml:space="preserve"> Line Chart</w:t>
+            </w:r>
+          </w:p>
+        </w:tc>
+        <w:tc>
+          <w:tcPr>
+            <w:tcW w:w="0" w:type="auto"/>
+            <w:hideMark/>
+          </w:tcPr>
+          <w:p>
+            <w:pPr>
+              <w:rPr>
+                <w:lang w:eastAsia="en-GB"/>
+              </w:rPr>
+            </w:pPr>
+            <w:r>
+              <w:rPr>
+                <w:lang w:eastAsia="en-GB"/>
+              </w:rPr>
+              <w:t>Highlights USD PPP spending disparities over time</w:t>
+            </w:r>
+            <w:r>
+              <w:rPr>
+                <w:lang w:eastAsia="en-GB"/>
+              </w:rPr>
+              <w:t>.</w:t>
+            </w:r>
+          </w:p>
+        </w:tc>
+      </w:tr>
+      <w:tr>
+        <w:tc>
+          <w:tcPr>
+            <w:tcW w:w="0" w:type="auto"/>
+            <w:hideMark/>
+          </w:tcPr>
+          <w:p>
+            <w:pPr>
+              <w:rPr>
+                <w:lang w:eastAsia="en-GB"/>
+              </w:rPr>
+            </w:pPr>
+            <w:r>
+              <w:rPr>
+                <w:lang w:eastAsia="en-GB"/>
+              </w:rPr>
+              <w:t>Q3: What is life expectancy across OECD nations?</w:t>
+            </w:r>
+          </w:p>
+        </w:tc>
+        <w:tc>
+          <w:tcPr>
+            <w:tcW w:w="0" w:type="auto"/>
+            <w:hideMark/>
+          </w:tcPr>
+          <w:p>
+            <w:pPr>
+              <w:rPr>
+                <w:lang w:eastAsia="en-GB"/>
+              </w:rPr>
+            </w:pPr>
+            <w:r>
+              <w:rPr>
+                <w:lang w:eastAsia="en-GB"/>
+              </w:rPr>
+              <w:t>Visual 3: Life Expectancy Line Chart</w:t>
+            </w:r>
+          </w:p>
+        </w:tc>
+        <w:tc>
+          <w:tcPr>
+            <w:tcW w:w="0" w:type="auto"/>
+            <w:hideMark/>
+          </w:tcPr>
+          <w:p>
+            <w:pPr>
+              <w:rPr>
+                <w:lang w:eastAsia="en-GB"/>
+              </w:rPr>
+            </w:pPr>
+            <w:r>
+              <w:rPr>
+                <w:lang w:eastAsia="en-GB"/>
+              </w:rPr>
+              <w:t>Displays relative health outcomes over time.</w:t>
+            </w:r>
+          </w:p>
+        </w:tc>
+      </w:tr>
+      <w:tr>
+        <w:tc>
+          <w:tcPr>
+            <w:tcW w:w="0" w:type="auto"/>
+            <w:hideMark/>
+          </w:tcPr>
+          <w:p>
+            <w:pPr>
+              <w:rPr>
+                <w:lang w:eastAsia="en-GB"/>
+              </w:rPr>
+            </w:pPr>
+            <w:r>
+              <w:rPr>
+                <w:lang w:eastAsia="en-GB"/>
+              </w:rPr>
+              <w:t>Q4: How have spending and longevity changed from 2015 to 2024?</w:t>
+            </w:r>
+          </w:p>
+        </w:tc>
+        <w:tc>
+          <w:tcPr>
+            <w:tcW w:w="0" w:type="auto"/>
+            <w:hideMark/>
+          </w:tcPr>
+          <w:p>
+            <w:pPr>
+              <w:rPr>
+                <w:lang w:eastAsia="en-GB"/>
+              </w:rPr>
+            </w:pPr>
+            <w:r>
+              <w:rPr>
+                <w:lang w:eastAsia="en-GB"/>
+              </w:rPr>
+              <w:t>Visuals 2 &amp; 3</w:t>
+            </w:r>
+          </w:p>
+        </w:tc>
+        <w:tc>
+          <w:tcPr>
+            <w:tcW w:w="0" w:type="auto"/>
+            <w:hideMark/>
+          </w:tcPr>
+          <w:p>
+            <w:pPr>
+              <w:rPr>
+                <w:lang w:eastAsia="en-GB"/>
+              </w:rPr>
+            </w:pPr>
+            <w:r>
+              <w:rPr>
+                <w:lang w:eastAsia="en-GB"/>
+              </w:rPr>
+              <w:t>Illustrates temporal trajectories and COVID-19 pandemic impacts.</w:t>
+            </w:r>
+          </w:p>
+        </w:tc>
+      </w:tr>
+      <w:tr>
+        <w:tc>
+          <w:tcPr>
+            <w:tcW w:w="0" w:type="auto"/>
+            <w:hideMark/>
+          </w:tcPr>
+          <w:p>
+            <w:pPr>
+              <w:rPr>
+                <w:lang w:eastAsia="en-GB"/>
+              </w:rPr>
+            </w:pPr>
+            <w:r>
+              <w:rPr>
+                <w:lang w:eastAsia="en-GB"/>
+              </w:rPr>
+              <w:t>Q5: Which countries achieve high life expectancy relative to spending?</w:t>
+            </w:r>
+          </w:p>
+        </w:tc>
+        <w:tc>
+          <w:tcPr>
+            <w:tcW w:w="0" w:type="auto"/>
+            <w:hideMark/>
+          </w:tcPr>
+          <w:p>
+            <w:pPr>
+              <w:rPr>
+                <w:lang w:eastAsia="en-GB"/>
+              </w:rPr>
+            </w:pPr>
+            <w:r>
+              <w:rPr>
+                <w:lang w:eastAsia="en-GB"/>
+              </w:rPr>
+              <w:t>Visual 1</w:t>
+            </w:r>
+          </w:p>
+        </w:tc>
+        <w:tc>
+          <w:tcPr>
+            <w:tcW w:w="0" w:type="auto"/>
+            <w:hideMark/>
+          </w:tcPr>
+          <w:p>
+            <w:pPr>
+              <w:rPr>
+                <w:lang w:eastAsia="en-GB"/>
+              </w:rPr>
+            </w:pPr>
+            <w:r>
+              <w:rPr>
+                <w:lang w:eastAsia="en-GB"/>
+              </w:rPr>
+              <w:t>Identifies high-efficiency nations</w:t>
+            </w:r>
+            <w:r>
+              <w:rPr>
+                <w:lang w:eastAsia="en-GB"/>
+              </w:rPr>
+              <w:t>.</w:t>
+            </w:r>
+          </w:p>
+        </w:tc>
+      </w:tr>
+    </w:tbl>
+    <w:p>
+      <w:pPr>
+        <w:rPr>
+          <w:rFonts w:asciiTheme="majorHAnsi" w:eastAsiaTheme="majorEastAsia" w:hAnsiTheme="majorHAnsi" w:cstheme="majorBidi"/>
+          <w:color w:val="0F4761" w:themeColor="accent1" w:themeShade="BF"/>
+          <w:sz w:val="40"/>
+          <w:szCs w:val="40"/>
+        </w:rPr>
+      </w:pPr>
+      <w:r>
+        <w:br w:type="page"/>
+      </w:r>
+    </w:p>
+    <w:p>
+      <w:pPr>
+        <w:pStyle w:val="Heading1"/>
+      </w:pPr>
+      <w:bookmarkStart w:id="12" w:name="_Toc242042087"/>
+      <w:r>
+        <w:lastRenderedPageBreak/>
+        <w:t>5. Validation</w:t>
+      </w:r>
+      <w:bookmarkEnd w:id="12"/>
+    </w:p>
+    <w:p>
+      <w:pPr>
+        <w:pStyle w:val="Heading2"/>
+      </w:pPr>
+      <w:bookmarkStart w:id="13" w:name="_Toc242042088"/>
+      <w:r>
+        <w:t>5.1 Informed Consent</w:t>
+      </w:r>
       <w:bookmarkEnd w:id="13"/>
     </w:p>
     <w:p>
       <w:r>
-        <w:t>The project is currently in the early design stage. Several visualisation approaches will be considered before selecting the final design.</w:t>
-      </w:r>
-    </w:p>
-    <w:p/>
-    <w:p>
-      <w:r>
-        <w:t>Possible visualisation ideas include:</w:t>
-      </w:r>
-    </w:p>
-    <w:p>
-      <w:pPr>
-        <w:pStyle w:val="Heading4"/>
-      </w:pPr>
-      <w:r>
-        <w:t>Design Idea 1 – Scatter Plot</w:t>
-      </w:r>
-    </w:p>
-    <w:p>
-      <w:r>
-        <w:t>A scatter plot could display healthcare expenditure on the x-axis and life expectancy on the y-axis. Each point would represent a country. This would make it easier to investigate whether countries with higher healthcare expenditure also tend to have higher life expectancy.</w:t>
-      </w:r>
-    </w:p>
-    <w:p/>
-    <w:p>
-      <w:pPr>
-        <w:pStyle w:val="Heading4"/>
-      </w:pPr>
-      <w:r>
-        <w:t>Design Idea 2 – Line Chart</w:t>
-      </w:r>
-    </w:p>
-    <w:p>
-      <w:r>
-        <w:t>A line chart could show changes in healthcare expenditure or life expectancy over time. Users could select or compare countries to observe long-term trends.</w:t>
-      </w:r>
-    </w:p>
-    <w:p/>
-    <w:p>
-      <w:pPr>
-        <w:pStyle w:val="Heading4"/>
-      </w:pPr>
-      <w:r>
-        <w:t>Design Idea 3 – Combined Interactive Dashboard</w:t>
-      </w:r>
-    </w:p>
-    <w:p>
-      <w:r>
-        <w:t>A dashboard could combine the scatter plot and line chart with filters for country and year. Selecting a country or year could update the visualisations and allow users to explore the data interactively.</w:t>
-      </w:r>
-    </w:p>
-    <w:p/>
-    <w:p>
-      <w:pPr>
-        <w:pStyle w:val="Heading4"/>
-      </w:pPr>
-      <w:r>
-        <w:t xml:space="preserve">Design Idea </w:t>
-      </w:r>
-      <w:r>
-        <w:t>4</w:t>
-      </w:r>
-      <w:r>
-        <w:t xml:space="preserve"> – </w:t>
-      </w:r>
-      <w:r>
-        <w:t>Bar Chart</w:t>
-      </w:r>
-    </w:p>
-    <w:p>
-      <w:r>
-        <w:t>A bar chart could have been used to demonstrate the spending of each country to see how they visual stack against each other. This was rejected due to the cluttered look. A line chart was favoured due to its ability to display the two variables together.</w:t>
-      </w:r>
-    </w:p>
-    <w:p/>
-    <w:p/>
-    <w:p>
-      <w:pPr>
-        <w:pStyle w:val="Heading1"/>
-      </w:pPr>
-      <w:r>
-        <w:t>5. Validation</w:t>
-      </w:r>
-    </w:p>
-    <w:p>
-      <w:pPr>
-        <w:pStyle w:val="Heading2"/>
-      </w:pPr>
-      <w:r>
-        <w:t>5.1 Informed Consent</w:t>
-      </w:r>
-    </w:p>
-    <w:p>
-      <w:r>
         <w:t xml:space="preserve">To adhere to academic research standards and guidelines, all user testing participants were provided with an informed Consent Form prior to testing – see </w:t>
       </w:r>
       <w:r>
-        <w:t>Appendix A: Participant Ethics &amp; Consent Form</w:t>
+        <w:t xml:space="preserve">Appendix </w:t>
+      </w:r>
+      <w:r>
+        <w:t>C</w:t>
+      </w:r>
+      <w:r>
+        <w:t>: Participant Ethics &amp; Consent Form</w:t>
       </w:r>
       <w:r>
         <w:t>.</w:t>
@@ -4264,7 +5721,6 @@
         </w:numPr>
       </w:pPr>
       <w:r>
-        <w:lastRenderedPageBreak/>
         <w:t>Participants were informed that participation was voluntary and could withdraw at any point.</w:t>
       </w:r>
     </w:p>
@@ -4277,24 +5733,35 @@
         </w:numPr>
       </w:pPr>
       <w:r>
-        <w:t xml:space="preserve">No personal identifiers will be included in the </w:t>
-      </w:r>
-      <w:proofErr w:type="gramStart"/>
-      <w:r>
-        <w:t>reporting</w:t>
-      </w:r>
-      <w:proofErr w:type="gramEnd"/>
-      <w:r>
-        <w:t xml:space="preserve"> and codes were assigned to protect privacy.</w:t>
-      </w:r>
+        <w:t xml:space="preserve">No personal identifiers </w:t>
+      </w:r>
+      <w:r>
+        <w:t xml:space="preserve">are </w:t>
+      </w:r>
+      <w:r>
+        <w:t>included in the reporting</w:t>
+      </w:r>
+      <w:r>
+        <w:t xml:space="preserve">, </w:t>
+      </w:r>
+      <w:r>
+        <w:t>and codes were assigned to protect privacy.</w:t>
+      </w:r>
+    </w:p>
+    <w:p>
+      <w:pPr>
+        <w:pStyle w:val="ListParagraph"/>
+      </w:pPr>
     </w:p>
     <w:p>
       <w:pPr>
         <w:pStyle w:val="Heading2"/>
       </w:pPr>
+      <w:bookmarkStart w:id="14" w:name="_Toc242042089"/>
       <w:r>
         <w:t>5.2 Participant Profile</w:t>
       </w:r>
+      <w:bookmarkEnd w:id="14"/>
     </w:p>
     <w:p>
       <w:r>
@@ -4984,9 +6451,11 @@
       <w:pPr>
         <w:pStyle w:val="Heading2"/>
       </w:pPr>
+      <w:bookmarkStart w:id="15" w:name="_Toc242042090"/>
       <w:r>
         <w:t>5.3 Evaluation and Satisfaction Survey</w:t>
       </w:r>
+      <w:bookmarkEnd w:id="15"/>
     </w:p>
     <w:p>
       <w:r>
@@ -5205,6 +6674,9 @@
             <w:tcW w:w="1321" w:type="dxa"/>
           </w:tcPr>
           <w:p>
+            <w:pPr>
+              <w:jc w:val="center"/>
+            </w:pPr>
             <w:r>
               <w:t>5</w:t>
             </w:r>
@@ -5219,9 +6691,9 @@
               <w:tabs>
                 <w:tab w:val="left" w:pos="527"/>
               </w:tabs>
+              <w:jc w:val="center"/>
             </w:pPr>
             <w:r>
-              <w:tab/>
               <w:t>5</w:t>
             </w:r>
           </w:p>
@@ -5234,7 +6706,6 @@
           </w:tcPr>
           <w:p>
             <w:r>
-              <w:lastRenderedPageBreak/>
               <w:t>Visual Clarity</w:t>
             </w:r>
           </w:p>
@@ -5278,6 +6749,9 @@
             <w:tcW w:w="1321" w:type="dxa"/>
           </w:tcPr>
           <w:p>
+            <w:pPr>
+              <w:jc w:val="center"/>
+            </w:pPr>
             <w:r>
               <w:t>5</w:t>
             </w:r>
@@ -5288,6 +6762,9 @@
             <w:tcW w:w="1321" w:type="dxa"/>
           </w:tcPr>
           <w:p>
+            <w:pPr>
+              <w:jc w:val="center"/>
+            </w:pPr>
             <w:r>
               <w:t>4</w:t>
             </w:r>
@@ -5330,6 +6807,9 @@
             <w:tcW w:w="1321" w:type="dxa"/>
           </w:tcPr>
           <w:p>
+            <w:pPr>
+              <w:jc w:val="center"/>
+            </w:pPr>
             <w:r>
               <w:t>3</w:t>
             </w:r>
@@ -5340,6 +6820,9 @@
             <w:tcW w:w="1321" w:type="dxa"/>
           </w:tcPr>
           <w:p>
+            <w:pPr>
+              <w:jc w:val="center"/>
+            </w:pPr>
             <w:r>
               <w:t>2.5</w:t>
             </w:r>
@@ -5382,6 +6865,9 @@
             <w:tcW w:w="1321" w:type="dxa"/>
           </w:tcPr>
           <w:p>
+            <w:pPr>
+              <w:jc w:val="center"/>
+            </w:pPr>
             <w:r>
               <w:t>4</w:t>
             </w:r>
@@ -5392,6 +6878,9 @@
             <w:tcW w:w="1321" w:type="dxa"/>
           </w:tcPr>
           <w:p>
+            <w:pPr>
+              <w:jc w:val="center"/>
+            </w:pPr>
             <w:r>
               <w:t>3</w:t>
             </w:r>
@@ -5404,20 +6893,24 @@
       <w:pPr>
         <w:pStyle w:val="Heading2"/>
       </w:pPr>
+      <w:bookmarkStart w:id="16" w:name="_Toc242042091"/>
       <w:r>
         <w:t xml:space="preserve">5.4 </w:t>
       </w:r>
       <w:r>
         <w:t>Usability Findings &amp; Qualitative Feedback</w:t>
       </w:r>
+      <w:bookmarkEnd w:id="16"/>
     </w:p>
     <w:p>
       <w:pPr>
         <w:pStyle w:val="Heading3"/>
       </w:pPr>
+      <w:bookmarkStart w:id="17" w:name="_Toc242042092"/>
       <w:r>
         <w:t>Positive Feedback</w:t>
       </w:r>
+      <w:bookmarkEnd w:id="17"/>
     </w:p>
     <w:p>
       <w:pPr>
@@ -5459,9 +6952,11 @@
       <w:pPr>
         <w:pStyle w:val="Heading3"/>
       </w:pPr>
+      <w:bookmarkStart w:id="18" w:name="_Toc242042093"/>
       <w:r>
         <w:t>Pain Points</w:t>
       </w:r>
+      <w:bookmarkEnd w:id="18"/>
     </w:p>
     <w:p>
       <w:pPr>
@@ -5472,29 +6967,7 @@
         </w:numPr>
       </w:pPr>
       <w:r>
-        <w:t xml:space="preserve">The legend for visualisations 2 &amp; 3 </w:t>
-      </w:r>
-      <w:proofErr w:type="gramStart"/>
-      <w:r>
-        <w:t>aren’t</w:t>
-      </w:r>
-      <w:proofErr w:type="gramEnd"/>
-      <w:r>
-        <w:t xml:space="preserve"> clear</w:t>
-      </w:r>
-      <w:r>
-        <w:t xml:space="preserve"> as </w:t>
-      </w:r>
-      <w:proofErr w:type="gramStart"/>
-      <w:r>
-        <w:t>the it</w:t>
-      </w:r>
-      <w:proofErr w:type="gramEnd"/>
-      <w:r>
-        <w:t xml:space="preserve"> seems like the lines on the visual are directly lining up to the country in the legend</w:t>
-      </w:r>
-      <w:r>
-        <w:t>,</w:t>
+        <w:t>The legends for Visuals 2 and 3 were unclear because the legend entries appeared to line up with the lines directly beside them.</w:t>
       </w:r>
     </w:p>
     <w:p>
@@ -5530,18 +7003,16 @@
         <w:t>Hard to see information when the lines crossed for visual 3.</w:t>
       </w:r>
     </w:p>
+    <w:p/>
     <w:p>
       <w:pPr>
         <w:pStyle w:val="Heading2"/>
       </w:pPr>
-    </w:p>
-    <w:p>
-      <w:pPr>
-        <w:pStyle w:val="Heading2"/>
-      </w:pPr>
+      <w:bookmarkStart w:id="19" w:name="_Toc242042094"/>
       <w:r>
         <w:t>5.5 Design Improvements</w:t>
       </w:r>
+      <w:bookmarkEnd w:id="19"/>
     </w:p>
     <w:p>
       <w:pPr>
@@ -5636,7 +7107,7 @@
               <w:ind w:left="0"/>
             </w:pPr>
             <w:r>
-              <w:t>Implemented gridline for visual 1 to aid visual eye.1</w:t>
+              <w:t>Implemented gridline for visual 1 to aid visual eye.</w:t>
             </w:r>
           </w:p>
         </w:tc>
@@ -5663,7 +7134,11 @@
               <w:ind w:left="0"/>
             </w:pPr>
             <w:r>
-              <w:t>Implemented country filtering, where a country can be selected from the legend or visual 1 and it is set like that until unselected.</w:t>
+              <w:t xml:space="preserve">Implemented country filtering, where a country can be selected from the legend </w:t>
+            </w:r>
+            <w:r>
+              <w:lastRenderedPageBreak/>
+              <w:t>or visual 1 and it is set like that until unselected.</w:t>
             </w:r>
           </w:p>
         </w:tc>
@@ -5679,7 +7154,14 @@
               <w:ind w:left="0"/>
             </w:pPr>
             <w:r>
-              <w:t>Hard to follow the overall story/answers to the guiding questions.</w:t>
+              <w:lastRenderedPageBreak/>
+              <w:t>Hard to follow the overall story/</w:t>
+            </w:r>
+            <w:r>
+              <w:t>answers</w:t>
+            </w:r>
+            <w:r>
+              <w:t xml:space="preserve"> to the guiding questions.</w:t>
             </w:r>
           </w:p>
         </w:tc>
@@ -5746,6 +7228,9 @@
               <w:pStyle w:val="ListParagraph"/>
               <w:ind w:left="0"/>
             </w:pPr>
+            <w:r>
+              <w:t>Added textual blurb of the statistic when a country is selected.</w:t>
+            </w:r>
           </w:p>
         </w:tc>
       </w:tr>
@@ -5764,10 +7249,14 @@
         <w:pStyle w:val="Heading1"/>
       </w:pPr>
       <w:r>
-        <w:t>6. Conclusion</w:t>
-      </w:r>
-    </w:p>
-    <w:p/>
+        <w:t xml:space="preserve">6. </w:t>
+      </w:r>
+      <w:bookmarkStart w:id="20" w:name="_Toc242042095"/>
+      <w:r>
+        <w:t>Conclusion</w:t>
+      </w:r>
+      <w:bookmarkEnd w:id="20"/>
+    </w:p>
     <w:p>
       <w:pPr>
         <w:rPr>
@@ -5777,6 +7266,41 @@
           <w:szCs w:val="40"/>
         </w:rPr>
       </w:pPr>
+    </w:p>
+    <w:p>
+      <w:pPr>
+        <w:pStyle w:val="Heading1"/>
+      </w:pPr>
+      <w:r>
+        <w:t>7. References</w:t>
+      </w:r>
+    </w:p>
+    <w:p>
+      <w:pPr>
+        <w:ind w:left="720" w:hanging="720"/>
+      </w:pPr>
+      <w:r>
+        <w:t xml:space="preserve">Anwar, A., Hyder, S., </w:t>
+      </w:r>
+      <w:proofErr w:type="gramStart"/>
+      <w:r>
+        <w:t>Nor,</w:t>
+      </w:r>
+      <w:proofErr w:type="gramEnd"/>
+      <w:r>
+        <w:t xml:space="preserve"> N. M., &amp; Younis, M. (2023). Government health expenditures and health outcome nexus: A study on OECD countries. Frontiers in Public Health, 11, Article 1123759. https://doi.org/10.3389/fpubh.2023.1123759</w:t>
+      </w:r>
+    </w:p>
+    <w:p/>
+    <w:p>
+      <w:pPr>
+        <w:rPr>
+          <w:rFonts w:asciiTheme="majorHAnsi" w:eastAsiaTheme="majorEastAsia" w:hAnsiTheme="majorHAnsi" w:cstheme="majorBidi"/>
+          <w:color w:val="0F4761" w:themeColor="accent1" w:themeShade="BF"/>
+          <w:sz w:val="40"/>
+          <w:szCs w:val="40"/>
+        </w:rPr>
+      </w:pPr>
       <w:r>
         <w:br w:type="page"/>
       </w:r>
@@ -5785,18 +7309,31 @@
       <w:pPr>
         <w:pStyle w:val="Heading1"/>
       </w:pPr>
+      <w:bookmarkStart w:id="21" w:name="_Toc242042096"/>
       <w:r>
         <w:lastRenderedPageBreak/>
         <w:t>Appendix</w:t>
       </w:r>
+      <w:bookmarkEnd w:id="21"/>
     </w:p>
     <w:p>
       <w:pPr>
         <w:pStyle w:val="Heading2"/>
       </w:pPr>
-      <w:r>
-        <w:t>Appendix A: Team Collaboration setup</w:t>
-      </w:r>
+      <w:bookmarkStart w:id="22" w:name="_Toc242042097"/>
+      <w:r>
+        <w:t xml:space="preserve">Appendix </w:t>
+      </w:r>
+      <w:r>
+        <w:t>A</w:t>
+      </w:r>
+      <w:r>
+        <w:t xml:space="preserve">: </w:t>
+      </w:r>
+      <w:r>
+        <w:t>Team Collaboration setup</w:t>
+      </w:r>
+      <w:bookmarkEnd w:id="22"/>
     </w:p>
     <w:tbl>
       <w:tblPr>
@@ -5822,7 +7359,7 @@
                 <w:szCs w:val="28"/>
               </w:rPr>
               <w:drawing>
-                <wp:anchor distT="0" distB="0" distL="114300" distR="114300" simplePos="0" relativeHeight="251658240" behindDoc="0" locked="0" layoutInCell="1" allowOverlap="1" wp14:anchorId="2AEF8A1F" wp14:editId="14A8B626">
+                <wp:anchor distT="0" distB="0" distL="114300" distR="114300" simplePos="0" relativeHeight="251658240" behindDoc="0" locked="0" layoutInCell="1" allowOverlap="1" wp14:anchorId="2AEF8A1F" wp14:editId="797B7868">
                   <wp:simplePos x="0" y="0"/>
                   <wp:positionH relativeFrom="column">
                     <wp:posOffset>2605405</wp:posOffset>
@@ -5845,7 +7382,7 @@
                           <pic:cNvPicPr/>
                         </pic:nvPicPr>
                         <pic:blipFill>
-                          <a:blip r:embed="rId13" cstate="print">
+                          <a:blip r:embed="rId15" cstate="print">
                             <a:extLst>
                               <a:ext uri="{28A0092B-C50C-407E-A947-70E740481C1C}">
                                 <a14:useLocalDpi xmlns:a14="http://schemas.microsoft.com/office/drawing/2010/main" val="0"/>
@@ -5909,7 +7446,7 @@
                           <pic:cNvPicPr/>
                         </pic:nvPicPr>
                         <pic:blipFill>
-                          <a:blip r:embed="rId14" cstate="print">
+                          <a:blip r:embed="rId16" cstate="print">
                             <a:extLst>
                               <a:ext uri="{28A0092B-C50C-407E-A947-70E740481C1C}">
                                 <a14:useLocalDpi xmlns:a14="http://schemas.microsoft.com/office/drawing/2010/main" val="0"/>
@@ -5959,7 +7496,7 @@
                 <w:szCs w:val="28"/>
               </w:rPr>
               <w:drawing>
-                <wp:anchor distT="0" distB="0" distL="114300" distR="114300" simplePos="0" relativeHeight="251660288" behindDoc="0" locked="0" layoutInCell="1" allowOverlap="1" wp14:anchorId="352BE701" wp14:editId="72C1ECDC">
+                <wp:anchor distT="0" distB="0" distL="114300" distR="114300" simplePos="0" relativeHeight="251660288" behindDoc="0" locked="0" layoutInCell="1" allowOverlap="1" wp14:anchorId="352BE701" wp14:editId="46380F98">
                   <wp:simplePos x="0" y="0"/>
                   <wp:positionH relativeFrom="column">
                     <wp:posOffset>-64877</wp:posOffset>
@@ -5982,7 +7519,7 @@
                           <pic:cNvPicPr/>
                         </pic:nvPicPr>
                         <pic:blipFill>
-                          <a:blip r:embed="rId15" cstate="print">
+                          <a:blip r:embed="rId17" cstate="print">
                             <a:extLst>
                               <a:ext uri="{28A0092B-C50C-407E-A947-70E740481C1C}">
                                 <a14:useLocalDpi xmlns:a14="http://schemas.microsoft.com/office/drawing/2010/main" val="0"/>
@@ -6019,7 +7556,6 @@
       </w:tr>
     </w:tbl>
     <w:p/>
-    <w:p/>
     <w:p>
       <w:pPr>
         <w:rPr>
@@ -6037,16 +7573,189 @@
       <w:pPr>
         <w:pStyle w:val="Heading2"/>
       </w:pPr>
+      <w:bookmarkStart w:id="23" w:name="_Toc242042098"/>
       <w:r>
         <w:lastRenderedPageBreak/>
         <w:t xml:space="preserve">Appendix </w:t>
       </w:r>
       <w:r>
-        <w:t>B</w:t>
+        <w:t>C</w:t>
+      </w:r>
+      <w:r>
+        <w:t xml:space="preserve">: </w:t>
+      </w:r>
+      <w:r>
+        <w:t>Visualisation Iteration Example</w:t>
+      </w:r>
+      <w:bookmarkEnd w:id="23"/>
+    </w:p>
+    <w:tbl>
+      <w:tblPr>
+        <w:tblStyle w:val="TableGrid"/>
+        <w:tblW w:w="0" w:type="auto"/>
+        <w:tblLook w:val="04A0" w:firstRow="1" w:lastRow="0" w:firstColumn="1" w:lastColumn="0" w:noHBand="0" w:noVBand="1"/>
+      </w:tblPr>
+      <w:tblGrid>
+        <w:gridCol w:w="9016"/>
+      </w:tblGrid>
+      <w:tr>
+        <w:tc>
+          <w:tcPr>
+            <w:tcW w:w="9016" w:type="dxa"/>
+          </w:tcPr>
+          <w:p>
+            <w:r>
+              <w:rPr>
+                <w:noProof/>
+              </w:rPr>
+              <w:drawing>
+                <wp:anchor distT="0" distB="0" distL="114300" distR="114300" simplePos="0" relativeHeight="251661312" behindDoc="0" locked="0" layoutInCell="1" allowOverlap="1" wp14:anchorId="0612DBF1" wp14:editId="06375FD7">
+                  <wp:simplePos x="0" y="0"/>
+                  <wp:positionH relativeFrom="column">
+                    <wp:posOffset>-65405</wp:posOffset>
+                  </wp:positionH>
+                  <wp:positionV relativeFrom="paragraph">
+                    <wp:posOffset>162732</wp:posOffset>
+                  </wp:positionV>
+                  <wp:extent cx="5731510" cy="3521710"/>
+                  <wp:effectExtent l="0" t="0" r="0" b="0"/>
+                  <wp:wrapTopAndBottom/>
+                  <wp:docPr id="492555438" name="Picture 1"/>
+                  <wp:cNvGraphicFramePr>
+                    <a:graphicFrameLocks xmlns:a="http://schemas.openxmlformats.org/drawingml/2006/main" noChangeAspect="1"/>
+                  </wp:cNvGraphicFramePr>
+                  <a:graphic xmlns:a="http://schemas.openxmlformats.org/drawingml/2006/main">
+                    <a:graphicData uri="http://schemas.openxmlformats.org/drawingml/2006/picture">
+                      <pic:pic xmlns:pic="http://schemas.openxmlformats.org/drawingml/2006/picture">
+                        <pic:nvPicPr>
+                          <pic:cNvPr id="492555438" name="Picture 492555438"/>
+                          <pic:cNvPicPr/>
+                        </pic:nvPicPr>
+                        <pic:blipFill>
+                          <a:blip r:embed="rId18" cstate="print">
+                            <a:extLst>
+                              <a:ext uri="{28A0092B-C50C-407E-A947-70E740481C1C}">
+                                <a14:useLocalDpi xmlns:a14="http://schemas.microsoft.com/office/drawing/2010/main" val="0"/>
+                              </a:ext>
+                            </a:extLst>
+                          </a:blip>
+                          <a:stretch>
+                            <a:fillRect/>
+                          </a:stretch>
+                        </pic:blipFill>
+                        <pic:spPr>
+                          <a:xfrm>
+                            <a:off x="0" y="0"/>
+                            <a:ext cx="5731510" cy="3521710"/>
+                          </a:xfrm>
+                          <a:prstGeom prst="rect">
+                            <a:avLst/>
+                          </a:prstGeom>
+                        </pic:spPr>
+                      </pic:pic>
+                    </a:graphicData>
+                  </a:graphic>
+                  <wp14:sizeRelH relativeFrom="page">
+                    <wp14:pctWidth>0</wp14:pctWidth>
+                  </wp14:sizeRelH>
+                  <wp14:sizeRelV relativeFrom="page">
+                    <wp14:pctHeight>0</wp14:pctHeight>
+                  </wp14:sizeRelV>
+                </wp:anchor>
+              </w:drawing>
+            </w:r>
+          </w:p>
+        </w:tc>
+      </w:tr>
+      <w:tr>
+        <w:tc>
+          <w:tcPr>
+            <w:tcW w:w="9016" w:type="dxa"/>
+          </w:tcPr>
+          <w:p>
+            <w:r>
+              <w:rPr>
+                <w:noProof/>
+              </w:rPr>
+              <w:drawing>
+                <wp:anchor distT="0" distB="0" distL="114300" distR="114300" simplePos="0" relativeHeight="251662336" behindDoc="0" locked="0" layoutInCell="1" allowOverlap="1" wp14:anchorId="0406298A" wp14:editId="5240422B">
+                  <wp:simplePos x="0" y="0"/>
+                  <wp:positionH relativeFrom="column">
+                    <wp:posOffset>-64932</wp:posOffset>
+                  </wp:positionH>
+                  <wp:positionV relativeFrom="paragraph">
+                    <wp:posOffset>154983</wp:posOffset>
+                  </wp:positionV>
+                  <wp:extent cx="5731510" cy="3439160"/>
+                  <wp:effectExtent l="0" t="0" r="0" b="2540"/>
+                  <wp:wrapTopAndBottom/>
+                  <wp:docPr id="1662344601" name="Picture 2"/>
+                  <wp:cNvGraphicFramePr>
+                    <a:graphicFrameLocks xmlns:a="http://schemas.openxmlformats.org/drawingml/2006/main" noChangeAspect="1"/>
+                  </wp:cNvGraphicFramePr>
+                  <a:graphic xmlns:a="http://schemas.openxmlformats.org/drawingml/2006/main">
+                    <a:graphicData uri="http://schemas.openxmlformats.org/drawingml/2006/picture">
+                      <pic:pic xmlns:pic="http://schemas.openxmlformats.org/drawingml/2006/picture">
+                        <pic:nvPicPr>
+                          <pic:cNvPr id="1662344601" name="Picture 1662344601"/>
+                          <pic:cNvPicPr/>
+                        </pic:nvPicPr>
+                        <pic:blipFill>
+                          <a:blip r:embed="rId19" cstate="print">
+                            <a:extLst>
+                              <a:ext uri="{28A0092B-C50C-407E-A947-70E740481C1C}">
+                                <a14:useLocalDpi xmlns:a14="http://schemas.microsoft.com/office/drawing/2010/main" val="0"/>
+                              </a:ext>
+                            </a:extLst>
+                          </a:blip>
+                          <a:stretch>
+                            <a:fillRect/>
+                          </a:stretch>
+                        </pic:blipFill>
+                        <pic:spPr>
+                          <a:xfrm>
+                            <a:off x="0" y="0"/>
+                            <a:ext cx="5731510" cy="3439160"/>
+                          </a:xfrm>
+                          <a:prstGeom prst="rect">
+                            <a:avLst/>
+                          </a:prstGeom>
+                        </pic:spPr>
+                      </pic:pic>
+                    </a:graphicData>
+                  </a:graphic>
+                  <wp14:sizeRelH relativeFrom="page">
+                    <wp14:pctWidth>0</wp14:pctWidth>
+                  </wp14:sizeRelH>
+                  <wp14:sizeRelV relativeFrom="page">
+                    <wp14:pctHeight>0</wp14:pctHeight>
+                  </wp14:sizeRelV>
+                </wp:anchor>
+              </w:drawing>
+            </w:r>
+          </w:p>
+        </w:tc>
+      </w:tr>
+    </w:tbl>
+    <w:p/>
+    <w:p/>
+    <w:p/>
+    <w:p>
+      <w:pPr>
+        <w:pStyle w:val="Heading2"/>
+      </w:pPr>
+      <w:bookmarkStart w:id="24" w:name="_Toc242042099"/>
+      <w:r>
+        <w:lastRenderedPageBreak/>
+        <w:t xml:space="preserve">Appendix </w:t>
+      </w:r>
+      <w:r>
+        <w:t>C</w:t>
       </w:r>
       <w:r>
         <w:t>: Participant Ethics &amp; Consent Form</w:t>
       </w:r>
+      <w:bookmarkEnd w:id="24"/>
     </w:p>
     <w:p>
       <w:pPr>
@@ -6132,7 +7841,39 @@
           <w:i/>
           <w:iCs/>
         </w:rPr>
-        <w:t xml:space="preserve"> You are invited to participate in a usability evaluation of an interactive data visualisation website exploring healthcare spending and life expectancy across OECD nations. </w:t>
+        <w:t xml:space="preserve"> You are invited to participate in a usability evaluation of an interactive data visuali</w:t>
+      </w:r>
+      <w:r>
+        <w:rPr>
+          <w:rFonts w:ascii="Arial" w:hAnsi="Arial" w:cs="Arial"/>
+          <w:i/>
+          <w:iCs/>
+        </w:rPr>
+        <w:t>s</w:t>
+      </w:r>
+      <w:r>
+        <w:rPr>
+          <w:rFonts w:ascii="Arial" w:hAnsi="Arial" w:cs="Arial"/>
+          <w:i/>
+          <w:iCs/>
+        </w:rPr>
+        <w:t xml:space="preserve">ation </w:t>
+      </w:r>
+      <w:r>
+        <w:rPr>
+          <w:rFonts w:ascii="Arial" w:hAnsi="Arial" w:cs="Arial"/>
+          <w:i/>
+          <w:iCs/>
+        </w:rPr>
+        <w:t>website</w:t>
+      </w:r>
+      <w:r>
+        <w:rPr>
+          <w:rFonts w:ascii="Arial" w:hAnsi="Arial" w:cs="Arial"/>
+          <w:i/>
+          <w:iCs/>
+        </w:rPr>
+        <w:t xml:space="preserve"> exploring healthcare spending and life expectancy across OECD nations. </w:t>
       </w:r>
     </w:p>
     <w:p>
@@ -6376,6 +8117,7 @@
       <w:pgSz w:w="11906" w:h="16838"/>
       <w:pgMar w:top="1440" w:right="1440" w:bottom="1440" w:left="1440" w:header="708" w:footer="708" w:gutter="0"/>
       <w:cols w:space="708"/>
+      <w:titlePg/>
       <w:docGrid w:linePitch="360"/>
     </w:sectPr>
   </w:body>
@@ -6383,7 +8125,7 @@
 </file>
 
 <file path=word/endnotes.xml><?xml version="1.0" encoding="utf-8"?>
-<w:endnotes xmlns:wpc="http://schemas.microsoft.com/office/word/2010/wordprocessingCanvas" xmlns:cx="http://schemas.microsoft.com/office/drawing/2014/chartex" xmlns:cx1="http://schemas.microsoft.com/office/drawing/2015/9/8/chartex" xmlns:cx2="http://schemas.microsoft.com/office/drawing/2015/10/21/chartex" xmlns:cx3="http://schemas.microsoft.com/office/drawing/2016/5/9/chartex" xmlns:cx4="http://schemas.microsoft.com/office/drawing/2016/5/10/chartex" xmlns:cx5="http://schemas.microsoft.com/office/drawing/2016/5/11/chartex" xmlns:cx6="http://schemas.microsoft.com/office/drawing/2016/5/12/chartex" xmlns:cx7="http://schemas.microsoft.com/office/drawing/2016/5/13/chartex" xmlns:cx8="http://schemas.microsoft.com/office/drawing/2016/5/14/chartex" xmlns:mc="http://schemas.openxmlformats.org/markup-compatibility/2006" xmlns:aink="http://schemas.microsoft.com/office/drawing/2016/ink" xmlns:am3d="http://schemas.microsoft.com/office/drawing/2017/model3d" xmlns:o="urn:schemas-microsoft-com:office:office" xmlns:oel="http://schemas.microsoft.com/office/2019/extlst" xmlns:r="http://schemas.openxmlformats.org/officeDocument/2006/relationships" xmlns:m="http://schemas.openxmlformats.org/officeDocument/2006/math" xmlns:v="urn:schemas-microsoft-com:vml" xmlns:wp14="http://schemas.microsoft.com/office/word/2010/wordprocessingDrawing" xmlns:wp="http://schemas.openxmlformats.org/drawingml/2006/wordprocessingDrawing" xmlns:w10="urn:schemas-microsoft-com:office:word" xmlns:w="http://schemas.openxmlformats.org/wordprocessingml/2006/main" xmlns:w14="http://schemas.microsoft.com/office/word/2010/wordml" xmlns:w15="http://schemas.microsoft.com/office/word/2012/wordml" xmlns:w16cex="http://schemas.microsoft.com/office/word/2018/wordml/cex" xmlns:w16cid="http://schemas.microsoft.com/office/word/2016/wordml/cid" xmlns:w16="http://schemas.microsoft.com/office/word/2018/wordml" xmlns:w16du="http://schemas.microsoft.com/office/word/2023/wordml/word16du" xmlns:w16sdtdh="http://schemas.microsoft.com/office/word/2020/wordml/sdtdatahash" xmlns:w16sdtfl="http://schemas.microsoft.com/office/word/2024/wordml/sdtformatlock" xmlns:w16se="http://schemas.microsoft.com/office/word/2015/wordml/symex" xmlns:wpg="http://schemas.microsoft.com/office/word/2010/wordprocessingGroup" xmlns:wpi="http://schemas.microsoft.com/office/word/2010/wordprocessingInk" xmlns:wne="http://schemas.microsoft.com/office/word/2006/wordml" xmlns:wps="http://schemas.microsoft.com/office/word/2010/wordprocessingShape" mc:Ignorable="w14 w15 w16se w16cid w16 w16cex w16sdtdh w16sdtfl w16du wp14">
+<w:endnotes xmlns:wpc="http://schemas.microsoft.com/office/word/2010/wordprocessingCanvas" xmlns:cx="http://schemas.microsoft.com/office/drawing/2014/chartex" xmlns:cx1="http://schemas.microsoft.com/office/drawing/2015/9/8/chartex" xmlns:cx2="http://schemas.microsoft.com/office/drawing/2015/10/21/chartex" xmlns:cx3="http://schemas.microsoft.com/office/drawing/2016/5/9/chartex" xmlns:cx4="http://schemas.microsoft.com/office/drawing/2016/5/10/chartex" xmlns:cx5="http://schemas.microsoft.com/office/drawing/2016/5/11/chartex" xmlns:cx6="http://schemas.microsoft.com/office/drawing/2016/5/12/chartex" xmlns:cx7="http://schemas.microsoft.com/office/drawing/2016/5/13/chartex" xmlns:cx8="http://schemas.microsoft.com/office/drawing/2016/5/14/chartex" xmlns:mc="http://schemas.openxmlformats.org/markup-compatibility/2006" xmlns:m="http://schemas.openxmlformats.org/officeDocument/2006/math" xmlns:aink="http://schemas.microsoft.com/office/drawing/2016/ink" xmlns:am3d="http://schemas.microsoft.com/office/drawing/2017/model3d" xmlns:oel="http://schemas.microsoft.com/office/2019/extlst" xmlns:r="http://schemas.openxmlformats.org/officeDocument/2006/relationships" xmlns:wp14="http://schemas.microsoft.com/office/word/2010/wordprocessingDrawing" xmlns:wp="http://schemas.openxmlformats.org/drawingml/2006/wordprocessingDrawing" xmlns:wpg="http://schemas.microsoft.com/office/word/2010/wordprocessingGroup" xmlns:wpi="http://schemas.microsoft.com/office/word/2010/wordprocessingInk" xmlns:wps="http://schemas.microsoft.com/office/word/2010/wordprocessingShape" xmlns:o="urn:schemas-microsoft-com:office:office" xmlns:v="urn:schemas-microsoft-com:vml" xmlns:w10="urn:schemas-microsoft-com:office:word" xmlns:w="http://schemas.openxmlformats.org/wordprocessingml/2006/main" xmlns:w14="http://schemas.microsoft.com/office/word/2010/wordml" xmlns:w15="http://schemas.microsoft.com/office/word/2012/wordml" xmlns:w16cex="http://schemas.microsoft.com/office/word/2018/wordml/cex" xmlns:w16cid="http://schemas.microsoft.com/office/word/2016/wordml/cid" xmlns:w16="http://schemas.microsoft.com/office/word/2018/wordml" xmlns:w16sdtdh="http://schemas.microsoft.com/office/word/2020/wordml/sdtdatahash" xmlns:w16sdtfl="http://schemas.microsoft.com/office/word/2024/wordml/sdtformatlock" xmlns:w16se="http://schemas.microsoft.com/office/word/2015/wordml/symex" xmlns:w16du="http://schemas.microsoft.com/office/word/2023/wordml/word16du" xmlns:wne="http://schemas.microsoft.com/office/word/2006/wordml" mc:Ignorable="w14 w15 w16se w16cid w16 w16cex w16sdtdh w16sdtfl w16du wp14">
   <w:endnote w:type="separator" w:id="-1">
     <w:p>
       <w:pPr>
@@ -6407,8 +8149,131 @@
 </w:endnotes>
 </file>
 
+<file path=word/footer1.xml><?xml version="1.0" encoding="utf-8"?>
+<w:ftr xmlns:wpc="http://schemas.microsoft.com/office/word/2010/wordprocessingCanvas" xmlns:cx="http://schemas.microsoft.com/office/drawing/2014/chartex" xmlns:cx1="http://schemas.microsoft.com/office/drawing/2015/9/8/chartex" xmlns:cx2="http://schemas.microsoft.com/office/drawing/2015/10/21/chartex" xmlns:cx3="http://schemas.microsoft.com/office/drawing/2016/5/9/chartex" xmlns:cx4="http://schemas.microsoft.com/office/drawing/2016/5/10/chartex" xmlns:cx5="http://schemas.microsoft.com/office/drawing/2016/5/11/chartex" xmlns:cx6="http://schemas.microsoft.com/office/drawing/2016/5/12/chartex" xmlns:cx7="http://schemas.microsoft.com/office/drawing/2016/5/13/chartex" xmlns:cx8="http://schemas.microsoft.com/office/drawing/2016/5/14/chartex" xmlns:mc="http://schemas.openxmlformats.org/markup-compatibility/2006" xmlns:m="http://schemas.openxmlformats.org/officeDocument/2006/math" xmlns:aink="http://schemas.microsoft.com/office/drawing/2016/ink" xmlns:am3d="http://schemas.microsoft.com/office/drawing/2017/model3d" xmlns:oel="http://schemas.microsoft.com/office/2019/extlst" xmlns:r="http://schemas.openxmlformats.org/officeDocument/2006/relationships" xmlns:wp14="http://schemas.microsoft.com/office/word/2010/wordprocessingDrawing" xmlns:wp="http://schemas.openxmlformats.org/drawingml/2006/wordprocessingDrawing" xmlns:wpg="http://schemas.microsoft.com/office/word/2010/wordprocessingGroup" xmlns:wpi="http://schemas.microsoft.com/office/word/2010/wordprocessingInk" xmlns:wps="http://schemas.microsoft.com/office/word/2010/wordprocessingShape" xmlns:o="urn:schemas-microsoft-com:office:office" xmlns:v="urn:schemas-microsoft-com:vml" xmlns:w10="urn:schemas-microsoft-com:office:word" xmlns:w="http://schemas.openxmlformats.org/wordprocessingml/2006/main" xmlns:w14="http://schemas.microsoft.com/office/word/2010/wordml" xmlns:w15="http://schemas.microsoft.com/office/word/2012/wordml" xmlns:w16cex="http://schemas.microsoft.com/office/word/2018/wordml/cex" xmlns:w16cid="http://schemas.microsoft.com/office/word/2016/wordml/cid" xmlns:w16="http://schemas.microsoft.com/office/word/2018/wordml" xmlns:w16sdtdh="http://schemas.microsoft.com/office/word/2020/wordml/sdtdatahash" xmlns:w16sdtfl="http://schemas.microsoft.com/office/word/2024/wordml/sdtformatlock" xmlns:w16se="http://schemas.microsoft.com/office/word/2015/wordml/symex" xmlns:w16du="http://schemas.microsoft.com/office/word/2023/wordml/word16du" xmlns:wne="http://schemas.microsoft.com/office/word/2006/wordml" mc:Ignorable="w14 w15 w16se w16cid w16 w16cex w16sdtdh w16sdtfl w16du wp14">
+  <w:sdt>
+    <w:sdtPr>
+      <w:rPr>
+        <w:rStyle w:val="PageNumber"/>
+      </w:rPr>
+      <w:id w:val="-1350868620"/>
+      <w:docPartObj>
+        <w:docPartGallery w:val="Page Numbers (Bottom of Page)"/>
+        <w:docPartUnique/>
+      </w:docPartObj>
+    </w:sdtPr>
+    <w:sdtContent>
+      <w:p>
+        <w:pPr>
+          <w:pStyle w:val="Footer"/>
+          <w:framePr w:wrap="none" w:vAnchor="text" w:hAnchor="margin" w:xAlign="right" w:y="1"/>
+          <w:rPr>
+            <w:rStyle w:val="PageNumber"/>
+          </w:rPr>
+        </w:pPr>
+        <w:r>
+          <w:rPr>
+            <w:rStyle w:val="PageNumber"/>
+          </w:rPr>
+          <w:fldChar w:fldCharType="begin"/>
+        </w:r>
+        <w:r>
+          <w:rPr>
+            <w:rStyle w:val="PageNumber"/>
+          </w:rPr>
+          <w:instrText xml:space="preserve"> PAGE </w:instrText>
+        </w:r>
+        <w:r>
+          <w:rPr>
+            <w:rStyle w:val="PageNumber"/>
+          </w:rPr>
+          <w:fldChar w:fldCharType="separate"/>
+        </w:r>
+        <w:r>
+          <w:rPr>
+            <w:rStyle w:val="PageNumber"/>
+          </w:rPr>
+          <w:fldChar w:fldCharType="end"/>
+        </w:r>
+      </w:p>
+    </w:sdtContent>
+  </w:sdt>
+  <w:p>
+    <w:pPr>
+      <w:pStyle w:val="Footer"/>
+      <w:ind w:right="360"/>
+    </w:pPr>
+  </w:p>
+</w:ftr>
+</file>
+
+<file path=word/footer2.xml><?xml version="1.0" encoding="utf-8"?>
+<w:ftr xmlns:wpc="http://schemas.microsoft.com/office/word/2010/wordprocessingCanvas" xmlns:cx="http://schemas.microsoft.com/office/drawing/2014/chartex" xmlns:cx1="http://schemas.microsoft.com/office/drawing/2015/9/8/chartex" xmlns:cx2="http://schemas.microsoft.com/office/drawing/2015/10/21/chartex" xmlns:cx3="http://schemas.microsoft.com/office/drawing/2016/5/9/chartex" xmlns:cx4="http://schemas.microsoft.com/office/drawing/2016/5/10/chartex" xmlns:cx5="http://schemas.microsoft.com/office/drawing/2016/5/11/chartex" xmlns:cx6="http://schemas.microsoft.com/office/drawing/2016/5/12/chartex" xmlns:cx7="http://schemas.microsoft.com/office/drawing/2016/5/13/chartex" xmlns:cx8="http://schemas.microsoft.com/office/drawing/2016/5/14/chartex" xmlns:mc="http://schemas.openxmlformats.org/markup-compatibility/2006" xmlns:m="http://schemas.openxmlformats.org/officeDocument/2006/math" xmlns:aink="http://schemas.microsoft.com/office/drawing/2016/ink" xmlns:am3d="http://schemas.microsoft.com/office/drawing/2017/model3d" xmlns:oel="http://schemas.microsoft.com/office/2019/extlst" xmlns:r="http://schemas.openxmlformats.org/officeDocument/2006/relationships" xmlns:wp14="http://schemas.microsoft.com/office/word/2010/wordprocessingDrawing" xmlns:wp="http://schemas.openxmlformats.org/drawingml/2006/wordprocessingDrawing" xmlns:wpg="http://schemas.microsoft.com/office/word/2010/wordprocessingGroup" xmlns:wpi="http://schemas.microsoft.com/office/word/2010/wordprocessingInk" xmlns:wps="http://schemas.microsoft.com/office/word/2010/wordprocessingShape" xmlns:o="urn:schemas-microsoft-com:office:office" xmlns:v="urn:schemas-microsoft-com:vml" xmlns:w10="urn:schemas-microsoft-com:office:word" xmlns:w="http://schemas.openxmlformats.org/wordprocessingml/2006/main" xmlns:w14="http://schemas.microsoft.com/office/word/2010/wordml" xmlns:w15="http://schemas.microsoft.com/office/word/2012/wordml" xmlns:w16cex="http://schemas.microsoft.com/office/word/2018/wordml/cex" xmlns:w16cid="http://schemas.microsoft.com/office/word/2016/wordml/cid" xmlns:w16="http://schemas.microsoft.com/office/word/2018/wordml" xmlns:w16sdtdh="http://schemas.microsoft.com/office/word/2020/wordml/sdtdatahash" xmlns:w16sdtfl="http://schemas.microsoft.com/office/word/2024/wordml/sdtformatlock" xmlns:w16se="http://schemas.microsoft.com/office/word/2015/wordml/symex" xmlns:w16du="http://schemas.microsoft.com/office/word/2023/wordml/word16du" xmlns:wne="http://schemas.microsoft.com/office/word/2006/wordml" mc:Ignorable="w14 w15 w16se w16cid w16 w16cex w16sdtdh w16sdtfl w16du wp14">
+  <w:sdt>
+    <w:sdtPr>
+      <w:rPr>
+        <w:rStyle w:val="PageNumber"/>
+      </w:rPr>
+      <w:id w:val="-1113821023"/>
+      <w:docPartObj>
+        <w:docPartGallery w:val="Page Numbers (Bottom of Page)"/>
+        <w:docPartUnique/>
+      </w:docPartObj>
+    </w:sdtPr>
+    <w:sdtContent>
+      <w:p>
+        <w:pPr>
+          <w:pStyle w:val="Footer"/>
+          <w:framePr w:wrap="none" w:vAnchor="text" w:hAnchor="margin" w:xAlign="right" w:y="1"/>
+          <w:rPr>
+            <w:rStyle w:val="PageNumber"/>
+          </w:rPr>
+        </w:pPr>
+        <w:r>
+          <w:rPr>
+            <w:rStyle w:val="PageNumber"/>
+          </w:rPr>
+          <w:fldChar w:fldCharType="begin"/>
+        </w:r>
+        <w:r>
+          <w:rPr>
+            <w:rStyle w:val="PageNumber"/>
+          </w:rPr>
+          <w:instrText xml:space="preserve"> PAGE </w:instrText>
+        </w:r>
+        <w:r>
+          <w:rPr>
+            <w:rStyle w:val="PageNumber"/>
+          </w:rPr>
+          <w:fldChar w:fldCharType="separate"/>
+        </w:r>
+        <w:r>
+          <w:rPr>
+            <w:rStyle w:val="PageNumber"/>
+            <w:noProof/>
+          </w:rPr>
+          <w:t>17</w:t>
+        </w:r>
+        <w:r>
+          <w:rPr>
+            <w:rStyle w:val="PageNumber"/>
+          </w:rPr>
+          <w:fldChar w:fldCharType="end"/>
+        </w:r>
+      </w:p>
+    </w:sdtContent>
+  </w:sdt>
+  <w:p>
+    <w:pPr>
+      <w:pStyle w:val="Footer"/>
+      <w:ind w:right="360"/>
+    </w:pPr>
+  </w:p>
+</w:ftr>
+</file>
+
 <file path=word/footnotes.xml><?xml version="1.0" encoding="utf-8"?>
-<w:footnotes xmlns:wpc="http://schemas.microsoft.com/office/word/2010/wordprocessingCanvas" xmlns:cx="http://schemas.microsoft.com/office/drawing/2014/chartex" xmlns:cx1="http://schemas.microsoft.com/office/drawing/2015/9/8/chartex" xmlns:cx2="http://schemas.microsoft.com/office/drawing/2015/10/21/chartex" xmlns:cx3="http://schemas.microsoft.com/office/drawing/2016/5/9/chartex" xmlns:cx4="http://schemas.microsoft.com/office/drawing/2016/5/10/chartex" xmlns:cx5="http://schemas.microsoft.com/office/drawing/2016/5/11/chartex" xmlns:cx6="http://schemas.microsoft.com/office/drawing/2016/5/12/chartex" xmlns:cx7="http://schemas.microsoft.com/office/drawing/2016/5/13/chartex" xmlns:cx8="http://schemas.microsoft.com/office/drawing/2016/5/14/chartex" xmlns:mc="http://schemas.openxmlformats.org/markup-compatibility/2006" xmlns:aink="http://schemas.microsoft.com/office/drawing/2016/ink" xmlns:am3d="http://schemas.microsoft.com/office/drawing/2017/model3d" xmlns:o="urn:schemas-microsoft-com:office:office" xmlns:oel="http://schemas.microsoft.com/office/2019/extlst" xmlns:r="http://schemas.openxmlformats.org/officeDocument/2006/relationships" xmlns:m="http://schemas.openxmlformats.org/officeDocument/2006/math" xmlns:v="urn:schemas-microsoft-com:vml" xmlns:wp14="http://schemas.microsoft.com/office/word/2010/wordprocessingDrawing" xmlns:wp="http://schemas.openxmlformats.org/drawingml/2006/wordprocessingDrawing" xmlns:w10="urn:schemas-microsoft-com:office:word" xmlns:w="http://schemas.openxmlformats.org/wordprocessingml/2006/main" xmlns:w14="http://schemas.microsoft.com/office/word/2010/wordml" xmlns:w15="http://schemas.microsoft.com/office/word/2012/wordml" xmlns:w16cex="http://schemas.microsoft.com/office/word/2018/wordml/cex" xmlns:w16cid="http://schemas.microsoft.com/office/word/2016/wordml/cid" xmlns:w16="http://schemas.microsoft.com/office/word/2018/wordml" xmlns:w16du="http://schemas.microsoft.com/office/word/2023/wordml/word16du" xmlns:w16sdtdh="http://schemas.microsoft.com/office/word/2020/wordml/sdtdatahash" xmlns:w16sdtfl="http://schemas.microsoft.com/office/word/2024/wordml/sdtformatlock" xmlns:w16se="http://schemas.microsoft.com/office/word/2015/wordml/symex" xmlns:wpg="http://schemas.microsoft.com/office/word/2010/wordprocessingGroup" xmlns:wpi="http://schemas.microsoft.com/office/word/2010/wordprocessingInk" xmlns:wne="http://schemas.microsoft.com/office/word/2006/wordml" xmlns:wps="http://schemas.microsoft.com/office/word/2010/wordprocessingShape" mc:Ignorable="w14 w15 w16se w16cid w16 w16cex w16sdtdh w16sdtfl w16du wp14">
+<w:footnotes xmlns:wpc="http://schemas.microsoft.com/office/word/2010/wordprocessingCanvas" xmlns:cx="http://schemas.microsoft.com/office/drawing/2014/chartex" xmlns:cx1="http://schemas.microsoft.com/office/drawing/2015/9/8/chartex" xmlns:cx2="http://schemas.microsoft.com/office/drawing/2015/10/21/chartex" xmlns:cx3="http://schemas.microsoft.com/office/drawing/2016/5/9/chartex" xmlns:cx4="http://schemas.microsoft.com/office/drawing/2016/5/10/chartex" xmlns:cx5="http://schemas.microsoft.com/office/drawing/2016/5/11/chartex" xmlns:cx6="http://schemas.microsoft.com/office/drawing/2016/5/12/chartex" xmlns:cx7="http://schemas.microsoft.com/office/drawing/2016/5/13/chartex" xmlns:cx8="http://schemas.microsoft.com/office/drawing/2016/5/14/chartex" xmlns:mc="http://schemas.openxmlformats.org/markup-compatibility/2006" xmlns:m="http://schemas.openxmlformats.org/officeDocument/2006/math" xmlns:aink="http://schemas.microsoft.com/office/drawing/2016/ink" xmlns:am3d="http://schemas.microsoft.com/office/drawing/2017/model3d" xmlns:oel="http://schemas.microsoft.com/office/2019/extlst" xmlns:r="http://schemas.openxmlformats.org/officeDocument/2006/relationships" xmlns:wp14="http://schemas.microsoft.com/office/word/2010/wordprocessingDrawing" xmlns:wp="http://schemas.openxmlformats.org/drawingml/2006/wordprocessingDrawing" xmlns:wpg="http://schemas.microsoft.com/office/word/2010/wordprocessingGroup" xmlns:wpi="http://schemas.microsoft.com/office/word/2010/wordprocessingInk" xmlns:wps="http://schemas.microsoft.com/office/word/2010/wordprocessingShape" xmlns:o="urn:schemas-microsoft-com:office:office" xmlns:v="urn:schemas-microsoft-com:vml" xmlns:w10="urn:schemas-microsoft-com:office:word" xmlns:w="http://schemas.openxmlformats.org/wordprocessingml/2006/main" xmlns:w14="http://schemas.microsoft.com/office/word/2010/wordml" xmlns:w15="http://schemas.microsoft.com/office/word/2012/wordml" xmlns:w16cex="http://schemas.microsoft.com/office/word/2018/wordml/cex" xmlns:w16cid="http://schemas.microsoft.com/office/word/2016/wordml/cid" xmlns:w16="http://schemas.microsoft.com/office/word/2018/wordml" xmlns:w16sdtdh="http://schemas.microsoft.com/office/word/2020/wordml/sdtdatahash" xmlns:w16sdtfl="http://schemas.microsoft.com/office/word/2024/wordml/sdtformatlock" xmlns:w16se="http://schemas.microsoft.com/office/word/2015/wordml/symex" xmlns:w16du="http://schemas.microsoft.com/office/word/2023/wordml/word16du" xmlns:wne="http://schemas.microsoft.com/office/word/2006/wordml" mc:Ignorable="w14 w15 w16se w16cid w16 w16cex w16sdtdh w16sdtfl w16du wp14">
   <w:footnote w:type="separator" w:id="-1">
     <w:p>
       <w:pPr>
@@ -6433,7 +8298,7 @@
 </file>
 
 <file path=word/header1.xml><?xml version="1.0" encoding="utf-8"?>
-<w:hdr xmlns:wpc="http://schemas.microsoft.com/office/word/2010/wordprocessingCanvas" xmlns:cx="http://schemas.microsoft.com/office/drawing/2014/chartex" xmlns:cx1="http://schemas.microsoft.com/office/drawing/2015/9/8/chartex" xmlns:cx2="http://schemas.microsoft.com/office/drawing/2015/10/21/chartex" xmlns:cx3="http://schemas.microsoft.com/office/drawing/2016/5/9/chartex" xmlns:cx4="http://schemas.microsoft.com/office/drawing/2016/5/10/chartex" xmlns:cx5="http://schemas.microsoft.com/office/drawing/2016/5/11/chartex" xmlns:cx6="http://schemas.microsoft.com/office/drawing/2016/5/12/chartex" xmlns:cx7="http://schemas.microsoft.com/office/drawing/2016/5/13/chartex" xmlns:cx8="http://schemas.microsoft.com/office/drawing/2016/5/14/chartex" xmlns:mc="http://schemas.openxmlformats.org/markup-compatibility/2006" xmlns:aink="http://schemas.microsoft.com/office/drawing/2016/ink" xmlns:am3d="http://schemas.microsoft.com/office/drawing/2017/model3d" xmlns:o="urn:schemas-microsoft-com:office:office" xmlns:oel="http://schemas.microsoft.com/office/2019/extlst" xmlns:r="http://schemas.openxmlformats.org/officeDocument/2006/relationships" xmlns:m="http://schemas.openxmlformats.org/officeDocument/2006/math" xmlns:v="urn:schemas-microsoft-com:vml" xmlns:wp14="http://schemas.microsoft.com/office/word/2010/wordprocessingDrawing" xmlns:wp="http://schemas.openxmlformats.org/drawingml/2006/wordprocessingDrawing" xmlns:w10="urn:schemas-microsoft-com:office:word" xmlns:w="http://schemas.openxmlformats.org/wordprocessingml/2006/main" xmlns:w14="http://schemas.microsoft.com/office/word/2010/wordml" xmlns:w15="http://schemas.microsoft.com/office/word/2012/wordml" xmlns:w16cex="http://schemas.microsoft.com/office/word/2018/wordml/cex" xmlns:w16cid="http://schemas.microsoft.com/office/word/2016/wordml/cid" xmlns:w16="http://schemas.microsoft.com/office/word/2018/wordml" xmlns:w16du="http://schemas.microsoft.com/office/word/2023/wordml/word16du" xmlns:w16sdtdh="http://schemas.microsoft.com/office/word/2020/wordml/sdtdatahash" xmlns:w16sdtfl="http://schemas.microsoft.com/office/word/2024/wordml/sdtformatlock" xmlns:w16se="http://schemas.microsoft.com/office/word/2015/wordml/symex" xmlns:wpg="http://schemas.microsoft.com/office/word/2010/wordprocessingGroup" xmlns:wpi="http://schemas.microsoft.com/office/word/2010/wordprocessingInk" xmlns:wne="http://schemas.microsoft.com/office/word/2006/wordml" xmlns:wps="http://schemas.microsoft.com/office/word/2010/wordprocessingShape" mc:Ignorable="w14 w15 w16se w16cid w16 w16cex w16sdtdh w16sdtfl w16du wp14">
+<w:hdr xmlns:wpc="http://schemas.microsoft.com/office/word/2010/wordprocessingCanvas" xmlns:cx="http://schemas.microsoft.com/office/drawing/2014/chartex" xmlns:cx1="http://schemas.microsoft.com/office/drawing/2015/9/8/chartex" xmlns:cx2="http://schemas.microsoft.com/office/drawing/2015/10/21/chartex" xmlns:cx3="http://schemas.microsoft.com/office/drawing/2016/5/9/chartex" xmlns:cx4="http://schemas.microsoft.com/office/drawing/2016/5/10/chartex" xmlns:cx5="http://schemas.microsoft.com/office/drawing/2016/5/11/chartex" xmlns:cx6="http://schemas.microsoft.com/office/drawing/2016/5/12/chartex" xmlns:cx7="http://schemas.microsoft.com/office/drawing/2016/5/13/chartex" xmlns:cx8="http://schemas.microsoft.com/office/drawing/2016/5/14/chartex" xmlns:mc="http://schemas.openxmlformats.org/markup-compatibility/2006" xmlns:m="http://schemas.openxmlformats.org/officeDocument/2006/math" xmlns:aink="http://schemas.microsoft.com/office/drawing/2016/ink" xmlns:am3d="http://schemas.microsoft.com/office/drawing/2017/model3d" xmlns:oel="http://schemas.microsoft.com/office/2019/extlst" xmlns:r="http://schemas.openxmlformats.org/officeDocument/2006/relationships" xmlns:wp14="http://schemas.microsoft.com/office/word/2010/wordprocessingDrawing" xmlns:wp="http://schemas.openxmlformats.org/drawingml/2006/wordprocessingDrawing" xmlns:wpg="http://schemas.microsoft.com/office/word/2010/wordprocessingGroup" xmlns:wpi="http://schemas.microsoft.com/office/word/2010/wordprocessingInk" xmlns:wps="http://schemas.microsoft.com/office/word/2010/wordprocessingShape" xmlns:o="urn:schemas-microsoft-com:office:office" xmlns:v="urn:schemas-microsoft-com:vml" xmlns:w10="urn:schemas-microsoft-com:office:word" xmlns:w="http://schemas.openxmlformats.org/wordprocessingml/2006/main" xmlns:w14="http://schemas.microsoft.com/office/word/2010/wordml" xmlns:w15="http://schemas.microsoft.com/office/word/2012/wordml" xmlns:w16cex="http://schemas.microsoft.com/office/word/2018/wordml/cex" xmlns:w16cid="http://schemas.microsoft.com/office/word/2016/wordml/cid" xmlns:w16="http://schemas.microsoft.com/office/word/2018/wordml" xmlns:w16sdtdh="http://schemas.microsoft.com/office/word/2020/wordml/sdtdatahash" xmlns:w16sdtfl="http://schemas.microsoft.com/office/word/2024/wordml/sdtformatlock" xmlns:w16se="http://schemas.microsoft.com/office/word/2015/wordml/symex" xmlns:w16du="http://schemas.microsoft.com/office/word/2023/wordml/word16du" xmlns:wne="http://schemas.microsoft.com/office/word/2006/wordml" mc:Ignorable="w14 w15 w16se w16cid w16 w16cex w16sdtdh w16sdtfl w16du wp14">
   <w:p>
     <w:pPr>
       <w:pStyle w:val="Header"/>
@@ -6456,7 +8321,7 @@
 </file>
 
 <file path=word/numbering.xml><?xml version="1.0" encoding="utf-8"?>
-<w:numbering xmlns:wpc="http://schemas.microsoft.com/office/word/2010/wordprocessingCanvas" xmlns:cx="http://schemas.microsoft.com/office/drawing/2014/chartex" xmlns:cx1="http://schemas.microsoft.com/office/drawing/2015/9/8/chartex" xmlns:cx2="http://schemas.microsoft.com/office/drawing/2015/10/21/chartex" xmlns:cx3="http://schemas.microsoft.com/office/drawing/2016/5/9/chartex" xmlns:cx4="http://schemas.microsoft.com/office/drawing/2016/5/10/chartex" xmlns:cx5="http://schemas.microsoft.com/office/drawing/2016/5/11/chartex" xmlns:cx6="http://schemas.microsoft.com/office/drawing/2016/5/12/chartex" xmlns:cx7="http://schemas.microsoft.com/office/drawing/2016/5/13/chartex" xmlns:cx8="http://schemas.microsoft.com/office/drawing/2016/5/14/chartex" xmlns:mc="http://schemas.openxmlformats.org/markup-compatibility/2006" xmlns:aink="http://schemas.microsoft.com/office/drawing/2016/ink" xmlns:am3d="http://schemas.microsoft.com/office/drawing/2017/model3d" xmlns:o="urn:schemas-microsoft-com:office:office" xmlns:oel="http://schemas.microsoft.com/office/2019/extlst" xmlns:r="http://schemas.openxmlformats.org/officeDocument/2006/relationships" xmlns:m="http://schemas.openxmlformats.org/officeDocument/2006/math" xmlns:v="urn:schemas-microsoft-com:vml" xmlns:wp14="http://schemas.microsoft.com/office/word/2010/wordprocessingDrawing" xmlns:wp="http://schemas.openxmlformats.org/drawingml/2006/wordprocessingDrawing" xmlns:w10="urn:schemas-microsoft-com:office:word" xmlns:w="http://schemas.openxmlformats.org/wordprocessingml/2006/main" xmlns:w14="http://schemas.microsoft.com/office/word/2010/wordml" xmlns:w15="http://schemas.microsoft.com/office/word/2012/wordml" xmlns:w16cex="http://schemas.microsoft.com/office/word/2018/wordml/cex" xmlns:w16cid="http://schemas.microsoft.com/office/word/2016/wordml/cid" xmlns:w16="http://schemas.microsoft.com/office/word/2018/wordml" xmlns:w16du="http://schemas.microsoft.com/office/word/2023/wordml/word16du" xmlns:w16sdtdh="http://schemas.microsoft.com/office/word/2020/wordml/sdtdatahash" xmlns:w16sdtfl="http://schemas.microsoft.com/office/word/2024/wordml/sdtformatlock" xmlns:w16se="http://schemas.microsoft.com/office/word/2015/wordml/symex" xmlns:wpg="http://schemas.microsoft.com/office/word/2010/wordprocessingGroup" xmlns:wpi="http://schemas.microsoft.com/office/word/2010/wordprocessingInk" xmlns:wne="http://schemas.microsoft.com/office/word/2006/wordml" xmlns:wps="http://schemas.microsoft.com/office/word/2010/wordprocessingShape" mc:Ignorable="w14 w15 w16se w16cid w16 w16cex w16sdtdh w16sdtfl w16du wp14">
+<w:numbering xmlns:wpc="http://schemas.microsoft.com/office/word/2010/wordprocessingCanvas" xmlns:cx="http://schemas.microsoft.com/office/drawing/2014/chartex" xmlns:cx1="http://schemas.microsoft.com/office/drawing/2015/9/8/chartex" xmlns:cx2="http://schemas.microsoft.com/office/drawing/2015/10/21/chartex" xmlns:cx3="http://schemas.microsoft.com/office/drawing/2016/5/9/chartex" xmlns:cx4="http://schemas.microsoft.com/office/drawing/2016/5/10/chartex" xmlns:cx5="http://schemas.microsoft.com/office/drawing/2016/5/11/chartex" xmlns:cx6="http://schemas.microsoft.com/office/drawing/2016/5/12/chartex" xmlns:cx7="http://schemas.microsoft.com/office/drawing/2016/5/13/chartex" xmlns:cx8="http://schemas.microsoft.com/office/drawing/2016/5/14/chartex" xmlns:mc="http://schemas.openxmlformats.org/markup-compatibility/2006" xmlns:m="http://schemas.openxmlformats.org/officeDocument/2006/math" xmlns:aink="http://schemas.microsoft.com/office/drawing/2016/ink" xmlns:am3d="http://schemas.microsoft.com/office/drawing/2017/model3d" xmlns:oel="http://schemas.microsoft.com/office/2019/extlst" xmlns:r="http://schemas.openxmlformats.org/officeDocument/2006/relationships" xmlns:wp14="http://schemas.microsoft.com/office/word/2010/wordprocessingDrawing" xmlns:wp="http://schemas.openxmlformats.org/drawingml/2006/wordprocessingDrawing" xmlns:wpg="http://schemas.microsoft.com/office/word/2010/wordprocessingGroup" xmlns:wpi="http://schemas.microsoft.com/office/word/2010/wordprocessingInk" xmlns:wps="http://schemas.microsoft.com/office/word/2010/wordprocessingShape" xmlns:o="urn:schemas-microsoft-com:office:office" xmlns:v="urn:schemas-microsoft-com:vml" xmlns:w10="urn:schemas-microsoft-com:office:word" xmlns:w="http://schemas.openxmlformats.org/wordprocessingml/2006/main" xmlns:w14="http://schemas.microsoft.com/office/word/2010/wordml" xmlns:w15="http://schemas.microsoft.com/office/word/2012/wordml" xmlns:w16cex="http://schemas.microsoft.com/office/word/2018/wordml/cex" xmlns:w16cid="http://schemas.microsoft.com/office/word/2016/wordml/cid" xmlns:w16="http://schemas.microsoft.com/office/word/2018/wordml" xmlns:w16sdtdh="http://schemas.microsoft.com/office/word/2020/wordml/sdtdatahash" xmlns:w16sdtfl="http://schemas.microsoft.com/office/word/2024/wordml/sdtformatlock" xmlns:w16se="http://schemas.microsoft.com/office/word/2015/wordml/symex" xmlns:w16du="http://schemas.microsoft.com/office/word/2023/wordml/word16du" xmlns:wne="http://schemas.microsoft.com/office/word/2006/wordml" mc:Ignorable="w14 w15 w16se w16cid w16 w16cex w16sdtdh w16sdtfl w16du wp14">
   <w:abstractNum w:abstractNumId="0" w15:restartNumberingAfterBreak="0">
     <w:nsid w:val="021F1635"/>
     <w:multiLevelType w:val="hybridMultilevel"/>
@@ -9284,7 +11149,7 @@
 </file>
 
 <file path=word/styles.xml><?xml version="1.0" encoding="utf-8"?>
-<w:styles xmlns:mc="http://schemas.openxmlformats.org/markup-compatibility/2006" xmlns:r="http://schemas.openxmlformats.org/officeDocument/2006/relationships" xmlns:w="http://schemas.openxmlformats.org/wordprocessingml/2006/main" xmlns:w14="http://schemas.microsoft.com/office/word/2010/wordml" xmlns:w15="http://schemas.microsoft.com/office/word/2012/wordml" xmlns:w16cex="http://schemas.microsoft.com/office/word/2018/wordml/cex" xmlns:w16cid="http://schemas.microsoft.com/office/word/2016/wordml/cid" xmlns:w16="http://schemas.microsoft.com/office/word/2018/wordml" xmlns:w16du="http://schemas.microsoft.com/office/word/2023/wordml/word16du" xmlns:w16sdtdh="http://schemas.microsoft.com/office/word/2020/wordml/sdtdatahash" xmlns:w16sdtfl="http://schemas.microsoft.com/office/word/2024/wordml/sdtformatlock" xmlns:w16se="http://schemas.microsoft.com/office/word/2015/wordml/symex" mc:Ignorable="w14 w15 w16se w16cid w16 w16cex w16sdtdh w16sdtfl w16du">
+<w:styles xmlns:mc="http://schemas.openxmlformats.org/markup-compatibility/2006" xmlns:r="http://schemas.openxmlformats.org/officeDocument/2006/relationships" xmlns:w="http://schemas.openxmlformats.org/wordprocessingml/2006/main" xmlns:w14="http://schemas.microsoft.com/office/word/2010/wordml" xmlns:w15="http://schemas.microsoft.com/office/word/2012/wordml" xmlns:w16cex="http://schemas.microsoft.com/office/word/2018/wordml/cex" xmlns:w16cid="http://schemas.microsoft.com/office/word/2016/wordml/cid" xmlns:w16="http://schemas.microsoft.com/office/word/2018/wordml" xmlns:w16sdtdh="http://schemas.microsoft.com/office/word/2020/wordml/sdtdatahash" xmlns:w16sdtfl="http://schemas.microsoft.com/office/word/2024/wordml/sdtformatlock" xmlns:w16se="http://schemas.microsoft.com/office/word/2015/wordml/symex" xmlns:w16du="http://schemas.microsoft.com/office/word/2023/wordml/word16du" mc:Ignorable="w14 w15 w16se w16cid w16 w16cex w16sdtdh w16sdtfl w16du">
   <w:docDefaults>
     <w:rPrDefault>
       <w:rPr>
@@ -9755,7 +11620,6 @@
     <w:next w:val="Normal"/>
     <w:link w:val="Heading4Char"/>
     <w:uiPriority w:val="9"/>
-    <w:semiHidden/>
     <w:unhideWhenUsed/>
     <w:qFormat/>
     <w:rsid w:val="00C5142B"/>
@@ -9883,6 +11747,7 @@
   <w:style w:type="character" w:default="1" w:styleId="DefaultParagraphFont">
     <w:name w:val="Default Paragraph Font"/>
     <w:uiPriority w:val="1"/>
+    <w:semiHidden/>
     <w:unhideWhenUsed/>
   </w:style>
   <w:style w:type="table" w:default="1" w:styleId="TableNormal">
@@ -9950,7 +11815,6 @@
     <w:basedOn w:val="DefaultParagraphFont"/>
     <w:link w:val="Heading4"/>
     <w:uiPriority w:val="9"/>
-    <w:semiHidden/>
     <w:rsid w:val="00C5142B"/>
     <w:rPr>
       <w:rFonts w:eastAsiaTheme="majorEastAsia" w:cstheme="majorBidi"/>
@@ -10396,13 +12260,21 @@
     <w:basedOn w:val="DefaultParagraphFont"/>
     <w:rsid w:val="000A790C"/>
   </w:style>
+  <w:style w:type="character" w:styleId="PageNumber">
+    <w:name w:val="page number"/>
+    <w:basedOn w:val="DefaultParagraphFont"/>
+    <w:uiPriority w:val="99"/>
+    <w:semiHidden/>
+    <w:unhideWhenUsed/>
+    <w:rsid w:val="00AD1964"/>
+  </w:style>
   <w:style w:type="character" w:styleId="FollowedHyperlink">
     <w:name w:val="FollowedHyperlink"/>
     <w:basedOn w:val="DefaultParagraphFont"/>
     <w:uiPriority w:val="99"/>
     <w:semiHidden/>
     <w:unhideWhenUsed/>
-    <w:rsid w:val="0029305B"/>
+    <w:rsid w:val="008E2D4C"/>
     <w:rPr>
       <w:color w:val="96607D" w:themeColor="followedHyperlink"/>
       <w:u w:val="single"/>

</xml_diff>

<commit_message>
Referenced appendix A in 1.4 Team Collaboration and Project Setup
</commit_message>
<xml_diff>
--- a/Assignment 3B_Project process book/Assignment 3B - Project process book.docx
+++ b/Assignment 3B_Project process book/Assignment 3B - Project process book.docx
@@ -4204,6 +4204,17 @@
       </w:r>
     </w:p>
     <w:p>
+      <w:r>
+        <w:t xml:space="preserve">See </w:t>
+      </w:r>
+      <w:r>
+        <w:t>Appendix A: Team Collaboration setup</w:t>
+      </w:r>
+      <w:r>
+        <w:t xml:space="preserve"> for examples of both Microsoft Teams and the GitHub Repository.</w:t>
+      </w:r>
+    </w:p>
+    <w:p>
       <w:pPr>
         <w:rPr>
           <w:b/>
@@ -4221,6 +4232,15 @@
           <w:docGrid w:linePitch="360"/>
         </w:sectPr>
       </w:pPr>
+      <w:r>
+        <w:rPr>
+          <w:b/>
+          <w:bCs/>
+          <w:sz w:val="28"/>
+          <w:szCs w:val="28"/>
+        </w:rPr>
+        <w:t xml:space="preserve"> </w:t>
+      </w:r>
     </w:p>
     <w:p>
       <w:pPr>
@@ -5289,25 +5309,7 @@
         <w:rPr>
           <w:rStyle w:val="SubtleReference"/>
         </w:rPr>
-        <w:t>Required</w:t>
-      </w:r>
-      <w:r>
-        <w:rPr>
-          <w:rStyle w:val="SubtleReference"/>
-        </w:rPr>
-        <w:t xml:space="preserve"> Feature</w:t>
-      </w:r>
-      <w:r>
-        <w:rPr>
-          <w:rStyle w:val="SubtleReference"/>
-        </w:rPr>
-        <w:t>s</w:t>
-      </w:r>
-      <w:r>
-        <w:rPr>
-          <w:rStyle w:val="SubtleReference"/>
-        </w:rPr>
-        <w:t xml:space="preserve"> Implementation Summary</w:t>
+        <w:t>Required Features Implementation Summary</w:t>
       </w:r>
     </w:p>
     <w:p/>
@@ -8130,7 +8132,7 @@
                 <w:szCs w:val="28"/>
               </w:rPr>
               <w:drawing>
-                <wp:anchor distT="0" distB="0" distL="114300" distR="114300" simplePos="0" relativeHeight="251658240" behindDoc="0" locked="0" layoutInCell="1" allowOverlap="1" wp14:anchorId="2AEF8A1F" wp14:editId="6C989D01">
+                <wp:anchor distT="0" distB="0" distL="114300" distR="114300" simplePos="0" relativeHeight="251658240" behindDoc="0" locked="0" layoutInCell="1" allowOverlap="1" wp14:anchorId="2AEF8A1F" wp14:editId="59D40296">
                   <wp:simplePos x="0" y="0"/>
                   <wp:positionH relativeFrom="column">
                     <wp:posOffset>2605405</wp:posOffset>
@@ -8267,7 +8269,7 @@
                 <w:szCs w:val="28"/>
               </w:rPr>
               <w:drawing>
-                <wp:anchor distT="0" distB="0" distL="114300" distR="114300" simplePos="0" relativeHeight="251660288" behindDoc="0" locked="0" layoutInCell="1" allowOverlap="1" wp14:anchorId="352BE701" wp14:editId="07B2ACB7">
+                <wp:anchor distT="0" distB="0" distL="114300" distR="114300" simplePos="0" relativeHeight="251660288" behindDoc="0" locked="0" layoutInCell="1" allowOverlap="1" wp14:anchorId="352BE701" wp14:editId="5610B3F1">
                   <wp:simplePos x="0" y="0"/>
                   <wp:positionH relativeFrom="column">
                     <wp:posOffset>-64877</wp:posOffset>
@@ -8347,7 +8349,13 @@
       <w:bookmarkStart w:id="24" w:name="_Toc242064480"/>
       <w:r>
         <w:lastRenderedPageBreak/>
-        <w:t>Appendix C: Visualisation Iteration Example</w:t>
+        <w:t xml:space="preserve">Appendix </w:t>
+      </w:r>
+      <w:r>
+        <w:t>B</w:t>
+      </w:r>
+      <w:r>
+        <w:t>: Visualisation Iteration Example</w:t>
       </w:r>
       <w:bookmarkEnd w:id="24"/>
     </w:p>

</xml_diff>

<commit_message>
minor update to page 1 header
</commit_message>
<xml_diff>
--- a/Assignment 3B_Project process book/Assignment 3B - Project process book.docx
+++ b/Assignment 3B_Project process book/Assignment 3B - Project process book.docx
@@ -208,16 +208,6 @@
       <w:pPr>
         <w:jc w:val="center"/>
         <w:rPr>
-          <w:color w:val="000000" w:themeColor="text1"/>
-          <w:sz w:val="28"/>
-          <w:szCs w:val="28"/>
-        </w:rPr>
-      </w:pPr>
-    </w:p>
-    <w:p>
-      <w:pPr>
-        <w:jc w:val="center"/>
-        <w:rPr>
           <w:b/>
           <w:bCs/>
           <w:i/>
@@ -4205,10 +4195,7 @@
     </w:p>
     <w:p>
       <w:r>
-        <w:t xml:space="preserve">See </w:t>
-      </w:r>
-      <w:r>
-        <w:t>Appendix A: Team Collaboration setup</w:t>
+        <w:t>See Appendix A: Team Collaboration setup</w:t>
       </w:r>
       <w:r>
         <w:t xml:space="preserve"> for examples of both Microsoft Teams and the GitHub Repository.</w:t>
@@ -4229,6 +4216,7 @@
           <w:pgSz w:w="11906" w:h="16838"/>
           <w:pgMar w:top="1440" w:right="1440" w:bottom="1440" w:left="1440" w:header="708" w:footer="708" w:gutter="0"/>
           <w:cols w:space="708"/>
+          <w:titlePg/>
           <w:docGrid w:linePitch="360"/>
         </w:sectPr>
       </w:pPr>
@@ -8132,7 +8120,7 @@
                 <w:szCs w:val="28"/>
               </w:rPr>
               <w:drawing>
-                <wp:anchor distT="0" distB="0" distL="114300" distR="114300" simplePos="0" relativeHeight="251658240" behindDoc="0" locked="0" layoutInCell="1" allowOverlap="1" wp14:anchorId="2AEF8A1F" wp14:editId="59D40296">
+                <wp:anchor distT="0" distB="0" distL="114300" distR="114300" simplePos="0" relativeHeight="251658240" behindDoc="0" locked="0" layoutInCell="1" allowOverlap="1" wp14:anchorId="2AEF8A1F" wp14:editId="3AF711AC">
                   <wp:simplePos x="0" y="0"/>
                   <wp:positionH relativeFrom="column">
                     <wp:posOffset>2605405</wp:posOffset>
@@ -8269,7 +8257,7 @@
                 <w:szCs w:val="28"/>
               </w:rPr>
               <w:drawing>
-                <wp:anchor distT="0" distB="0" distL="114300" distR="114300" simplePos="0" relativeHeight="251660288" behindDoc="0" locked="0" layoutInCell="1" allowOverlap="1" wp14:anchorId="352BE701" wp14:editId="5610B3F1">
+                <wp:anchor distT="0" distB="0" distL="114300" distR="114300" simplePos="0" relativeHeight="251660288" behindDoc="0" locked="0" layoutInCell="1" allowOverlap="1" wp14:anchorId="352BE701" wp14:editId="19ADC8A5">
                   <wp:simplePos x="0" y="0"/>
                   <wp:positionH relativeFrom="column">
                     <wp:posOffset>-64877</wp:posOffset>

</xml_diff>